<commit_message>
Update paper with RAMR revision results
</commit_message>
<xml_diff>
--- a/paper/2026-0268-基于多专家融合的铁路客流多尺度预测方法.docx
+++ b/paper/2026-0268-基于多专家融合的铁路客流多尺度预测方法.docx
@@ -440,297 +440,7 @@
         </w:rPr>
       </w:pPr>
       <w:r>
-        <w:rPr>
-          <w:rFonts w:hint="eastAsia" w:ascii="宋体" w:hAnsi="宋体" w:eastAsia="宋体" w:cs="宋体"/>
-          <w:sz w:val="18"/>
-          <w:szCs w:val="18"/>
-          <w:highlight w:val="none"/>
-        </w:rPr>
-        <w:t>高精度铁路客流预测对客运组织、运力配置与智能调度具有重要意义。铁路客流序列呈现短期波动、周期变化与异常扰动等多尺度非平稳特征，日粒度序列可近似为</w:t>
-      </w:r>
-      <m:oMath>
-        <m:sSub>
-          <m:sSubPr>
-            <m:ctrlPr>
-              <w:rPr>
-                <w:rFonts w:hint="eastAsia" w:ascii="Cambria Math" w:hAnsi="Cambria Math" w:eastAsia="宋体" w:cs="宋体"/>
-                <w:i/>
-                <w:sz w:val="18"/>
-                <w:szCs w:val="18"/>
-                <w:highlight w:val="none"/>
-                <w:lang w:val="en-US"/>
-              </w:rPr>
-            </m:ctrlPr>
-          </m:sSubPr>
-          <m:e>
-            <m:r>
-              <m:rPr/>
-              <w:rPr>
-                <w:rFonts w:hint="eastAsia" w:ascii="Cambria Math" w:hAnsi="Cambria Math" w:eastAsia="宋体" w:cs="宋体"/>
-                <w:sz w:val="18"/>
-                <w:szCs w:val="18"/>
-                <w:highlight w:val="none"/>
-                <w:lang w:val="en-US" w:eastAsia="zh-CN"/>
-              </w:rPr>
-              <m:t>X</m:t>
-            </m:r>
-            <m:ctrlPr>
-              <w:rPr>
-                <w:rFonts w:hint="eastAsia" w:ascii="Cambria Math" w:hAnsi="Cambria Math" w:eastAsia="宋体" w:cs="宋体"/>
-                <w:i/>
-                <w:sz w:val="18"/>
-                <w:szCs w:val="18"/>
-                <w:highlight w:val="none"/>
-                <w:lang w:val="en-US"/>
-              </w:rPr>
-            </m:ctrlPr>
-          </m:e>
-          <m:sub>
-            <m:r>
-              <m:rPr/>
-              <w:rPr>
-                <w:rFonts w:hint="eastAsia" w:ascii="Cambria Math" w:hAnsi="Cambria Math" w:eastAsia="宋体" w:cs="宋体"/>
-                <w:sz w:val="18"/>
-                <w:szCs w:val="18"/>
-                <w:highlight w:val="none"/>
-                <w:lang w:val="en-US" w:eastAsia="zh-CN"/>
-              </w:rPr>
-              <m:t>t</m:t>
-            </m:r>
-            <m:ctrlPr>
-              <w:rPr>
-                <w:rFonts w:hint="eastAsia" w:ascii="Cambria Math" w:hAnsi="Cambria Math" w:eastAsia="宋体" w:cs="宋体"/>
-                <w:i/>
-                <w:sz w:val="18"/>
-                <w:szCs w:val="18"/>
-                <w:highlight w:val="none"/>
-                <w:lang w:val="en-US"/>
-              </w:rPr>
-            </m:ctrlPr>
-          </m:sub>
-        </m:sSub>
-        <m:r>
-          <m:rPr/>
-          <w:rPr>
-            <w:rFonts w:hint="eastAsia" w:ascii="Cambria Math" w:hAnsi="Cambria Math" w:eastAsia="宋体" w:cs="宋体"/>
-            <w:sz w:val="18"/>
-            <w:szCs w:val="18"/>
-            <w:highlight w:val="none"/>
-            <w:lang w:val="en-US" w:eastAsia="zh-CN"/>
-          </w:rPr>
-          <m:t>=</m:t>
-        </m:r>
-        <m:sSub>
-          <m:sSubPr>
-            <m:ctrlPr>
-              <w:rPr>
-                <w:rFonts w:hint="eastAsia" w:ascii="Cambria Math" w:hAnsi="Cambria Math" w:eastAsia="宋体" w:cs="宋体"/>
-                <w:i/>
-                <w:sz w:val="18"/>
-                <w:szCs w:val="18"/>
-                <w:highlight w:val="none"/>
-                <w:lang w:val="en-US" w:eastAsia="zh-CN"/>
-              </w:rPr>
-            </m:ctrlPr>
-          </m:sSubPr>
-          <m:e>
-            <m:r>
-              <m:rPr/>
-              <w:rPr>
-                <w:rFonts w:hint="eastAsia" w:ascii="Cambria Math" w:hAnsi="Cambria Math" w:eastAsia="宋体" w:cs="宋体"/>
-                <w:sz w:val="18"/>
-                <w:szCs w:val="18"/>
-                <w:highlight w:val="none"/>
-                <w:lang w:val="en-US" w:eastAsia="zh-CN"/>
-              </w:rPr>
-              <m:t>T</m:t>
-            </m:r>
-            <m:ctrlPr>
-              <w:rPr>
-                <w:rFonts w:hint="eastAsia" w:ascii="Cambria Math" w:hAnsi="Cambria Math" w:eastAsia="宋体" w:cs="宋体"/>
-                <w:i/>
-                <w:sz w:val="18"/>
-                <w:szCs w:val="18"/>
-                <w:highlight w:val="none"/>
-                <w:lang w:val="en-US" w:eastAsia="zh-CN"/>
-              </w:rPr>
-            </m:ctrlPr>
-          </m:e>
-          <m:sub>
-            <m:r>
-              <m:rPr/>
-              <w:rPr>
-                <w:rFonts w:hint="eastAsia" w:ascii="Cambria Math" w:hAnsi="Cambria Math" w:eastAsia="宋体" w:cs="宋体"/>
-                <w:sz w:val="18"/>
-                <w:szCs w:val="18"/>
-                <w:highlight w:val="none"/>
-                <w:lang w:val="en-US" w:eastAsia="zh-CN"/>
-              </w:rPr>
-              <m:t>t</m:t>
-            </m:r>
-            <m:ctrlPr>
-              <w:rPr>
-                <w:rFonts w:hint="eastAsia" w:ascii="Cambria Math" w:hAnsi="Cambria Math" w:eastAsia="宋体" w:cs="宋体"/>
-                <w:i/>
-                <w:sz w:val="18"/>
-                <w:szCs w:val="18"/>
-                <w:highlight w:val="none"/>
-                <w:lang w:val="en-US" w:eastAsia="zh-CN"/>
-              </w:rPr>
-            </m:ctrlPr>
-          </m:sub>
-        </m:sSub>
-        <m:r>
-          <m:rPr/>
-          <w:rPr>
-            <w:rFonts w:hint="eastAsia" w:ascii="Cambria Math" w:hAnsi="Cambria Math" w:eastAsia="宋体" w:cs="宋体"/>
-            <w:sz w:val="18"/>
-            <w:szCs w:val="18"/>
-            <w:highlight w:val="none"/>
-            <w:lang w:val="en-US" w:eastAsia="zh-CN"/>
-          </w:rPr>
-          <m:t>+</m:t>
-        </m:r>
-        <m:sSub>
-          <m:sSubPr>
-            <m:ctrlPr>
-              <w:rPr>
-                <w:rFonts w:hint="eastAsia" w:ascii="Cambria Math" w:hAnsi="Cambria Math" w:eastAsia="宋体" w:cs="宋体"/>
-                <w:i/>
-                <w:sz w:val="18"/>
-                <w:szCs w:val="18"/>
-                <w:highlight w:val="none"/>
-                <w:lang w:val="en-US" w:eastAsia="zh-CN"/>
-              </w:rPr>
-            </m:ctrlPr>
-          </m:sSubPr>
-          <m:e>
-            <m:r>
-              <m:rPr/>
-              <w:rPr>
-                <w:rFonts w:hint="eastAsia" w:ascii="Cambria Math" w:hAnsi="Cambria Math" w:eastAsia="宋体" w:cs="宋体"/>
-                <w:sz w:val="18"/>
-                <w:szCs w:val="18"/>
-                <w:highlight w:val="none"/>
-                <w:lang w:val="en-US" w:eastAsia="zh-CN"/>
-              </w:rPr>
-              <m:t>S</m:t>
-            </m:r>
-            <m:ctrlPr>
-              <w:rPr>
-                <w:rFonts w:hint="eastAsia" w:ascii="Cambria Math" w:hAnsi="Cambria Math" w:eastAsia="宋体" w:cs="宋体"/>
-                <w:i/>
-                <w:sz w:val="18"/>
-                <w:szCs w:val="18"/>
-                <w:highlight w:val="none"/>
-                <w:lang w:val="en-US" w:eastAsia="zh-CN"/>
-              </w:rPr>
-            </m:ctrlPr>
-          </m:e>
-          <m:sub>
-            <m:r>
-              <m:rPr/>
-              <w:rPr>
-                <w:rFonts w:hint="eastAsia" w:ascii="Cambria Math" w:hAnsi="Cambria Math" w:eastAsia="宋体" w:cs="宋体"/>
-                <w:sz w:val="18"/>
-                <w:szCs w:val="18"/>
-                <w:highlight w:val="none"/>
-                <w:lang w:val="en-US" w:eastAsia="zh-CN"/>
-              </w:rPr>
-              <m:t>t</m:t>
-            </m:r>
-            <m:ctrlPr>
-              <w:rPr>
-                <w:rFonts w:hint="eastAsia" w:ascii="Cambria Math" w:hAnsi="Cambria Math" w:eastAsia="宋体" w:cs="宋体"/>
-                <w:i/>
-                <w:sz w:val="18"/>
-                <w:szCs w:val="18"/>
-                <w:highlight w:val="none"/>
-                <w:lang w:val="en-US" w:eastAsia="zh-CN"/>
-              </w:rPr>
-            </m:ctrlPr>
-          </m:sub>
-        </m:sSub>
-        <m:r>
-          <m:rPr/>
-          <w:rPr>
-            <w:rFonts w:hint="eastAsia" w:ascii="Cambria Math" w:hAnsi="Cambria Math" w:eastAsia="宋体" w:cs="宋体"/>
-            <w:sz w:val="18"/>
-            <w:szCs w:val="18"/>
-            <w:highlight w:val="none"/>
-            <w:lang w:val="en-US" w:eastAsia="zh-CN"/>
-          </w:rPr>
-          <m:t>+</m:t>
-        </m:r>
-        <m:sSub>
-          <m:sSubPr>
-            <m:ctrlPr>
-              <w:rPr>
-                <w:rFonts w:hint="eastAsia" w:ascii="Cambria Math" w:hAnsi="Cambria Math" w:eastAsia="宋体" w:cs="宋体"/>
-                <w:i/>
-                <w:sz w:val="18"/>
-                <w:szCs w:val="18"/>
-                <w:highlight w:val="none"/>
-                <w:lang w:val="en-US" w:eastAsia="zh-CN"/>
-              </w:rPr>
-            </m:ctrlPr>
-          </m:sSubPr>
-          <m:e>
-            <m:r>
-              <m:rPr/>
-              <w:rPr>
-                <w:rFonts w:hint="eastAsia" w:ascii="Cambria Math" w:hAnsi="Cambria Math" w:eastAsia="宋体" w:cs="宋体"/>
-                <w:sz w:val="18"/>
-                <w:szCs w:val="18"/>
-                <w:highlight w:val="none"/>
-                <w:lang w:val="en-US" w:eastAsia="zh-CN"/>
-              </w:rPr>
-              <m:t>R</m:t>
-            </m:r>
-            <m:ctrlPr>
-              <w:rPr>
-                <w:rFonts w:hint="eastAsia" w:ascii="Cambria Math" w:hAnsi="Cambria Math" w:eastAsia="宋体" w:cs="宋体"/>
-                <w:i/>
-                <w:sz w:val="18"/>
-                <w:szCs w:val="18"/>
-                <w:highlight w:val="none"/>
-                <w:lang w:val="en-US" w:eastAsia="zh-CN"/>
-              </w:rPr>
-            </m:ctrlPr>
-          </m:e>
-          <m:sub>
-            <m:r>
-              <m:rPr/>
-              <w:rPr>
-                <w:rFonts w:hint="eastAsia" w:ascii="Cambria Math" w:hAnsi="Cambria Math" w:eastAsia="宋体" w:cs="宋体"/>
-                <w:sz w:val="18"/>
-                <w:szCs w:val="18"/>
-                <w:highlight w:val="none"/>
-                <w:lang w:val="en-US" w:eastAsia="zh-CN"/>
-              </w:rPr>
-              <m:t>t</m:t>
-            </m:r>
-            <m:ctrlPr>
-              <w:rPr>
-                <w:rFonts w:hint="eastAsia" w:ascii="Cambria Math" w:hAnsi="Cambria Math" w:eastAsia="宋体" w:cs="宋体"/>
-                <w:i/>
-                <w:sz w:val="18"/>
-                <w:szCs w:val="18"/>
-                <w:highlight w:val="none"/>
-                <w:lang w:val="en-US" w:eastAsia="zh-CN"/>
-              </w:rPr>
-            </m:ctrlPr>
-          </m:sub>
-        </m:sSub>
-      </m:oMath>
-      <w:r>
-        <w:rPr>
-          <w:rFonts w:hint="eastAsia" w:ascii="宋体" w:hAnsi="宋体" w:eastAsia="宋体" w:cs="宋体"/>
-          <w:sz w:val="18"/>
-          <w:szCs w:val="18"/>
-          <w:highlight w:val="none"/>
-        </w:rPr>
-        <w:t>。本文提出MoE-Rail：以时序分解为专家归纳偏置，构建短期依赖、长期依赖与统计特征三类异构专家，结合场景感知门控与负载均衡约束实现自适应融合。某铁路枢纽6站877天实验表明，测试集MAPE为19.41%，优于全部对比基线与消融变体；STL—门控机制验证显示节假日统计专家权重显著升高；Traffic数据集上平均MSE为0.293，验证框架跨域泛化能力。</w:t>
+        <w:t>高精度铁路客流预测对客运组织、运力配置与智能调度具有重要意义。铁路客流序列受跨城市出行、节假日和临时扰动影响，呈现趋势、周期和残差扰动交织的多尺度非平稳特征。本文提出一种场景驱动的非平稳时序分解-路由机制（Regime-aware Mixture Routing, RAMR），将趋势、周期与扰动结构显式映射到专家空间，并通过日历场景与窗口级非平稳状态共同条件化门控网络，实现不同非平稳成分的自适应建模。某铁路枢纽运营数据实验表明，原MoE-Rail测试集MAPE为19.41%；进一步的RAMR补充实验显示，引入场景条件与regime条件后，相比去除场景门控和去除regime路由的变体分别降低1.56和0.49个百分点。门控可视化表明模型能够在不同场景下调整短期、长期与分布偏移专家权重，为铁路客流非平稳预测提供可解释的多专家路由机制。</w:t>
       </w:r>
     </w:p>
     <w:p>
@@ -1506,24 +1216,139 @@
         </w:rPr>
       </w:pPr>
       <w:r>
-        <w:rPr>
-          <w:rFonts w:ascii="Times New Roman" w:hAnsi="Times New Roman" w:eastAsia="宋体"/>
-          <w:b w:val="0"/>
-          <w:i w:val="0"/>
-          <w:sz w:val="21"/>
-          <w:highlight w:val="none"/>
-        </w:rPr>
-        <w:t xml:space="preserve">Abstract: </w:t>
-      </w:r>
-      <w:r>
-        <w:rPr>
-          <w:rFonts w:hint="eastAsia" w:ascii="Times New Roman" w:hAnsi="Times New Roman" w:eastAsia="宋体"/>
-          <w:b w:val="0"/>
-          <w:i w:val="0"/>
-          <w:sz w:val="21"/>
-          <w:highlight w:val="none"/>
-        </w:rPr>
-        <w:t xml:space="preserve">High-precision railway passenger flow forecasting is of great significance for passenger organization, capacity allocation, and intelligent dispatching. Railway passenger flow sequences exhibit multi-scale non-stationary characteristics, including short-term fluctuations, periodic variations, and anomalous disturbances. The daily granularity sequence can be approximated as </w:t>
+        <w:t>Abstract: High-precision railway passenger flow forecasting is important for passenger organization, capacity allocation, and intelligent dispatching. Railway passenger flow is affected by intercity travel demand, holidays, and temporary disturbances, and therefore exhibits multi-scale non-stationarity with intertwined trend, seasonal, and residual disturbance components. This paper proposes a regime-aware mixture routing mechanism driven by scenario-conditioned non-stationary decomposition. The proposed method maps trend, seasonal, and disturbance structures into the expert space and conditions the gating network on both calendar scenarios and window-level regime states. Experiments on railway hub operation data show that the original MoE-Rail achieves a test MAPE of 19.41%. Additional RAMR experiments show that scenario-aware routing and regime-aware routing reduce test MAPE by 1.56 and 0.49 percentage points compared with their corresponding ablations. Gating visualization further indicates that the model adaptively adjusts short-term, long-term, and distribution-shift experts under different regimes, providing an interpretable routing mechanism for non-stationary railway passenger flow forecasting.</w:t>
+      </w:r>
+    </w:p>
+    <w:p>
+      <w:pPr>
+        <w:spacing w:before="0" w:after="0" w:line="360" w:lineRule="auto"/>
+        <w:ind w:left="425" w:right="425" w:firstLine="0"/>
+        <w:jc w:val="both"/>
+        <w:rPr>
+          <w:szCs w:val="21"/>
+          <w:highlight w:val="none"/>
+        </w:rPr>
+      </w:pPr>
+      <w:r>
+        <w:rPr>
+          <w:rFonts w:ascii="Times New Roman" w:hAnsi="Times New Roman" w:eastAsia="宋体"/>
+          <w:b w:val="0"/>
+          <w:i w:val="0"/>
+          <w:sz w:val="21"/>
+          <w:highlight w:val="none"/>
+        </w:rPr>
+        <w:t>Keywords: railway passenger flow; passenger flow forecasting; mixture-of-experts; time series decomposition; scenario-aware gating; multi-scale forecasting</w:t>
+      </w:r>
+    </w:p>
+    <w:p>
+      <w:pPr>
+        <w:overflowPunct w:val="0"/>
+        <w:autoSpaceDE w:val="0"/>
+        <w:spacing w:before="120" w:after="60" w:line="360" w:lineRule="auto"/>
+        <w:ind w:firstLine="0"/>
+        <w:jc w:val="both"/>
+        <w:outlineLvl w:val="0"/>
+        <w:rPr>
+          <w:rFonts w:hint="eastAsia" w:ascii="黑体" w:hAnsi="黑体" w:eastAsia="黑体"/>
+          <w:sz w:val="28"/>
+          <w:szCs w:val="28"/>
+          <w:highlight w:val="none"/>
+        </w:rPr>
+      </w:pPr>
+      <w:r>
+        <w:rPr>
+          <w:rFonts w:ascii="Times New Roman" w:hAnsi="Times New Roman" w:eastAsia="宋体"/>
+          <w:b/>
+          <w:i w:val="0"/>
+          <w:sz w:val="24"/>
+          <w:highlight w:val="none"/>
+        </w:rPr>
+        <w:t>引言</w:t>
+      </w:r>
+    </w:p>
+    <w:p>
+      <w:pPr>
+        <w:overflowPunct w:val="0"/>
+        <w:autoSpaceDE w:val="0"/>
+        <w:spacing w:line="360" w:lineRule="auto"/>
+        <w:ind w:firstLine="420"/>
+        <w:rPr>
+          <w:szCs w:val="21"/>
+          <w:highlight w:val="none"/>
+        </w:rPr>
+      </w:pPr>
+      <w:r>
+        <w:rPr>
+          <w:rFonts w:ascii="Times New Roman" w:hAnsi="Times New Roman" w:eastAsia="宋体"/>
+          <w:b w:val="0"/>
+          <w:i w:val="0"/>
+          <w:sz w:val="21"/>
+          <w:szCs w:val="21"/>
+          <w:highlight w:val="none"/>
+        </w:rPr>
+        <w:t>铁路作为现代城市综合交通体系的核心枢纽，承担着重要的客运与运输功能。随着线网扩张和客流持续增长，运输组织呈现高密度、高频次和强耦合特征。在此背景下，高精度客流预测可为突发加开、长短期运行图调整提供依据，对保障运输安全、提升运行效率具有重要意义[1-2]。面对复杂的时空动态，基于历史客流的时序建模与预测已成为高效调度与科学决策的核心技术手段。</w:t>
+      </w:r>
+    </w:p>
+    <w:p>
+      <w:pPr>
+        <w:overflowPunct w:val="0"/>
+        <w:autoSpaceDE w:val="0"/>
+        <w:spacing w:line="360" w:lineRule="auto"/>
+        <w:ind w:firstLine="420"/>
+        <w:rPr>
+          <w:rFonts w:hint="default" w:ascii="Times New Roman" w:hAnsi="Times New Roman" w:eastAsia="宋体"/>
+          <w:b w:val="0"/>
+          <w:i w:val="0"/>
+          <w:sz w:val="21"/>
+          <w:szCs w:val="21"/>
+          <w:highlight w:val="none"/>
+        </w:rPr>
+      </w:pPr>
+      <w:r>
+        <w:rPr>
+          <w:rFonts w:ascii="Times New Roman" w:hAnsi="Times New Roman" w:eastAsia="宋体"/>
+          <w:b w:val="0"/>
+          <w:i w:val="0"/>
+          <w:sz w:val="21"/>
+          <w:szCs w:val="21"/>
+          <w:highlight w:val="none"/>
+        </w:rPr>
+        <w:t>针对铁路客流预测，现有研究主要包括统计模型与传统机器学习模型，如历史平均法[3]、ARIMA[4]以及支持向量机[5]等。此类模型具备一定可解释性，但在面对铁路客流序列中普遍存在的短期突发波动、周期叠加及显著非平稳特征时，表现出建模能力有限、预测精度不足等问题。为解决长短期依赖难以建模的问题，LSTM、GRU 等循环网络[6-7]改善了长短期依赖建模；融合图神经网络的时空预测模型（如DCRNN [8]、Graph-WaveNet [9]、ASTGCN [10]等）通过显式编码轨道交通网络的空间拓扑结构，有效增强了对站点间空间关联性的刻画，但依赖显式邻接结构。本文聚焦铁路客流时间维度上的多尺度机制解耦</w:t>
+      </w:r>
+      <w:r>
+        <w:rPr>
+          <w:rFonts w:hint="default" w:ascii="Times New Roman" w:hAnsi="Times New Roman" w:eastAsia="宋体"/>
+          <w:b w:val="0"/>
+          <w:i w:val="0"/>
+          <w:sz w:val="21"/>
+          <w:szCs w:val="21"/>
+          <w:highlight w:val="none"/>
+        </w:rPr>
+        <w:t>，通过枢纽多站联合预测隐式刻画站间关联，显式图建模留作后续工作。</w:t>
+      </w:r>
+    </w:p>
+    <w:p>
+      <w:pPr>
+        <w:overflowPunct w:val="0"/>
+        <w:autoSpaceDE w:val="0"/>
+        <w:spacing w:line="360" w:lineRule="auto"/>
+        <w:ind w:firstLine="420"/>
+        <w:rPr>
+          <w:rFonts w:hint="default"/>
+          <w:szCs w:val="21"/>
+          <w:highlight w:val="none"/>
+        </w:rPr>
+      </w:pPr>
+      <w:r>
+        <w:rPr>
+          <w:rFonts w:hint="default" w:ascii="Times New Roman" w:hAnsi="Times New Roman" w:eastAsia="宋体"/>
+          <w:b w:val="0"/>
+          <w:i w:val="0"/>
+          <w:sz w:val="21"/>
+          <w:szCs w:val="21"/>
+          <w:highlight w:val="none"/>
+        </w:rPr>
+        <w:t>尽管如此，单一深度网络仍难以在统一参数空间内兼顾日内高频波动与中长期周期演化，铁路客流在非平稳、多模式叠加下更易出现多尺度优化冲突。从生成机制看，日粒度序列可近似表示为</w:t>
       </w:r>
       <m:oMath>
         <m:sSub>
@@ -1857,478 +1682,6 @@
       </m:oMath>
       <w:r>
         <w:rPr>
-          <w:rFonts w:hint="eastAsia" w:ascii="Times New Roman" w:hAnsi="Times New Roman" w:eastAsia="宋体"/>
-          <w:b w:val="0"/>
-          <w:i w:val="0"/>
-          <w:sz w:val="21"/>
-          <w:highlight w:val="none"/>
-        </w:rPr>
-        <w:t>. This paper proposes MoE-Rail, a framework that incorporates time series decomposition as expert inductive bias, constructing three types of heterogeneous experts—short-term dependency, long-term dependency, and statistical features—and adaptively fuses them using a context-aware gating mechanism with load balance constraints. Experiments on 877-day data from six railway hub stations show that the proposed method achieves a test-set MAPE of 19.41%, outperforming all baseline models and ablation variants. The STL-gating mechanism validation indicates a significant increase in the weight of the statistical expert during holidays. Moreover, the framework achieves an average MSE of 0.293 on the Traffic dataset, demonstrating its cross-domain generalization capability.</w:t>
-      </w:r>
-    </w:p>
-    <w:p>
-      <w:pPr>
-        <w:spacing w:before="0" w:after="0" w:line="360" w:lineRule="auto"/>
-        <w:ind w:left="425" w:right="425" w:firstLine="0"/>
-        <w:jc w:val="both"/>
-        <w:rPr>
-          <w:szCs w:val="21"/>
-          <w:highlight w:val="none"/>
-        </w:rPr>
-      </w:pPr>
-      <w:r>
-        <w:rPr>
-          <w:rFonts w:ascii="Times New Roman" w:hAnsi="Times New Roman" w:eastAsia="宋体"/>
-          <w:b w:val="0"/>
-          <w:i w:val="0"/>
-          <w:sz w:val="21"/>
-          <w:highlight w:val="none"/>
-        </w:rPr>
-        <w:t>Keywords: railway passenger flow; passenger flow forecasting; mixture-of-experts; time series decomposition; scenario-aware gating; multi-scale forecasting</w:t>
-      </w:r>
-    </w:p>
-    <w:p>
-      <w:pPr>
-        <w:overflowPunct w:val="0"/>
-        <w:autoSpaceDE w:val="0"/>
-        <w:spacing w:before="120" w:after="60" w:line="360" w:lineRule="auto"/>
-        <w:ind w:firstLine="0"/>
-        <w:jc w:val="both"/>
-        <w:outlineLvl w:val="0"/>
-        <w:rPr>
-          <w:rFonts w:hint="eastAsia" w:ascii="黑体" w:hAnsi="黑体" w:eastAsia="黑体"/>
-          <w:sz w:val="28"/>
-          <w:szCs w:val="28"/>
-          <w:highlight w:val="none"/>
-        </w:rPr>
-      </w:pPr>
-      <w:r>
-        <w:rPr>
-          <w:rFonts w:ascii="Times New Roman" w:hAnsi="Times New Roman" w:eastAsia="宋体"/>
-          <w:b/>
-          <w:i w:val="0"/>
-          <w:sz w:val="24"/>
-          <w:highlight w:val="none"/>
-        </w:rPr>
-        <w:t>引言</w:t>
-      </w:r>
-    </w:p>
-    <w:p>
-      <w:pPr>
-        <w:overflowPunct w:val="0"/>
-        <w:autoSpaceDE w:val="0"/>
-        <w:spacing w:line="360" w:lineRule="auto"/>
-        <w:ind w:firstLine="420"/>
-        <w:rPr>
-          <w:szCs w:val="21"/>
-          <w:highlight w:val="none"/>
-        </w:rPr>
-      </w:pPr>
-      <w:r>
-        <w:rPr>
-          <w:rFonts w:ascii="Times New Roman" w:hAnsi="Times New Roman" w:eastAsia="宋体"/>
-          <w:b w:val="0"/>
-          <w:i w:val="0"/>
-          <w:sz w:val="21"/>
-          <w:szCs w:val="21"/>
-          <w:highlight w:val="none"/>
-        </w:rPr>
-        <w:t>铁路作为现代城市综合交通体系的核心枢纽，承担着重要的客运与运输功能。随着线网扩张和客流持续增长，运输组织呈现高密度、高频次和强耦合特征。在此背景下，高精度客流预测可为突发加开、长短期运行图调整提供依据，对保障运输安全、提升运行效率具有重要意义[1-2]。面对复杂的时空动态，基于历史客流的时序建模与预测已成为高效调度与科学决策的核心技术手段。</w:t>
-      </w:r>
-    </w:p>
-    <w:p>
-      <w:pPr>
-        <w:overflowPunct w:val="0"/>
-        <w:autoSpaceDE w:val="0"/>
-        <w:spacing w:line="360" w:lineRule="auto"/>
-        <w:ind w:firstLine="420"/>
-        <w:rPr>
-          <w:rFonts w:hint="default" w:ascii="Times New Roman" w:hAnsi="Times New Roman" w:eastAsia="宋体"/>
-          <w:b w:val="0"/>
-          <w:i w:val="0"/>
-          <w:sz w:val="21"/>
-          <w:szCs w:val="21"/>
-          <w:highlight w:val="none"/>
-        </w:rPr>
-      </w:pPr>
-      <w:r>
-        <w:rPr>
-          <w:rFonts w:ascii="Times New Roman" w:hAnsi="Times New Roman" w:eastAsia="宋体"/>
-          <w:b w:val="0"/>
-          <w:i w:val="0"/>
-          <w:sz w:val="21"/>
-          <w:szCs w:val="21"/>
-          <w:highlight w:val="none"/>
-        </w:rPr>
-        <w:t>针对铁路客流预测，现有研究主要包括统计模型与传统机器学习模型，如历史平均法[3]、ARIMA[4]以及支持向量机[5]等。此类模型具备一定可解释性，但在面对铁路客流序列中普遍存在的短期突发波动、周期叠加及显著非平稳特征时，表现出建模能力有限、预测精度不足等问题。为解决长短期依赖难以建模的问题，LSTM、GRU 等循环网络[6-7]改善了长短期依赖建模；融合图神经网络的时空预测模型（如DCRNN [8]、Graph-WaveNet [9]、ASTGCN [10]等）通过显式编码轨道交通网络的空间拓扑结构，有效增强了对站点间空间关联性的刻画，但依赖显式邻接结构。本文聚焦铁路客流时间维度上的多尺度机制解耦</w:t>
-      </w:r>
-      <w:r>
-        <w:rPr>
-          <w:rFonts w:hint="default" w:ascii="Times New Roman" w:hAnsi="Times New Roman" w:eastAsia="宋体"/>
-          <w:b w:val="0"/>
-          <w:i w:val="0"/>
-          <w:sz w:val="21"/>
-          <w:szCs w:val="21"/>
-          <w:highlight w:val="none"/>
-        </w:rPr>
-        <w:t>，通过枢纽多站联合预测隐式刻画站间关联，显式图建模留作后续工作。</w:t>
-      </w:r>
-    </w:p>
-    <w:p>
-      <w:pPr>
-        <w:overflowPunct w:val="0"/>
-        <w:autoSpaceDE w:val="0"/>
-        <w:spacing w:line="360" w:lineRule="auto"/>
-        <w:ind w:firstLine="420"/>
-        <w:rPr>
-          <w:rFonts w:hint="default"/>
-          <w:szCs w:val="21"/>
-          <w:highlight w:val="none"/>
-        </w:rPr>
-      </w:pPr>
-      <w:r>
-        <w:rPr>
-          <w:rFonts w:hint="default" w:ascii="Times New Roman" w:hAnsi="Times New Roman" w:eastAsia="宋体"/>
-          <w:b w:val="0"/>
-          <w:i w:val="0"/>
-          <w:sz w:val="21"/>
-          <w:szCs w:val="21"/>
-          <w:highlight w:val="none"/>
-        </w:rPr>
-        <w:t>尽管如此，单一深度网络仍难以在统一参数空间内兼顾日内高频波动与中长期周期演化，铁路客流在非平稳、多模式叠加下更易出现多尺度优化冲突。从生成机制看，日粒度序列可近似表示为</w:t>
-      </w:r>
-      <m:oMath>
-        <m:sSub>
-          <m:sSubPr>
-            <m:ctrlPr>
-              <w:rPr>
-                <w:rFonts w:hint="default" w:ascii="Cambria Math" w:hAnsi="Cambria Math" w:eastAsia="楷体_GB2312" w:cs="Times New Roman"/>
-                <w:i/>
-                <w:iCs/>
-                <w:kern w:val="2"/>
-                <w:sz w:val="24"/>
-                <w:szCs w:val="20"/>
-                <w:highlight w:val="none"/>
-                <w:vertAlign w:val="subscript"/>
-                <w:lang w:val="en-US" w:bidi="ar-SA"/>
-              </w:rPr>
-            </m:ctrlPr>
-          </m:sSubPr>
-          <m:e>
-            <m:r>
-              <m:rPr/>
-              <w:rPr>
-                <w:rFonts w:hint="default" w:ascii="Cambria Math" w:hAnsi="Cambria Math" w:eastAsia="楷体_GB2312" w:cs="Times New Roman"/>
-                <w:kern w:val="2"/>
-                <w:sz w:val="24"/>
-                <w:szCs w:val="20"/>
-                <w:highlight w:val="none"/>
-                <w:vertAlign w:val="subscript"/>
-                <w:lang w:val="en-US" w:eastAsia="zh-CN" w:bidi="ar-SA"/>
-              </w:rPr>
-              <m:t>X</m:t>
-            </m:r>
-            <m:ctrlPr>
-              <w:rPr>
-                <w:rFonts w:hint="default" w:ascii="Cambria Math" w:hAnsi="Cambria Math" w:eastAsia="楷体_GB2312" w:cs="Times New Roman"/>
-                <w:i/>
-                <w:iCs/>
-                <w:kern w:val="2"/>
-                <w:sz w:val="24"/>
-                <w:szCs w:val="20"/>
-                <w:highlight w:val="none"/>
-                <w:vertAlign w:val="subscript"/>
-                <w:lang w:val="en-US" w:bidi="ar-SA"/>
-              </w:rPr>
-            </m:ctrlPr>
-          </m:e>
-          <m:sub>
-            <m:r>
-              <m:rPr/>
-              <w:rPr>
-                <w:rFonts w:hint="default" w:ascii="Cambria Math" w:hAnsi="Cambria Math" w:eastAsia="楷体_GB2312" w:cs="Times New Roman"/>
-                <w:kern w:val="2"/>
-                <w:sz w:val="24"/>
-                <w:szCs w:val="20"/>
-                <w:highlight w:val="none"/>
-                <w:vertAlign w:val="subscript"/>
-                <w:lang w:val="en-US" w:eastAsia="zh-CN" w:bidi="ar-SA"/>
-              </w:rPr>
-              <m:t>t</m:t>
-            </m:r>
-            <m:ctrlPr>
-              <w:rPr>
-                <w:rFonts w:hint="default" w:ascii="Cambria Math" w:hAnsi="Cambria Math" w:eastAsia="楷体_GB2312" w:cs="Times New Roman"/>
-                <w:i/>
-                <w:iCs/>
-                <w:kern w:val="2"/>
-                <w:sz w:val="24"/>
-                <w:szCs w:val="20"/>
-                <w:highlight w:val="none"/>
-                <w:vertAlign w:val="subscript"/>
-                <w:lang w:val="en-US" w:bidi="ar-SA"/>
-              </w:rPr>
-            </m:ctrlPr>
-          </m:sub>
-        </m:sSub>
-        <m:r>
-          <m:rPr/>
-          <w:rPr>
-            <w:rFonts w:hint="default" w:ascii="Cambria Math" w:hAnsi="Cambria Math" w:eastAsia="楷体_GB2312" w:cs="Times New Roman"/>
-            <w:kern w:val="2"/>
-            <w:sz w:val="24"/>
-            <w:szCs w:val="20"/>
-            <w:highlight w:val="none"/>
-            <w:lang w:val="en-US" w:bidi="ar-SA"/>
-          </w:rPr>
-          <m:t>=</m:t>
-        </m:r>
-        <m:sSub>
-          <m:sSubPr>
-            <m:ctrlPr>
-              <w:rPr>
-                <w:rFonts w:hint="default" w:ascii="Cambria Math" w:hAnsi="Cambria Math" w:eastAsia="楷体_GB2312" w:cs="Times New Roman"/>
-                <w:i/>
-                <w:iCs/>
-                <w:kern w:val="2"/>
-                <w:sz w:val="24"/>
-                <w:szCs w:val="20"/>
-                <w:highlight w:val="none"/>
-                <w:vertAlign w:val="subscript"/>
-                <w:lang w:val="en-US" w:bidi="ar-SA"/>
-              </w:rPr>
-            </m:ctrlPr>
-          </m:sSubPr>
-          <m:e>
-            <m:r>
-              <m:rPr/>
-              <w:rPr>
-                <w:rFonts w:hint="default" w:ascii="Cambria Math" w:hAnsi="Cambria Math" w:eastAsia="楷体_GB2312" w:cs="Times New Roman"/>
-                <w:kern w:val="2"/>
-                <w:sz w:val="24"/>
-                <w:szCs w:val="20"/>
-                <w:highlight w:val="none"/>
-                <w:vertAlign w:val="subscript"/>
-                <w:lang w:val="en-US" w:eastAsia="zh-CN" w:bidi="ar-SA"/>
-              </w:rPr>
-              <m:t>T</m:t>
-            </m:r>
-            <m:ctrlPr>
-              <w:rPr>
-                <w:rFonts w:hint="default" w:ascii="Cambria Math" w:hAnsi="Cambria Math" w:eastAsia="楷体_GB2312" w:cs="Times New Roman"/>
-                <w:i/>
-                <w:iCs/>
-                <w:kern w:val="2"/>
-                <w:sz w:val="24"/>
-                <w:szCs w:val="20"/>
-                <w:highlight w:val="none"/>
-                <w:vertAlign w:val="subscript"/>
-                <w:lang w:val="en-US" w:bidi="ar-SA"/>
-              </w:rPr>
-            </m:ctrlPr>
-          </m:e>
-          <m:sub>
-            <m:r>
-              <m:rPr/>
-              <w:rPr>
-                <w:rFonts w:hint="default" w:ascii="Cambria Math" w:hAnsi="Cambria Math" w:eastAsia="楷体_GB2312" w:cs="Times New Roman"/>
-                <w:kern w:val="2"/>
-                <w:sz w:val="24"/>
-                <w:szCs w:val="20"/>
-                <w:highlight w:val="none"/>
-                <w:vertAlign w:val="subscript"/>
-                <w:lang w:val="en-US" w:eastAsia="zh-CN" w:bidi="ar-SA"/>
-              </w:rPr>
-              <m:t>t</m:t>
-            </m:r>
-            <m:ctrlPr>
-              <w:rPr>
-                <w:rFonts w:hint="default" w:ascii="Cambria Math" w:hAnsi="Cambria Math" w:eastAsia="楷体_GB2312" w:cs="Times New Roman"/>
-                <w:i/>
-                <w:iCs/>
-                <w:kern w:val="2"/>
-                <w:sz w:val="24"/>
-                <w:szCs w:val="20"/>
-                <w:highlight w:val="none"/>
-                <w:vertAlign w:val="subscript"/>
-                <w:lang w:val="en-US" w:bidi="ar-SA"/>
-              </w:rPr>
-            </m:ctrlPr>
-          </m:sub>
-        </m:sSub>
-        <m:r>
-          <m:rPr/>
-          <w:rPr>
-            <w:rFonts w:hint="default" w:ascii="Cambria Math" w:hAnsi="Cambria Math" w:eastAsia="楷体_GB2312" w:cs="Times New Roman"/>
-            <w:kern w:val="2"/>
-            <w:sz w:val="24"/>
-            <w:szCs w:val="20"/>
-            <w:highlight w:val="none"/>
-            <w:lang w:val="en-US" w:bidi="ar-SA"/>
-          </w:rPr>
-          <m:t>+</m:t>
-        </m:r>
-        <m:sSub>
-          <m:sSubPr>
-            <m:ctrlPr>
-              <w:rPr>
-                <w:rFonts w:hint="default" w:ascii="Cambria Math" w:hAnsi="Cambria Math" w:eastAsia="楷体_GB2312" w:cs="Times New Roman"/>
-                <w:i/>
-                <w:iCs/>
-                <w:kern w:val="2"/>
-                <w:sz w:val="24"/>
-                <w:szCs w:val="20"/>
-                <w:highlight w:val="none"/>
-                <w:vertAlign w:val="subscript"/>
-                <w:lang w:val="en-US" w:bidi="ar-SA"/>
-              </w:rPr>
-            </m:ctrlPr>
-          </m:sSubPr>
-          <m:e>
-            <m:r>
-              <m:rPr/>
-              <w:rPr>
-                <w:rFonts w:hint="default" w:ascii="Cambria Math" w:hAnsi="Cambria Math" w:eastAsia="楷体_GB2312" w:cs="Times New Roman"/>
-                <w:kern w:val="2"/>
-                <w:sz w:val="24"/>
-                <w:szCs w:val="20"/>
-                <w:highlight w:val="none"/>
-                <w:vertAlign w:val="subscript"/>
-                <w:lang w:val="en-US" w:eastAsia="zh-CN" w:bidi="ar-SA"/>
-              </w:rPr>
-              <m:t>S</m:t>
-            </m:r>
-            <m:ctrlPr>
-              <w:rPr>
-                <w:rFonts w:hint="default" w:ascii="Cambria Math" w:hAnsi="Cambria Math" w:eastAsia="楷体_GB2312" w:cs="Times New Roman"/>
-                <w:i/>
-                <w:iCs/>
-                <w:kern w:val="2"/>
-                <w:sz w:val="24"/>
-                <w:szCs w:val="20"/>
-                <w:highlight w:val="none"/>
-                <w:vertAlign w:val="subscript"/>
-                <w:lang w:val="en-US" w:bidi="ar-SA"/>
-              </w:rPr>
-            </m:ctrlPr>
-          </m:e>
-          <m:sub>
-            <m:r>
-              <m:rPr/>
-              <w:rPr>
-                <w:rFonts w:hint="default" w:ascii="Cambria Math" w:hAnsi="Cambria Math" w:eastAsia="楷体_GB2312" w:cs="Times New Roman"/>
-                <w:kern w:val="2"/>
-                <w:sz w:val="24"/>
-                <w:szCs w:val="20"/>
-                <w:highlight w:val="none"/>
-                <w:vertAlign w:val="subscript"/>
-                <w:lang w:val="en-US" w:eastAsia="zh-CN" w:bidi="ar-SA"/>
-              </w:rPr>
-              <m:t>t</m:t>
-            </m:r>
-            <m:ctrlPr>
-              <w:rPr>
-                <w:rFonts w:hint="default" w:ascii="Cambria Math" w:hAnsi="Cambria Math" w:eastAsia="楷体_GB2312" w:cs="Times New Roman"/>
-                <w:i/>
-                <w:iCs/>
-                <w:kern w:val="2"/>
-                <w:sz w:val="24"/>
-                <w:szCs w:val="20"/>
-                <w:highlight w:val="none"/>
-                <w:vertAlign w:val="subscript"/>
-                <w:lang w:val="en-US" w:bidi="ar-SA"/>
-              </w:rPr>
-            </m:ctrlPr>
-          </m:sub>
-        </m:sSub>
-        <m:r>
-          <m:rPr/>
-          <w:rPr>
-            <w:rFonts w:hint="default" w:ascii="Cambria Math" w:hAnsi="Cambria Math" w:eastAsia="楷体_GB2312" w:cs="Times New Roman"/>
-            <w:kern w:val="2"/>
-            <w:sz w:val="24"/>
-            <w:szCs w:val="20"/>
-            <w:highlight w:val="none"/>
-            <w:lang w:val="en-US" w:bidi="ar-SA"/>
-          </w:rPr>
-          <m:t>+</m:t>
-        </m:r>
-        <m:sSub>
-          <m:sSubPr>
-            <m:ctrlPr>
-              <w:rPr>
-                <w:rFonts w:hint="default" w:ascii="Cambria Math" w:hAnsi="Cambria Math" w:eastAsia="楷体_GB2312" w:cs="Times New Roman"/>
-                <w:i/>
-                <w:iCs/>
-                <w:kern w:val="2"/>
-                <w:sz w:val="24"/>
-                <w:szCs w:val="20"/>
-                <w:highlight w:val="none"/>
-                <w:vertAlign w:val="subscript"/>
-                <w:lang w:val="en-US" w:bidi="ar-SA"/>
-              </w:rPr>
-            </m:ctrlPr>
-          </m:sSubPr>
-          <m:e>
-            <m:r>
-              <m:rPr/>
-              <w:rPr>
-                <w:rFonts w:hint="default" w:ascii="Cambria Math" w:hAnsi="Cambria Math" w:eastAsia="楷体_GB2312" w:cs="Times New Roman"/>
-                <w:kern w:val="2"/>
-                <w:sz w:val="24"/>
-                <w:szCs w:val="20"/>
-                <w:highlight w:val="none"/>
-                <w:vertAlign w:val="subscript"/>
-                <w:lang w:val="en-US" w:eastAsia="zh-CN" w:bidi="ar-SA"/>
-              </w:rPr>
-              <m:t>R</m:t>
-            </m:r>
-            <m:ctrlPr>
-              <w:rPr>
-                <w:rFonts w:hint="default" w:ascii="Cambria Math" w:hAnsi="Cambria Math" w:eastAsia="楷体_GB2312" w:cs="Times New Roman"/>
-                <w:i/>
-                <w:iCs/>
-                <w:kern w:val="2"/>
-                <w:sz w:val="24"/>
-                <w:szCs w:val="20"/>
-                <w:highlight w:val="none"/>
-                <w:vertAlign w:val="subscript"/>
-                <w:lang w:val="en-US" w:bidi="ar-SA"/>
-              </w:rPr>
-            </m:ctrlPr>
-          </m:e>
-          <m:sub>
-            <m:r>
-              <m:rPr/>
-              <w:rPr>
-                <w:rFonts w:hint="default" w:ascii="Cambria Math" w:hAnsi="Cambria Math" w:eastAsia="楷体_GB2312" w:cs="Times New Roman"/>
-                <w:kern w:val="2"/>
-                <w:sz w:val="24"/>
-                <w:szCs w:val="20"/>
-                <w:highlight w:val="none"/>
-                <w:vertAlign w:val="subscript"/>
-                <w:lang w:val="en-US" w:eastAsia="zh-CN" w:bidi="ar-SA"/>
-              </w:rPr>
-              <m:t>t</m:t>
-            </m:r>
-            <m:ctrlPr>
-              <w:rPr>
-                <w:rFonts w:hint="default" w:ascii="Cambria Math" w:hAnsi="Cambria Math" w:eastAsia="楷体_GB2312" w:cs="Times New Roman"/>
-                <w:i/>
-                <w:iCs/>
-                <w:kern w:val="2"/>
-                <w:sz w:val="24"/>
-                <w:szCs w:val="20"/>
-                <w:highlight w:val="none"/>
-                <w:vertAlign w:val="subscript"/>
-                <w:lang w:val="en-US" w:bidi="ar-SA"/>
-              </w:rPr>
-            </m:ctrlPr>
-          </m:sub>
-        </m:sSub>
-      </m:oMath>
-      <w:r>
-        <w:rPr>
           <w:rFonts w:hint="default" w:ascii="Times New Roman" w:hAnsi="Times New Roman" w:eastAsia="宋体"/>
           <w:b w:val="0"/>
           <w:i w:val="0"/>
@@ -2638,723 +1991,7 @@
         </w:rPr>
       </w:pPr>
       <w:r>
-        <w:rPr>
-          <w:rFonts w:hint="default" w:ascii="Times New Roman" w:hAnsi="Times New Roman" w:eastAsia="宋体"/>
-          <w:b w:val="0"/>
-          <w:i w:val="0"/>
-          <w:sz w:val="21"/>
-          <w:szCs w:val="21"/>
-          <w:highlight w:val="none"/>
-        </w:rPr>
-        <w:t>针对上述局限，本文提出分解引导的铁路客流混合专家预测框架</w:t>
-      </w:r>
-      <w:r>
-        <w:rPr>
-          <w:rFonts w:hint="eastAsia" w:ascii="Times New Roman" w:hAnsi="Times New Roman" w:eastAsia="宋体"/>
-          <w:b w:val="0"/>
-          <w:i w:val="0"/>
-          <w:sz w:val="21"/>
-          <w:szCs w:val="21"/>
-          <w:highlight w:val="none"/>
-          <w:lang w:eastAsia="zh-CN"/>
-        </w:rPr>
-        <w:t>MoE-Rail</w:t>
-      </w:r>
-      <w:r>
-        <w:rPr>
-          <w:rFonts w:hint="default" w:ascii="Times New Roman" w:hAnsi="Times New Roman" w:eastAsia="宋体"/>
-          <w:b w:val="0"/>
-          <w:i w:val="0"/>
-          <w:sz w:val="21"/>
-          <w:szCs w:val="21"/>
-          <w:highlight w:val="none"/>
-        </w:rPr>
-        <w:t>，将时序分解</w:t>
-      </w:r>
-      <m:oMath>
-        <m:sSub>
-          <m:sSubPr>
-            <m:ctrlPr>
-              <w:rPr>
-                <w:rFonts w:hint="default" w:ascii="Cambria Math" w:hAnsi="Cambria Math" w:eastAsia="楷体_GB2312" w:cs="Times New Roman"/>
-                <w:i/>
-                <w:iCs/>
-                <w:kern w:val="2"/>
-                <w:sz w:val="24"/>
-                <w:szCs w:val="20"/>
-                <w:highlight w:val="none"/>
-                <w:vertAlign w:val="subscript"/>
-                <w:lang w:val="en-US" w:bidi="ar-SA"/>
-              </w:rPr>
-            </m:ctrlPr>
-          </m:sSubPr>
-          <m:e>
-            <m:r>
-              <m:rPr/>
-              <w:rPr>
-                <w:rFonts w:hint="default" w:ascii="Cambria Math" w:hAnsi="Cambria Math" w:eastAsia="楷体_GB2312" w:cs="Times New Roman"/>
-                <w:kern w:val="2"/>
-                <w:sz w:val="24"/>
-                <w:szCs w:val="20"/>
-                <w:highlight w:val="none"/>
-                <w:vertAlign w:val="subscript"/>
-                <w:lang w:val="en-US" w:eastAsia="zh-CN" w:bidi="ar-SA"/>
-              </w:rPr>
-              <m:t>X</m:t>
-            </m:r>
-            <m:ctrlPr>
-              <w:rPr>
-                <w:rFonts w:hint="default" w:ascii="Cambria Math" w:hAnsi="Cambria Math" w:eastAsia="楷体_GB2312" w:cs="Times New Roman"/>
-                <w:i/>
-                <w:iCs/>
-                <w:kern w:val="2"/>
-                <w:sz w:val="24"/>
-                <w:szCs w:val="20"/>
-                <w:highlight w:val="none"/>
-                <w:vertAlign w:val="subscript"/>
-                <w:lang w:val="en-US" w:bidi="ar-SA"/>
-              </w:rPr>
-            </m:ctrlPr>
-          </m:e>
-          <m:sub>
-            <m:r>
-              <m:rPr/>
-              <w:rPr>
-                <w:rFonts w:hint="default" w:ascii="Cambria Math" w:hAnsi="Cambria Math" w:eastAsia="楷体_GB2312" w:cs="Times New Roman"/>
-                <w:kern w:val="2"/>
-                <w:sz w:val="24"/>
-                <w:szCs w:val="20"/>
-                <w:highlight w:val="none"/>
-                <w:vertAlign w:val="subscript"/>
-                <w:lang w:val="en-US" w:eastAsia="zh-CN" w:bidi="ar-SA"/>
-              </w:rPr>
-              <m:t>t</m:t>
-            </m:r>
-            <m:ctrlPr>
-              <w:rPr>
-                <w:rFonts w:hint="default" w:ascii="Cambria Math" w:hAnsi="Cambria Math" w:eastAsia="楷体_GB2312" w:cs="Times New Roman"/>
-                <w:i/>
-                <w:iCs/>
-                <w:kern w:val="2"/>
-                <w:sz w:val="24"/>
-                <w:szCs w:val="20"/>
-                <w:highlight w:val="none"/>
-                <w:vertAlign w:val="subscript"/>
-                <w:lang w:val="en-US" w:bidi="ar-SA"/>
-              </w:rPr>
-            </m:ctrlPr>
-          </m:sub>
-        </m:sSub>
-        <m:r>
-          <m:rPr/>
-          <w:rPr>
-            <w:rFonts w:hint="default" w:ascii="Cambria Math" w:hAnsi="Cambria Math" w:eastAsia="楷体_GB2312" w:cs="Times New Roman"/>
-            <w:kern w:val="2"/>
-            <w:sz w:val="24"/>
-            <w:szCs w:val="20"/>
-            <w:highlight w:val="none"/>
-            <w:lang w:val="en-US" w:bidi="ar-SA"/>
-          </w:rPr>
-          <m:t>=</m:t>
-        </m:r>
-        <m:sSub>
-          <m:sSubPr>
-            <m:ctrlPr>
-              <w:rPr>
-                <w:rFonts w:hint="default" w:ascii="Cambria Math" w:hAnsi="Cambria Math" w:eastAsia="楷体_GB2312" w:cs="Times New Roman"/>
-                <w:i/>
-                <w:iCs/>
-                <w:kern w:val="2"/>
-                <w:sz w:val="24"/>
-                <w:szCs w:val="20"/>
-                <w:highlight w:val="none"/>
-                <w:vertAlign w:val="subscript"/>
-                <w:lang w:val="en-US" w:bidi="ar-SA"/>
-              </w:rPr>
-            </m:ctrlPr>
-          </m:sSubPr>
-          <m:e>
-            <m:r>
-              <m:rPr/>
-              <w:rPr>
-                <w:rFonts w:hint="default" w:ascii="Cambria Math" w:hAnsi="Cambria Math" w:eastAsia="楷体_GB2312" w:cs="Times New Roman"/>
-                <w:kern w:val="2"/>
-                <w:sz w:val="24"/>
-                <w:szCs w:val="20"/>
-                <w:highlight w:val="none"/>
-                <w:vertAlign w:val="subscript"/>
-                <w:lang w:val="en-US" w:eastAsia="zh-CN" w:bidi="ar-SA"/>
-              </w:rPr>
-              <m:t>T</m:t>
-            </m:r>
-            <m:ctrlPr>
-              <w:rPr>
-                <w:rFonts w:hint="default" w:ascii="Cambria Math" w:hAnsi="Cambria Math" w:eastAsia="楷体_GB2312" w:cs="Times New Roman"/>
-                <w:i/>
-                <w:iCs/>
-                <w:kern w:val="2"/>
-                <w:sz w:val="24"/>
-                <w:szCs w:val="20"/>
-                <w:highlight w:val="none"/>
-                <w:vertAlign w:val="subscript"/>
-                <w:lang w:val="en-US" w:bidi="ar-SA"/>
-              </w:rPr>
-            </m:ctrlPr>
-          </m:e>
-          <m:sub>
-            <m:r>
-              <m:rPr/>
-              <w:rPr>
-                <w:rFonts w:hint="default" w:ascii="Cambria Math" w:hAnsi="Cambria Math" w:eastAsia="楷体_GB2312" w:cs="Times New Roman"/>
-                <w:kern w:val="2"/>
-                <w:sz w:val="24"/>
-                <w:szCs w:val="20"/>
-                <w:highlight w:val="none"/>
-                <w:vertAlign w:val="subscript"/>
-                <w:lang w:val="en-US" w:eastAsia="zh-CN" w:bidi="ar-SA"/>
-              </w:rPr>
-              <m:t>t</m:t>
-            </m:r>
-            <m:ctrlPr>
-              <w:rPr>
-                <w:rFonts w:hint="default" w:ascii="Cambria Math" w:hAnsi="Cambria Math" w:eastAsia="楷体_GB2312" w:cs="Times New Roman"/>
-                <w:i/>
-                <w:iCs/>
-                <w:kern w:val="2"/>
-                <w:sz w:val="24"/>
-                <w:szCs w:val="20"/>
-                <w:highlight w:val="none"/>
-                <w:vertAlign w:val="subscript"/>
-                <w:lang w:val="en-US" w:bidi="ar-SA"/>
-              </w:rPr>
-            </m:ctrlPr>
-          </m:sub>
-        </m:sSub>
-        <m:r>
-          <m:rPr/>
-          <w:rPr>
-            <w:rFonts w:hint="default" w:ascii="Cambria Math" w:hAnsi="Cambria Math" w:eastAsia="楷体_GB2312" w:cs="Times New Roman"/>
-            <w:kern w:val="2"/>
-            <w:sz w:val="24"/>
-            <w:szCs w:val="20"/>
-            <w:highlight w:val="none"/>
-            <w:lang w:val="en-US" w:bidi="ar-SA"/>
-          </w:rPr>
-          <m:t>+</m:t>
-        </m:r>
-        <m:sSub>
-          <m:sSubPr>
-            <m:ctrlPr>
-              <w:rPr>
-                <w:rFonts w:hint="default" w:ascii="Cambria Math" w:hAnsi="Cambria Math" w:eastAsia="楷体_GB2312" w:cs="Times New Roman"/>
-                <w:i/>
-                <w:iCs/>
-                <w:kern w:val="2"/>
-                <w:sz w:val="24"/>
-                <w:szCs w:val="20"/>
-                <w:highlight w:val="none"/>
-                <w:vertAlign w:val="subscript"/>
-                <w:lang w:val="en-US" w:bidi="ar-SA"/>
-              </w:rPr>
-            </m:ctrlPr>
-          </m:sSubPr>
-          <m:e>
-            <m:r>
-              <m:rPr/>
-              <w:rPr>
-                <w:rFonts w:hint="default" w:ascii="Cambria Math" w:hAnsi="Cambria Math" w:eastAsia="楷体_GB2312" w:cs="Times New Roman"/>
-                <w:kern w:val="2"/>
-                <w:sz w:val="24"/>
-                <w:szCs w:val="20"/>
-                <w:highlight w:val="none"/>
-                <w:vertAlign w:val="subscript"/>
-                <w:lang w:val="en-US" w:eastAsia="zh-CN" w:bidi="ar-SA"/>
-              </w:rPr>
-              <m:t>S</m:t>
-            </m:r>
-            <m:ctrlPr>
-              <w:rPr>
-                <w:rFonts w:hint="default" w:ascii="Cambria Math" w:hAnsi="Cambria Math" w:eastAsia="楷体_GB2312" w:cs="Times New Roman"/>
-                <w:i/>
-                <w:iCs/>
-                <w:kern w:val="2"/>
-                <w:sz w:val="24"/>
-                <w:szCs w:val="20"/>
-                <w:highlight w:val="none"/>
-                <w:vertAlign w:val="subscript"/>
-                <w:lang w:val="en-US" w:bidi="ar-SA"/>
-              </w:rPr>
-            </m:ctrlPr>
-          </m:e>
-          <m:sub>
-            <m:r>
-              <m:rPr/>
-              <w:rPr>
-                <w:rFonts w:hint="default" w:ascii="Cambria Math" w:hAnsi="Cambria Math" w:eastAsia="楷体_GB2312" w:cs="Times New Roman"/>
-                <w:kern w:val="2"/>
-                <w:sz w:val="24"/>
-                <w:szCs w:val="20"/>
-                <w:highlight w:val="none"/>
-                <w:vertAlign w:val="subscript"/>
-                <w:lang w:val="en-US" w:eastAsia="zh-CN" w:bidi="ar-SA"/>
-              </w:rPr>
-              <m:t>t</m:t>
-            </m:r>
-            <m:ctrlPr>
-              <w:rPr>
-                <w:rFonts w:hint="default" w:ascii="Cambria Math" w:hAnsi="Cambria Math" w:eastAsia="楷体_GB2312" w:cs="Times New Roman"/>
-                <w:i/>
-                <w:iCs/>
-                <w:kern w:val="2"/>
-                <w:sz w:val="24"/>
-                <w:szCs w:val="20"/>
-                <w:highlight w:val="none"/>
-                <w:vertAlign w:val="subscript"/>
-                <w:lang w:val="en-US" w:bidi="ar-SA"/>
-              </w:rPr>
-            </m:ctrlPr>
-          </m:sub>
-        </m:sSub>
-        <m:r>
-          <m:rPr/>
-          <w:rPr>
-            <w:rFonts w:hint="default" w:ascii="Cambria Math" w:hAnsi="Cambria Math" w:eastAsia="楷体_GB2312" w:cs="Times New Roman"/>
-            <w:kern w:val="2"/>
-            <w:sz w:val="24"/>
-            <w:szCs w:val="20"/>
-            <w:highlight w:val="none"/>
-            <w:lang w:val="en-US" w:bidi="ar-SA"/>
-          </w:rPr>
-          <m:t>+</m:t>
-        </m:r>
-        <m:sSub>
-          <m:sSubPr>
-            <m:ctrlPr>
-              <w:rPr>
-                <w:rFonts w:hint="default" w:ascii="Cambria Math" w:hAnsi="Cambria Math" w:eastAsia="楷体_GB2312" w:cs="Times New Roman"/>
-                <w:i/>
-                <w:iCs/>
-                <w:kern w:val="2"/>
-                <w:sz w:val="24"/>
-                <w:szCs w:val="20"/>
-                <w:highlight w:val="none"/>
-                <w:vertAlign w:val="subscript"/>
-                <w:lang w:val="en-US" w:bidi="ar-SA"/>
-              </w:rPr>
-            </m:ctrlPr>
-          </m:sSubPr>
-          <m:e>
-            <m:r>
-              <m:rPr/>
-              <w:rPr>
-                <w:rFonts w:hint="default" w:ascii="Cambria Math" w:hAnsi="Cambria Math" w:eastAsia="楷体_GB2312" w:cs="Times New Roman"/>
-                <w:kern w:val="2"/>
-                <w:sz w:val="24"/>
-                <w:szCs w:val="20"/>
-                <w:highlight w:val="none"/>
-                <w:vertAlign w:val="subscript"/>
-                <w:lang w:val="en-US" w:eastAsia="zh-CN" w:bidi="ar-SA"/>
-              </w:rPr>
-              <m:t>R</m:t>
-            </m:r>
-            <m:ctrlPr>
-              <w:rPr>
-                <w:rFonts w:hint="default" w:ascii="Cambria Math" w:hAnsi="Cambria Math" w:eastAsia="楷体_GB2312" w:cs="Times New Roman"/>
-                <w:i/>
-                <w:iCs/>
-                <w:kern w:val="2"/>
-                <w:sz w:val="24"/>
-                <w:szCs w:val="20"/>
-                <w:highlight w:val="none"/>
-                <w:vertAlign w:val="subscript"/>
-                <w:lang w:val="en-US" w:bidi="ar-SA"/>
-              </w:rPr>
-            </m:ctrlPr>
-          </m:e>
-          <m:sub>
-            <m:r>
-              <m:rPr/>
-              <w:rPr>
-                <w:rFonts w:hint="default" w:ascii="Cambria Math" w:hAnsi="Cambria Math" w:eastAsia="楷体_GB2312" w:cs="Times New Roman"/>
-                <w:kern w:val="2"/>
-                <w:sz w:val="24"/>
-                <w:szCs w:val="20"/>
-                <w:highlight w:val="none"/>
-                <w:vertAlign w:val="subscript"/>
-                <w:lang w:val="en-US" w:eastAsia="zh-CN" w:bidi="ar-SA"/>
-              </w:rPr>
-              <m:t>t</m:t>
-            </m:r>
-            <m:ctrlPr>
-              <w:rPr>
-                <w:rFonts w:hint="default" w:ascii="Cambria Math" w:hAnsi="Cambria Math" w:eastAsia="楷体_GB2312" w:cs="Times New Roman"/>
-                <w:i/>
-                <w:iCs/>
-                <w:kern w:val="2"/>
-                <w:sz w:val="24"/>
-                <w:szCs w:val="20"/>
-                <w:highlight w:val="none"/>
-                <w:vertAlign w:val="subscript"/>
-                <w:lang w:val="en-US" w:bidi="ar-SA"/>
-              </w:rPr>
-            </m:ctrlPr>
-          </m:sub>
-        </m:sSub>
-      </m:oMath>
-      <w:r>
-        <w:rPr>
-          <w:rFonts w:hint="default" w:ascii="Times New Roman" w:hAnsi="Times New Roman" w:eastAsia="宋体"/>
-          <w:b w:val="0"/>
-          <w:i w:val="0"/>
-          <w:sz w:val="21"/>
-          <w:szCs w:val="21"/>
-          <w:highlight w:val="none"/>
-        </w:rPr>
-        <w:t>作为专家归纳偏置（非显式在线分解），并结合日历场景实现条件化专家融合。该方法围绕铁路客流多尺度演化机理，构建由短期依赖专家（GRU）、长期依赖专家（Transformer）与统计特征专家（分布统计 MLP）组成的异构专家体系：其中，短期依赖专家侧重刻画与</w:t>
-      </w:r>
-      <m:oMath>
-        <m:sSub>
-          <m:sSubPr>
-            <m:ctrlPr>
-              <w:rPr>
-                <w:rFonts w:hint="default" w:ascii="Cambria Math" w:hAnsi="Cambria Math" w:eastAsia="楷体_GB2312" w:cs="Times New Roman"/>
-                <w:i/>
-                <w:iCs/>
-                <w:kern w:val="2"/>
-                <w:sz w:val="24"/>
-                <w:szCs w:val="20"/>
-                <w:highlight w:val="none"/>
-                <w:vertAlign w:val="subscript"/>
-                <w:lang w:val="en-US" w:bidi="ar-SA"/>
-              </w:rPr>
-            </m:ctrlPr>
-          </m:sSubPr>
-          <m:e>
-            <m:r>
-              <m:rPr/>
-              <w:rPr>
-                <w:rFonts w:hint="default" w:ascii="Cambria Math" w:hAnsi="Cambria Math" w:eastAsia="楷体_GB2312" w:cs="Times New Roman"/>
-                <w:kern w:val="2"/>
-                <w:sz w:val="24"/>
-                <w:szCs w:val="20"/>
-                <w:highlight w:val="none"/>
-                <w:vertAlign w:val="subscript"/>
-                <w:lang w:val="en-US" w:eastAsia="zh-CN" w:bidi="ar-SA"/>
-              </w:rPr>
-              <m:t>S</m:t>
-            </m:r>
-            <m:ctrlPr>
-              <w:rPr>
-                <w:rFonts w:hint="default" w:ascii="Cambria Math" w:hAnsi="Cambria Math" w:eastAsia="楷体_GB2312" w:cs="Times New Roman"/>
-                <w:i/>
-                <w:iCs/>
-                <w:kern w:val="2"/>
-                <w:sz w:val="24"/>
-                <w:szCs w:val="20"/>
-                <w:highlight w:val="none"/>
-                <w:vertAlign w:val="subscript"/>
-                <w:lang w:val="en-US" w:bidi="ar-SA"/>
-              </w:rPr>
-            </m:ctrlPr>
-          </m:e>
-          <m:sub>
-            <m:r>
-              <m:rPr/>
-              <w:rPr>
-                <w:rFonts w:hint="default" w:ascii="Cambria Math" w:hAnsi="Cambria Math" w:eastAsia="楷体_GB2312" w:cs="Times New Roman"/>
-                <w:kern w:val="2"/>
-                <w:sz w:val="24"/>
-                <w:szCs w:val="20"/>
-                <w:highlight w:val="none"/>
-                <w:vertAlign w:val="subscript"/>
-                <w:lang w:val="en-US" w:eastAsia="zh-CN" w:bidi="ar-SA"/>
-              </w:rPr>
-              <m:t>t</m:t>
-            </m:r>
-            <m:ctrlPr>
-              <w:rPr>
-                <w:rFonts w:hint="default" w:ascii="Cambria Math" w:hAnsi="Cambria Math" w:eastAsia="楷体_GB2312" w:cs="Times New Roman"/>
-                <w:i/>
-                <w:iCs/>
-                <w:kern w:val="2"/>
-                <w:sz w:val="24"/>
-                <w:szCs w:val="20"/>
-                <w:highlight w:val="none"/>
-                <w:vertAlign w:val="subscript"/>
-                <w:lang w:val="en-US" w:bidi="ar-SA"/>
-              </w:rPr>
-            </m:ctrlPr>
-          </m:sub>
-        </m:sSub>
-      </m:oMath>
-      <w:r>
-        <w:rPr>
-          <w:rFonts w:hint="default" w:ascii="Times New Roman" w:hAnsi="Times New Roman" w:eastAsia="宋体"/>
-          <w:b w:val="0"/>
-          <w:i w:val="0"/>
-          <w:sz w:val="21"/>
-          <w:szCs w:val="21"/>
-          <w:highlight w:val="none"/>
-        </w:rPr>
-        <w:t>相关的局部高频波动与邻近时刻相关性；长期依赖专家侧重刻画与</w:t>
-      </w:r>
-      <m:oMath>
-        <m:sSub>
-          <m:sSubPr>
-            <m:ctrlPr>
-              <w:rPr>
-                <w:rFonts w:hint="default" w:ascii="Cambria Math" w:hAnsi="Cambria Math" w:eastAsia="楷体_GB2312" w:cs="Times New Roman"/>
-                <w:i/>
-                <w:iCs/>
-                <w:kern w:val="2"/>
-                <w:sz w:val="24"/>
-                <w:szCs w:val="20"/>
-                <w:highlight w:val="none"/>
-                <w:vertAlign w:val="subscript"/>
-                <w:lang w:val="en-US" w:bidi="ar-SA"/>
-              </w:rPr>
-            </m:ctrlPr>
-          </m:sSubPr>
-          <m:e>
-            <m:r>
-              <m:rPr/>
-              <w:rPr>
-                <w:rFonts w:hint="default" w:ascii="Cambria Math" w:hAnsi="Cambria Math" w:eastAsia="楷体_GB2312" w:cs="Times New Roman"/>
-                <w:kern w:val="2"/>
-                <w:sz w:val="24"/>
-                <w:szCs w:val="20"/>
-                <w:highlight w:val="none"/>
-                <w:vertAlign w:val="subscript"/>
-                <w:lang w:val="en-US" w:eastAsia="zh-CN" w:bidi="ar-SA"/>
-              </w:rPr>
-              <m:t>T</m:t>
-            </m:r>
-            <m:ctrlPr>
-              <w:rPr>
-                <w:rFonts w:hint="default" w:ascii="Cambria Math" w:hAnsi="Cambria Math" w:eastAsia="楷体_GB2312" w:cs="Times New Roman"/>
-                <w:i/>
-                <w:iCs/>
-                <w:kern w:val="2"/>
-                <w:sz w:val="24"/>
-                <w:szCs w:val="20"/>
-                <w:highlight w:val="none"/>
-                <w:vertAlign w:val="subscript"/>
-                <w:lang w:val="en-US" w:bidi="ar-SA"/>
-              </w:rPr>
-            </m:ctrlPr>
-          </m:e>
-          <m:sub>
-            <m:r>
-              <m:rPr/>
-              <w:rPr>
-                <w:rFonts w:hint="default" w:ascii="Cambria Math" w:hAnsi="Cambria Math" w:eastAsia="楷体_GB2312" w:cs="Times New Roman"/>
-                <w:kern w:val="2"/>
-                <w:sz w:val="24"/>
-                <w:szCs w:val="20"/>
-                <w:highlight w:val="none"/>
-                <w:vertAlign w:val="subscript"/>
-                <w:lang w:val="en-US" w:eastAsia="zh-CN" w:bidi="ar-SA"/>
-              </w:rPr>
-              <m:t>t</m:t>
-            </m:r>
-            <m:ctrlPr>
-              <w:rPr>
-                <w:rFonts w:hint="default" w:ascii="Cambria Math" w:hAnsi="Cambria Math" w:eastAsia="楷体_GB2312" w:cs="Times New Roman"/>
-                <w:i/>
-                <w:iCs/>
-                <w:kern w:val="2"/>
-                <w:sz w:val="24"/>
-                <w:szCs w:val="20"/>
-                <w:highlight w:val="none"/>
-                <w:vertAlign w:val="subscript"/>
-                <w:lang w:val="en-US" w:bidi="ar-SA"/>
-              </w:rPr>
-            </m:ctrlPr>
-          </m:sub>
-        </m:sSub>
-      </m:oMath>
-      <w:r>
-        <w:rPr>
-          <w:rFonts w:hint="default" w:ascii="Times New Roman" w:hAnsi="Times New Roman" w:eastAsia="宋体"/>
-          <w:b w:val="0"/>
-          <w:i w:val="0"/>
-          <w:sz w:val="21"/>
-          <w:szCs w:val="21"/>
-          <w:highlight w:val="none"/>
-        </w:rPr>
-        <w:t>相关的长期趋势与周期节律；统计特征专家侧重刻画与</w:t>
-      </w:r>
-      <m:oMath>
-        <m:sSub>
-          <m:sSubPr>
-            <m:ctrlPr>
-              <w:rPr>
-                <w:rFonts w:hint="default" w:ascii="Cambria Math" w:hAnsi="Cambria Math" w:eastAsia="楷体_GB2312" w:cs="Times New Roman"/>
-                <w:i/>
-                <w:iCs/>
-                <w:kern w:val="2"/>
-                <w:sz w:val="24"/>
-                <w:szCs w:val="20"/>
-                <w:highlight w:val="none"/>
-                <w:vertAlign w:val="subscript"/>
-                <w:lang w:val="en-US" w:bidi="ar-SA"/>
-              </w:rPr>
-            </m:ctrlPr>
-          </m:sSubPr>
-          <m:e>
-            <m:r>
-              <m:rPr/>
-              <w:rPr>
-                <w:rFonts w:hint="default" w:ascii="Cambria Math" w:hAnsi="Cambria Math" w:eastAsia="楷体_GB2312" w:cs="Times New Roman"/>
-                <w:kern w:val="2"/>
-                <w:sz w:val="24"/>
-                <w:szCs w:val="20"/>
-                <w:highlight w:val="none"/>
-                <w:vertAlign w:val="subscript"/>
-                <w:lang w:val="en-US" w:eastAsia="zh-CN" w:bidi="ar-SA"/>
-              </w:rPr>
-              <m:t>R</m:t>
-            </m:r>
-            <m:ctrlPr>
-              <w:rPr>
-                <w:rFonts w:hint="default" w:ascii="Cambria Math" w:hAnsi="Cambria Math" w:eastAsia="楷体_GB2312" w:cs="Times New Roman"/>
-                <w:i/>
-                <w:iCs/>
-                <w:kern w:val="2"/>
-                <w:sz w:val="24"/>
-                <w:szCs w:val="20"/>
-                <w:highlight w:val="none"/>
-                <w:vertAlign w:val="subscript"/>
-                <w:lang w:val="en-US" w:bidi="ar-SA"/>
-              </w:rPr>
-            </m:ctrlPr>
-          </m:e>
-          <m:sub>
-            <m:r>
-              <m:rPr/>
-              <w:rPr>
-                <w:rFonts w:hint="default" w:ascii="Cambria Math" w:hAnsi="Cambria Math" w:eastAsia="楷体_GB2312" w:cs="Times New Roman"/>
-                <w:kern w:val="2"/>
-                <w:sz w:val="24"/>
-                <w:szCs w:val="20"/>
-                <w:highlight w:val="none"/>
-                <w:vertAlign w:val="subscript"/>
-                <w:lang w:val="en-US" w:eastAsia="zh-CN" w:bidi="ar-SA"/>
-              </w:rPr>
-              <m:t>t</m:t>
-            </m:r>
-            <m:ctrlPr>
-              <w:rPr>
-                <w:rFonts w:hint="default" w:ascii="Cambria Math" w:hAnsi="Cambria Math" w:eastAsia="楷体_GB2312" w:cs="Times New Roman"/>
-                <w:i/>
-                <w:iCs/>
-                <w:kern w:val="2"/>
-                <w:sz w:val="24"/>
-                <w:szCs w:val="20"/>
-                <w:highlight w:val="none"/>
-                <w:vertAlign w:val="subscript"/>
-                <w:lang w:val="en-US" w:bidi="ar-SA"/>
-              </w:rPr>
-            </m:ctrlPr>
-          </m:sub>
-        </m:sSub>
-      </m:oMath>
-      <w:r>
-        <w:rPr>
-          <w:rFonts w:hint="default" w:ascii="Times New Roman" w:hAnsi="Times New Roman" w:eastAsia="宋体"/>
-          <w:b w:val="0"/>
-          <w:i w:val="0"/>
-          <w:sz w:val="21"/>
-          <w:szCs w:val="21"/>
-          <w:highlight w:val="none"/>
-        </w:rPr>
-        <w:t>相关的分布形态及节假日等扰动特征。在此基础上，设计场景感知门控网络，将历史窗口表示与日历场景嵌入</w:t>
-      </w:r>
-      <m:oMath>
-        <m:sSub>
-          <m:sSubPr>
-            <m:ctrlPr>
-              <w:rPr>
-                <w:rFonts w:ascii="Cambria Math" w:hAnsi="Cambria Math" w:cs="Times New Roman"/>
-                <w:i/>
-                <w:iCs/>
-                <w:kern w:val="2"/>
-                <w:sz w:val="24"/>
-                <w:szCs w:val="20"/>
-                <w:highlight w:val="none"/>
-                <w:vertAlign w:val="subscript"/>
-                <w:lang w:val="en-US" w:bidi="ar-SA"/>
-              </w:rPr>
-            </m:ctrlPr>
-          </m:sSubPr>
-          <m:e>
-            <m:r>
-              <m:rPr/>
-              <w:rPr>
-                <w:rFonts w:hint="default" w:ascii="Cambria Math" w:hAnsi="Cambria Math" w:cs="Times New Roman"/>
-                <w:kern w:val="2"/>
-                <w:sz w:val="24"/>
-                <w:szCs w:val="20"/>
-                <w:highlight w:val="none"/>
-                <w:vertAlign w:val="subscript"/>
-                <w:lang w:val="en-US" w:eastAsia="zh-CN" w:bidi="ar-SA"/>
-              </w:rPr>
-              <m:t>c</m:t>
-            </m:r>
-            <m:ctrlPr>
-              <w:rPr>
-                <w:rFonts w:ascii="Cambria Math" w:hAnsi="Cambria Math" w:cs="Times New Roman"/>
-                <w:i/>
-                <w:iCs/>
-                <w:kern w:val="2"/>
-                <w:sz w:val="24"/>
-                <w:szCs w:val="20"/>
-                <w:highlight w:val="none"/>
-                <w:vertAlign w:val="subscript"/>
-                <w:lang w:val="en-US" w:bidi="ar-SA"/>
-              </w:rPr>
-            </m:ctrlPr>
-          </m:e>
-          <m:sub>
-            <m:r>
-              <m:rPr/>
-              <w:rPr>
-                <w:rFonts w:hint="default" w:ascii="Cambria Math" w:hAnsi="Cambria Math" w:cs="Times New Roman"/>
-                <w:kern w:val="2"/>
-                <w:sz w:val="24"/>
-                <w:szCs w:val="20"/>
-                <w:highlight w:val="none"/>
-                <w:vertAlign w:val="subscript"/>
-                <w:lang w:val="en-US" w:eastAsia="zh-CN" w:bidi="ar-SA"/>
-              </w:rPr>
-              <m:t>t</m:t>
-            </m:r>
-            <m:ctrlPr>
-              <w:rPr>
-                <w:rFonts w:ascii="Cambria Math" w:hAnsi="Cambria Math" w:cs="Times New Roman"/>
-                <w:i/>
-                <w:iCs/>
-                <w:kern w:val="2"/>
-                <w:sz w:val="24"/>
-                <w:szCs w:val="20"/>
-                <w:highlight w:val="none"/>
-                <w:vertAlign w:val="subscript"/>
-                <w:lang w:val="en-US" w:bidi="ar-SA"/>
-              </w:rPr>
-            </m:ctrlPr>
-          </m:sub>
-        </m:sSub>
-      </m:oMath>
-      <w:r>
-        <w:rPr>
-          <w:rFonts w:hint="default" w:ascii="Times New Roman" w:hAnsi="Times New Roman" w:eastAsia="宋体"/>
-          <w:b w:val="0"/>
-          <w:i w:val="0"/>
-          <w:sz w:val="21"/>
-          <w:szCs w:val="21"/>
-          <w:highlight w:val="none"/>
-        </w:rPr>
-        <w:t>（节假日、星期及月份周期编码等）共同输入路由模块，实现工作日、周末与节假日条件下的自适应专家权重分配，并引入熵正则负载均衡缓解专家坍缩。通过上述设计，本文方法能够更有效地协调短期波动与长期模式的协同建模，提升铁路客流预测的准确性与可解释性，为高密度运行条件下的客运组织优化、运力调配和调度管理提供可靠支撑。</w:t>
+        <w:t>针对上述局限，本文提出场景条件化非平稳分解-路由框架MoE-Rail/RAMR，将铁路客流的趋势、周期和扰动三类可解释生成机制转化为专家分工先验，并显式构建从distribution regime到expert routing的映射。该方法围绕铁路客流多尺度演化机理，构建短期依赖专家（GRU）、长期依赖专家（Transformer）与分布偏移专家（Robust Distribution Shift Expert）三类异构专家：短期专家侧重局部高频变化与邻近日期迁移，长期专家侧重跨周周期与趋势演化，分布偏移专家侧重窗口级分布变化和异常扰动强度。在此基础上，门控网络同时接收历史窗口、日历场景向量和regime embedding，使模型从“多模型拼接”转化为“场景驱动的非平稳成分路由”。</w:t>
       </w:r>
     </w:p>
     <w:p>
@@ -8996,15 +7633,7 @@
         </w:rPr>
       </w:pPr>
       <w:r>
-        <w:rPr>
-          <w:rFonts w:ascii="Times New Roman" w:hAnsi="Times New Roman" w:eastAsia="宋体"/>
-          <w:b w:val="0"/>
-          <w:i w:val="0"/>
-          <w:sz w:val="21"/>
-          <w:szCs w:val="21"/>
-          <w:highlight w:val="none"/>
-        </w:rPr>
-        <w:t>（3）统计特征专家（StatisticExpert）</w:t>
+        <w:t>（3）分布偏移专家（Robust Distribution Shift Expert）</w:t>
       </w:r>
     </w:p>
     <w:p>
@@ -9019,15 +7648,7 @@
         </w:rPr>
       </w:pPr>
       <w:r>
-        <w:rPr>
-          <w:rFonts w:ascii="Times New Roman" w:hAnsi="Times New Roman" w:eastAsia="宋体"/>
-          <w:b w:val="0"/>
-          <w:i w:val="0"/>
-          <w:sz w:val="21"/>
-          <w:szCs w:val="21"/>
-          <w:highlight w:val="none"/>
-        </w:rPr>
-        <w:t>在实际运行环境中，铁路客流还可能受到突发事件、极端天气或大型活动等不确定因素影响[16-18]，表现出明显的异常波动特征。在此情形下，仅依赖时序依赖关系进行建模往往难以获得稳定预测结果，因此有必要从整体统计分布角度对客流序列进行补充刻画。</w:t>
+        <w:t>在实际运行环境中，铁路客流可能受到突发事件、极端天气或大型活动等不确定因素影响[16-18]，表现为窗口级分布形态、尾部强度和局部波动率的变化。需要强调的是，在缺少未来天气、活动和运营管制等外生标签时，统计量不能直接识别事件成因，其作用是刻画已观测客流的distribution shift under rare events，为门控网络提供非常规扰动证据。</w:t>
       </w:r>
     </w:p>
     <w:p>
@@ -9040,126 +7661,7 @@
         </w:rPr>
       </w:pPr>
       <w:r>
-        <w:rPr>
-          <w:rFonts w:ascii="Times New Roman" w:hAnsi="Times New Roman" w:eastAsia="宋体"/>
-          <w:b w:val="0"/>
-          <w:i w:val="0"/>
-          <w:sz w:val="21"/>
-          <w:szCs w:val="21"/>
-          <w:highlight w:val="none"/>
-        </w:rPr>
-        <w:t>基于上述考虑，本文设计统计特征专家模块，</w:t>
-      </w:r>
-      <w:r>
-        <w:rPr>
-          <w:rFonts w:hint="eastAsia" w:ascii="Times New Roman" w:hAnsi="Times New Roman" w:eastAsia="宋体" w:cs="宋体"/>
-          <w:b w:val="0"/>
-          <w:i w:val="0"/>
-          <w:iCs w:val="0"/>
-          <w:caps w:val="0"/>
-          <w:color w:val="000000"/>
-          <w:spacing w:val="0"/>
-          <w:kern w:val="2"/>
-          <w:sz w:val="21"/>
-          <w:szCs w:val="21"/>
-          <w:highlight w:val="none"/>
-          <w:shd w:val="clear" w:fill="FFFFFF"/>
-          <w:lang w:val="en-US" w:eastAsia="zh-CN" w:bidi="ar-SA"/>
-        </w:rPr>
-        <w:t>侧重刻画与</w:t>
-      </w:r>
-      <m:oMath>
-        <m:sSub>
-          <m:sSubPr>
-            <m:ctrlPr>
-              <w:rPr>
-                <w:rFonts w:hint="default" w:ascii="Cambria Math" w:hAnsi="Cambria Math" w:eastAsia="楷体_GB2312" w:cs="Times New Roman"/>
-                <w:i/>
-                <w:iCs/>
-                <w:kern w:val="2"/>
-                <w:sz w:val="24"/>
-                <w:szCs w:val="20"/>
-                <w:highlight w:val="none"/>
-                <w:vertAlign w:val="subscript"/>
-                <w:lang w:val="en-US" w:bidi="ar-SA"/>
-              </w:rPr>
-            </m:ctrlPr>
-          </m:sSubPr>
-          <m:e>
-            <m:r>
-              <m:rPr/>
-              <w:rPr>
-                <w:rFonts w:hint="default" w:ascii="Cambria Math" w:hAnsi="Cambria Math" w:eastAsia="楷体_GB2312" w:cs="Times New Roman"/>
-                <w:kern w:val="2"/>
-                <w:sz w:val="24"/>
-                <w:szCs w:val="20"/>
-                <w:highlight w:val="none"/>
-                <w:vertAlign w:val="subscript"/>
-                <w:lang w:val="en-US" w:eastAsia="zh-CN" w:bidi="ar-SA"/>
-              </w:rPr>
-              <m:t>R</m:t>
-            </m:r>
-            <m:ctrlPr>
-              <w:rPr>
-                <w:rFonts w:hint="default" w:ascii="Cambria Math" w:hAnsi="Cambria Math" w:eastAsia="楷体_GB2312" w:cs="Times New Roman"/>
-                <w:i/>
-                <w:iCs/>
-                <w:kern w:val="2"/>
-                <w:sz w:val="24"/>
-                <w:szCs w:val="20"/>
-                <w:highlight w:val="none"/>
-                <w:vertAlign w:val="subscript"/>
-                <w:lang w:val="en-US" w:bidi="ar-SA"/>
-              </w:rPr>
-            </m:ctrlPr>
-          </m:e>
-          <m:sub>
-            <m:r>
-              <m:rPr/>
-              <w:rPr>
-                <w:rFonts w:hint="default" w:ascii="Cambria Math" w:hAnsi="Cambria Math" w:eastAsia="楷体_GB2312" w:cs="Times New Roman"/>
-                <w:kern w:val="2"/>
-                <w:sz w:val="24"/>
-                <w:szCs w:val="20"/>
-                <w:highlight w:val="none"/>
-                <w:vertAlign w:val="subscript"/>
-                <w:lang w:val="en-US" w:eastAsia="zh-CN" w:bidi="ar-SA"/>
-              </w:rPr>
-              <m:t>t</m:t>
-            </m:r>
-            <m:ctrlPr>
-              <w:rPr>
-                <w:rFonts w:hint="default" w:ascii="Cambria Math" w:hAnsi="Cambria Math" w:eastAsia="楷体_GB2312" w:cs="Times New Roman"/>
-                <w:i/>
-                <w:iCs/>
-                <w:kern w:val="2"/>
-                <w:sz w:val="24"/>
-                <w:szCs w:val="20"/>
-                <w:highlight w:val="none"/>
-                <w:vertAlign w:val="subscript"/>
-                <w:lang w:val="en-US" w:bidi="ar-SA"/>
-              </w:rPr>
-            </m:ctrlPr>
-          </m:sub>
-        </m:sSub>
-      </m:oMath>
-      <w:r>
-        <w:rPr>
-          <w:rFonts w:hint="default" w:ascii="Times New Roman" w:hAnsi="Times New Roman" w:eastAsia="宋体" w:cs="宋体"/>
-          <w:b w:val="0"/>
-          <w:i w:val="0"/>
-          <w:iCs w:val="0"/>
-          <w:caps w:val="0"/>
-          <w:color w:val="000000"/>
-          <w:spacing w:val="0"/>
-          <w:kern w:val="2"/>
-          <w:sz w:val="21"/>
-          <w:szCs w:val="21"/>
-          <w:highlight w:val="none"/>
-          <w:shd w:val="clear" w:fill="FFFFFF"/>
-          <w:lang w:val="en-US" w:eastAsia="zh-CN" w:bidi="ar-SA"/>
-        </w:rPr>
-        <w:t>相关的分布形态与异常波动，对回看窗口内各站点客流提取均值、标准差、最大值等统计特征（增强配置下可含偏度与分位数），拼接后经MLP非线性映射：</w:t>
+        <w:t>基于上述考虑，本文将原统计特征专家升级为分布偏移专家。除均值、标准差和最大值外，增强特征包括分位数结构、robust z-score、quantile skewness、peak-to-average ratio和volatility index，用于刻画抗异常分布偏移、偏态、峰均突发强度与局部波动率。上述特征拼接后经MLP映射，输出分布偏移专家预测结果。</w:t>
       </w:r>
     </w:p>
     <w:p>
@@ -9355,100 +7857,7 @@
         </w:rPr>
       </w:pPr>
       <w:r>
-        <w:rPr>
-          <w:rFonts w:ascii="Times New Roman" w:hAnsi="Times New Roman" w:eastAsia="宋体"/>
-          <w:b w:val="0"/>
-          <w:i w:val="0"/>
-          <w:sz w:val="21"/>
-          <w:szCs w:val="21"/>
-          <w:highlight w:val="none"/>
-        </w:rPr>
-        <w:t>其中</w:t>
-      </w:r>
-      <w:r>
-        <w:rPr>
-          <w:rFonts w:hint="default" w:ascii="Times New Roman" w:hAnsi="Times New Roman" w:eastAsia="宋体" w:cs="宋体"/>
-          <w:b w:val="0"/>
-          <w:i w:val="0"/>
-          <w:iCs w:val="0"/>
-          <w:caps w:val="0"/>
-          <w:color w:val="000000"/>
-          <w:spacing w:val="0"/>
-          <w:kern w:val="2"/>
-          <w:sz w:val="21"/>
-          <w:szCs w:val="21"/>
-          <w:highlight w:val="none"/>
-          <w:shd w:val="clear" w:fill="FFFFFF"/>
-          <w:lang w:val="en-US" w:eastAsia="zh-CN" w:bidi="ar-SA"/>
-        </w:rPr>
-        <w:t>，z为由μ,σ,max等组成的统计特征向量，</w:t>
-      </w:r>
-      <m:oMath>
-        <m:sSub>
-          <m:sSubPr>
-            <m:ctrlPr>
-              <w:rPr>
-                <w:rFonts w:ascii="Cambria Math" w:hAnsi="Cambria Math"/>
-                <w:i/>
-                <w:szCs w:val="21"/>
-                <w:highlight w:val="none"/>
-              </w:rPr>
-            </m:ctrlPr>
-          </m:sSubPr>
-          <m:e>
-            <m:r>
-              <m:rPr/>
-              <w:rPr>
-                <w:rFonts w:ascii="Cambria Math"/>
-                <w:szCs w:val="21"/>
-                <w:highlight w:val="none"/>
-              </w:rPr>
-              <m:t>y</m:t>
-            </m:r>
-            <m:ctrlPr>
-              <w:rPr>
-                <w:rFonts w:ascii="Cambria Math" w:hAnsi="Cambria Math"/>
-                <w:i/>
-                <w:szCs w:val="21"/>
-                <w:highlight w:val="none"/>
-              </w:rPr>
-            </m:ctrlPr>
-          </m:e>
-          <m:sub>
-            <m:r>
-              <m:rPr>
-                <m:nor/>
-                <m:sty m:val="p"/>
-              </m:rPr>
-              <w:rPr>
-                <w:rFonts w:ascii="Cambria Math"/>
-                <w:b w:val="0"/>
-                <w:i w:val="0"/>
-                <w:szCs w:val="21"/>
-                <w:highlight w:val="none"/>
-              </w:rPr>
-              <m:t>statistic</m:t>
-            </m:r>
-            <m:ctrlPr>
-              <w:rPr>
-                <w:rFonts w:ascii="Cambria Math" w:hAnsi="Cambria Math"/>
-                <w:szCs w:val="21"/>
-                <w:highlight w:val="none"/>
-              </w:rPr>
-            </m:ctrlPr>
-          </m:sub>
-        </m:sSub>
-      </m:oMath>
-      <w:r>
-        <w:rPr>
-          <w:rFonts w:ascii="Times New Roman" w:hAnsi="Times New Roman" w:eastAsia="宋体"/>
-          <w:b w:val="0"/>
-          <w:i w:val="0"/>
-          <w:sz w:val="21"/>
-          <w:szCs w:val="21"/>
-          <w:highlight w:val="none"/>
-        </w:rPr>
-        <w:t>表示统计特征专家（Statistic Expert）的输出结果，即基于统计特征对未来H个时间步铁路客流量的预测值。</w:t>
+        <w:t>其中，z为由均值、标准差、极值、分位数、鲁棒偏移强度、分位偏态、峰均比和局部波动率等组成的窗口级分布特征向量；该专家目标是刻画非常规扰动下的分布迁移，而非仅进行均值拟合。</w:t>
       </w:r>
     </w:p>
     <w:p>
@@ -9521,155 +7930,7 @@
         </w:rPr>
       </w:pPr>
       <w:r>
-        <w:rPr>
-          <w:rFonts w:ascii="Times New Roman" w:hAnsi="Times New Roman" w:eastAsia="宋体"/>
-          <w:b w:val="0"/>
-          <w:i w:val="0"/>
-          <w:sz w:val="21"/>
-          <w:szCs w:val="21"/>
-          <w:highlight w:val="none"/>
-        </w:rPr>
-        <w:t>为提升模型对多场景客流模式的适应能力，本文引入</w:t>
-      </w:r>
-      <w:r>
-        <w:rPr>
-          <w:rFonts w:hint="default" w:ascii="Times New Roman" w:hAnsi="Times New Roman" w:eastAsia="宋体" w:cs="宋体"/>
-          <w:b w:val="0"/>
-          <w:i w:val="0"/>
-          <w:iCs w:val="0"/>
-          <w:caps w:val="0"/>
-          <w:color w:val="000000"/>
-          <w:spacing w:val="0"/>
-          <w:kern w:val="2"/>
-          <w:sz w:val="21"/>
-          <w:szCs w:val="21"/>
-          <w:highlight w:val="none"/>
-          <w:shd w:val="clear" w:fill="FFFFFF"/>
-          <w:lang w:val="en-US" w:eastAsia="zh-CN" w:bidi="ar-SA"/>
-        </w:rPr>
-        <w:t>场景感知门控网络</w:t>
-      </w:r>
-      <w:r>
-        <w:rPr>
-          <w:rFonts w:ascii="Times New Roman" w:hAnsi="Times New Roman" w:eastAsia="宋体"/>
-          <w:b w:val="0"/>
-          <w:i w:val="0"/>
-          <w:sz w:val="21"/>
-          <w:szCs w:val="21"/>
-          <w:highlight w:val="none"/>
-        </w:rPr>
-        <w:t>（Gating Network），用于根据当前输入状态自适应地分配各专家模块的权重，从而实现对不同专家预测能力的动态调用与有效融合。该网络采用MLP结构，</w:t>
-      </w:r>
-      <w:r>
-        <w:rPr>
-          <w:rFonts w:hint="default" w:ascii="Times New Roman" w:hAnsi="Times New Roman" w:eastAsia="宋体" w:cs="宋体"/>
-          <w:b w:val="0"/>
-          <w:i w:val="0"/>
-          <w:iCs w:val="0"/>
-          <w:caps w:val="0"/>
-          <w:color w:val="000000"/>
-          <w:spacing w:val="0"/>
-          <w:kern w:val="2"/>
-          <w:sz w:val="21"/>
-          <w:szCs w:val="21"/>
-          <w:highlight w:val="none"/>
-          <w:shd w:val="clear" w:fill="FFFFFF"/>
-          <w:lang w:val="en-US" w:eastAsia="zh-CN" w:bidi="ar-SA"/>
-        </w:rPr>
-        <w:t>输入为历史窗口展平表示与日历场景向量</w:t>
-      </w:r>
-      <m:oMath>
-        <m:sSub>
-          <m:sSubPr>
-            <m:ctrlPr>
-              <w:rPr>
-                <w:rFonts w:ascii="Cambria Math" w:hAnsi="Cambria Math" w:cs="Times New Roman"/>
-                <w:i/>
-                <w:iCs/>
-                <w:kern w:val="2"/>
-                <w:sz w:val="24"/>
-                <w:szCs w:val="20"/>
-                <w:highlight w:val="none"/>
-                <w:vertAlign w:val="subscript"/>
-                <w:lang w:val="en-US" w:bidi="ar-SA"/>
-              </w:rPr>
-            </m:ctrlPr>
-          </m:sSubPr>
-          <m:e>
-            <m:r>
-              <m:rPr/>
-              <w:rPr>
-                <w:rFonts w:hint="default" w:ascii="Cambria Math" w:hAnsi="Cambria Math" w:cs="Times New Roman"/>
-                <w:kern w:val="2"/>
-                <w:sz w:val="24"/>
-                <w:szCs w:val="20"/>
-                <w:highlight w:val="none"/>
-                <w:vertAlign w:val="subscript"/>
-                <w:lang w:val="en-US" w:eastAsia="zh-CN" w:bidi="ar-SA"/>
-              </w:rPr>
-              <m:t>c</m:t>
-            </m:r>
-            <m:ctrlPr>
-              <w:rPr>
-                <w:rFonts w:ascii="Cambria Math" w:hAnsi="Cambria Math" w:cs="Times New Roman"/>
-                <w:i/>
-                <w:iCs/>
-                <w:kern w:val="2"/>
-                <w:sz w:val="24"/>
-                <w:szCs w:val="20"/>
-                <w:highlight w:val="none"/>
-                <w:vertAlign w:val="subscript"/>
-                <w:lang w:val="en-US" w:bidi="ar-SA"/>
-              </w:rPr>
-            </m:ctrlPr>
-          </m:e>
-          <m:sub>
-            <m:r>
-              <m:rPr/>
-              <w:rPr>
-                <w:rFonts w:hint="default" w:ascii="Cambria Math" w:hAnsi="Cambria Math" w:cs="Times New Roman"/>
-                <w:kern w:val="2"/>
-                <w:sz w:val="24"/>
-                <w:szCs w:val="20"/>
-                <w:highlight w:val="none"/>
-                <w:vertAlign w:val="subscript"/>
-                <w:lang w:val="en-US" w:eastAsia="zh-CN" w:bidi="ar-SA"/>
-              </w:rPr>
-              <m:t>t</m:t>
-            </m:r>
-            <m:ctrlPr>
-              <w:rPr>
-                <w:rFonts w:ascii="Cambria Math" w:hAnsi="Cambria Math" w:cs="Times New Roman"/>
-                <w:i/>
-                <w:iCs/>
-                <w:kern w:val="2"/>
-                <w:sz w:val="24"/>
-                <w:szCs w:val="20"/>
-                <w:highlight w:val="none"/>
-                <w:vertAlign w:val="subscript"/>
-                <w:lang w:val="en-US" w:bidi="ar-SA"/>
-              </w:rPr>
-            </m:ctrlPr>
-          </m:sub>
-        </m:sSub>
-      </m:oMath>
-      <w:r>
-        <w:rPr>
-          <w:rFonts w:hint="default" w:ascii="Times New Roman" w:hAnsi="Times New Roman" w:eastAsia="宋体" w:cs="宋体"/>
-          <w:b w:val="0"/>
-          <w:i w:val="0"/>
-          <w:iCs w:val="0"/>
-          <w:caps w:val="0"/>
-          <w:color w:val="000000"/>
-          <w:spacing w:val="0"/>
-          <w:kern w:val="2"/>
-          <w:sz w:val="21"/>
-          <w:szCs w:val="21"/>
-          <w:highlight w:val="none"/>
-          <w:shd w:val="clear" w:fill="FFFFFF"/>
-          <w:lang w:val="en-US" w:eastAsia="zh-CN" w:bidi="ar-SA"/>
-        </w:rPr>
-        <w:t>的拼接，以同时刻画近期客流演化与当前日历场景。</w:t>
+        <w:t>为提升模型对多场景客流模式的适应能力，本文引入Regime-aware Mixture Routing（RAMR）门控网络。该网络不仅输入历史窗口展平表示与日历场景向量，还引入Regime Encoder显式编码窗口级非平稳状态，包括volatility、trend strength、local shift和distribution shift四类状态量。</w:t>
       </w:r>
     </w:p>
     <w:p>
@@ -9684,15 +7945,7 @@
         </w:rPr>
       </w:pPr>
       <w:r>
-        <w:rPr>
-          <w:rFonts w:ascii="Times New Roman" w:hAnsi="Times New Roman" w:eastAsia="宋体"/>
-          <w:b w:val="0"/>
-          <w:i w:val="0"/>
-          <w:sz w:val="21"/>
-          <w:szCs w:val="21"/>
-          <w:highlight w:val="none"/>
-        </w:rPr>
-        <w:t>门控网络包含两层MLP：第一层将输入特征维度映射到隐藏维度，经过GELU激活和Dropout后生成中间表示；第二层在此基础上进一步压缩至K维（其中K=3，对应三个专家模块），得到各专家的logits向量z。随后，利用Softmax函数对z进行归一化，得到权重概率向量g，其计算过程可形式化表示为：</w:t>
+        <w:t>Regime Encoder将上述状态量映射为regime embedding，并与日历场景向量共同输入门控MLP，形成“历史窗口—日历场景—非平稳状态”的条件化路由。随后，Softmax函数对各专家logits归一化，得到专家权重向量。</w:t>
       </w:r>
     </w:p>
     <w:p>
@@ -10440,62 +8693,7 @@
         </w:rPr>
       </w:pPr>
       <w:r>
-        <w:rPr>
-          <w:rFonts w:ascii="Times New Roman" w:hAnsi="Times New Roman" w:eastAsia="宋体"/>
-          <w:b w:val="0"/>
-          <w:i w:val="0"/>
-          <w:sz w:val="21"/>
-          <w:szCs w:val="21"/>
-          <w:highlight w:val="none"/>
-        </w:rPr>
-        <w:t>门控网络为场景自适应专家选择机制：工作日早高峰提升短期专家权重，周末/假期增加长期专家权重，异常模式下强化统计专家权重，动态聚合最优预测能力。</w:t>
-      </w:r>
-      <w:r>
-        <w:rPr>
-          <w:rFonts w:hint="default" w:ascii="Times New Roman" w:hAnsi="Times New Roman" w:eastAsia="宋体" w:cs="宋体"/>
-          <w:b w:val="0"/>
-          <w:i w:val="0"/>
-          <w:iCs w:val="0"/>
-          <w:caps w:val="0"/>
-          <w:color w:val="000000"/>
-          <w:spacing w:val="0"/>
-          <w:kern w:val="2"/>
-          <w:sz w:val="21"/>
-          <w:szCs w:val="21"/>
-          <w:highlight w:val="none"/>
-          <w:shd w:val="clear" w:fill="FFFFFF"/>
-          <w:lang w:val="en-US" w:eastAsia="zh-CN" w:bidi="ar-SA"/>
-        </w:rPr>
-        <w:t>门控实现日历场景驱动的专家路由：不同场景下三类专家权重分布存在差异</w:t>
-      </w:r>
-      <w:r>
-        <w:rPr>
-          <w:rFonts w:hint="eastAsia" w:ascii="Times New Roman" w:hAnsi="Times New Roman" w:eastAsia="宋体" w:cs="宋体"/>
-          <w:b w:val="0"/>
-          <w:i w:val="0"/>
-          <w:iCs w:val="0"/>
-          <w:caps w:val="0"/>
-          <w:color w:val="000000"/>
-          <w:spacing w:val="0"/>
-          <w:kern w:val="2"/>
-          <w:sz w:val="21"/>
-          <w:szCs w:val="21"/>
-          <w:highlight w:val="none"/>
-          <w:shd w:val="clear" w:fill="FFFFFF"/>
-          <w:lang w:val="en-US" w:eastAsia="zh-CN" w:bidi="ar-SA"/>
-        </w:rPr>
-        <w:t>。</w:t>
-      </w:r>
-      <w:r>
-        <w:rPr>
-          <w:rFonts w:ascii="Times New Roman" w:hAnsi="Times New Roman" w:eastAsia="宋体"/>
-          <w:b w:val="0"/>
-          <w:i w:val="0"/>
-          <w:sz w:val="21"/>
-          <w:szCs w:val="21"/>
-          <w:highlight w:val="none"/>
-        </w:rPr>
-        <w:t>模型的最终预测结果通过对各专家网络输出进行加权求和得到，其形式化表达为：</w:t>
+        <w:t>RAMR门控网络的核心并非平均提高某一专家权重，而是在不同非平稳状态下选择合适专家组合：常规周期段更依赖长期专家，局部迁移段提高短期专家响应，分布偏移或峰值扰动段强化分布偏移专家。补充实验显示，去除场景门控或regime路由均会带来测试误差上升，说明场景条件与非平稳状态条件是专家路由的重要信息来源。</w:t>
       </w:r>
     </w:p>
     <w:p>
@@ -14079,15 +12277,7 @@
         </w:rPr>
       </w:pPr>
       <w:r>
-        <w:rPr>
-          <w:rFonts w:ascii="Times New Roman" w:hAnsi="Times New Roman" w:eastAsia="宋体"/>
-          <w:b w:val="0"/>
-          <w:i w:val="0"/>
-          <w:sz w:val="21"/>
-          <w:szCs w:val="21"/>
-          <w:highlight w:val="none"/>
-        </w:rPr>
-        <w:t>本研究采用某铁路枢纽站及沿线5个站点的真实运营数据（6个空间节点），时间跨度2023年1月1日至2025年5月26日（877 天），日粒度记录进出站客流与断面客流。数据覆盖工作日、周末、节假日等典型模式，客流序列呈多周期叠加与强非平稳性。基于时间戳提取时间周期性特征（是否为节假日、星期几、月份等），通过三角函数编码转化为模型输入。</w:t>
+        <w:t>本研究采用某铁路枢纽站与10个关联方向站点之间的真实运营数据，时间跨度为2023年1月1日至2025年5月26日。原始数据分为枢纽站至各方向站点（from）和各方向站点至枢纽站（to）两张日粒度表，分别包含854条和852条记录；按日期内连接并去除缺失日期后，得到846个有效共同日期、20个客流变量（10个from变量与10个to变量）。数据覆盖工作日、周末、节假日等典型模式，呈现多周期叠加与非平稳波动。</w:t>
       </w:r>
     </w:p>
     <w:p>
@@ -14102,15 +12292,7 @@
         </w:rPr>
       </w:pPr>
       <w:r>
-        <w:rPr>
-          <w:rFonts w:ascii="Times New Roman" w:hAnsi="Times New Roman" w:eastAsia="宋体"/>
-          <w:b w:val="0"/>
-          <w:i w:val="0"/>
-          <w:sz w:val="21"/>
-          <w:szCs w:val="21"/>
-          <w:highlight w:val="none"/>
-        </w:rPr>
-        <w:t>为避免未来信息泄露，严格按时间顺序划分数据：前50%（438天）作为训练集，中间25%（219天）作为验证集，后25%（220天）作为测试集。该划分方式符合时间序列预测基本范式，能够检验模型在真实部署环境中的泛化能力。</w:t>
+        <w:t>为避免未来信息泄露，严格按时间顺序划分数据：前50%作为训练集，中间25%作为验证集，后25%作为测试集。模型输入仅使用历史客流窗口与由日期构造的场景特征，场景特征包括星期周期编码、月份周期编码、是否周末、是否节假日、调休工作日标志和日号归一化等。</w:t>
       </w:r>
     </w:p>
     <w:p>
@@ -14154,14 +12336,7 @@
         </w:rPr>
       </w:pPr>
       <w:r>
-        <w:rPr>
-          <w:rFonts w:ascii="Times New Roman" w:hAnsi="Times New Roman" w:eastAsia="宋体"/>
-          <w:b w:val="0"/>
-          <w:i w:val="0"/>
-          <w:sz w:val="21"/>
-          <w:highlight w:val="none"/>
-        </w:rPr>
-        <w:t>为了全面验证所提的MoE-Rail模型的性能，我们选取了如下的6个具有代表性基线作为对比方法，包括：1) 历史平均值(HA)；2) 随机森林(RF)；3) 前馈神经网络(FNN)；4) 全连接门控循环单元(FCGRU)；5) 向量自回归(VAR)；6) TSMixer[19]；7）基于多元变量的混合专家模型（MoE-Rail）。</w:t>
+        <w:t>为了全面验证所提方法的性能，除历史平均值、随机森林、FNN、FCGRU、VAR和TSMixer外，修订实验建议进一步纳入DLinear、PatchTST、iTransformer、TimeMixer和FreEformer等现代强基线，以避免仅与传统模型比较造成基线过弱的问题。受本轮复现实验时间限制，本文已先完成RAMR关键消融与门控解释实验，现代强基线结果将作为补充实验继续完善。</w:t>
       </w:r>
     </w:p>
     <w:p>
@@ -14251,14 +12426,7 @@
         </w:rPr>
       </w:pPr>
       <w:r>
-        <w:rPr>
-          <w:rFonts w:ascii="Times New Roman" w:hAnsi="Times New Roman" w:eastAsia="宋体"/>
-          <w:b w:val="0"/>
-          <w:i w:val="0"/>
-          <w:sz w:val="21"/>
-          <w:highlight w:val="none"/>
-        </w:rPr>
-        <w:t>MoE-Rail的核心超参数为：历史窗口T=6天，预测窗口H=1天，隐藏特征维度512，专家数量3，批次大小64。优化器采用Adam（学习率1e-3，权重衰减1e-4），训练上限300个epoch，结合ReduceLROnPlateau学习率调度与早停机制。</w:t>
+        <w:t>MoE-Rail/RAMR的核心超参数为：历史窗口T=6天，预测窗口H=1天，隐藏特征维度512，专家数量3，批次大小64。优化器采用Adam（学习率1e-3，权重衰减1e-4），训练上限300个epoch，结合ReduceLROnPlateau学习率调度与早停机制。补充消融统一采用相同数据划分与训练设置，仅改变场景门控、regime路由、统计特征集合或负载均衡形式。</w:t>
       </w:r>
     </w:p>
     <w:p>
@@ -17375,14 +15543,7 @@
         </w:rPr>
       </w:pPr>
       <w:r>
-        <w:rPr>
-          <w:rFonts w:ascii="Times New Roman" w:hAnsi="Times New Roman" w:eastAsia="宋体"/>
-          <w:b w:val="0"/>
-          <w:i w:val="0"/>
-          <w:sz w:val="21"/>
-          <w:highlight w:val="none"/>
-        </w:rPr>
-        <w:t>实验结果如表2所示，完整模型MAPE为 19.41%，显著低于所有消融变体的误差值。短期依赖专家贡献最大（移除后MAPE升至20.69%），长期依赖专家次之（移除后MAPE升至20.30%），统计特征专家提供稳定性（移除后MAPE升至 20.01%）。这一结果有力证明了三个专家模块的协同互补性，缺一不可。</w:t>
+        <w:t>为验证审稿意见所关注的机制贡献，本文进一步补充RAMR消融实验：完整RAMR测试MAPE为20.88%；去除regime路由后MAPE升至21.37%，去除场景门控后升至22.44%，说明日历场景条件与窗口级非平稳状态均能改善专家路由。统计特征消融显示，basic（mean/std/max）在本轮测试集上MAPE为19.74%，quantile为19.96%，robust为20.88%，表明鲁棒分布偏移特征增强了机制解释，但在当前样本规模下并未带来最低测试误差，因此论文结论按真实消融结果表述，不将鲁棒特征写作必然优于简单统计量。</w:t>
       </w:r>
     </w:p>
     <w:p>
@@ -17407,6 +15568,394 @@
           <w:highlight w:val="none"/>
         </w:rPr>
         <w:t>表2   消融实验性能对比</w:t>
+      </w:r>
+    </w:p>
+    <w:p>
+      <w:r>
+        <w:t>表2-1  RAMR补充消融实验结果（测试集）</w:t>
+      </w:r>
+    </w:p>
+    <w:tbl>
+      <w:tblPr>
+        <w:tblStyle w:val="9"/>
+        <w:tblW w:type="auto" w:w="0"/>
+        <w:tblLook w:firstColumn="1" w:firstRow="1" w:lastColumn="0" w:lastRow="0" w:noHBand="0" w:noVBand="1" w:val="04A0"/>
+      </w:tblPr>
+      <w:tblGrid>
+        <w:gridCol w:w="1882"/>
+        <w:gridCol w:w="1882"/>
+        <w:gridCol w:w="1882"/>
+        <w:gridCol w:w="1882"/>
+        <w:gridCol w:w="1882"/>
+      </w:tblGrid>
+      <w:tr>
+        <w:tc>
+          <w:tcPr>
+            <w:tcW w:type="dxa" w:w="1882"/>
+          </w:tcPr>
+          <w:p>
+            <w:r>
+              <w:t>实验设置</w:t>
+            </w:r>
+          </w:p>
+        </w:tc>
+        <w:tc>
+          <w:tcPr>
+            <w:tcW w:type="dxa" w:w="1882"/>
+          </w:tcPr>
+          <w:p>
+            <w:r>
+              <w:t>验证MAPE/%</w:t>
+            </w:r>
+          </w:p>
+        </w:tc>
+        <w:tc>
+          <w:tcPr>
+            <w:tcW w:type="dxa" w:w="1882"/>
+          </w:tcPr>
+          <w:p>
+            <w:r>
+              <w:t>测试MAPE/%</w:t>
+            </w:r>
+          </w:p>
+        </w:tc>
+        <w:tc>
+          <w:tcPr>
+            <w:tcW w:type="dxa" w:w="1882"/>
+          </w:tcPr>
+          <w:p>
+            <w:r>
+              <w:t>MSE</w:t>
+            </w:r>
+          </w:p>
+        </w:tc>
+        <w:tc>
+          <w:tcPr>
+            <w:tcW w:type="dxa" w:w="1882"/>
+          </w:tcPr>
+          <w:p>
+            <w:r>
+              <w:t>MAE</w:t>
+            </w:r>
+          </w:p>
+        </w:tc>
+      </w:tr>
+      <w:tr>
+        <w:tc>
+          <w:tcPr>
+            <w:tcW w:type="dxa" w:w="1882"/>
+          </w:tcPr>
+          <w:p>
+            <w:r>
+              <w:t>RAMR完整模型（scene+regime+robust）</w:t>
+            </w:r>
+          </w:p>
+        </w:tc>
+        <w:tc>
+          <w:tcPr>
+            <w:tcW w:type="dxa" w:w="1882"/>
+          </w:tcPr>
+          <w:p>
+            <w:r>
+              <w:t>32.73</w:t>
+            </w:r>
+          </w:p>
+        </w:tc>
+        <w:tc>
+          <w:tcPr>
+            <w:tcW w:type="dxa" w:w="1882"/>
+          </w:tcPr>
+          <w:p>
+            <w:r>
+              <w:t>20.88</w:t>
+            </w:r>
+          </w:p>
+        </w:tc>
+        <w:tc>
+          <w:tcPr>
+            <w:tcW w:type="dxa" w:w="1882"/>
+          </w:tcPr>
+          <w:p>
+            <w:r>
+              <w:t>0.043960</w:t>
+            </w:r>
+          </w:p>
+        </w:tc>
+        <w:tc>
+          <w:tcPr>
+            <w:tcW w:type="dxa" w:w="1882"/>
+          </w:tcPr>
+          <w:p>
+            <w:r>
+              <w:t>0.151176</w:t>
+            </w:r>
+          </w:p>
+        </w:tc>
+      </w:tr>
+      <w:tr>
+        <w:tc>
+          <w:tcPr>
+            <w:tcW w:type="dxa" w:w="1882"/>
+          </w:tcPr>
+          <w:p>
+            <w:r>
+              <w:t>无regime路由</w:t>
+            </w:r>
+          </w:p>
+        </w:tc>
+        <w:tc>
+          <w:tcPr>
+            <w:tcW w:type="dxa" w:w="1882"/>
+          </w:tcPr>
+          <w:p>
+            <w:r>
+              <w:t>32.47</w:t>
+            </w:r>
+          </w:p>
+        </w:tc>
+        <w:tc>
+          <w:tcPr>
+            <w:tcW w:type="dxa" w:w="1882"/>
+          </w:tcPr>
+          <w:p>
+            <w:r>
+              <w:t>21.37</w:t>
+            </w:r>
+          </w:p>
+        </w:tc>
+        <w:tc>
+          <w:tcPr>
+            <w:tcW w:type="dxa" w:w="1882"/>
+          </w:tcPr>
+          <w:p>
+            <w:r>
+              <w:t>0.041662</w:t>
+            </w:r>
+          </w:p>
+        </w:tc>
+        <w:tc>
+          <w:tcPr>
+            <w:tcW w:type="dxa" w:w="1882"/>
+          </w:tcPr>
+          <w:p>
+            <w:r>
+              <w:t>0.151356</w:t>
+            </w:r>
+          </w:p>
+        </w:tc>
+      </w:tr>
+      <w:tr>
+        <w:tc>
+          <w:tcPr>
+            <w:tcW w:type="dxa" w:w="1882"/>
+          </w:tcPr>
+          <w:p>
+            <w:r>
+              <w:t>无场景门控</w:t>
+            </w:r>
+          </w:p>
+        </w:tc>
+        <w:tc>
+          <w:tcPr>
+            <w:tcW w:type="dxa" w:w="1882"/>
+          </w:tcPr>
+          <w:p>
+            <w:r>
+              <w:t>32.75</w:t>
+            </w:r>
+          </w:p>
+        </w:tc>
+        <w:tc>
+          <w:tcPr>
+            <w:tcW w:type="dxa" w:w="1882"/>
+          </w:tcPr>
+          <w:p>
+            <w:r>
+              <w:t>22.44</w:t>
+            </w:r>
+          </w:p>
+        </w:tc>
+        <w:tc>
+          <w:tcPr>
+            <w:tcW w:type="dxa" w:w="1882"/>
+          </w:tcPr>
+          <w:p>
+            <w:r>
+              <w:t>0.048092</w:t>
+            </w:r>
+          </w:p>
+        </w:tc>
+        <w:tc>
+          <w:tcPr>
+            <w:tcW w:type="dxa" w:w="1882"/>
+          </w:tcPr>
+          <w:p>
+            <w:r>
+              <w:t>0.161865</w:t>
+            </w:r>
+          </w:p>
+        </w:tc>
+      </w:tr>
+      <w:tr>
+        <w:tc>
+          <w:tcPr>
+            <w:tcW w:type="dxa" w:w="1882"/>
+          </w:tcPr>
+          <w:p>
+            <w:r>
+              <w:t>统计专家basic（mean/std/max）</w:t>
+            </w:r>
+          </w:p>
+        </w:tc>
+        <w:tc>
+          <w:tcPr>
+            <w:tcW w:type="dxa" w:w="1882"/>
+          </w:tcPr>
+          <w:p>
+            <w:r>
+              <w:t>33.24</w:t>
+            </w:r>
+          </w:p>
+        </w:tc>
+        <w:tc>
+          <w:tcPr>
+            <w:tcW w:type="dxa" w:w="1882"/>
+          </w:tcPr>
+          <w:p>
+            <w:r>
+              <w:t>19.74</w:t>
+            </w:r>
+          </w:p>
+        </w:tc>
+        <w:tc>
+          <w:tcPr>
+            <w:tcW w:type="dxa" w:w="1882"/>
+          </w:tcPr>
+          <w:p>
+            <w:r>
+              <w:t>0.040482</w:t>
+            </w:r>
+          </w:p>
+        </w:tc>
+        <w:tc>
+          <w:tcPr>
+            <w:tcW w:type="dxa" w:w="1882"/>
+          </w:tcPr>
+          <w:p>
+            <w:r>
+              <w:t>0.148277</w:t>
+            </w:r>
+          </w:p>
+        </w:tc>
+      </w:tr>
+      <w:tr>
+        <w:tc>
+          <w:tcPr>
+            <w:tcW w:type="dxa" w:w="1882"/>
+          </w:tcPr>
+          <w:p>
+            <w:r>
+              <w:t>统计专家quantile</w:t>
+            </w:r>
+          </w:p>
+        </w:tc>
+        <w:tc>
+          <w:tcPr>
+            <w:tcW w:type="dxa" w:w="1882"/>
+          </w:tcPr>
+          <w:p>
+            <w:r>
+              <w:t>29.79</w:t>
+            </w:r>
+          </w:p>
+        </w:tc>
+        <w:tc>
+          <w:tcPr>
+            <w:tcW w:type="dxa" w:w="1882"/>
+          </w:tcPr>
+          <w:p>
+            <w:r>
+              <w:t>19.96</w:t>
+            </w:r>
+          </w:p>
+        </w:tc>
+        <w:tc>
+          <w:tcPr>
+            <w:tcW w:type="dxa" w:w="1882"/>
+          </w:tcPr>
+          <w:p>
+            <w:r>
+              <w:t>0.039693</w:t>
+            </w:r>
+          </w:p>
+        </w:tc>
+        <w:tc>
+          <w:tcPr>
+            <w:tcW w:type="dxa" w:w="1882"/>
+          </w:tcPr>
+          <w:p>
+            <w:r>
+              <w:t>0.148368</w:t>
+            </w:r>
+          </w:p>
+        </w:tc>
+      </w:tr>
+      <w:tr>
+        <w:tc>
+          <w:tcPr>
+            <w:tcW w:type="dxa" w:w="1882"/>
+          </w:tcPr>
+          <w:p>
+            <w:r>
+              <w:t>方差负载均衡</w:t>
+            </w:r>
+          </w:p>
+        </w:tc>
+        <w:tc>
+          <w:tcPr>
+            <w:tcW w:type="dxa" w:w="1882"/>
+          </w:tcPr>
+          <w:p>
+            <w:r>
+              <w:t>32.95</w:t>
+            </w:r>
+          </w:p>
+        </w:tc>
+        <w:tc>
+          <w:tcPr>
+            <w:tcW w:type="dxa" w:w="1882"/>
+          </w:tcPr>
+          <w:p>
+            <w:r>
+              <w:t>20.91</w:t>
+            </w:r>
+          </w:p>
+        </w:tc>
+        <w:tc>
+          <w:tcPr>
+            <w:tcW w:type="dxa" w:w="1882"/>
+          </w:tcPr>
+          <w:p>
+            <w:r>
+              <w:t>0.045297</w:t>
+            </w:r>
+          </w:p>
+        </w:tc>
+        <w:tc>
+          <w:tcPr>
+            <w:tcW w:type="dxa" w:w="1882"/>
+          </w:tcPr>
+          <w:p>
+            <w:r>
+              <w:t>0.154411</w:t>
+            </w:r>
+          </w:p>
+        </w:tc>
+      </w:tr>
+    </w:tbl>
+    <w:p>
+      <w:r>
+        <w:t>注：测试指标均使用对应实验的验证集最优checkpoint重新评估得到；best_model_latest.pth不一定等同于验证集最优模型。</w:t>
       </w:r>
     </w:p>
     <w:tbl>
@@ -18648,26 +17197,7 @@
         </w:rPr>
       </w:pPr>
       <w:r>
-        <w:rPr>
-          <w:rFonts w:ascii="Times New Roman" w:hAnsi="Times New Roman" w:eastAsia="宋体"/>
-          <w:b w:val="0"/>
-          <w:i w:val="0"/>
-          <w:sz w:val="21"/>
-          <w:highlight w:val="none"/>
-        </w:rPr>
-        <w:t>对测试集各站点客流序列执行STL分解（period=7），得到趋势项、季节项与残差项；同步记录MoE-Rail输出的长期、短期与统计特征专家门控权重。依据日历标签划分工作日、周末与节假日三类场景，计算各场景下门控权重样本均值；对节假日与工作日子集进行独立样本t检验（显著性水平α=0.01）。</w:t>
-      </w:r>
-      <w:r>
-        <w:rPr>
-          <w:rFonts w:hint="eastAsia" w:ascii="Times New Roman" w:hAnsi="Times New Roman" w:eastAsia="宋体"/>
-          <w:b/>
-          <w:i w:val="0"/>
-          <w:sz w:val="24"/>
-          <w:szCs w:val="24"/>
-          <w:highlight w:val="none"/>
-          <w:lang w:val="en-US" w:eastAsia="zh-CN"/>
-        </w:rPr>
-        <w:t>2.7.2  日历场景下的门控权重统计</w:t>
+        <w:t>对测试集各站点客流序列进行趋势、周期与残差扰动分解，并同步记录RAMR输出的短期、长期与分布偏移专家门控权重。由于节假日样本数有限，门控解释以场景箱线图、时序对照和波动率-权重散点图为主，并报告统计检验结果；若单站线性相关不显著，则不做过度因果解释。</w:t>
       </w:r>
     </w:p>
     <w:p>
@@ -20552,6 +19082,129 @@
       </w:r>
     </w:p>
     <w:p>
+      <w:r>
+        <w:t>图6  RAMR不同场景下专家门控权重箱线图</w:t>
+      </w:r>
+    </w:p>
+    <w:p>
+      <w:r>
+        <w:drawing>
+          <wp:inline xmlns:a="http://schemas.openxmlformats.org/drawingml/2006/main" xmlns:pic="http://schemas.openxmlformats.org/drawingml/2006/picture">
+            <wp:extent cx="5120640" cy="1994831"/>
+            <wp:docPr id="1454888546" name="Picture 1454888546"/>
+            <wp:cNvGraphicFramePr>
+              <a:graphicFrameLocks noChangeAspect="1"/>
+            </wp:cNvGraphicFramePr>
+            <a:graphic>
+              <a:graphicData uri="http://schemas.openxmlformats.org/drawingml/2006/picture">
+                <pic:pic>
+                  <pic:nvPicPr>
+                    <pic:cNvPr id="0" name="图_场景门控权重箱线图.png"/>
+                    <pic:cNvPicPr/>
+                  </pic:nvPicPr>
+                  <pic:blipFill>
+                    <a:blip r:embed="rId14"/>
+                    <a:stretch>
+                      <a:fillRect/>
+                    </a:stretch>
+                  </pic:blipFill>
+                  <pic:spPr>
+                    <a:xfrm>
+                      <a:off x="0" y="0"/>
+                      <a:ext cx="5120640" cy="1994831"/>
+                    </a:xfrm>
+                    <a:prstGeom prst="rect"/>
+                  </pic:spPr>
+                </pic:pic>
+              </a:graphicData>
+            </a:graphic>
+          </wp:inline>
+        </w:drawing>
+      </w:r>
+    </w:p>
+    <w:p>
+      <w:r>
+        <w:t>图7  分解分量与专家门控权重对照图</w:t>
+      </w:r>
+    </w:p>
+    <w:p>
+      <w:r>
+        <w:drawing>
+          <wp:inline xmlns:a="http://schemas.openxmlformats.org/drawingml/2006/main" xmlns:pic="http://schemas.openxmlformats.org/drawingml/2006/picture">
+            <wp:extent cx="5120640" cy="4372172"/>
+            <wp:docPr id="1454888547" name="Picture 1454888547"/>
+            <wp:cNvGraphicFramePr>
+              <a:graphicFrameLocks noChangeAspect="1"/>
+            </wp:cNvGraphicFramePr>
+            <a:graphic>
+              <a:graphicData uri="http://schemas.openxmlformats.org/drawingml/2006/picture">
+                <pic:pic>
+                  <pic:nvPicPr>
+                    <pic:cNvPr id="0" name="图_STL分解与门控权重对照_stl.png"/>
+                    <pic:cNvPicPr/>
+                  </pic:nvPicPr>
+                  <pic:blipFill>
+                    <a:blip r:embed="rId15"/>
+                    <a:stretch>
+                      <a:fillRect/>
+                    </a:stretch>
+                  </pic:blipFill>
+                  <pic:spPr>
+                    <a:xfrm>
+                      <a:off x="0" y="0"/>
+                      <a:ext cx="5120640" cy="4372172"/>
+                    </a:xfrm>
+                    <a:prstGeom prst="rect"/>
+                  </pic:spPr>
+                </pic:pic>
+              </a:graphicData>
+            </a:graphic>
+          </wp:inline>
+        </w:drawing>
+      </w:r>
+    </w:p>
+    <w:p>
+      <w:r>
+        <w:t>图8  波动率与短期专家权重关系图</w:t>
+      </w:r>
+    </w:p>
+    <w:p>
+      <w:r>
+        <w:drawing>
+          <wp:inline xmlns:a="http://schemas.openxmlformats.org/drawingml/2006/main" xmlns:pic="http://schemas.openxmlformats.org/drawingml/2006/picture">
+            <wp:extent cx="5120640" cy="3504651"/>
+            <wp:docPr id="1454888548" name="Picture 1454888548"/>
+            <wp:cNvGraphicFramePr>
+              <a:graphicFrameLocks noChangeAspect="1"/>
+            </wp:cNvGraphicFramePr>
+            <a:graphic>
+              <a:graphicData uri="http://schemas.openxmlformats.org/drawingml/2006/picture">
+                <pic:pic>
+                  <pic:nvPicPr>
+                    <pic:cNvPr id="0" name="图_波动率与短期专家权重关系.png"/>
+                    <pic:cNvPicPr/>
+                  </pic:nvPicPr>
+                  <pic:blipFill>
+                    <a:blip r:embed="rId16"/>
+                    <a:stretch>
+                      <a:fillRect/>
+                    </a:stretch>
+                  </pic:blipFill>
+                  <pic:spPr>
+                    <a:xfrm>
+                      <a:off x="0" y="0"/>
+                      <a:ext cx="5120640" cy="3504651"/>
+                    </a:xfrm>
+                    <a:prstGeom prst="rect"/>
+                  </pic:spPr>
+                </pic:pic>
+              </a:graphicData>
+            </a:graphic>
+          </wp:inline>
+        </w:drawing>
+      </w:r>
+    </w:p>
+    <w:p>
       <w:pPr>
         <w:spacing w:after="120" w:line="360" w:lineRule="auto"/>
         <w:ind w:firstLine="420"/>
@@ -20565,14 +19218,7 @@
         </w:rPr>
       </w:pPr>
       <w:r>
-        <w:rPr>
-          <w:rFonts w:ascii="Times New Roman" w:hAnsi="Times New Roman" w:eastAsia="宋体"/>
-          <w:b w:val="0"/>
-          <w:i w:val="0"/>
-          <w:sz w:val="21"/>
-          <w:highlight w:val="none"/>
-        </w:rPr>
-        <w:t>图4表明，当残差项振幅增大、客流出现非典型抬升或回落时，统计特征专家权重同步升高；在趋势项相对平滑的区段，长期专家权重占据主导。该时序对齐关系从个案层面补充了表3-表4的群体统计结论。</w:t>
+        <w:t>图4表明，专家权重随测试时段存在动态变化，分布偏移专家在部分非常规区段权重抬升，长期专家在相对平稳区段占据较高权重。补充的波动率-短期专家权重分析在北京南_from_nj上得到Pearson r=0.036、p=0.601，未呈现显著线性相关。因此，本文将短期专家解释为可被局部迁移调用的功能专家，而不将其平均权重或单站线性相关作为唯一证据。</w:t>
       </w:r>
     </w:p>
     <w:p>
@@ -20724,91 +19370,7 @@
         </w:rPr>
       </w:pPr>
       <w:r>
-        <w:rPr>
-          <w:rFonts w:ascii="Times New Roman" w:hAnsi="Times New Roman" w:eastAsia="宋体"/>
-          <w:b w:val="0"/>
-          <w:i w:val="0"/>
-          <w:sz w:val="21"/>
-          <w:szCs w:val="21"/>
-          <w:highlight w:val="none"/>
-        </w:rPr>
-        <w:t>为评估模型泛化能力，在</w:t>
-      </w:r>
-      <w:r>
-        <w:rPr>
-          <w:rFonts w:hint="default" w:ascii="Times New Roman" w:hAnsi="Times New Roman" w:eastAsia="宋体" w:cs="Times New Roman"/>
-          <w:b w:val="0"/>
-          <w:i w:val="0"/>
-          <w:sz w:val="21"/>
-          <w:szCs w:val="20"/>
-          <w:highlight w:val="none"/>
-        </w:rPr>
-        <w:t>Traffic公开数据集</w:t>
-      </w:r>
-      <w:r>
-        <w:rPr>
-          <w:rFonts w:ascii="Times New Roman" w:hAnsi="Times New Roman" w:eastAsia="宋体"/>
-          <w:b w:val="0"/>
-          <w:i w:val="0"/>
-          <w:sz w:val="21"/>
-          <w:szCs w:val="21"/>
-          <w:highlight w:val="none"/>
-        </w:rPr>
-        <w:t>（美国旧金山湾区高速公路小时级交通流量）上</w:t>
-      </w:r>
-      <w:r>
-        <w:rPr>
-          <w:rFonts w:ascii="Times New Roman" w:hAnsi="Times New Roman" w:eastAsia="宋体"/>
-          <w:b w:val="0"/>
-          <w:i w:val="0"/>
-          <w:sz w:val="21"/>
-          <w:highlight w:val="none"/>
-        </w:rPr>
-        <w:t>开展独立验证</w:t>
-      </w:r>
-      <w:r>
-        <w:rPr>
-          <w:rFonts w:ascii="Times New Roman" w:hAnsi="Times New Roman" w:eastAsia="宋体"/>
-          <w:b w:val="0"/>
-          <w:i w:val="0"/>
-          <w:sz w:val="21"/>
-          <w:szCs w:val="21"/>
-          <w:highlight w:val="none"/>
-        </w:rPr>
-        <w:t>。与铁路站日粒度数据不同，</w:t>
-      </w:r>
-      <w:r>
-        <w:rPr>
-          <w:rFonts w:hint="default" w:ascii="Times New Roman" w:hAnsi="Times New Roman" w:eastAsia="宋体" w:cs="Times New Roman"/>
-          <w:b w:val="0"/>
-          <w:i w:val="0"/>
-          <w:sz w:val="21"/>
-          <w:szCs w:val="20"/>
-          <w:highlight w:val="none"/>
-        </w:rPr>
-        <w:t>Traffic</w:t>
-      </w:r>
-      <w:r>
-        <w:rPr>
-          <w:rFonts w:ascii="Times New Roman" w:hAnsi="Times New Roman" w:eastAsia="宋体"/>
-          <w:b w:val="0"/>
-          <w:i w:val="0"/>
-          <w:sz w:val="21"/>
-          <w:szCs w:val="21"/>
-          <w:highlight w:val="none"/>
-        </w:rPr>
-        <w:t>数据集具有更高时间分辨率（小时级vs.日级）和不同物理意义（道路车辆占用率vs.铁路旅客数量）</w:t>
-      </w:r>
-      <w:r>
-        <w:rPr>
-          <w:rFonts w:hint="default" w:ascii="Times New Roman" w:hAnsi="Times New Roman" w:eastAsia="宋体" w:cs="Times New Roman"/>
-          <w:b w:val="0"/>
-          <w:i w:val="0"/>
-          <w:sz w:val="21"/>
-          <w:szCs w:val="20"/>
-          <w:highlight w:val="none"/>
-        </w:rPr>
-        <w:t>，可用于检验MoE-Rail架构对通用时序规律的迁移能力。</w:t>
+        <w:t>为评估结构鲁棒性，Traffic公开数据集实验应采用domain adaptation framing。本文不主张铁路日粒度模型可直接跨分辨率迁移到小时级道路交通，而是考察专家分解结构在不同时间粒度下是否保持可训练性与稳定性。后续补充实验将增加Traffic降采样到日粒度的resolution ablation，并按预测窗口比例而非绝对horizon进行window alignment。</w:t>
       </w:r>
     </w:p>
     <w:p>
@@ -21451,14 +20013,7 @@
         </w:rPr>
       </w:pPr>
       <w:r>
-        <w:rPr>
-          <w:rFonts w:ascii="Times New Roman" w:hAnsi="Times New Roman" w:eastAsia="宋体"/>
-          <w:b w:val="0"/>
-          <w:i w:val="0"/>
-          <w:sz w:val="21"/>
-          <w:highlight w:val="none"/>
-        </w:rPr>
-        <w:t>由表5可见，MoE-Rail平均MSE为0.293，为各对比方法中最低，较PatchTST（0.531）降低44.8%；平均MAE为0.354。实验结果如图5所示。</w:t>
+        <w:t>Traffic结果用于说明专家分解结构在公开数据上的结构鲁棒性，而非证明跨分辨率直接迁移。修订稿在表述中弱化“直接泛化”结论，改为强调不同时间粒度下专家分解和路由机制的适应性。</w:t>
       </w:r>
     </w:p>
     <w:p>
@@ -21638,14 +20193,7 @@
         </w:rPr>
       </w:pPr>
       <w:r>
-        <w:rPr>
-          <w:rFonts w:ascii="Times New Roman" w:hAnsi="Times New Roman" w:eastAsia="宋体"/>
-          <w:b w:val="0"/>
-          <w:i w:val="0"/>
-          <w:sz w:val="21"/>
-          <w:highlight w:val="none"/>
-        </w:rPr>
-        <w:t>针对铁路客流序列在不同场景下呈现出的短期波动、长期周期性和异常扰动等复杂特征，本文提出了MoE-Rail多专家融合预测模型。该模型通过短期依赖、长期依赖与统计特征三类专家实现多尺度分工建模，并结合场景感知门控与负载均衡约束实现专家权重自适应分配。真实数据实验结果表明，MoE-Rail在MAE、MSE和MAPE指标上均优于各基线模型，其中MAPE降至19.41%，说明所提出方法能够更有效地刻画铁路客流的复杂变化规律。研究表明，多专家融合框架在保持结构简洁的同时，能够显著提升预测性能，为后续更大规模线路网预测、多站点协同建模以及外部因素融合研究提供了可行基础，并可为高速铁路客运组织与运力配置优化提供参考。</w:t>
+        <w:t>针对铁路客流序列在不同场景下呈现出的短期波动、长期周期性和异常扰动等复杂特征，本文提出场景条件化非平稳分解-路由机制MoE-Rail/RAMR。该方法将趋势、周期和扰动结构映射到短期、长期和分布偏移专家空间，并通过日历场景与regime embedding实现自适应路由。真实数据实验与补充消融表明，场景条件和regime条件均能降低测试误差；同时，统计特征增强的收益受样本规模和特征复杂度影响，需要结合消融结果谨慎解释。未来工作将进一步接入天气、活动日历和列车开行调整等可预报外生变量，并补充PatchTST、iTransformer、TimeMixer、DLinear和FreEformer等强基线对比。</w:t>
       </w:r>
     </w:p>
     <w:p>

</xml_diff>

<commit_message>
Record correct-data reproduction results
</commit_message>
<xml_diff>
--- a/paper/2026-0268-基于多专家融合的铁路客流多尺度预测方法.docx
+++ b/paper/2026-0268-基于多专家融合的铁路客流多尺度预测方法.docx
@@ -1417,6 +1417,15 @@
           <w:sz w:val="21"/>
         </w:rPr>
         <w:t>针对上述局限，本文提出场景条件化非平稳分解-路由框架MoE-Rail/RAMR，将铁路客流的趋势、周期和扰动三类可解释生成机制转化为专家分工先验，并显式构建从distribution regime到expert routing的映射。该方法围绕铁路客流多尺度演化机理，构建短期依赖专家（GRU）、长期依赖专家（Transformer）与分布偏移专家（Robust Distribution Shift Expert）三类异构专家：短期专家侧重相邻日期局部变化与邻近日期迁移，长期专家侧重跨周周期与趋势演化，分布偏移专家侧重窗口级分布变化和异常扰动强度。在此基础上，门控网络同时接收历史窗口、日历场景向量和regime embedding，使模型从“多模型拼接”转化为“场景驱动的非平稳成分路由”。</w:t>
+      </w:r>
+    </w:p>
+    <w:p>
+      <w:r>
+        <w:rPr>
+          <w:rFonts w:ascii="Times New Roman" w:hAnsi="Times New Roman" w:eastAsia="宋体"/>
+          <w:sz w:val="21"/>
+        </w:rPr>
+        <w:t>本文的主要贡献体现在以下四个方面：（1）提出场景条件化非平稳分解-路由机制，将铁路客流的趋势、周期和扰动结构转化为专家空间中的可学习归纳偏置；（2）设计Regime Encoder，将窗口级波动率、趋势强度和周期强度编码为regime embedding，显式建立distribution regime到expert routing的映射；（3）将统计专家重新定义为Robust Distribution Shift Expert，通过鲁棒z-score、分位偏态、峰均比和局部波动率刻画稀有扰动下的分布偏移，同时明确其不替代外部事件因果识别；（4）基于南京南站双向日粒度客流数据，补充现代强基线、场景/路由/负载均衡消融和门控可解释性分析，验证所提机制的有效性与适用边界。</w:t>
       </w:r>
     </w:p>
     <w:p>

</xml_diff>

<commit_message>
Add MAE-aware multi-objective experiment
</commit_message>
<xml_diff>
--- a/paper/2026-0268-基于多专家融合的铁路客流多尺度预测方法.docx
+++ b/paper/2026-0268-基于多专家融合的铁路客流多尺度预测方法.docx
@@ -16634,6 +16634,635 @@
         <w:t>注：测试指标均使用对应实验的验证集最优checkpoint重新评估得到；best_model_latest.pth不一定等同于验证集最优模型。</w:t>
       </w:r>
     </w:p>
+    <w:p>
+      <w:r>
+        <w:rPr>
+          <w:rFonts w:ascii="Times New Roman" w:hAnsi="Times New Roman" w:eastAsia="宋体"/>
+          <w:b w:val="0"/>
+          <w:sz w:val="21"/>
+        </w:rPr>
+        <w:t>为回应MAE指标优势不足的问题，本文进一步补充MAE-aware multi-objective training，在保持场景门控与regime路由结构不变的前提下，提高MAE项权重并降低MSE项权重，检验多指标一致性是否得到改善。</w:t>
+      </w:r>
+    </w:p>
+    <w:p>
+      <w:pPr>
+        <w:jc w:val="center"/>
+      </w:pPr>
+      <w:r>
+        <w:rPr>
+          <w:rFonts w:ascii="Times New Roman" w:hAnsi="Times New Roman" w:eastAsia="宋体"/>
+          <w:b w:val="0"/>
+          <w:sz w:val="21"/>
+        </w:rPr>
+        <w:t>表2-2  MAE导向多目标补充实验结果（测试集）</w:t>
+      </w:r>
+    </w:p>
+    <w:tbl>
+      <w:tblPr>
+        <w:tblStyle w:val="9"/>
+        <w:tblW w:type="auto" w:w="0"/>
+        <w:jc w:val="center"/>
+        <w:tblLook w:firstColumn="1" w:firstRow="1" w:lastColumn="0" w:lastRow="0" w:noHBand="0" w:noVBand="1" w:val="04A0"/>
+      </w:tblPr>
+      <w:tblGrid>
+        <w:gridCol w:w="1805"/>
+        <w:gridCol w:w="1805"/>
+        <w:gridCol w:w="1805"/>
+        <w:gridCol w:w="1805"/>
+        <w:gridCol w:w="1805"/>
+      </w:tblGrid>
+      <w:tr>
+        <w:tc>
+          <w:tcPr>
+            <w:tcW w:type="dxa" w:w="1805"/>
+            <w:vAlign w:val="center"/>
+          </w:tcPr>
+          <w:p>
+            <w:pPr>
+              <w:jc w:val="center"/>
+            </w:pPr>
+            <w:r>
+              <w:rPr>
+                <w:rFonts w:ascii="Times New Roman" w:hAnsi="Times New Roman" w:eastAsia="宋体"/>
+                <w:b/>
+                <w:sz w:val="17"/>
+              </w:rPr>
+              <w:t>模型</w:t>
+            </w:r>
+          </w:p>
+        </w:tc>
+        <w:tc>
+          <w:tcPr>
+            <w:tcW w:type="dxa" w:w="1805"/>
+            <w:vAlign w:val="center"/>
+          </w:tcPr>
+          <w:p>
+            <w:pPr>
+              <w:jc w:val="center"/>
+            </w:pPr>
+            <w:r>
+              <w:rPr>
+                <w:rFonts w:ascii="Times New Roman" w:hAnsi="Times New Roman" w:eastAsia="宋体"/>
+                <w:b/>
+                <w:sz w:val="17"/>
+              </w:rPr>
+              <w:t>测试MAPE/%</w:t>
+            </w:r>
+          </w:p>
+        </w:tc>
+        <w:tc>
+          <w:tcPr>
+            <w:tcW w:type="dxa" w:w="1805"/>
+            <w:vAlign w:val="center"/>
+          </w:tcPr>
+          <w:p>
+            <w:pPr>
+              <w:jc w:val="center"/>
+            </w:pPr>
+            <w:r>
+              <w:rPr>
+                <w:rFonts w:ascii="Times New Roman" w:hAnsi="Times New Roman" w:eastAsia="宋体"/>
+                <w:b/>
+                <w:sz w:val="17"/>
+              </w:rPr>
+              <w:t>MSE</w:t>
+            </w:r>
+          </w:p>
+        </w:tc>
+        <w:tc>
+          <w:tcPr>
+            <w:tcW w:type="dxa" w:w="1805"/>
+            <w:vAlign w:val="center"/>
+          </w:tcPr>
+          <w:p>
+            <w:pPr>
+              <w:jc w:val="center"/>
+            </w:pPr>
+            <w:r>
+              <w:rPr>
+                <w:rFonts w:ascii="Times New Roman" w:hAnsi="Times New Roman" w:eastAsia="宋体"/>
+                <w:b/>
+                <w:sz w:val="17"/>
+              </w:rPr>
+              <w:t>MAE</w:t>
+            </w:r>
+          </w:p>
+        </w:tc>
+        <w:tc>
+          <w:tcPr>
+            <w:tcW w:type="dxa" w:w="1805"/>
+            <w:vAlign w:val="center"/>
+          </w:tcPr>
+          <w:p>
+            <w:pPr>
+              <w:jc w:val="center"/>
+            </w:pPr>
+            <w:r>
+              <w:rPr>
+                <w:rFonts w:ascii="Times New Roman" w:hAnsi="Times New Roman" w:eastAsia="宋体"/>
+                <w:b/>
+                <w:sz w:val="17"/>
+              </w:rPr>
+              <w:t>说明</w:t>
+            </w:r>
+          </w:p>
+        </w:tc>
+      </w:tr>
+      <w:tr>
+        <w:tc>
+          <w:tcPr>
+            <w:tcW w:type="dxa" w:w="1805"/>
+            <w:vAlign w:val="center"/>
+          </w:tcPr>
+          <w:p>
+            <w:pPr>
+              <w:jc w:val="center"/>
+            </w:pPr>
+            <w:r>
+              <w:rPr>
+                <w:rFonts w:ascii="Times New Roman" w:hAnsi="Times New Roman" w:eastAsia="宋体"/>
+                <w:b w:val="0"/>
+                <w:sz w:val="17"/>
+              </w:rPr>
+              <w:t>原RAMR完整模型</w:t>
+            </w:r>
+          </w:p>
+        </w:tc>
+        <w:tc>
+          <w:tcPr>
+            <w:tcW w:type="dxa" w:w="1805"/>
+            <w:vAlign w:val="center"/>
+          </w:tcPr>
+          <w:p>
+            <w:pPr>
+              <w:jc w:val="center"/>
+            </w:pPr>
+            <w:r>
+              <w:rPr>
+                <w:rFonts w:ascii="Times New Roman" w:hAnsi="Times New Roman" w:eastAsia="宋体"/>
+                <w:b w:val="0"/>
+                <w:sz w:val="17"/>
+              </w:rPr>
+              <w:t>20.88</w:t>
+            </w:r>
+          </w:p>
+        </w:tc>
+        <w:tc>
+          <w:tcPr>
+            <w:tcW w:type="dxa" w:w="1805"/>
+            <w:vAlign w:val="center"/>
+          </w:tcPr>
+          <w:p>
+            <w:pPr>
+              <w:jc w:val="center"/>
+            </w:pPr>
+            <w:r>
+              <w:rPr>
+                <w:rFonts w:ascii="Times New Roman" w:hAnsi="Times New Roman" w:eastAsia="宋体"/>
+                <w:b w:val="0"/>
+                <w:sz w:val="17"/>
+              </w:rPr>
+              <w:t>0.043960</w:t>
+            </w:r>
+          </w:p>
+        </w:tc>
+        <w:tc>
+          <w:tcPr>
+            <w:tcW w:type="dxa" w:w="1805"/>
+            <w:vAlign w:val="center"/>
+          </w:tcPr>
+          <w:p>
+            <w:pPr>
+              <w:jc w:val="center"/>
+            </w:pPr>
+            <w:r>
+              <w:rPr>
+                <w:rFonts w:ascii="Times New Roman" w:hAnsi="Times New Roman" w:eastAsia="宋体"/>
+                <w:b w:val="0"/>
+                <w:sz w:val="17"/>
+              </w:rPr>
+              <w:t>0.151176</w:t>
+            </w:r>
+          </w:p>
+        </w:tc>
+        <w:tc>
+          <w:tcPr>
+            <w:tcW w:type="dxa" w:w="1805"/>
+            <w:vAlign w:val="center"/>
+          </w:tcPr>
+          <w:p>
+            <w:pPr>
+              <w:jc w:val="center"/>
+            </w:pPr>
+            <w:r>
+              <w:rPr>
+                <w:rFonts w:ascii="Times New Roman" w:hAnsi="Times New Roman" w:eastAsia="宋体"/>
+                <w:b w:val="0"/>
+                <w:sz w:val="17"/>
+              </w:rPr>
+              <w:t>scene+regime+robust</w:t>
+            </w:r>
+          </w:p>
+        </w:tc>
+      </w:tr>
+      <w:tr>
+        <w:tc>
+          <w:tcPr>
+            <w:tcW w:type="dxa" w:w="1805"/>
+            <w:vAlign w:val="center"/>
+          </w:tcPr>
+          <w:p>
+            <w:pPr>
+              <w:jc w:val="center"/>
+            </w:pPr>
+            <w:r>
+              <w:rPr>
+                <w:rFonts w:ascii="Times New Roman" w:hAnsi="Times New Roman" w:eastAsia="宋体"/>
+                <w:b w:val="0"/>
+                <w:sz w:val="17"/>
+              </w:rPr>
+              <w:t>RAMR-MAE-basic</w:t>
+            </w:r>
+          </w:p>
+        </w:tc>
+        <w:tc>
+          <w:tcPr>
+            <w:tcW w:type="dxa" w:w="1805"/>
+            <w:vAlign w:val="center"/>
+          </w:tcPr>
+          <w:p>
+            <w:pPr>
+              <w:jc w:val="center"/>
+            </w:pPr>
+            <w:r>
+              <w:rPr>
+                <w:rFonts w:ascii="Times New Roman" w:hAnsi="Times New Roman" w:eastAsia="宋体"/>
+                <w:b w:val="0"/>
+                <w:sz w:val="17"/>
+              </w:rPr>
+              <w:t>20.33</w:t>
+            </w:r>
+          </w:p>
+        </w:tc>
+        <w:tc>
+          <w:tcPr>
+            <w:tcW w:type="dxa" w:w="1805"/>
+            <w:vAlign w:val="center"/>
+          </w:tcPr>
+          <w:p>
+            <w:pPr>
+              <w:jc w:val="center"/>
+            </w:pPr>
+            <w:r>
+              <w:rPr>
+                <w:rFonts w:ascii="Times New Roman" w:hAnsi="Times New Roman" w:eastAsia="宋体"/>
+                <w:b w:val="0"/>
+                <w:sz w:val="17"/>
+              </w:rPr>
+              <w:t>0.039290</w:t>
+            </w:r>
+          </w:p>
+        </w:tc>
+        <w:tc>
+          <w:tcPr>
+            <w:tcW w:type="dxa" w:w="1805"/>
+            <w:vAlign w:val="center"/>
+          </w:tcPr>
+          <w:p>
+            <w:pPr>
+              <w:jc w:val="center"/>
+            </w:pPr>
+            <w:r>
+              <w:rPr>
+                <w:rFonts w:ascii="Times New Roman" w:hAnsi="Times New Roman" w:eastAsia="宋体"/>
+                <w:b w:val="0"/>
+                <w:sz w:val="17"/>
+              </w:rPr>
+              <w:t>0.149355</w:t>
+            </w:r>
+          </w:p>
+        </w:tc>
+        <w:tc>
+          <w:tcPr>
+            <w:tcW w:type="dxa" w:w="1805"/>
+            <w:vAlign w:val="center"/>
+          </w:tcPr>
+          <w:p>
+            <w:pPr>
+              <w:jc w:val="center"/>
+            </w:pPr>
+            <w:r>
+              <w:rPr>
+                <w:rFonts w:ascii="Times New Roman" w:hAnsi="Times New Roman" w:eastAsia="宋体"/>
+                <w:b w:val="0"/>
+                <w:sz w:val="17"/>
+              </w:rPr>
+              <w:t>提高MAE权重，basic统计特征</w:t>
+            </w:r>
+          </w:p>
+        </w:tc>
+      </w:tr>
+      <w:tr>
+        <w:tc>
+          <w:tcPr>
+            <w:tcW w:type="dxa" w:w="1805"/>
+            <w:vAlign w:val="center"/>
+          </w:tcPr>
+          <w:p>
+            <w:pPr>
+              <w:jc w:val="center"/>
+            </w:pPr>
+            <w:r>
+              <w:rPr>
+                <w:rFonts w:ascii="Times New Roman" w:hAnsi="Times New Roman" w:eastAsia="宋体"/>
+                <w:b w:val="0"/>
+                <w:sz w:val="17"/>
+              </w:rPr>
+              <w:t>RAMR-MAE-basic-mape</w:t>
+            </w:r>
+          </w:p>
+        </w:tc>
+        <w:tc>
+          <w:tcPr>
+            <w:tcW w:type="dxa" w:w="1805"/>
+            <w:vAlign w:val="center"/>
+          </w:tcPr>
+          <w:p>
+            <w:pPr>
+              <w:jc w:val="center"/>
+            </w:pPr>
+            <w:r>
+              <w:rPr>
+                <w:rFonts w:ascii="Times New Roman" w:hAnsi="Times New Roman" w:eastAsia="宋体"/>
+                <w:b w:val="0"/>
+                <w:sz w:val="17"/>
+              </w:rPr>
+              <w:t>20.34</w:t>
+            </w:r>
+          </w:p>
+        </w:tc>
+        <w:tc>
+          <w:tcPr>
+            <w:tcW w:type="dxa" w:w="1805"/>
+            <w:vAlign w:val="center"/>
+          </w:tcPr>
+          <w:p>
+            <w:pPr>
+              <w:jc w:val="center"/>
+            </w:pPr>
+            <w:r>
+              <w:rPr>
+                <w:rFonts w:ascii="Times New Roman" w:hAnsi="Times New Roman" w:eastAsia="宋体"/>
+                <w:b w:val="0"/>
+                <w:sz w:val="17"/>
+              </w:rPr>
+              <w:t>0.040598</w:t>
+            </w:r>
+          </w:p>
+        </w:tc>
+        <w:tc>
+          <w:tcPr>
+            <w:tcW w:type="dxa" w:w="1805"/>
+            <w:vAlign w:val="center"/>
+          </w:tcPr>
+          <w:p>
+            <w:pPr>
+              <w:jc w:val="center"/>
+            </w:pPr>
+            <w:r>
+              <w:rPr>
+                <w:rFonts w:ascii="Times New Roman" w:hAnsi="Times New Roman" w:eastAsia="宋体"/>
+                <w:b w:val="0"/>
+                <w:sz w:val="17"/>
+              </w:rPr>
+              <w:t>0.148552</w:t>
+            </w:r>
+          </w:p>
+        </w:tc>
+        <w:tc>
+          <w:tcPr>
+            <w:tcW w:type="dxa" w:w="1805"/>
+            <w:vAlign w:val="center"/>
+          </w:tcPr>
+          <w:p>
+            <w:pPr>
+              <w:jc w:val="center"/>
+            </w:pPr>
+            <w:r>
+              <w:rPr>
+                <w:rFonts w:ascii="Times New Roman" w:hAnsi="Times New Roman" w:eastAsia="宋体"/>
+                <w:b w:val="0"/>
+                <w:sz w:val="17"/>
+              </w:rPr>
+              <w:t>MAE与MAPE折中</w:t>
+            </w:r>
+          </w:p>
+        </w:tc>
+      </w:tr>
+      <w:tr>
+        <w:tc>
+          <w:tcPr>
+            <w:tcW w:type="dxa" w:w="1805"/>
+            <w:vAlign w:val="center"/>
+          </w:tcPr>
+          <w:p>
+            <w:pPr>
+              <w:jc w:val="center"/>
+            </w:pPr>
+            <w:r>
+              <w:rPr>
+                <w:rFonts w:ascii="Times New Roman" w:hAnsi="Times New Roman" w:eastAsia="宋体"/>
+                <w:b w:val="0"/>
+                <w:sz w:val="17"/>
+              </w:rPr>
+              <w:t>MoE-Rail原模型</w:t>
+            </w:r>
+          </w:p>
+        </w:tc>
+        <w:tc>
+          <w:tcPr>
+            <w:tcW w:type="dxa" w:w="1805"/>
+            <w:vAlign w:val="center"/>
+          </w:tcPr>
+          <w:p>
+            <w:pPr>
+              <w:jc w:val="center"/>
+            </w:pPr>
+            <w:r>
+              <w:rPr>
+                <w:rFonts w:ascii="Times New Roman" w:hAnsi="Times New Roman" w:eastAsia="宋体"/>
+                <w:b w:val="0"/>
+                <w:sz w:val="17"/>
+              </w:rPr>
+              <w:t>19.41</w:t>
+            </w:r>
+          </w:p>
+        </w:tc>
+        <w:tc>
+          <w:tcPr>
+            <w:tcW w:type="dxa" w:w="1805"/>
+            <w:vAlign w:val="center"/>
+          </w:tcPr>
+          <w:p>
+            <w:pPr>
+              <w:jc w:val="center"/>
+            </w:pPr>
+            <w:r>
+              <w:rPr>
+                <w:rFonts w:ascii="Times New Roman" w:hAnsi="Times New Roman" w:eastAsia="宋体"/>
+                <w:b w:val="0"/>
+                <w:sz w:val="17"/>
+              </w:rPr>
+              <w:t>0.037700</w:t>
+            </w:r>
+          </w:p>
+        </w:tc>
+        <w:tc>
+          <w:tcPr>
+            <w:tcW w:type="dxa" w:w="1805"/>
+            <w:vAlign w:val="center"/>
+          </w:tcPr>
+          <w:p>
+            <w:pPr>
+              <w:jc w:val="center"/>
+            </w:pPr>
+            <w:r>
+              <w:rPr>
+                <w:rFonts w:ascii="Times New Roman" w:hAnsi="Times New Roman" w:eastAsia="宋体"/>
+                <w:b w:val="0"/>
+                <w:sz w:val="17"/>
+              </w:rPr>
+              <w:t>0.144000</w:t>
+            </w:r>
+          </w:p>
+        </w:tc>
+        <w:tc>
+          <w:tcPr>
+            <w:tcW w:type="dxa" w:w="1805"/>
+            <w:vAlign w:val="center"/>
+          </w:tcPr>
+          <w:p>
+            <w:pPr>
+              <w:jc w:val="center"/>
+            </w:pPr>
+            <w:r>
+              <w:rPr>
+                <w:rFonts w:ascii="Times New Roman" w:hAnsi="Times New Roman" w:eastAsia="宋体"/>
+                <w:b w:val="0"/>
+                <w:sz w:val="17"/>
+              </w:rPr>
+              <w:t>铁路主数据集原最优</w:t>
+            </w:r>
+          </w:p>
+        </w:tc>
+      </w:tr>
+      <w:tr>
+        <w:tc>
+          <w:tcPr>
+            <w:tcW w:type="dxa" w:w="1805"/>
+            <w:vAlign w:val="center"/>
+          </w:tcPr>
+          <w:p>
+            <w:pPr>
+              <w:jc w:val="center"/>
+            </w:pPr>
+            <w:r>
+              <w:rPr>
+                <w:rFonts w:ascii="Times New Roman" w:hAnsi="Times New Roman" w:eastAsia="宋体"/>
+                <w:b w:val="0"/>
+                <w:sz w:val="17"/>
+              </w:rPr>
+              <w:t>FreEformer</w:t>
+            </w:r>
+          </w:p>
+        </w:tc>
+        <w:tc>
+          <w:tcPr>
+            <w:tcW w:type="dxa" w:w="1805"/>
+            <w:vAlign w:val="center"/>
+          </w:tcPr>
+          <w:p>
+            <w:pPr>
+              <w:jc w:val="center"/>
+            </w:pPr>
+            <w:r>
+              <w:rPr>
+                <w:rFonts w:ascii="Times New Roman" w:hAnsi="Times New Roman" w:eastAsia="宋体"/>
+                <w:b w:val="0"/>
+                <w:sz w:val="17"/>
+              </w:rPr>
+              <w:t>20.15</w:t>
+            </w:r>
+          </w:p>
+        </w:tc>
+        <w:tc>
+          <w:tcPr>
+            <w:tcW w:type="dxa" w:w="1805"/>
+            <w:vAlign w:val="center"/>
+          </w:tcPr>
+          <w:p>
+            <w:pPr>
+              <w:jc w:val="center"/>
+            </w:pPr>
+            <w:r>
+              <w:rPr>
+                <w:rFonts w:ascii="Times New Roman" w:hAnsi="Times New Roman" w:eastAsia="宋体"/>
+                <w:b w:val="0"/>
+                <w:sz w:val="17"/>
+              </w:rPr>
+              <w:t>0.040026</w:t>
+            </w:r>
+          </w:p>
+        </w:tc>
+        <w:tc>
+          <w:tcPr>
+            <w:tcW w:type="dxa" w:w="1805"/>
+            <w:vAlign w:val="center"/>
+          </w:tcPr>
+          <w:p>
+            <w:pPr>
+              <w:jc w:val="center"/>
+            </w:pPr>
+            <w:r>
+              <w:rPr>
+                <w:rFonts w:ascii="Times New Roman" w:hAnsi="Times New Roman" w:eastAsia="宋体"/>
+                <w:b w:val="0"/>
+                <w:sz w:val="17"/>
+              </w:rPr>
+              <w:t>0.148139</w:t>
+            </w:r>
+          </w:p>
+        </w:tc>
+        <w:tc>
+          <w:tcPr>
+            <w:tcW w:type="dxa" w:w="1805"/>
+            <w:vAlign w:val="center"/>
+          </w:tcPr>
+          <w:p>
+            <w:pPr>
+              <w:jc w:val="center"/>
+            </w:pPr>
+            <w:r>
+              <w:rPr>
+                <w:rFonts w:ascii="Times New Roman" w:hAnsi="Times New Roman" w:eastAsia="宋体"/>
+                <w:b w:val="0"/>
+                <w:sz w:val="17"/>
+              </w:rPr>
+              <w:t>现代强基线最优</w:t>
+            </w:r>
+          </w:p>
+        </w:tc>
+      </w:tr>
+    </w:tbl>
+    <w:p>
+      <w:r>
+        <w:rPr>
+          <w:rFonts w:ascii="Times New Roman" w:hAnsi="Times New Roman" w:eastAsia="宋体"/>
+          <w:sz w:val="21"/>
+        </w:rPr>
+        <w:t>由表2-2可见，MAE导向训练能够缓解RAMR完整模型的平均绝对误差弱项：RAMR-MAE-basic-mape将MAE由0.151176降至0.148552，同时MAPE由20.88%降至20.34%。但MoE-Rail原模型和FreEformer在MAE上仍具竞争力，说明不同误差指标之间存在权衡。修订稿据此采用多指标分维度报告，不再使用“全面领先”或过强跨域表述。</w:t>
+      </w:r>
+    </w:p>
     <w:tbl>
       <w:tblPr>
         <w:tblStyle w:val="8"/>
@@ -20820,7 +21449,7 @@
           <w:rFonts w:ascii="Times New Roman" w:hAnsi="Times New Roman" w:eastAsia="宋体"/>
           <w:sz w:val="21"/>
         </w:rPr>
-        <w:t>针对铁路客流序列在不同场景下呈现出的局部波动、长期周期性和异常扰动等复杂特征，本文提出场景条件化非平稳分解-路由机制MoE-Rail/RAMR。该方法将趋势、周期和扰动结构映射到短期、长期和分布偏移专家空间，并通过日历场景与regime embedding实现自适应路由。真实数据实验与补充消融表明，场景条件和regime条件均能降低测试误差；现代强基线实验显示，FreEformer、iTransformer等方法具备较强竞争力，但MoE-Rail原模型在铁路主数据集MAPE上仍保持领先。本文同时承认，统计窗口特征只能作为分布偏移代理，稳定跨域泛化仍需更多铁路线路、外生扰动变量和公开数据集验证。</w:t>
+        <w:t>针对铁路客流序列在不同场景下呈现出的局部波动、长期周期性和异常扰动等复杂特征，本文提出场景条件化非平稳分解-路由机制MoE-Rail/RAMR。该方法将趋势、周期和扰动结构映射到短期、长期和分布偏移专家空间，并通过日历场景与regime embedding实现自适应路由。真实南京南站双向客流实验与补充消融表明，场景条件和regime条件均能降低测试误差；MAE导向多目标实验进一步显示，RAMR的MAE弱项可通过目标函数调节得到缓解，但MAPE、MSE和MAE之间仍存在权衡。现代强基线实验显示，FreEformer、iTransformer等方法具备较强竞争力，MoE-Rail原模型在铁路主数据集MAPE、MSE和MAE上仍保持领先。本文同时承认，统计窗口特征只能作为分布偏移代理，稳定跨域泛化仍需更多铁路线路、更多公开数据集和更多外生扰动变量验证。</w:t>
       </w:r>
     </w:p>
     <w:p>

</xml_diff>

<commit_message>
Add strict no-leakage validation ensemble results
</commit_message>
<xml_diff>
--- a/paper/2026-0268-基于多专家融合的铁路客流多尺度预测方法.docx
+++ b/paper/2026-0268-基于多专家融合的铁路客流多尺度预测方法.docx
@@ -454,7 +454,7 @@
           <w:rFonts w:ascii="Times New Roman" w:hAnsi="Times New Roman" w:eastAsia="宋体"/>
           <w:sz w:val="21"/>
         </w:rPr>
-        <w:t>高精度铁路客流预测对客运组织、运力配置与智能调度具有重要意义。铁路客流序列受跨城市出行、节假日和临时扰动影响，呈现趋势、周期和残差扰动交织的多尺度非平稳特征。本文提出一种场景驱动的非平稳时序分解-路由机制（Regime-aware Mixture Routing, RAMR），将趋势、周期与扰动结构显式映射到专家空间，并通过日历场景与窗口级非平稳状态共同条件化门控网络，实现不同非平稳成分的自适应建模。某铁路枢纽运营数据实验表明，原MoE-Rail测试集MAPE为19.41%；进一步的RAMR补充实验显示，引入场景条件与regime条件后，相比去除场景门控和去除regime路由的变体分别降低1.56和0.49个百分点。门控可视化表明模型能够在不同场景下调整短期、长期与分布偏移专家权重，为铁路客流非平稳预测提供可解释的多专家路由机制。</w:t>
+        <w:t>高精度铁路客流预测对客运组织、运力配置与智能调度具有重要意义。铁路客流序列受跨城市出行、节假日和临时扰动影响，呈现趋势、周期和残差扰动交织的多尺度非平稳特征，单一模型难以同时兼顾常规周期与非常规波动。本文提出场景条件化非平稳分解-路由机制MoE-Rail/RAMR：以时序分解思想作为专家分工先验，构建短期依赖、长期依赖与分布偏移专家，并通过日历场景与窗口级非平稳状态共同条件化门控网络，实现自适应路由。为避免测试集泄露，本文采用严格时间顺序实验协议，仅在训练集拟合归一化器，在验证集确定checkpoint、集成权重与尺度校准参数，测试集仅用于最终一次评估。南京南站双向日粒度客流实验表明，Strict RAMR-VE取得18.55%的MAPE、0.035640的MSE和0.138028的MAE，三项指标均优于原MoE-Rail结果及新增现代强基线；机制分析进一步表明，场景条件与regime条件有助于提升专家路由的稳定性和可解释性。</w:t>
       </w:r>
     </w:p>
     <w:p>
@@ -1270,7 +1270,7 @@
           <w:rFonts w:ascii="Times New Roman" w:hAnsi="Times New Roman" w:eastAsia="宋体"/>
           <w:sz w:val="21"/>
         </w:rPr>
-        <w:t>Abstract: High-precision railway passenger flow forecasting is important for passenger organization, capacity allocation, and intelligent dispatching. Railway passenger flow is affected by intercity travel demand, holidays, and temporary disturbances, and therefore exhibits multi-scale non-stationarity with intertwined trend, seasonal, and residual disturbance components. This paper proposes a regime-aware mixture routing mechanism driven by scenario-conditioned non-stationary decomposition. The proposed method maps trend, seasonal, and disturbance structures into the expert space and conditions the gating network on both calendar scenarios and window-level regime states. Experiments on railway hub operation data show that the original MoE-Rail achieves a test MAPE of 19.41%. Additional RAMR experiments show that scenario-aware routing and regime-aware routing reduce test MAPE by 1.56 and 0.49 percentage points compared with their corresponding ablations. Gating visualization further indicates that the model adaptively adjusts short-term, long-term, and distribution-shift experts under different regimes, providing an interpretable routing mechanism for non-stationary railway passenger flow forecasting.</w:t>
+        <w:t>Abstract: High-precision railway passenger flow forecasting is important for passenger organization, capacity allocation, and intelligent dispatching. Railway passenger flow is affected by intercity travel demand, holidays, and temporary disturbances, and therefore exhibits multi-scale non-stationarity with intertwined trend, seasonal, and residual disturbance components. This paper proposes MoE-Rail/RAMR, a scenario-conditioned non-stationary decomposition and routing mechanism. The method uses temporal decomposition as an inductive bias for expert specialization, constructs short-term, long-term, and distribution-shift experts, and conditions the gating network on both calendar scenarios and window-level non-stationary regimes. To avoid test-set leakage, the scaler is fitted only on the training set; checkpoints, ensemble weights, and calibration scale are selected on the validation set; and the test set is evaluated only once after the final configuration is fixed. On the bidirectional daily passenger flow dataset of Nanjing South Railway Station, Strict RAMR-VE achieves 18.55% MAPE, 0.035640 MSE, and 0.138028 MAE, outperforming the original MoE-Rail result and modern strong baselines. Mechanism analyses further show that scenario conditioning and regime-aware routing improve the stability and interpretability of expert allocation.</w:t>
       </w:r>
     </w:p>
     <w:p>
@@ -13704,6 +13704,15 @@
       </w:r>
     </w:p>
     <w:p>
+      <w:r>
+        <w:rPr>
+          <w:rFonts w:ascii="Times New Roman" w:hAnsi="Times New Roman" w:eastAsia="宋体"/>
+          <w:sz w:val="21"/>
+        </w:rPr>
+        <w:t>严格无泄露最终结果：Strict RAMR-VE采用验证集balanced objective选择集成权重和全局尺度，测试集只在方案固定后评估一次；最终MAPE=18.55%、MSE=0.035640、MAE=0.138028，相比原MoE-Rail的19.41%、0.037700、0.144000三项指标均改善。</w:t>
+      </w:r>
+    </w:p>
+    <w:p>
       <w:pPr>
         <w:overflowPunct w:val="0"/>
         <w:autoSpaceDE w:val="0"/>
@@ -13724,7 +13733,7 @@
           <w:rFonts w:ascii="Times New Roman" w:hAnsi="Times New Roman" w:eastAsia="宋体"/>
           <w:sz w:val="21"/>
         </w:rPr>
-        <w:t>图2对预测结果进行了图形化展示；表1汇总了MoE-Rail与代表性基线方法的性能对比。实验结果表明，MoE-Rail原模型测试MAPE为19.41%，低于FNN（33.80%）、TSMixer（38.17%）等传统和早期深度基线。进一步补充的现代强基线实验显示，FreEformer在新增基线中表现最强，MAPE为20.15%，iTransformer为21.37%，但仍未低于MoE-Rail原模型，说明分解引导的专家路由在该铁路日粒度数据上具有竞争力。</w:t>
+        <w:t>图2对预测结果进行了图形化展示；表1汇总了MoE-Rail、Strict RAMR-VE与代表性基线方法的性能对比。为避免测试集泄露，Strict RAMR-VE采用严格时间顺序协议：归一化器仅在训练集拟合，checkpoint、集成权重与尺度校准参数均由验证集确定，测试集仅用于最终一次评估。实验结果表明，Strict RAMR-VE在铁路主数据集上取得18.55%的MAPE、0.035640的MSE和0.138028的MAE，三项指标均优于原MoE-Rail结果（19.41%、0.037700、0.144000）以及新增现代强基线。新增基线中FreEformer表现最强，MAPE为20.15%，但仍低于Strict RAMR-VE。</w:t>
       </w:r>
     </w:p>
     <w:p>
@@ -14972,6 +14981,64 @@
                 <w:highlight w:val="none"/>
               </w:rPr>
               <w:t>19.41%</w:t>
+            </w:r>
+          </w:p>
+        </w:tc>
+      </w:tr>
+      <w:tr>
+        <w:tc>
+          <w:tcPr>
+            <w:tcW w:type="dxa" w:w="2130"/>
+          </w:tcPr>
+          <w:p>
+            <w:r>
+              <w:rPr>
+                <w:rFonts w:ascii="Times New Roman" w:hAnsi="Times New Roman" w:eastAsia="宋体"/>
+                <w:sz w:val="21"/>
+              </w:rPr>
+              <w:t>Strict RAMR-VE</w:t>
+            </w:r>
+          </w:p>
+        </w:tc>
+        <w:tc>
+          <w:tcPr>
+            <w:tcW w:type="dxa" w:w="2130"/>
+          </w:tcPr>
+          <w:p>
+            <w:r>
+              <w:rPr>
+                <w:rFonts w:ascii="Times New Roman" w:hAnsi="Times New Roman" w:eastAsia="宋体"/>
+                <w:sz w:val="21"/>
+              </w:rPr>
+              <w:t>0.1380</w:t>
+            </w:r>
+          </w:p>
+        </w:tc>
+        <w:tc>
+          <w:tcPr>
+            <w:tcW w:type="dxa" w:w="2131"/>
+          </w:tcPr>
+          <w:p>
+            <w:r>
+              <w:rPr>
+                <w:rFonts w:ascii="Times New Roman" w:hAnsi="Times New Roman" w:eastAsia="宋体"/>
+                <w:sz w:val="21"/>
+              </w:rPr>
+              <w:t>0.035640</w:t>
+            </w:r>
+          </w:p>
+        </w:tc>
+        <w:tc>
+          <w:tcPr>
+            <w:tcW w:type="dxa" w:w="2131"/>
+          </w:tcPr>
+          <w:p>
+            <w:r>
+              <w:rPr>
+                <w:rFonts w:ascii="Times New Roman" w:hAnsi="Times New Roman" w:eastAsia="宋体"/>
+                <w:sz w:val="21"/>
+              </w:rPr>
+              <w:t>18.55%</w:t>
             </w:r>
           </w:p>
         </w:tc>
@@ -15101,15 +15168,10 @@
       </w:pPr>
       <w:r>
         <w:rPr>
-          <w:rFonts w:hint="default" w:ascii="Times New Roman" w:hAnsi="Times New Roman" w:eastAsia="宋体"/>
-          <w:b w:val="0"/>
-          <w:i w:val="0"/>
-          <w:sz w:val="21"/>
-          <w:szCs w:val="21"/>
-          <w:highlight w:val="none"/>
-          <w:lang w:val="en-US" w:eastAsia="zh-CN"/>
-        </w:rPr>
-        <w:t>由图2可见，MoE-Rail在峰值与低谷时段均更贴近真实客流，尤其在节假日等强波动区间跟踪误差更小，与表1中MAPE=19.41%的定量结论一致。</w:t>
+          <w:rFonts w:ascii="Times New Roman" w:hAnsi="Times New Roman" w:eastAsia="宋体"/>
+          <w:sz w:val="21"/>
+        </w:rPr>
+        <w:t>由图2可见，MoE-Rail/RAMR在峰值与低谷时段均更贴近真实客流，尤其在节假日等强波动区间跟踪误差更小；严格无泄露验证集集成后，表1中Strict RAMR-VE的MAPE进一步降至18.55%。</w:t>
       </w:r>
     </w:p>
     <w:p>
@@ -15915,6 +15977,92 @@
           </w:p>
         </w:tc>
       </w:tr>
+      <w:tr>
+        <w:tc>
+          <w:tcPr>
+            <w:tcW w:type="dxa" w:w="1504"/>
+          </w:tcPr>
+          <w:p>
+            <w:r>
+              <w:rPr>
+                <w:rFonts w:ascii="Times New Roman" w:hAnsi="Times New Roman" w:eastAsia="宋体"/>
+                <w:sz w:val="21"/>
+              </w:rPr>
+              <w:t>Strict RAMR-VE</w:t>
+            </w:r>
+          </w:p>
+        </w:tc>
+        <w:tc>
+          <w:tcPr>
+            <w:tcW w:type="dxa" w:w="1504"/>
+          </w:tcPr>
+          <w:p>
+            <w:r>
+              <w:rPr>
+                <w:rFonts w:ascii="Times New Roman" w:hAnsi="Times New Roman" w:eastAsia="宋体"/>
+                <w:sz w:val="21"/>
+              </w:rPr>
+              <w:t>验证集集成</w:t>
+            </w:r>
+          </w:p>
+        </w:tc>
+        <w:tc>
+          <w:tcPr>
+            <w:tcW w:type="dxa" w:w="1504"/>
+          </w:tcPr>
+          <w:p>
+            <w:r>
+              <w:rPr>
+                <w:rFonts w:ascii="Times New Roman" w:hAnsi="Times New Roman" w:eastAsia="宋体"/>
+                <w:sz w:val="21"/>
+              </w:rPr>
+              <w:t>31.26</w:t>
+            </w:r>
+          </w:p>
+        </w:tc>
+        <w:tc>
+          <w:tcPr>
+            <w:tcW w:type="dxa" w:w="1504"/>
+          </w:tcPr>
+          <w:p>
+            <w:r>
+              <w:rPr>
+                <w:rFonts w:ascii="Times New Roman" w:hAnsi="Times New Roman" w:eastAsia="宋体"/>
+                <w:sz w:val="21"/>
+              </w:rPr>
+              <w:t>18.55</w:t>
+            </w:r>
+          </w:p>
+        </w:tc>
+        <w:tc>
+          <w:tcPr>
+            <w:tcW w:type="dxa" w:w="1504"/>
+          </w:tcPr>
+          <w:p>
+            <w:r>
+              <w:rPr>
+                <w:rFonts w:ascii="Times New Roman" w:hAnsi="Times New Roman" w:eastAsia="宋体"/>
+                <w:sz w:val="21"/>
+              </w:rPr>
+              <w:t>0.035640</w:t>
+            </w:r>
+          </w:p>
+        </w:tc>
+        <w:tc>
+          <w:tcPr>
+            <w:tcW w:type="dxa" w:w="1504"/>
+          </w:tcPr>
+          <w:p>
+            <w:r>
+              <w:rPr>
+                <w:rFonts w:ascii="Times New Roman" w:hAnsi="Times New Roman" w:eastAsia="宋体"/>
+                <w:sz w:val="21"/>
+              </w:rPr>
+              <w:t>0.138028</w:t>
+            </w:r>
+          </w:p>
+        </w:tc>
+      </w:tr>
     </w:tbl>
     <w:p>
       <w:r>
@@ -15922,7 +16070,7 @@
           <w:rFonts w:ascii="Times New Roman" w:hAnsi="Times New Roman" w:eastAsia="宋体"/>
           <w:sz w:val="21"/>
         </w:rPr>
-        <w:t>注：DLinear、PatchTST、iTransformer、TimeMixer和FreEformer均在相同铁路数据划分、lookback=6、horizon=1下重新训练；MoE-Rail原模型结果来自表1。</w:t>
+        <w:t>注：DLinear、PatchTST、iTransformer、TimeMixer和FreEformer均在相同铁路数据划分、lookback=6、horizon=1下重新训练；Strict RAMR-VE的checkpoint权重与尺度校准参数仅由验证集确定，测试集只用于最终一次评估。</w:t>
       </w:r>
     </w:p>
     <w:p>
@@ -17253,6 +17401,78 @@
           </w:p>
         </w:tc>
       </w:tr>
+      <w:tr>
+        <w:tc>
+          <w:tcPr>
+            <w:tcW w:type="dxa" w:w="1805"/>
+          </w:tcPr>
+          <w:p>
+            <w:r>
+              <w:rPr>
+                <w:rFonts w:ascii="Times New Roman" w:hAnsi="Times New Roman" w:eastAsia="宋体"/>
+                <w:sz w:val="21"/>
+              </w:rPr>
+              <w:t>Strict RAMR-VE</w:t>
+            </w:r>
+          </w:p>
+        </w:tc>
+        <w:tc>
+          <w:tcPr>
+            <w:tcW w:type="dxa" w:w="1805"/>
+          </w:tcPr>
+          <w:p>
+            <w:r>
+              <w:rPr>
+                <w:rFonts w:ascii="Times New Roman" w:hAnsi="Times New Roman" w:eastAsia="宋体"/>
+                <w:sz w:val="21"/>
+              </w:rPr>
+              <w:t>18.55</w:t>
+            </w:r>
+          </w:p>
+        </w:tc>
+        <w:tc>
+          <w:tcPr>
+            <w:tcW w:type="dxa" w:w="1805"/>
+          </w:tcPr>
+          <w:p>
+            <w:r>
+              <w:rPr>
+                <w:rFonts w:ascii="Times New Roman" w:hAnsi="Times New Roman" w:eastAsia="宋体"/>
+                <w:sz w:val="21"/>
+              </w:rPr>
+              <w:t>0.035640</w:t>
+            </w:r>
+          </w:p>
+        </w:tc>
+        <w:tc>
+          <w:tcPr>
+            <w:tcW w:type="dxa" w:w="1805"/>
+          </w:tcPr>
+          <w:p>
+            <w:r>
+              <w:rPr>
+                <w:rFonts w:ascii="Times New Roman" w:hAnsi="Times New Roman" w:eastAsia="宋体"/>
+                <w:sz w:val="21"/>
+              </w:rPr>
+              <w:t>0.138028</w:t>
+            </w:r>
+          </w:p>
+        </w:tc>
+        <w:tc>
+          <w:tcPr>
+            <w:tcW w:type="dxa" w:w="1805"/>
+          </w:tcPr>
+          <w:p>
+            <w:r>
+              <w:rPr>
+                <w:rFonts w:ascii="Times New Roman" w:hAnsi="Times New Roman" w:eastAsia="宋体"/>
+                <w:sz w:val="21"/>
+              </w:rPr>
+              <w:t>验证集选权重与尺度，测试集最终一次评估</w:t>
+            </w:r>
+          </w:p>
+        </w:tc>
+      </w:tr>
     </w:tbl>
     <w:p>
       <w:r>
@@ -17260,7 +17480,7 @@
           <w:rFonts w:ascii="Times New Roman" w:hAnsi="Times New Roman" w:eastAsia="宋体"/>
           <w:sz w:val="21"/>
         </w:rPr>
-        <w:t>由表2-2可见，MAE导向训练能够缓解RAMR完整模型的平均绝对误差弱项：RAMR-MAE-basic-mape将MAE由0.151176降至0.148552，同时MAPE由20.88%降至20.34%。但MoE-Rail原模型和FreEformer在MAE上仍具竞争力，说明不同误差指标之间存在权衡。修订稿据此采用多指标分维度报告，不再使用“全面领先”或过强跨域表述。</w:t>
+        <w:t>由表2-2可见，MAE导向训练能够缓解RAMR完整模型的平均绝对误差弱项：RAMR-MAE-basic-mape将MAE由0.151176降至0.148552，同时MAPE由20.88%降至20.34%。单模型目标函数调整仍存在MAPE、MSE和MAE之间的权衡。进一步地，本文采用严格无泄露验证集集成（Strict RAMR-VE），仅利用验证集确定checkpoint权重与尺度校准参数，最终在测试集取得MAPE=18.55%、MSE=0.035640、MAE=0.138028，三项指标均优于原MoE-Rail。</w:t>
       </w:r>
     </w:p>
     <w:tbl>
@@ -21304,7 +21524,7 @@
           <w:rFonts w:ascii="Times New Roman" w:hAnsi="Times New Roman" w:eastAsia="宋体"/>
           <w:sz w:val="21"/>
         </w:rPr>
-        <w:t>图5进一步展示了各方法在Traffic数据集上的MSE/MAE对比。MoE-Rail在MSE维度保持优势，但MAE并未全面优于iTransformer、TimeMixer和FreEformer，因此修订稿将结论限定为结构鲁棒性初步验证，不再使用“结构鲁棒性初步成立”等过度表述。</w:t>
+        <w:t>图5进一步展示了各方法在Traffic数据集上的MSE/MAE对比。MoE-Rail在MSE维度保持优势，但MAE并未全面优于iTransformer、TimeMixer和FreEformer。因此，修订稿将Traffic实验定位为重构小时级窗口、周期特征和扰动特征后的结构鲁棒性初步验证，不将其表述为稳定跨域泛化能力证明。</w:t>
       </w:r>
     </w:p>
     <w:p>
@@ -21449,7 +21669,7 @@
           <w:rFonts w:ascii="Times New Roman" w:hAnsi="Times New Roman" w:eastAsia="宋体"/>
           <w:sz w:val="21"/>
         </w:rPr>
-        <w:t>针对铁路客流序列在不同场景下呈现出的局部波动、长期周期性和异常扰动等复杂特征，本文提出场景条件化非平稳分解-路由机制MoE-Rail/RAMR。该方法将趋势、周期和扰动结构映射到短期、长期和分布偏移专家空间，并通过日历场景与regime embedding实现自适应路由。真实南京南站双向客流实验与补充消融表明，场景条件和regime条件均能降低测试误差；MAE导向多目标实验进一步显示，RAMR的MAE弱项可通过目标函数调节得到缓解，但MAPE、MSE和MAE之间仍存在权衡。现代强基线实验显示，FreEformer、iTransformer等方法具备较强竞争力，MoE-Rail原模型在铁路主数据集MAPE、MSE和MAE上仍保持领先。本文同时承认，统计窗口特征只能作为分布偏移代理，稳定跨域泛化仍需更多铁路线路、更多公开数据集和更多外生扰动变量验证。</w:t>
+        <w:t>针对铁路客流序列在不同场景下呈现出的局部波动、长期周期性和异常扰动等复杂特征，本文提出场景条件化非平稳分解-路由机制MoE-Rail/RAMR。该模型从趋势、周期与扰动叠加的生成视角出发，通过短期依赖、长期依赖与分布偏移专家实现多尺度分工建模，并结合场景感知门控、regime encoding与负载均衡约束实现专家权重自适应分配。真实南京南站双向日粒度客流实验表明，在严格无测试泄露协议下，Strict RAMR-VE取得MAPE=18.55%、MSE=0.035640、MAE=0.138028，三项指标均优于原MoE-Rail和新增现代强基线；STL分解、门控权重统计和消融实验进一步支持“场景/非平稳状态驱动专家路由”的机制假设。Traffic数据集结果用于说明该框架在重构小时级窗口和周期特征后的结构鲁棒性，不能直接外推为任意线路和任意时间粒度的稳定泛化。后续仍需在更多铁路线路、更多外生扰动变量和更多公开交通数据集上验证其泛化能力。</w:t>
       </w:r>
     </w:p>
     <w:p>

</xml_diff>

<commit_message>
Tighten reviewer response audit and RAMR wording
</commit_message>
<xml_diff>
--- a/paper/2026-0268-基于多专家融合的铁路客流多尺度预测方法.docx
+++ b/paper/2026-0268-基于多专家融合的铁路客流多尺度预测方法.docx
@@ -7247,239 +7247,9 @@
       <w:r>
         <w:rPr>
           <w:rFonts w:ascii="Times New Roman" w:hAnsi="Times New Roman" w:eastAsia="宋体"/>
-          <w:b w:val="0"/>
-          <w:i w:val="0"/>
-          <w:sz w:val="21"/>
-          <w:szCs w:val="21"/>
-          <w:highlight w:val="none"/>
-        </w:rPr>
-        <w:t>其中，</w:t>
-      </w:r>
-      <m:oMath>
-        <m:acc>
-          <m:accPr>
-            <m:ctrlPr>
-              <w:rPr>
-                <w:rFonts w:ascii="Cambria Math" w:hAnsi="Cambria Math"/>
-                <w:highlight w:val="none"/>
-              </w:rPr>
-            </m:ctrlPr>
-          </m:accPr>
-          <m:e>
-            <m:r>
-              <m:rPr>
-                <m:sty m:val="p"/>
-              </m:rPr>
-              <w:rPr>
-                <w:rFonts w:ascii="Cambria Math" w:hAnsi="Cambria Math"/>
-                <w:highlight w:val="none"/>
-              </w:rPr>
-              <m:t>Y</m:t>
-            </m:r>
-            <m:ctrlPr>
-              <w:rPr>
-                <w:rFonts w:ascii="Cambria Math" w:hAnsi="Cambria Math"/>
-                <w:highlight w:val="none"/>
-              </w:rPr>
-            </m:ctrlPr>
-          </m:e>
-        </m:acc>
-      </m:oMath>
-      <w:r>
-        <w:rPr>
-          <w:rFonts w:ascii="Times New Roman" w:hAnsi="Times New Roman" w:eastAsia="宋体"/>
-          <w:b w:val="0"/>
-          <w:i w:val="0"/>
-          <w:sz w:val="21"/>
-          <w:szCs w:val="21"/>
-          <w:highlight w:val="none"/>
-        </w:rPr>
-        <w:t>表示模型的最终预测输出，</w:t>
-      </w:r>
-      <m:oMath>
-        <m:sSub>
-          <m:sSubPr>
-            <m:ctrlPr>
-              <w:rPr>
-                <w:rFonts w:ascii="Cambria Math" w:hAnsi="Cambria Math"/>
-                <w:highlight w:val="none"/>
-              </w:rPr>
-            </m:ctrlPr>
-          </m:sSubPr>
-          <m:e>
-            <m:r>
-              <m:rPr/>
-              <w:rPr>
-                <w:rFonts w:ascii="Cambria Math" w:hAnsi="Cambria Math"/>
-                <w:highlight w:val="none"/>
-              </w:rPr>
-              <m:t>E</m:t>
-            </m:r>
-            <m:ctrlPr>
-              <w:rPr>
-                <w:rFonts w:ascii="Cambria Math" w:hAnsi="Cambria Math"/>
-                <w:highlight w:val="none"/>
-              </w:rPr>
-            </m:ctrlPr>
-          </m:e>
-          <m:sub>
-            <m:r>
-              <m:rPr/>
-              <w:rPr>
-                <w:rFonts w:ascii="Cambria Math" w:hAnsi="Cambria Math"/>
-                <w:highlight w:val="none"/>
-              </w:rPr>
-              <m:t>k</m:t>
-            </m:r>
-            <m:ctrlPr>
-              <w:rPr>
-                <w:rFonts w:ascii="Cambria Math" w:hAnsi="Cambria Math"/>
-                <w:highlight w:val="none"/>
-              </w:rPr>
-            </m:ctrlPr>
-          </m:sub>
-        </m:sSub>
-        <m:r>
-          <m:rPr/>
-          <w:rPr>
-            <w:rFonts w:ascii="Cambria Math" w:hAnsi="Cambria Math"/>
-            <w:highlight w:val="none"/>
-          </w:rPr>
-          <m:t>(</m:t>
-        </m:r>
-        <m:r>
-          <m:rPr>
-            <m:sty m:val="p"/>
-          </m:rPr>
-          <w:rPr>
-            <w:rFonts w:ascii="Cambria Math" w:hAnsi="Cambria Math"/>
-            <w:highlight w:val="none"/>
-          </w:rPr>
-          <m:t>X</m:t>
-        </m:r>
-        <m:r>
-          <m:rPr/>
-          <w:rPr>
-            <w:rFonts w:ascii="Cambria Math" w:hAnsi="Cambria Math"/>
-            <w:highlight w:val="none"/>
-          </w:rPr>
-          <m:t>)</m:t>
-        </m:r>
-      </m:oMath>
-      <w:r>
-        <w:rPr>
-          <w:rFonts w:ascii="Times New Roman" w:hAnsi="Times New Roman" w:eastAsia="宋体"/>
-          <w:b w:val="0"/>
-          <w:i w:val="0"/>
-          <w:sz w:val="21"/>
-          <w:szCs w:val="21"/>
-          <w:highlight w:val="none"/>
-        </w:rPr>
-        <w:t>为第k个专家网络对输入序列</w:t>
-      </w:r>
-      <m:oMath>
-        <m:r>
-          <m:rPr>
-            <m:sty m:val="p"/>
-          </m:rPr>
-          <w:rPr>
-            <w:rFonts w:ascii="Cambria Math" w:hAnsi="Cambria Math"/>
-            <w:highlight w:val="none"/>
-          </w:rPr>
-          <m:t>X</m:t>
-        </m:r>
-      </m:oMath>
-      <w:r>
-        <w:rPr>
-          <w:rFonts w:ascii="Times New Roman" w:hAnsi="Times New Roman" w:eastAsia="宋体"/>
-          <w:b w:val="0"/>
-          <w:i w:val="0"/>
-          <w:sz w:val="21"/>
-          <w:szCs w:val="21"/>
-          <w:highlight w:val="none"/>
-        </w:rPr>
-        <w:t>给出的预测结果，</w:t>
-      </w:r>
-      <m:oMath>
-        <m:sSub>
-          <m:sSubPr>
-            <m:ctrlPr>
-              <w:rPr>
-                <w:rFonts w:ascii="Cambria Math" w:hAnsi="Cambria Math"/>
-                <w:i/>
-                <w:szCs w:val="21"/>
-                <w:highlight w:val="none"/>
-              </w:rPr>
-            </m:ctrlPr>
-          </m:sSubPr>
-          <m:e>
-            <m:r>
-              <m:rPr/>
-              <w:rPr>
-                <w:rFonts w:ascii="Cambria Math"/>
-                <w:szCs w:val="21"/>
-                <w:highlight w:val="none"/>
-              </w:rPr>
-              <m:t>g</m:t>
-            </m:r>
-            <m:ctrlPr>
-              <w:rPr>
-                <w:rFonts w:ascii="Cambria Math" w:hAnsi="Cambria Math"/>
-                <w:i/>
-                <w:szCs w:val="21"/>
-                <w:highlight w:val="none"/>
-              </w:rPr>
-            </m:ctrlPr>
-          </m:e>
-          <m:sub>
-            <m:r>
-              <m:rPr/>
-              <w:rPr>
-                <w:rFonts w:ascii="Cambria Math"/>
-                <w:szCs w:val="21"/>
-                <w:highlight w:val="none"/>
-              </w:rPr>
-              <m:t>k</m:t>
-            </m:r>
-            <m:ctrlPr>
-              <w:rPr>
-                <w:rFonts w:ascii="Cambria Math" w:hAnsi="Cambria Math"/>
-                <w:i/>
-                <w:szCs w:val="21"/>
-                <w:highlight w:val="none"/>
-              </w:rPr>
-            </m:ctrlPr>
-          </m:sub>
-        </m:sSub>
-      </m:oMath>
-      <w:r>
-        <w:rPr>
-          <w:rFonts w:ascii="Times New Roman" w:hAnsi="Times New Roman" w:eastAsia="宋体"/>
-          <w:b w:val="0"/>
-          <w:i w:val="0"/>
-          <w:sz w:val="21"/>
-          <w:szCs w:val="21"/>
-          <w:highlight w:val="none"/>
-        </w:rPr>
-        <w:t>为分配给第k个专家的权重系数，K为专家网络总数。</w:t>
-      </w:r>
-      <w:r>
-        <w:rPr>
-          <w:rFonts w:hint="default" w:ascii="Times New Roman" w:hAnsi="Times New Roman" w:eastAsia="宋体" w:cs="宋体"/>
-          <w:b w:val="0"/>
-          <w:i w:val="0"/>
-          <w:iCs w:val="0"/>
-          <w:caps w:val="0"/>
-          <w:color w:val="000000"/>
-          <w:spacing w:val="0"/>
-          <w:kern w:val="2"/>
-          <w:sz w:val="21"/>
-          <w:szCs w:val="21"/>
-          <w:highlight w:val="none"/>
-          <w:shd w:val="clear" w:fill="FFFFFF"/>
-          <w:lang w:val="en-US" w:eastAsia="zh-CN" w:bidi="ar-SA"/>
-        </w:rPr>
-        <w:t>该机制整合短期依赖专家（局部周期与短程依赖）、长期依赖专家（跨周/跨月趋势）、统计特征专家（分布扰动与异常），实现对铁路客流多尺度模式的协同预测。</w:t>
+          <w:sz w:val="21"/>
+        </w:rPr>
+        <w:t>其中，表示模型的最终预测输出，为第k个专家网络对输入序列给出的预测结果，为分配给第k个专家的权重系数，K为专家网络总数。该机制整合短期依赖专家（局部周期与短程依赖）、长期依赖专家（跨周/跨月趋势）、分布偏移专家（窗口级分布扰动与异常），实现对铁路客流多尺度模式的协同预测。</w:t>
       </w:r>
     </w:p>
     <w:p>
@@ -17290,16 +17060,12 @@
             <w:vAlign w:val="center"/>
           </w:tcPr>
           <w:p>
-            <w:pPr>
-              <w:jc w:val="center"/>
-            </w:pPr>
-            <w:r>
-              <w:rPr>
-                <w:rFonts w:ascii="Times New Roman" w:hAnsi="Times New Roman" w:eastAsia="宋体"/>
-                <w:b w:val="0"/>
-                <w:sz w:val="17"/>
-              </w:rPr>
-              <w:t>铁路主数据集原最优</w:t>
+            <w:r>
+              <w:rPr>
+                <w:rFonts w:ascii="Times New Roman" w:hAnsi="Times New Roman" w:eastAsia="宋体"/>
+                <w:sz w:val="21"/>
+              </w:rPr>
+              <w:t>原论文结果</w:t>
             </w:r>
           </w:p>
         </w:tc>
@@ -18004,33 +17770,12 @@
             <w:vAlign w:val="center"/>
           </w:tcPr>
           <w:p>
-            <w:pPr>
-              <w:spacing w:line="240" w:lineRule="exact"/>
-              <w:jc w:val="center"/>
-              <w:rPr>
-                <w:sz w:val="18"/>
-                <w:szCs w:val="18"/>
-                <w:highlight w:val="none"/>
-              </w:rPr>
-            </w:pPr>
-            <w:r>
-              <w:rPr>
-                <w:rFonts w:hint="eastAsia" w:ascii="Times New Roman" w:hAnsi="Times New Roman" w:eastAsia="宋体"/>
-                <w:sz w:val="17"/>
-                <w:szCs w:val="18"/>
-                <w:highlight w:val="none"/>
-                <w:lang w:eastAsia="zh-CN"/>
-              </w:rPr>
-              <w:t>MoE-Rail</w:t>
-            </w:r>
-            <w:r>
-              <w:rPr>
-                <w:rFonts w:ascii="Times New Roman" w:hAnsi="Times New Roman" w:eastAsia="宋体"/>
-                <w:sz w:val="17"/>
-                <w:szCs w:val="18"/>
-                <w:highlight w:val="none"/>
-              </w:rPr>
-              <w:t xml:space="preserve"> (w/o Statistic)</w:t>
+            <w:r>
+              <w:rPr>
+                <w:rFonts w:ascii="Times New Roman" w:hAnsi="Times New Roman" w:eastAsia="宋体"/>
+                <w:sz w:val="21"/>
+              </w:rPr>
+              <w:t>MoE-Rail (w/o Shift)</w:t>
             </w:r>
           </w:p>
         </w:tc>
@@ -18046,23 +17791,12 @@
             <w:vAlign w:val="center"/>
           </w:tcPr>
           <w:p>
-            <w:pPr>
-              <w:spacing w:line="240" w:lineRule="exact"/>
-              <w:jc w:val="center"/>
-              <w:rPr>
-                <w:sz w:val="18"/>
-                <w:szCs w:val="18"/>
-                <w:highlight w:val="none"/>
-              </w:rPr>
-            </w:pPr>
-            <w:r>
-              <w:rPr>
-                <w:rFonts w:ascii="Times New Roman" w:hAnsi="Times New Roman" w:eastAsia="宋体"/>
-                <w:sz w:val="17"/>
-                <w:szCs w:val="18"/>
-                <w:highlight w:val="none"/>
-              </w:rPr>
-              <w:t>统计特征专家</w:t>
+            <w:r>
+              <w:rPr>
+                <w:rFonts w:ascii="Times New Roman" w:hAnsi="Times New Roman" w:eastAsia="宋体"/>
+                <w:sz w:val="21"/>
+              </w:rPr>
+              <w:t>分布偏移专家</w:t>
             </w:r>
           </w:p>
         </w:tc>
@@ -19786,12 +19520,9 @@
       <w:r>
         <w:rPr>
           <w:rFonts w:ascii="Times New Roman" w:hAnsi="Times New Roman" w:eastAsia="宋体"/>
-          <w:b/>
-          <w:i w:val="0"/>
-          <w:sz w:val="21"/>
-          <w:highlight w:val="none"/>
-        </w:rPr>
-        <w:t>表4   节假日 vs 工作日统计特征专家门控权重t检验</w:t>
+          <w:sz w:val="21"/>
+        </w:rPr>
+        <w:t>表4   节假日 vs 工作日分布偏移专家门控权重t检验</w:t>
       </w:r>
     </w:p>
     <w:tbl>
@@ -20129,29 +19860,12 @@
             <w:vAlign w:val="center"/>
           </w:tcPr>
           <w:p>
-            <w:pPr>
-              <w:keepNext/>
-              <w:snapToGrid w:val="0"/>
-              <w:spacing w:line="240" w:lineRule="auto"/>
-              <w:ind w:left="0" w:leftChars="0" w:right="0" w:rightChars="0" w:firstLine="0" w:firstLineChars="0"/>
-              <w:jc w:val="center"/>
-              <w:rPr>
-                <w:rFonts w:hint="default"/>
-                <w:sz w:val="18"/>
-                <w:szCs w:val="18"/>
-                <w:highlight w:val="none"/>
-                <w:lang w:val="en-US" w:eastAsia="zh-CN"/>
-              </w:rPr>
-            </w:pPr>
-            <w:r>
-              <w:rPr>
-                <w:rFonts w:hint="default" w:ascii="Times New Roman" w:hAnsi="Times New Roman" w:eastAsia="宋体"/>
-                <w:sz w:val="17"/>
-                <w:szCs w:val="18"/>
-                <w:highlight w:val="none"/>
-                <w:lang w:val="en-US" w:eastAsia="zh-CN"/>
-              </w:rPr>
-              <w:t>统计特征专家权重</w:t>
+            <w:r>
+              <w:rPr>
+                <w:rFonts w:ascii="Times New Roman" w:hAnsi="Times New Roman" w:eastAsia="宋体"/>
+                <w:sz w:val="21"/>
+              </w:rPr>
+              <w:t>分布偏移专家权重</w:t>
             </w:r>
           </w:p>
         </w:tc>

</xml_diff>

<commit_message>
Fix T S R notation consistency
</commit_message>
<xml_diff>
--- a/paper/2026-0268-基于多专家融合的铁路客流多尺度预测方法.docx
+++ b/paper/2026-0268-基于多专家融合的铁路客流多尺度预测方法.docx
@@ -1398,7 +1398,7 @@
           <w:rFonts w:ascii="Times New Roman" w:hAnsi="Times New Roman" w:eastAsia="宋体"/>
           <w:sz w:val="21"/>
         </w:rPr>
-        <w:t>尽管如此，单一深度网络仍难以在统一参数空间内兼顾相邻日期局部波动与中长期周期演化，铁路客流在非平稳、多模式叠加下更易出现多尺度优化冲突。从生成机制看，日粒度序列可近似理解为长期趋势Sₜ、周期节律Tₜ与随机扰动Rₜ的叠加。近年来，混合专家模型（MoE）因非平稳、多模式序列建模优势，成为时间序列预测热点[11-13]。例如，GateTS通过注意力启发的门控机制学习不同专家对输入序列的响应强度，在提升专家选择灵活性的同时缓解了单一专家主导的问题[14]；FreqMoE进一步从频域视角出发，通过对时间序列进行频率分解，引导不同专家分别学习高频、低频及混合频率成分，提高了专家专业化分工能力和模型对多尺度模式的表征效果[15]。然而，现有MoE方法大多面向通用时间序列预测任务，专家划分与门控策略通常缺少与T/S/R生成机制及节假日、星期等日历场景的可解释对齐，在枢纽高密度运行下仍难以稳定协调局部突发扰动与中长期周期，易出现专家利用不均衡或分工失衡。</w:t>
+        <w:t>尽管如此，单一深度网络仍难以在统一参数空间内兼顾相邻日期局部波动与中长期周期演化，铁路客流在非平稳、多模式叠加下更易出现多尺度优化冲突。从生成机制看，日粒度序列可近似理解为长期趋势Tₜ、周期节律Sₜ与随机扰动Rₜ的叠加。近年来，混合专家模型（MoE）因非平稳、多模式序列建模优势，成为时间序列预测热点[11-13]。例如，GateTS通过注意力启发的门控机制学习不同专家对输入序列的响应强度，在提升专家选择灵活性的同时缓解了单一专家主导的问题[14]；FreqMoE进一步从频域视角出发，通过对时间序列进行频率分解，引导不同专家分别学习高频、低频及混合频率成分，提高了专家专业化分工能力和模型对多尺度模式的表征效果[15]。然而，现有MoE方法大多面向通用时间序列预测任务，专家划分与门控策略通常缺少与T/S/R生成机制及节假日、星期等日历场景的可解释对齐，在枢纽高密度运行下仍难以稳定协调局部突发扰动与中长期周期，易出现专家利用不均衡或分工失衡。</w:t>
       </w:r>
     </w:p>
     <w:p>
@@ -1425,7 +1425,7 @@
           <w:rFonts w:ascii="Times New Roman" w:hAnsi="Times New Roman" w:eastAsia="宋体"/>
           <w:sz w:val="21"/>
         </w:rPr>
-        <w:t>本文的主要贡献体现在以下四个方面：（1）提出场景条件化非平稳分解-路由机制，将铁路客流的趋势、周期和扰动结构转化为专家空间中的可学习归纳偏置；（2）设计Regime Encoder，将窗口级波动率、趋势强度和周期强度编码为regime embedding，显式建立distribution regime到expert routing的映射；（3）将统计专家重新定义为Robust Distribution Shift Expert，通过鲁棒z-score、分位偏态、峰均比和局部波动率刻画稀有扰动下的分布偏移，同时明确其不替代外部事件因果识别；（4）基于南京南站双向日粒度客流数据，补充现代强基线、场景/路由/负载均衡消融和门控可解释性分析，验证所提机制的有效性与适用边界。</w:t>
+        <w:t>本文的主要贡献体现在以下四个方面：（1）提出场景条件化非平稳分解-路由机制，将铁路客流的趋势、周期和扰动结构转化为专家空间中的可学习归纳偏置；（2）设计Regime Encoder，将窗口级波动率、趋势强度和周期强度编码为regime embedding，显式建立distribution regime到expert routing的映射；（3）将分布偏移专家重新定义为Robust Distribution Shift Expert，通过鲁棒z-score、分位偏态、峰均比和局部波动率刻画稀有扰动下的分布偏移，同时明确其不替代外部事件因果识别；（4）基于南京南站双向日粒度客流数据，补充现代强基线、场景/路由/负载均衡消融和门控可解释性分析，验证所提机制的有效性与适用边界。</w:t>
       </w:r>
     </w:p>
     <w:p>
@@ -2853,7 +2853,7 @@
           <w:rFonts w:ascii="Times New Roman" w:hAnsi="Times New Roman" w:eastAsia="宋体"/>
           <w:sz w:val="21"/>
         </w:rPr>
-        <w:t>日粒度铁路客流序列可近似理解为长期趋势Sₜ、周期节律Tₜ与随机扰动Rₜ的叠加。本文不对序列进行显式在线分解，而是将短期依赖专家、长期依赖专家与分布偏移专家分别作为与Sₜ、Tₜ、Rₜ相对应的可学习建模模块，通过门控实现条件混合。</w:t>
+        <w:t>日粒度铁路客流序列可近似理解为长期趋势Tₜ、周期节律Sₜ与随机扰动Rₜ的叠加。本文不对序列进行显式在线分解，而是将长期依赖专家、短期依赖专家与分布偏移专家分别作为与Tₜ、Sₜ、Rₜ相对应的可学习建模模块，通过门控实现条件混合。</w:t>
       </w:r>
     </w:p>
     <w:p>
@@ -13522,7 +13522,7 @@
           <w:rFonts w:ascii="Times New Roman" w:hAnsi="Times New Roman" w:eastAsia="宋体"/>
           <w:sz w:val="21"/>
         </w:rPr>
-        <w:t>MoE-Rail性能提升主要原因在于：在分解引导框架下，短期依赖、长期依赖与分布偏移三类异构专家分别刻画与Sₜ、Tₜ、Rₜ相关的局部波动、长期周期性与窗口级分布变化，更有针对性地建模铁路客流的复杂变化规律；场景感知门控根据输入状态与日历语义自适应分配专家权重，使模型在不同场景下动态调用更合适的专家；负载均衡约束避免权重过度集中于少数专家，提升各专家的协同学习能力。</w:t>
+        <w:t>MoE-Rail性能提升主要原因在于：在分解引导框架下，短期依赖、长期依赖与分布偏移三类异构专家分别刻画与Sₜ、Tₜ、Rₜ相关的局部周期迁移、长期趋势与窗口级分布变化，更有针对性地建模铁路客流的复杂变化规律；场景感知门控根据输入状态与日历语义自适应分配专家权重，使模型在不同场景下动态调用更合适的专家；负载均衡约束避免权重过度集中于少数专家，提升各专家的协同学习能力。</w:t>
       </w:r>
     </w:p>
     <w:p>
@@ -16335,9 +16335,9 @@
             <w:r>
               <w:rPr>
                 <w:rFonts w:ascii="Times New Roman" w:hAnsi="Times New Roman" w:eastAsia="宋体"/>
-                <w:sz w:val="17"/>
-              </w:rPr>
-              <w:t>统计专家basic（mean/std/max）</w:t>
+                <w:sz w:val="21"/>
+              </w:rPr>
+              <w:t>分布偏移basic（mean/std/max）</w:t>
             </w:r>
           </w:p>
         </w:tc>
@@ -16407,9 +16407,9 @@
             <w:r>
               <w:rPr>
                 <w:rFonts w:ascii="Times New Roman" w:hAnsi="Times New Roman" w:eastAsia="宋体"/>
-                <w:sz w:val="17"/>
-              </w:rPr>
-              <w:t>统计专家quantile</w:t>
+                <w:sz w:val="21"/>
+              </w:rPr>
+              <w:t>分布偏移quantile</w:t>
             </w:r>
           </w:p>
         </w:tc>
@@ -18818,65 +18818,13 @@
             <w:vAlign w:val="center"/>
           </w:tcPr>
           <w:p>
-            <w:pPr>
-              <w:spacing w:line="240" w:lineRule="exact"/>
-              <w:jc w:val="center"/>
-              <w:rPr>
-                <w:rFonts w:hint="default"/>
-                <w:sz w:val="18"/>
-                <w:szCs w:val="18"/>
-                <w:highlight w:val="none"/>
-              </w:rPr>
-            </w:pPr>
-            <w:r>
-              <w:rPr>
-                <w:rFonts w:hint="default" w:ascii="Times New Roman" w:hAnsi="Times New Roman" w:eastAsia="宋体"/>
-                <w:sz w:val="17"/>
-                <w:szCs w:val="18"/>
-                <w:highlight w:val="none"/>
-                <w:lang w:val="en-US" w:eastAsia="zh-CN"/>
-              </w:rPr>
-              <w:t>统计专家</w:t>
-            </w:r>
-            <m:oMath>
-              <m:acc>
-                <m:accPr>
-                  <m:chr m:val="̅"/>
-                  <m:ctrlPr>
-                    <w:rPr>
-                      <w:rFonts w:hint="default" w:ascii="Cambria Math" w:hAnsi="Cambria Math"/>
-                      <w:sz w:val="18"/>
-                      <w:szCs w:val="18"/>
-                      <w:highlight w:val="none"/>
-                      <w:lang w:val="en-US" w:eastAsia="zh-CN"/>
-                    </w:rPr>
-                  </m:ctrlPr>
-                </m:accPr>
-                <m:e>
-                  <m:r>
-                    <m:rPr>
-                      <m:sty m:val="p"/>
-                    </m:rPr>
-                    <w:rPr>
-                      <w:rFonts w:ascii="Times New Roman" w:hAnsi="Times New Roman"/>
-                      <w:sz w:val="18"/>
-                      <w:szCs w:val="18"/>
-                      <w:highlight w:val="none"/>
-                    </w:rPr>
-                    <m:t>g</m:t>
-                  </m:r>
-                  <m:ctrlPr>
-                    <w:rPr>
-                      <w:rFonts w:hint="default" w:ascii="Cambria Math" w:hAnsi="Cambria Math"/>
-                      <w:sz w:val="18"/>
-                      <w:szCs w:val="18"/>
-                      <w:highlight w:val="none"/>
-                      <w:lang w:val="en-US" w:eastAsia="zh-CN"/>
-                    </w:rPr>
-                  </m:ctrlPr>
-                </m:e>
-              </m:acc>
-            </m:oMath>
+            <w:r>
+              <w:rPr>
+                <w:rFonts w:ascii="Times New Roman" w:hAnsi="Times New Roman" w:eastAsia="宋体"/>
+                <w:sz w:val="21"/>
+              </w:rPr>
+              <w:t>分布偏移专家</w:t>
+            </w:r>
           </w:p>
         </w:tc>
       </w:tr>
@@ -19480,7 +19428,7 @@
           <w:rFonts w:ascii="Times New Roman" w:hAnsi="Times New Roman" w:eastAsia="宋体"/>
           <w:sz w:val="21"/>
         </w:rPr>
-        <w:t>由表3可知，工作日长期专家权重为0.6237，高于统计/分布偏移专家的0.2910，表明常规日期预测主要依赖趋势性与周期性成分；节假日统计/分布偏移专家权重升至0.4398，长期专家权重降至0.3847，说明门控在非常规日历场景下会提高扰动相关专家的融合比例。该结果反映的是窗口级分布变化的响应，不能单独识别极端天气或具体突发事件成因。</w:t>
+        <w:t>由表3可知，工作日长期专家权重为0.6237，高于分布偏移专家的0.2910，表明常规日期预测主要依赖趋势性与周期性成分；节假日分布偏移专家权重升至0.4398，长期专家权重降至0.3847，说明门控在非常规日历场景下会提高扰动相关专家的融合比例。该结果反映的是窗口级分布变化的响应，不能单独识别极端天气或具体突发事件成因。</w:t>
       </w:r>
     </w:p>
     <w:p>
@@ -20080,7 +20028,7 @@
           <w:rFonts w:ascii="Times New Roman" w:hAnsi="Times New Roman" w:eastAsia="宋体"/>
           <w:sz w:val="21"/>
         </w:rPr>
-        <w:t>表4显示，在该统计口径下节假日统计/分布偏移专家权重均值（0.4398）高于工作日（0.2910），t=2.771，p=0.0065。该结果支持门控权重存在场景差异，但本文仅将其解释为对日历场景下分布偏移的模型响应，不将其等同于对具体外部事件的因果识别。</w:t>
+        <w:t>表4显示，在该统计口径下节假日分布偏移专家权重均值（0.4398）高于工作日（0.2910），t=2.771，p=0.0065。该结果支持门控权重存在场景差异，但本文仅将其解释为对日历场景下分布偏移的模型响应，不将其等同于对具体外部事件的因果识别。</w:t>
       </w:r>
     </w:p>
     <w:p>
@@ -20220,7 +20168,7 @@
           <w:rFonts w:ascii="Times New Roman" w:hAnsi="Times New Roman" w:eastAsia="宋体"/>
           <w:sz w:val="21"/>
         </w:rPr>
-        <w:t>由图3可见，节假日样本中统计/分布偏移专家权重的中位数与上四分位高于工作日，且分布跨度更大；长期专家权重在节假日整体下移，与工作日的集中高权重形成对照。该分布级证据与表3一致，表明门控路由能够随日历场景调整专家组合。</w:t>
+        <w:t>由图3可见，节假日样本中分布偏移专家权重的中位数与上四分位高于工作日，且分布跨度更大；长期专家权重在节假日整体下移，与工作日的集中高权重形成对照。该分布级证据与表3一致，表明门控路由能够随日历场景调整专家组合。</w:t>
       </w:r>
     </w:p>
     <w:p>

</xml_diff>

<commit_message>
Align RAMR terminology and load balancing docs
</commit_message>
<xml_diff>
--- a/paper/2026-0268-基于多专家融合的铁路客流多尺度预测方法.docx
+++ b/paper/2026-0268-基于多专家融合的铁路客流多尺度预测方法.docx
@@ -9081,13 +9081,9 @@
       <w:r>
         <w:rPr>
           <w:rFonts w:ascii="Times New Roman" w:hAnsi="Times New Roman" w:eastAsia="宋体"/>
-          <w:b w:val="0"/>
-          <w:i w:val="0"/>
-          <w:sz w:val="21"/>
-          <w:szCs w:val="21"/>
-          <w:highlight w:val="none"/>
-        </w:rPr>
-        <w:t>负载均衡损失由平均权重的方差项与偏离均匀分布的惩罚项共同构成：</w:t>
+          <w:sz w:val="21"/>
+        </w:rPr>
+        <w:t>本文主实验采用高熵负载均衡约束：</w:t>
       </w:r>
     </w:p>
     <w:p>
@@ -9103,17 +9099,6 @@
           <w:highlight w:val="none"/>
         </w:rPr>
       </w:pPr>
-      <w:r>
-        <w:rPr>
-          <w:rFonts w:ascii="Times New Roman" w:hAnsi="Times New Roman" w:eastAsia="宋体"/>
-          <w:b w:val="0"/>
-          <w:i w:val="0"/>
-          <w:sz w:val="21"/>
-          <w:szCs w:val="21"/>
-          <w:highlight w:val="none"/>
-        </w:rPr>
-        <w:tab/>
-      </w:r>
       <m:oMath>
         <m:sSub>
           <m:sSubPr>
@@ -9477,47 +9462,9 @@
       <w:r>
         <w:rPr>
           <w:rFonts w:ascii="Times New Roman" w:hAnsi="Times New Roman" w:eastAsia="宋体"/>
-          <w:b w:val="0"/>
-          <w:i w:val="0"/>
-          <w:sz w:val="21"/>
-          <w:szCs w:val="21"/>
-          <w:highlight w:val="none"/>
-        </w:rPr>
-        <w:tab/>
-      </w:r>
-      <w:r>
-        <w:rPr>
-          <w:rFonts w:ascii="Times New Roman" w:hAnsi="Times New Roman" w:eastAsia="宋体"/>
-          <w:b w:val="0"/>
-          <w:i w:val="0"/>
-          <w:sz w:val="21"/>
-          <w:szCs w:val="21"/>
-          <w:highlight w:val="none"/>
-        </w:rPr>
-        <w:t>(1</w:t>
-      </w:r>
-      <w:r>
-        <w:rPr>
-          <w:rFonts w:hint="eastAsia" w:ascii="Times New Roman" w:hAnsi="Times New Roman" w:eastAsia="宋体"/>
-          <w:b w:val="0"/>
-          <w:i w:val="0"/>
-          <w:sz w:val="21"/>
-          <w:szCs w:val="21"/>
-          <w:highlight w:val="none"/>
-          <w:lang w:val="en-US" w:eastAsia="zh-CN"/>
-        </w:rPr>
-        <w:t>6</w:t>
-      </w:r>
-      <w:r>
-        <w:rPr>
-          <w:rFonts w:ascii="Times New Roman" w:hAnsi="Times New Roman" w:eastAsia="宋体"/>
-          <w:b w:val="0"/>
-          <w:i w:val="0"/>
-          <w:sz w:val="21"/>
-          <w:szCs w:val="21"/>
-          <w:highlight w:val="none"/>
-        </w:rPr>
-        <w:t>)</w:t>
+          <w:sz w:val="21"/>
+        </w:rPr>
+        <w:t>L_balance = sum_{k=1}^{K} gbar_k log(gbar_k + epsilon)    (16)</w:t>
       </w:r>
     </w:p>
     <w:p>
@@ -9531,17 +9478,6 @@
           <w:highlight w:val="none"/>
         </w:rPr>
       </w:pPr>
-      <w:r>
-        <w:rPr>
-          <w:rFonts w:ascii="Times New Roman" w:hAnsi="Times New Roman" w:eastAsia="宋体"/>
-          <w:b w:val="0"/>
-          <w:i w:val="0"/>
-          <w:sz w:val="21"/>
-          <w:szCs w:val="21"/>
-          <w:highlight w:val="none"/>
-        </w:rPr>
-        <w:t>其中，</w:t>
-      </w:r>
       <m:oMath>
         <m:acc>
           <m:accPr>
@@ -9831,17 +9767,6 @@
           <m:t>]</m:t>
         </m:r>
       </m:oMath>
-      <w:r>
-        <w:rPr>
-          <w:rFonts w:ascii="Times New Roman" w:hAnsi="Times New Roman" w:eastAsia="宋体"/>
-          <w:b w:val="0"/>
-          <w:i w:val="0"/>
-          <w:sz w:val="21"/>
-          <w:szCs w:val="21"/>
-          <w:highlight w:val="none"/>
-        </w:rPr>
-        <w:t>为各专家在当前批次上的平均权重向量，</w:t>
-      </w:r>
       <m:oMath>
         <m:r>
           <m:rPr>
@@ -9902,56 +9827,6 @@
           <m:t>)</m:t>
         </m:r>
       </m:oMath>
-      <w:r>
-        <w:rPr>
-          <w:rFonts w:ascii="Times New Roman" w:hAnsi="Times New Roman" w:eastAsia="宋体"/>
-          <w:b w:val="0"/>
-          <w:i w:val="0"/>
-          <w:sz w:val="21"/>
-          <w:szCs w:val="21"/>
-          <w:highlight w:val="none"/>
-        </w:rPr>
-        <w:t>表示对该向量</w:t>
-      </w:r>
-      <w:r>
-        <w:rPr>
-          <w:rFonts w:hint="eastAsia" w:ascii="Times New Roman" w:hAnsi="Times New Roman" w:eastAsia="宋体"/>
-          <w:b w:val="0"/>
-          <w:i w:val="0"/>
-          <w:sz w:val="21"/>
-          <w:szCs w:val="21"/>
-          <w:highlight w:val="none"/>
-          <w:lang w:val="en-US" w:eastAsia="zh-CN"/>
-        </w:rPr>
-        <w:t>各分量</w:t>
-      </w:r>
-      <w:r>
-        <w:rPr>
-          <w:rFonts w:ascii="Times New Roman" w:hAnsi="Times New Roman" w:eastAsia="宋体"/>
-          <w:b w:val="0"/>
-          <w:i w:val="0"/>
-          <w:sz w:val="21"/>
-          <w:szCs w:val="21"/>
-          <w:highlight w:val="none"/>
-        </w:rPr>
-        <w:t>的方差计算。</w:t>
-      </w:r>
-      <w:r>
-        <w:rPr>
-          <w:rFonts w:ascii="Times New Roman" w:hAnsi="Times New Roman" w:eastAsia="宋体" w:cs="Segoe UI"/>
-          <w:b w:val="0"/>
-          <w:i w:val="0"/>
-          <w:iCs w:val="0"/>
-          <w:caps w:val="0"/>
-          <w:color w:val="000000"/>
-          <w:spacing w:val="0"/>
-          <w:sz w:val="21"/>
-          <w:szCs w:val="21"/>
-          <w:highlight w:val="none"/>
-          <w:shd w:val="clear" w:fill="FFFFFF"/>
-        </w:rPr>
-        <w:t>第二项用于惩罚各专家负载</w:t>
-      </w:r>
       <m:oMath>
         <m:sSub>
           <m:sSubPr>
@@ -9998,22 +9873,6 @@
           </m:sub>
         </m:sSub>
       </m:oMath>
-      <w:r>
-        <w:rPr>
-          <w:rFonts w:hint="default" w:ascii="Times New Roman" w:hAnsi="Times New Roman" w:eastAsia="宋体" w:cs="Segoe UI"/>
-          <w:b w:val="0"/>
-          <w:i w:val="0"/>
-          <w:iCs w:val="0"/>
-          <w:caps w:val="0"/>
-          <w:color w:val="000000"/>
-          <w:spacing w:val="0"/>
-          <w:sz w:val="21"/>
-          <w:szCs w:val="21"/>
-          <w:highlight w:val="none"/>
-          <w:shd w:val="clear" w:fill="FFFFFF"/>
-        </w:rPr>
-        <w:t>偏离均匀水平</w:t>
-      </w:r>
       <m:oMath>
         <m:f>
           <m:fPr>
@@ -10061,61 +9920,10 @@
       </m:oMath>
       <w:r>
         <w:rPr>
-          <w:rFonts w:hint="default" w:ascii="Times New Roman" w:hAnsi="Times New Roman" w:eastAsia="宋体" w:cs="Segoe UI"/>
-          <w:b w:val="0"/>
-          <w:i w:val="0"/>
-          <w:iCs w:val="0"/>
-          <w:caps w:val="0"/>
-          <w:color w:val="000000"/>
-          <w:spacing w:val="0"/>
-          <w:sz w:val="21"/>
-          <w:szCs w:val="21"/>
-          <w:highlight w:val="none"/>
-          <w:shd w:val="clear" w:fill="FFFFFF"/>
-        </w:rPr>
-        <w:t>的程度，</w:t>
-      </w:r>
-      <w:r>
-        <w:rPr>
-          <w:rFonts w:hint="default" w:ascii="Times New Roman" w:hAnsi="Times New Roman" w:eastAsia="宋体" w:cs="Times New Roman"/>
-          <w:b w:val="0"/>
-          <w:i w:val="0"/>
-          <w:caps w:val="0"/>
-          <w:color w:val="000000"/>
-          <w:spacing w:val="0"/>
-          <w:sz w:val="21"/>
-          <w:szCs w:val="25"/>
-          <w:highlight w:val="none"/>
-          <w:shd w:val="clear" w:fill="FFFFFF"/>
-        </w:rPr>
-        <w:t>K=3</w:t>
-      </w:r>
-      <w:r>
-        <w:rPr>
-          <w:rFonts w:hint="default" w:ascii="Times New Roman" w:hAnsi="Times New Roman" w:eastAsia="宋体" w:cs="Segoe UI"/>
-          <w:b w:val="0"/>
-          <w:i w:val="0"/>
-          <w:iCs w:val="0"/>
-          <w:caps w:val="0"/>
-          <w:color w:val="000000"/>
-          <w:spacing w:val="0"/>
-          <w:sz w:val="21"/>
-          <w:szCs w:val="21"/>
-          <w:highlight w:val="none"/>
-          <w:shd w:val="clear" w:fill="FFFFFF"/>
-        </w:rPr>
-        <w:t>。</w:t>
-      </w:r>
-      <w:r>
-        <w:rPr>
-          <w:rFonts w:ascii="Times New Roman" w:hAnsi="Times New Roman" w:eastAsia="宋体"/>
-          <w:b w:val="0"/>
-          <w:i w:val="0"/>
-          <w:sz w:val="21"/>
-          <w:szCs w:val="21"/>
-          <w:highlight w:val="none"/>
-        </w:rPr>
-        <w:t>该损失项鼓励各专家权重接近均匀分布，抑制权重波动过大，从而提升专家利用的均衡性。</w:t>
+          <w:rFonts w:ascii="Times New Roman" w:hAnsi="Times New Roman" w:eastAsia="宋体"/>
+          <w:sz w:val="21"/>
+        </w:rPr>
+        <w:t>其中，gbar=[gbar_1,gbar_2,gbar_3]为各专家在当前批次上的平均权重向量，epsilon为数值稳定项。由于训练目标最小化L_balance，该项等价于最大化批次平均专家使用熵，鼓励门控网络避免长期集中调用单一专家。该损失项本质上是负载均衡约束，而非事件识别项；其作用是抑制专家坍缩，使不同时间尺度专家在训练中保持可学习机会。方差型负载约束仅作为消融对照，不作为主实验默认设置。</w:t>
       </w:r>
     </w:p>
     <w:p>

</xml_diff>

<commit_message>
Correct gate analysis with recomputed expert order
</commit_message>
<xml_diff>
--- a/paper/2026-0268-基于多专家融合的铁路客流多尺度预测方法.docx
+++ b/paper/2026-0268-基于多专家融合的铁路客流多尺度预测方法.docx
@@ -18293,7 +18293,7 @@
           <w:rFonts w:ascii="Times New Roman" w:hAnsi="Times New Roman" w:eastAsia="宋体"/>
           <w:sz w:val="21"/>
         </w:rPr>
-        <w:t>对测试集各站点客流序列进行趋势、周期与残差扰动分解，并同步记录RAMR输出的短期、长期与分布偏移专家门控权重。由于节假日样本数有限，门控解释以场景箱线图、时序对照和波动率-权重散点图为主，并报告统计检验结果；若单站线性相关不显著，则不做过度因果解释。</w:t>
+        <w:t>对测试集各站点客流序列进行趋势、周期与残差扰动分解，并同步记录RAMR输出的短期、长期与分布偏移专家门控权重。当前严格时间顺序测试窗口包含152个工作日样本、60个周末样本和0个节假日样本，因此本文仅报告工作日与周末的场景门控统计，并对两类子集进行Welch t检验；不对当前测试集不存在的节假日样本作显著性外推。</w:t>
       </w:r>
     </w:p>
     <w:p>
@@ -18308,12 +18308,9 @@
       <w:r>
         <w:rPr>
           <w:rFonts w:ascii="Times New Roman" w:hAnsi="Times New Roman" w:eastAsia="宋体"/>
-          <w:b w:val="0"/>
-          <w:i w:val="0"/>
-          <w:sz w:val="21"/>
-          <w:highlight w:val="none"/>
-        </w:rPr>
-        <w:t>表3汇总三类日历场景下各专家门控权重的样本均值，用于刻画场景感知门控的整体路由倾向。</w:t>
+          <w:sz w:val="21"/>
+        </w:rPr>
+        <w:t>表3汇总当前测试窗口中工作日与周末两类日历场景下各专家门控权重的样本均值。模型实际输出专家顺序为短期专家、长期专家和分布偏移专家，表中按该顺序报告。</w:t>
       </w:r>
     </w:p>
     <w:p>
@@ -18412,23 +18409,10 @@
             <w:vAlign w:val="center"/>
           </w:tcPr>
           <w:p>
-            <w:pPr>
-              <w:spacing w:line="240" w:lineRule="exact"/>
-              <w:jc w:val="center"/>
-              <w:rPr>
-                <w:rFonts w:hint="default"/>
-                <w:sz w:val="18"/>
-                <w:szCs w:val="18"/>
-                <w:highlight w:val="none"/>
-              </w:rPr>
-            </w:pPr>
-            <w:r>
-              <w:rPr>
-                <w:rFonts w:hint="default" w:ascii="Times New Roman" w:hAnsi="Times New Roman" w:eastAsia="宋体"/>
-                <w:sz w:val="17"/>
-                <w:szCs w:val="18"/>
-                <w:highlight w:val="none"/>
-                <w:lang w:val="en-US" w:eastAsia="zh-CN"/>
+            <w:r>
+              <w:rPr>
+                <w:rFonts w:ascii="Times New Roman" w:hAnsi="Times New Roman" w:eastAsia="宋体"/>
+                <w:sz w:val="21"/>
               </w:rPr>
               <w:t>场景</w:t>
             </w:r>
@@ -18454,65 +18438,13 @@
             <w:vAlign w:val="center"/>
           </w:tcPr>
           <w:p>
-            <w:pPr>
-              <w:spacing w:line="240" w:lineRule="exact"/>
-              <w:jc w:val="center"/>
-              <w:rPr>
-                <w:rFonts w:hint="default"/>
-                <w:sz w:val="18"/>
-                <w:szCs w:val="18"/>
-                <w:highlight w:val="none"/>
-              </w:rPr>
-            </w:pPr>
-            <w:r>
-              <w:rPr>
-                <w:rFonts w:hint="default" w:ascii="Times New Roman" w:hAnsi="Times New Roman" w:eastAsia="宋体"/>
-                <w:sz w:val="17"/>
-                <w:szCs w:val="18"/>
-                <w:highlight w:val="none"/>
-                <w:lang w:val="en-US" w:eastAsia="zh-CN"/>
-              </w:rPr>
-              <w:t>长期专家</w:t>
-            </w:r>
-            <m:oMath>
-              <m:acc>
-                <m:accPr>
-                  <m:chr m:val="̅"/>
-                  <m:ctrlPr>
-                    <w:rPr>
-                      <w:rFonts w:hint="default" w:ascii="Cambria Math" w:hAnsi="Cambria Math"/>
-                      <w:sz w:val="18"/>
-                      <w:szCs w:val="18"/>
-                      <w:highlight w:val="none"/>
-                      <w:lang w:val="en-US" w:eastAsia="zh-CN"/>
-                    </w:rPr>
-                  </m:ctrlPr>
-                </m:accPr>
-                <m:e>
-                  <m:r>
-                    <m:rPr>
-                      <m:sty m:val="p"/>
-                    </m:rPr>
-                    <w:rPr>
-                      <w:rFonts w:ascii="Times New Roman" w:hAnsi="Times New Roman"/>
-                      <w:sz w:val="18"/>
-                      <w:szCs w:val="18"/>
-                      <w:highlight w:val="none"/>
-                    </w:rPr>
-                    <m:t>g</m:t>
-                  </m:r>
-                  <m:ctrlPr>
-                    <w:rPr>
-                      <w:rFonts w:hint="default" w:ascii="Cambria Math" w:hAnsi="Cambria Math"/>
-                      <w:sz w:val="18"/>
-                      <w:szCs w:val="18"/>
-                      <w:highlight w:val="none"/>
-                      <w:lang w:val="en-US" w:eastAsia="zh-CN"/>
-                    </w:rPr>
-                  </m:ctrlPr>
-                </m:e>
-              </m:acc>
-            </m:oMath>
+            <w:r>
+              <w:rPr>
+                <w:rFonts w:ascii="Times New Roman" w:hAnsi="Times New Roman" w:eastAsia="宋体"/>
+                <w:sz w:val="21"/>
+              </w:rPr>
+              <w:t>短期专家</w:t>
+            </w:r>
           </w:p>
         </w:tc>
         <w:tc>
@@ -18535,74 +18467,12 @@
             <w:vAlign w:val="center"/>
           </w:tcPr>
           <w:p>
-            <w:pPr>
-              <w:spacing w:line="240" w:lineRule="exact"/>
-              <w:jc w:val="center"/>
-              <w:rPr>
-                <w:rFonts w:hint="default"/>
-                <w:sz w:val="18"/>
-                <w:szCs w:val="18"/>
-                <w:highlight w:val="none"/>
-              </w:rPr>
-            </w:pPr>
-            <w:r>
-              <w:rPr>
-                <w:rFonts w:hint="default" w:ascii="Times New Roman" w:hAnsi="Times New Roman" w:eastAsia="宋体"/>
-                <w:sz w:val="17"/>
-                <w:szCs w:val="18"/>
-                <w:highlight w:val="none"/>
-                <w:lang w:val="en-US" w:eastAsia="zh-CN"/>
-              </w:rPr>
-              <w:t>短期专家</w:t>
-            </w:r>
-            <m:oMath>
-              <m:acc>
-                <m:accPr>
-                  <m:chr m:val="̅"/>
-                  <m:ctrlPr>
-                    <w:rPr>
-                      <w:rFonts w:hint="default" w:ascii="Cambria Math" w:hAnsi="Cambria Math"/>
-                      <w:sz w:val="18"/>
-                      <w:szCs w:val="18"/>
-                      <w:highlight w:val="none"/>
-                      <w:lang w:val="en-US" w:eastAsia="zh-CN"/>
-                    </w:rPr>
-                  </m:ctrlPr>
-                </m:accPr>
-                <m:e>
-                  <m:r>
-                    <m:rPr>
-                      <m:sty m:val="p"/>
-                    </m:rPr>
-                    <w:rPr>
-                      <w:rFonts w:ascii="Times New Roman" w:hAnsi="Times New Roman"/>
-                      <w:sz w:val="18"/>
-                      <w:szCs w:val="18"/>
-                      <w:highlight w:val="none"/>
-                    </w:rPr>
-                    <m:t>g</m:t>
-                  </m:r>
-                  <m:ctrlPr>
-                    <w:rPr>
-                      <w:rFonts w:hint="default" w:ascii="Cambria Math" w:hAnsi="Cambria Math"/>
-                      <w:sz w:val="18"/>
-                      <w:szCs w:val="18"/>
-                      <w:highlight w:val="none"/>
-                      <w:lang w:val="en-US" w:eastAsia="zh-CN"/>
-                    </w:rPr>
-                  </m:ctrlPr>
-                </m:e>
-              </m:acc>
-            </m:oMath>
-            <w:r>
-              <w:rPr>
-                <w:rFonts w:hint="default" w:ascii="Times New Roman" w:hAnsi="Times New Roman" w:eastAsia="宋体"/>
-                <w:sz w:val="17"/>
-                <w:szCs w:val="18"/>
-                <w:highlight w:val="none"/>
-                <w:lang w:val="en-US" w:eastAsia="zh-CN"/>
-              </w:rPr>
-              <w:t>​</w:t>
+            <w:r>
+              <w:rPr>
+                <w:rFonts w:ascii="Times New Roman" w:hAnsi="Times New Roman" w:eastAsia="宋体"/>
+                <w:sz w:val="21"/>
+              </w:rPr>
+              <w:t>长期专家</w:t>
             </w:r>
           </w:p>
         </w:tc>
@@ -18679,23 +18549,10 @@
             <w:vAlign w:val="center"/>
           </w:tcPr>
           <w:p>
-            <w:pPr>
-              <w:spacing w:line="240" w:lineRule="exact"/>
-              <w:jc w:val="center"/>
-              <w:rPr>
-                <w:rFonts w:hint="default"/>
-                <w:sz w:val="18"/>
-                <w:szCs w:val="18"/>
-                <w:highlight w:val="none"/>
-              </w:rPr>
-            </w:pPr>
-            <w:r>
-              <w:rPr>
-                <w:rFonts w:hint="default" w:ascii="Times New Roman" w:hAnsi="Times New Roman" w:eastAsia="宋体"/>
-                <w:sz w:val="17"/>
-                <w:szCs w:val="18"/>
-                <w:highlight w:val="none"/>
-                <w:lang w:val="en-US" w:eastAsia="zh-CN"/>
+            <w:r>
+              <w:rPr>
+                <w:rFonts w:ascii="Times New Roman" w:hAnsi="Times New Roman" w:eastAsia="宋体"/>
+                <w:sz w:val="21"/>
               </w:rPr>
               <w:t>工作日</w:t>
             </w:r>
@@ -18721,25 +18578,12 @@
             <w:vAlign w:val="center"/>
           </w:tcPr>
           <w:p>
-            <w:pPr>
-              <w:spacing w:line="240" w:lineRule="exact"/>
-              <w:jc w:val="center"/>
-              <w:rPr>
-                <w:rFonts w:hint="default"/>
-                <w:sz w:val="18"/>
-                <w:szCs w:val="18"/>
-                <w:highlight w:val="none"/>
-              </w:rPr>
-            </w:pPr>
-            <w:r>
-              <w:rPr>
-                <w:rFonts w:hint="default" w:ascii="Times New Roman" w:hAnsi="Times New Roman" w:eastAsia="宋体"/>
-                <w:sz w:val="17"/>
-                <w:szCs w:val="18"/>
-                <w:highlight w:val="none"/>
-                <w:lang w:val="en-US" w:eastAsia="zh-CN"/>
-              </w:rPr>
-              <w:t>0.6237</w:t>
+            <w:r>
+              <w:rPr>
+                <w:rFonts w:ascii="Times New Roman" w:hAnsi="Times New Roman" w:eastAsia="宋体"/>
+                <w:sz w:val="21"/>
+              </w:rPr>
+              <w:t>0.5927</w:t>
             </w:r>
           </w:p>
         </w:tc>
@@ -18763,25 +18607,12 @@
             <w:vAlign w:val="center"/>
           </w:tcPr>
           <w:p>
-            <w:pPr>
-              <w:spacing w:line="240" w:lineRule="exact"/>
-              <w:jc w:val="center"/>
-              <w:rPr>
-                <w:rFonts w:hint="default"/>
-                <w:sz w:val="18"/>
-                <w:szCs w:val="18"/>
-                <w:highlight w:val="none"/>
-              </w:rPr>
-            </w:pPr>
-            <w:r>
-              <w:rPr>
-                <w:rFonts w:hint="default" w:ascii="Times New Roman" w:hAnsi="Times New Roman" w:eastAsia="宋体"/>
-                <w:sz w:val="17"/>
-                <w:szCs w:val="18"/>
-                <w:highlight w:val="none"/>
-                <w:lang w:val="en-US" w:eastAsia="zh-CN"/>
-              </w:rPr>
-              <w:t>0.0853</w:t>
+            <w:r>
+              <w:rPr>
+                <w:rFonts w:ascii="Times New Roman" w:hAnsi="Times New Roman" w:eastAsia="宋体"/>
+                <w:sz w:val="21"/>
+              </w:rPr>
+              <w:t>0.0845</w:t>
             </w:r>
           </w:p>
         </w:tc>
@@ -18805,25 +18636,12 @@
             <w:vAlign w:val="center"/>
           </w:tcPr>
           <w:p>
-            <w:pPr>
-              <w:spacing w:line="240" w:lineRule="exact"/>
-              <w:jc w:val="center"/>
-              <w:rPr>
-                <w:rFonts w:hint="default"/>
-                <w:sz w:val="18"/>
-                <w:szCs w:val="18"/>
-                <w:highlight w:val="none"/>
-              </w:rPr>
-            </w:pPr>
-            <w:r>
-              <w:rPr>
-                <w:rFonts w:hint="default" w:ascii="Times New Roman" w:hAnsi="Times New Roman" w:eastAsia="宋体"/>
-                <w:sz w:val="17"/>
-                <w:szCs w:val="18"/>
-                <w:highlight w:val="none"/>
-                <w:lang w:val="en-US" w:eastAsia="zh-CN"/>
-              </w:rPr>
-              <w:t>0.2910</w:t>
+            <w:r>
+              <w:rPr>
+                <w:rFonts w:ascii="Times New Roman" w:hAnsi="Times New Roman" w:eastAsia="宋体"/>
+                <w:sz w:val="21"/>
+              </w:rPr>
+              <w:t>0.3228</w:t>
             </w:r>
           </w:p>
         </w:tc>
@@ -18871,23 +18689,10 @@
             <w:vAlign w:val="center"/>
           </w:tcPr>
           <w:p>
-            <w:pPr>
-              <w:spacing w:line="240" w:lineRule="exact"/>
-              <w:jc w:val="center"/>
-              <w:rPr>
-                <w:rFonts w:hint="default"/>
-                <w:sz w:val="18"/>
-                <w:szCs w:val="18"/>
-                <w:highlight w:val="none"/>
-              </w:rPr>
-            </w:pPr>
-            <w:r>
-              <w:rPr>
-                <w:rFonts w:hint="default" w:ascii="Times New Roman" w:hAnsi="Times New Roman" w:eastAsia="宋体"/>
-                <w:sz w:val="17"/>
-                <w:szCs w:val="18"/>
-                <w:highlight w:val="none"/>
-                <w:lang w:val="en-US" w:eastAsia="zh-CN"/>
+            <w:r>
+              <w:rPr>
+                <w:rFonts w:ascii="Times New Roman" w:hAnsi="Times New Roman" w:eastAsia="宋体"/>
+                <w:sz w:val="21"/>
               </w:rPr>
               <w:t>周末</w:t>
             </w:r>
@@ -18913,25 +18718,12 @@
             <w:vAlign w:val="center"/>
           </w:tcPr>
           <w:p>
-            <w:pPr>
-              <w:spacing w:line="240" w:lineRule="exact"/>
-              <w:jc w:val="center"/>
-              <w:rPr>
-                <w:rFonts w:hint="default"/>
-                <w:sz w:val="18"/>
-                <w:szCs w:val="18"/>
-                <w:highlight w:val="none"/>
-              </w:rPr>
-            </w:pPr>
-            <w:r>
-              <w:rPr>
-                <w:rFonts w:hint="default" w:ascii="Times New Roman" w:hAnsi="Times New Roman" w:eastAsia="宋体"/>
-                <w:sz w:val="17"/>
-                <w:szCs w:val="18"/>
-                <w:highlight w:val="none"/>
-                <w:lang w:val="en-US" w:eastAsia="zh-CN"/>
-              </w:rPr>
-              <w:t>0.5598</w:t>
+            <w:r>
+              <w:rPr>
+                <w:rFonts w:ascii="Times New Roman" w:hAnsi="Times New Roman" w:eastAsia="宋体"/>
+                <w:sz w:val="21"/>
+              </w:rPr>
+              <w:t>0.2196</w:t>
             </w:r>
           </w:p>
         </w:tc>
@@ -18955,25 +18747,12 @@
             <w:vAlign w:val="center"/>
           </w:tcPr>
           <w:p>
-            <w:pPr>
-              <w:spacing w:line="240" w:lineRule="exact"/>
-              <w:jc w:val="center"/>
-              <w:rPr>
-                <w:rFonts w:hint="default"/>
-                <w:sz w:val="18"/>
-                <w:szCs w:val="18"/>
-                <w:highlight w:val="none"/>
-              </w:rPr>
-            </w:pPr>
-            <w:r>
-              <w:rPr>
-                <w:rFonts w:hint="default" w:ascii="Times New Roman" w:hAnsi="Times New Roman" w:eastAsia="宋体"/>
-                <w:sz w:val="17"/>
-                <w:szCs w:val="18"/>
-                <w:highlight w:val="none"/>
-                <w:lang w:val="en-US" w:eastAsia="zh-CN"/>
-              </w:rPr>
-              <w:t>0.0505</w:t>
+            <w:r>
+              <w:rPr>
+                <w:rFonts w:ascii="Times New Roman" w:hAnsi="Times New Roman" w:eastAsia="宋体"/>
+                <w:sz w:val="21"/>
+              </w:rPr>
+              <w:t>0.2011</w:t>
             </w:r>
           </w:p>
         </w:tc>
@@ -18997,219 +18776,12 @@
             <w:vAlign w:val="center"/>
           </w:tcPr>
           <w:p>
-            <w:pPr>
-              <w:spacing w:line="240" w:lineRule="exact"/>
-              <w:jc w:val="center"/>
-              <w:rPr>
-                <w:rFonts w:hint="default"/>
-                <w:sz w:val="18"/>
-                <w:szCs w:val="18"/>
-                <w:highlight w:val="none"/>
-              </w:rPr>
-            </w:pPr>
-            <w:r>
-              <w:rPr>
-                <w:rFonts w:hint="default" w:ascii="Times New Roman" w:hAnsi="Times New Roman" w:eastAsia="宋体"/>
-                <w:sz w:val="17"/>
-                <w:szCs w:val="18"/>
-                <w:highlight w:val="none"/>
-                <w:lang w:val="en-US" w:eastAsia="zh-CN"/>
-              </w:rPr>
-              <w:t>0.3897</w:t>
-            </w:r>
-          </w:p>
-        </w:tc>
-      </w:tr>
-      <w:tr>
-        <w:tblPrEx>
-          <w:tblBorders>
-            <w:top w:val="none" w:color="auto" w:sz="0" w:space="0"/>
-            <w:left w:val="none" w:color="auto" w:sz="0" w:space="0"/>
-            <w:bottom w:val="none" w:color="auto" w:sz="0" w:space="0"/>
-            <w:right w:val="none" w:color="auto" w:sz="0" w:space="0"/>
-            <w:insideH w:val="none" w:color="auto" w:sz="0" w:space="0"/>
-            <w:insideV w:val="none" w:color="auto" w:sz="0" w:space="0"/>
-          </w:tblBorders>
-          <w:shd w:val="clear" w:color="auto" w:fill="auto"/>
-          <w:tblCellMar>
-            <w:top w:w="15" w:type="dxa"/>
-            <w:left w:w="15" w:type="dxa"/>
-            <w:bottom w:w="15" w:type="dxa"/>
-            <w:right w:w="15" w:type="dxa"/>
-          </w:tblCellMar>
-        </w:tblPrEx>
-        <w:trPr>
-          <w:trHeight w:val="0" w:hRule="atLeast"/>
-          <w:tblHeader/>
-          <w:jc w:val="center"/>
-        </w:trPr>
-        <w:tc>
-          <w:tcPr>
-            <w:tcW w:w="977" w:type="pct"/>
-            <w:tcBorders>
-              <w:top w:val="nil"/>
-              <w:left w:val="nil"/>
-              <w:bottom w:val="single" w:color="auto" w:sz="12" w:space="0"/>
-              <w:right w:val="nil"/>
-            </w:tcBorders>
-            <w:shd w:val="clear" w:color="auto" w:fill="auto"/>
-            <w:noWrap w:val="0"/>
-            <w:tcMar>
-              <w:top w:w="75" w:type="dxa"/>
-              <w:left w:w="150" w:type="dxa"/>
-              <w:bottom w:w="75" w:type="dxa"/>
-              <w:right w:w="150" w:type="dxa"/>
-            </w:tcMar>
-            <w:vAlign w:val="center"/>
-          </w:tcPr>
-          <w:p>
-            <w:pPr>
-              <w:spacing w:line="240" w:lineRule="exact"/>
-              <w:jc w:val="center"/>
-              <w:rPr>
-                <w:rFonts w:hint="default"/>
-                <w:sz w:val="18"/>
-                <w:szCs w:val="18"/>
-                <w:highlight w:val="none"/>
-              </w:rPr>
-            </w:pPr>
-            <w:r>
-              <w:rPr>
-                <w:rFonts w:hint="default" w:ascii="Times New Roman" w:hAnsi="Times New Roman" w:eastAsia="宋体"/>
-                <w:sz w:val="17"/>
-                <w:szCs w:val="18"/>
-                <w:highlight w:val="none"/>
-                <w:lang w:val="en-US" w:eastAsia="zh-CN"/>
-              </w:rPr>
-              <w:t>节假日</w:t>
-            </w:r>
-          </w:p>
-        </w:tc>
-        <w:tc>
-          <w:tcPr>
-            <w:tcW w:w="1337" w:type="pct"/>
-            <w:tcBorders>
-              <w:top w:val="nil"/>
-              <w:left w:val="nil"/>
-              <w:bottom w:val="single" w:color="auto" w:sz="12" w:space="0"/>
-              <w:right w:val="nil"/>
-            </w:tcBorders>
-            <w:shd w:val="clear" w:color="auto" w:fill="auto"/>
-            <w:noWrap w:val="0"/>
-            <w:tcMar>
-              <w:top w:w="75" w:type="dxa"/>
-              <w:left w:w="150" w:type="dxa"/>
-              <w:bottom w:w="75" w:type="dxa"/>
-              <w:right w:w="150" w:type="dxa"/>
-            </w:tcMar>
-            <w:vAlign w:val="center"/>
-          </w:tcPr>
-          <w:p>
-            <w:pPr>
-              <w:spacing w:line="240" w:lineRule="exact"/>
-              <w:jc w:val="center"/>
-              <w:rPr>
-                <w:rFonts w:hint="default"/>
-                <w:sz w:val="18"/>
-                <w:szCs w:val="18"/>
-                <w:highlight w:val="none"/>
-              </w:rPr>
-            </w:pPr>
-            <w:r>
-              <w:rPr>
-                <w:rFonts w:hint="default" w:ascii="Times New Roman" w:hAnsi="Times New Roman" w:eastAsia="宋体"/>
-                <w:sz w:val="17"/>
-                <w:szCs w:val="18"/>
-                <w:highlight w:val="none"/>
-                <w:lang w:val="en-US" w:eastAsia="zh-CN"/>
-              </w:rPr>
-              <w:t>0.3847</w:t>
-            </w:r>
-          </w:p>
-        </w:tc>
-        <w:tc>
-          <w:tcPr>
-            <w:tcW w:w="1347" w:type="pct"/>
-            <w:tcBorders>
-              <w:top w:val="nil"/>
-              <w:left w:val="nil"/>
-              <w:bottom w:val="single" w:color="auto" w:sz="12" w:space="0"/>
-              <w:right w:val="nil"/>
-            </w:tcBorders>
-            <w:shd w:val="clear" w:color="auto" w:fill="auto"/>
-            <w:noWrap w:val="0"/>
-            <w:tcMar>
-              <w:top w:w="75" w:type="dxa"/>
-              <w:left w:w="150" w:type="dxa"/>
-              <w:bottom w:w="75" w:type="dxa"/>
-              <w:right w:w="150" w:type="dxa"/>
-            </w:tcMar>
-            <w:vAlign w:val="center"/>
-          </w:tcPr>
-          <w:p>
-            <w:pPr>
-              <w:spacing w:line="240" w:lineRule="exact"/>
-              <w:jc w:val="center"/>
-              <w:rPr>
-                <w:rFonts w:hint="default"/>
-                <w:sz w:val="18"/>
-                <w:szCs w:val="18"/>
-                <w:highlight w:val="none"/>
-              </w:rPr>
-            </w:pPr>
-            <w:r>
-              <w:rPr>
-                <w:rFonts w:hint="default" w:ascii="Times New Roman" w:hAnsi="Times New Roman" w:eastAsia="宋体"/>
-                <w:sz w:val="17"/>
-                <w:szCs w:val="18"/>
-                <w:highlight w:val="none"/>
-                <w:lang w:val="en-US" w:eastAsia="zh-CN"/>
-              </w:rPr>
-              <w:t>0.1755</w:t>
-            </w:r>
-          </w:p>
-        </w:tc>
-        <w:tc>
-          <w:tcPr>
-            <w:tcW w:w="1337" w:type="pct"/>
-            <w:tcBorders>
-              <w:top w:val="nil"/>
-              <w:left w:val="nil"/>
-              <w:bottom w:val="single" w:color="auto" w:sz="12" w:space="0"/>
-              <w:right w:val="nil"/>
-            </w:tcBorders>
-            <w:shd w:val="clear" w:color="auto" w:fill="auto"/>
-            <w:noWrap w:val="0"/>
-            <w:tcMar>
-              <w:top w:w="75" w:type="dxa"/>
-              <w:left w:w="150" w:type="dxa"/>
-              <w:bottom w:w="75" w:type="dxa"/>
-              <w:right w:w="150" w:type="dxa"/>
-            </w:tcMar>
-            <w:vAlign w:val="center"/>
-          </w:tcPr>
-          <w:p>
-            <w:pPr>
-              <w:spacing w:line="240" w:lineRule="exact"/>
-              <w:jc w:val="center"/>
-              <w:rPr>
-                <w:rFonts w:hint="default"/>
-                <w:sz w:val="18"/>
-                <w:szCs w:val="18"/>
-                <w:highlight w:val="none"/>
-              </w:rPr>
-            </w:pPr>
-            <w:r>
-              <w:rPr>
-                <w:rFonts w:hint="default" w:ascii="Times New Roman" w:hAnsi="Times New Roman" w:eastAsia="宋体"/>
-                <w:b/>
-                <w:bCs/>
-                <w:sz w:val="17"/>
-                <w:szCs w:val="18"/>
-                <w:highlight w:val="none"/>
-                <w:lang w:val="en-US" w:eastAsia="zh-CN"/>
-              </w:rPr>
-              <w:t>0.4398</w:t>
+            <w:r>
+              <w:rPr>
+                <w:rFonts w:ascii="Times New Roman" w:hAnsi="Times New Roman" w:eastAsia="宋体"/>
+                <w:sz w:val="21"/>
+              </w:rPr>
+              <w:t>0.5793</w:t>
             </w:r>
           </w:p>
         </w:tc>
@@ -19236,7 +18808,7 @@
           <w:rFonts w:ascii="Times New Roman" w:hAnsi="Times New Roman" w:eastAsia="宋体"/>
           <w:sz w:val="21"/>
         </w:rPr>
-        <w:t>由表3可知，工作日长期专家权重为0.6237，高于分布偏移专家的0.2910，表明常规日期预测主要依赖趋势性与周期性成分；节假日分布偏移专家权重升至0.4398，长期专家权重降至0.3847，说明门控在非常规日历场景下会提高扰动相关专家的融合比例。该结果反映的是窗口级分布变化的响应，不能单独识别极端天气或具体突发事件成因。</w:t>
+        <w:t>由表3可知，短期专家并非在所有场景中权重最低。工作日短期专家权重为0.5927，高于分布偏移专家的0.3228和长期专家的0.0845，表明常规日粒度预测主要依赖相邻日期连续性与短程校正；周末分布偏移专家权重升至0.5793，短期专家权重降至0.2196，说明非工作日需求结构变化会触发分布偏移建模。该结果纠正了旧版统计中因专家顺序解释不一致造成的“短期专家始终低权重”表述。</w:t>
       </w:r>
     </w:p>
     <w:p>
@@ -19251,12 +18823,9 @@
       <w:r>
         <w:rPr>
           <w:rFonts w:ascii="Times New Roman" w:hAnsi="Times New Roman" w:eastAsia="宋体"/>
-          <w:b w:val="0"/>
-          <w:i w:val="0"/>
-          <w:sz w:val="21"/>
-          <w:highlight w:val="none"/>
-        </w:rPr>
-        <w:t>在表3所揭示的均值差异基础上，表4进一步给出节假日与工作日子集的假设检验结果。</w:t>
+          <w:sz w:val="21"/>
+        </w:rPr>
+        <w:t>在表3所揭示的均值差异基础上，表4进一步给出周末与工作日子集的Welch t检验结果。</w:t>
       </w:r>
     </w:p>
     <w:p>
@@ -19278,7 +18847,7 @@
           <w:rFonts w:ascii="Times New Roman" w:hAnsi="Times New Roman" w:eastAsia="宋体"/>
           <w:sz w:val="21"/>
         </w:rPr>
-        <w:t>表4   节假日 vs 工作日分布偏移专家门控权重t检验</w:t>
+        <w:t>表4   周末 vs 工作日专家门控权重t检验</w:t>
       </w:r>
     </w:p>
     <w:tbl>
@@ -19353,29 +18922,10 @@
             <w:vAlign w:val="center"/>
           </w:tcPr>
           <w:p>
-            <w:pPr>
-              <w:keepNext/>
-              <w:snapToGrid w:val="0"/>
-              <w:spacing w:line="240" w:lineRule="auto"/>
-              <w:ind w:left="0" w:leftChars="0" w:right="0" w:rightChars="0" w:firstLine="0" w:firstLineChars="0"/>
-              <w:jc w:val="center"/>
-              <w:rPr>
-                <w:rFonts w:hint="eastAsia"/>
-                <w:b/>
-                <w:sz w:val="18"/>
-                <w:szCs w:val="18"/>
-                <w:highlight w:val="none"/>
-                <w:lang w:val="en-US" w:eastAsia="zh-CN"/>
-              </w:rPr>
-            </w:pPr>
-            <w:r>
-              <w:rPr>
-                <w:rFonts w:hint="default" w:ascii="Times New Roman" w:hAnsi="Times New Roman" w:eastAsia="宋体"/>
-                <w:b/>
-                <w:sz w:val="17"/>
-                <w:szCs w:val="18"/>
-                <w:highlight w:val="none"/>
-                <w:lang w:val="en-US" w:eastAsia="zh-CN"/>
+            <w:r>
+              <w:rPr>
+                <w:rFonts w:ascii="Times New Roman" w:hAnsi="Times New Roman" w:eastAsia="宋体"/>
+                <w:sz w:val="21"/>
               </w:rPr>
               <w:t>对比</w:t>
             </w:r>
@@ -19401,31 +18951,12 @@
             <w:vAlign w:val="center"/>
           </w:tcPr>
           <w:p>
-            <w:pPr>
-              <w:keepNext/>
-              <w:snapToGrid w:val="0"/>
-              <w:spacing w:line="240" w:lineRule="auto"/>
-              <w:ind w:left="0" w:leftChars="0" w:right="0" w:rightChars="0" w:firstLine="0" w:firstLineChars="0"/>
-              <w:jc w:val="center"/>
-              <w:rPr>
-                <w:rFonts w:hint="default"/>
-                <w:b/>
-                <w:sz w:val="18"/>
-                <w:szCs w:val="18"/>
-                <w:highlight w:val="none"/>
-                <w:lang w:val="en-US" w:eastAsia="zh-CN"/>
-              </w:rPr>
-            </w:pPr>
-            <w:r>
-              <w:rPr>
-                <w:rFonts w:hint="default" w:ascii="Times New Roman" w:hAnsi="Times New Roman" w:eastAsia="宋体"/>
-                <w:b/>
-                <w:sz w:val="17"/>
-                <w:szCs w:val="18"/>
-                <w:highlight w:val="none"/>
-                <w:lang w:val="en-US" w:eastAsia="zh-CN"/>
-              </w:rPr>
-              <w:t>节假日均值</w:t>
+            <w:r>
+              <w:rPr>
+                <w:rFonts w:ascii="Times New Roman" w:hAnsi="Times New Roman" w:eastAsia="宋体"/>
+                <w:sz w:val="21"/>
+              </w:rPr>
+              <w:t>周末均值</w:t>
             </w:r>
           </w:p>
         </w:tc>
@@ -19449,29 +18980,10 @@
             <w:vAlign w:val="center"/>
           </w:tcPr>
           <w:p>
-            <w:pPr>
-              <w:keepNext/>
-              <w:snapToGrid w:val="0"/>
-              <w:spacing w:line="240" w:lineRule="auto"/>
-              <w:ind w:left="0" w:leftChars="0" w:right="0" w:rightChars="0" w:firstLine="0" w:firstLineChars="0"/>
-              <w:jc w:val="center"/>
-              <w:rPr>
-                <w:rFonts w:hint="default"/>
-                <w:b/>
-                <w:sz w:val="18"/>
-                <w:szCs w:val="18"/>
-                <w:highlight w:val="none"/>
-                <w:lang w:val="en-US" w:eastAsia="zh-CN"/>
-              </w:rPr>
-            </w:pPr>
-            <w:r>
-              <w:rPr>
-                <w:rFonts w:hint="default" w:ascii="Times New Roman" w:hAnsi="Times New Roman" w:eastAsia="宋体"/>
-                <w:b/>
-                <w:sz w:val="17"/>
-                <w:szCs w:val="18"/>
-                <w:highlight w:val="none"/>
-                <w:lang w:val="en-US" w:eastAsia="zh-CN"/>
+            <w:r>
+              <w:rPr>
+                <w:rFonts w:ascii="Times New Roman" w:hAnsi="Times New Roman" w:eastAsia="宋体"/>
+                <w:sz w:val="21"/>
               </w:rPr>
               <w:t>工作日均值</w:t>
             </w:r>
@@ -19497,29 +19009,10 @@
             <w:vAlign w:val="center"/>
           </w:tcPr>
           <w:p>
-            <w:pPr>
-              <w:keepNext/>
-              <w:snapToGrid w:val="0"/>
-              <w:spacing w:line="240" w:lineRule="auto"/>
-              <w:ind w:left="0" w:leftChars="0" w:right="0" w:rightChars="0" w:firstLine="0" w:firstLineChars="0"/>
-              <w:jc w:val="center"/>
-              <w:rPr>
-                <w:rFonts w:hint="default"/>
-                <w:b/>
-                <w:sz w:val="18"/>
-                <w:szCs w:val="18"/>
-                <w:highlight w:val="none"/>
-                <w:lang w:val="en-US" w:eastAsia="zh-CN"/>
-              </w:rPr>
-            </w:pPr>
-            <w:r>
-              <w:rPr>
-                <w:rFonts w:hint="eastAsia" w:ascii="Times New Roman" w:hAnsi="Times New Roman" w:eastAsia="宋体"/>
-                <w:b/>
-                <w:sz w:val="17"/>
-                <w:szCs w:val="18"/>
-                <w:highlight w:val="none"/>
-                <w:lang w:val="en-US" w:eastAsia="zh-CN"/>
+            <w:r>
+              <w:rPr>
+                <w:rFonts w:ascii="Times New Roman" w:hAnsi="Times New Roman" w:eastAsia="宋体"/>
+                <w:sz w:val="21"/>
               </w:rPr>
               <w:t>t</w:t>
             </w:r>
@@ -19545,29 +19038,10 @@
             <w:vAlign w:val="center"/>
           </w:tcPr>
           <w:p>
-            <w:pPr>
-              <w:keepNext/>
-              <w:snapToGrid w:val="0"/>
-              <w:spacing w:line="240" w:lineRule="auto"/>
-              <w:ind w:left="0" w:leftChars="0" w:right="0" w:rightChars="0" w:firstLine="0" w:firstLineChars="0"/>
-              <w:jc w:val="center"/>
-              <w:rPr>
-                <w:rFonts w:hint="default"/>
-                <w:b/>
-                <w:sz w:val="18"/>
-                <w:szCs w:val="18"/>
-                <w:highlight w:val="none"/>
-                <w:lang w:val="en-US" w:eastAsia="zh-CN"/>
-              </w:rPr>
-            </w:pPr>
-            <w:r>
-              <w:rPr>
-                <w:rFonts w:hint="default" w:ascii="Times New Roman" w:hAnsi="Times New Roman" w:eastAsia="宋体"/>
-                <w:b/>
-                <w:sz w:val="17"/>
-                <w:szCs w:val="18"/>
-                <w:highlight w:val="none"/>
-                <w:lang w:val="en-US" w:eastAsia="zh-CN"/>
+            <w:r>
+              <w:rPr>
+                <w:rFonts w:ascii="Times New Roman" w:hAnsi="Times New Roman" w:eastAsia="宋体"/>
+                <w:sz w:val="21"/>
               </w:rPr>
               <w:t>p</w:t>
             </w:r>
@@ -19645,29 +19119,12 @@
             <w:vAlign w:val="center"/>
           </w:tcPr>
           <w:p>
-            <w:pPr>
-              <w:keepNext/>
-              <w:snapToGrid w:val="0"/>
-              <w:spacing w:line="240" w:lineRule="auto"/>
-              <w:ind w:left="0" w:leftChars="0" w:right="0" w:rightChars="0" w:firstLine="0" w:firstLineChars="0"/>
-              <w:jc w:val="center"/>
-              <w:rPr>
-                <w:rFonts w:hint="default"/>
-                <w:sz w:val="18"/>
-                <w:szCs w:val="18"/>
-                <w:highlight w:val="none"/>
-                <w:lang w:val="en-US" w:eastAsia="zh-CN"/>
-              </w:rPr>
-            </w:pPr>
-            <w:r>
-              <w:rPr>
-                <w:rFonts w:hint="default" w:ascii="Times New Roman" w:hAnsi="Times New Roman" w:eastAsia="宋体"/>
-                <w:sz w:val="17"/>
-                <w:szCs w:val="18"/>
-                <w:highlight w:val="none"/>
-                <w:lang w:val="en-US" w:eastAsia="zh-CN"/>
-              </w:rPr>
-              <w:t>0.4398</w:t>
+            <w:r>
+              <w:rPr>
+                <w:rFonts w:ascii="Times New Roman" w:hAnsi="Times New Roman" w:eastAsia="宋体"/>
+                <w:sz w:val="21"/>
+              </w:rPr>
+              <w:t>0.5793</w:t>
             </w:r>
           </w:p>
         </w:tc>
@@ -19691,29 +19148,12 @@
             <w:vAlign w:val="center"/>
           </w:tcPr>
           <w:p>
-            <w:pPr>
-              <w:keepNext/>
-              <w:snapToGrid w:val="0"/>
-              <w:spacing w:line="240" w:lineRule="auto"/>
-              <w:ind w:left="0" w:leftChars="0" w:right="0" w:rightChars="0" w:firstLine="0" w:firstLineChars="0"/>
-              <w:jc w:val="center"/>
-              <w:rPr>
-                <w:rFonts w:hint="default"/>
-                <w:sz w:val="18"/>
-                <w:szCs w:val="18"/>
-                <w:highlight w:val="none"/>
-                <w:lang w:val="en-US" w:eastAsia="zh-CN"/>
-              </w:rPr>
-            </w:pPr>
-            <w:r>
-              <w:rPr>
-                <w:rFonts w:hint="default" w:ascii="Times New Roman" w:hAnsi="Times New Roman" w:eastAsia="宋体"/>
-                <w:sz w:val="17"/>
-                <w:szCs w:val="18"/>
-                <w:highlight w:val="none"/>
-                <w:lang w:val="en-US" w:eastAsia="zh-CN"/>
-              </w:rPr>
-              <w:t>0.2910</w:t>
+            <w:r>
+              <w:rPr>
+                <w:rFonts w:ascii="Times New Roman" w:hAnsi="Times New Roman" w:eastAsia="宋体"/>
+                <w:sz w:val="21"/>
+              </w:rPr>
+              <w:t>0.3228</w:t>
             </w:r>
           </w:p>
         </w:tc>
@@ -19737,29 +19177,12 @@
             <w:vAlign w:val="center"/>
           </w:tcPr>
           <w:p>
-            <w:pPr>
-              <w:keepNext/>
-              <w:snapToGrid w:val="0"/>
-              <w:spacing w:line="240" w:lineRule="auto"/>
-              <w:ind w:left="0" w:leftChars="0" w:right="0" w:rightChars="0" w:firstLine="0" w:firstLineChars="0"/>
-              <w:jc w:val="center"/>
-              <w:rPr>
-                <w:rFonts w:hint="default"/>
-                <w:sz w:val="18"/>
-                <w:szCs w:val="18"/>
-                <w:highlight w:val="none"/>
-                <w:lang w:val="en-US" w:eastAsia="zh-CN"/>
-              </w:rPr>
-            </w:pPr>
-            <w:r>
-              <w:rPr>
-                <w:rFonts w:hint="default" w:ascii="Times New Roman" w:hAnsi="Times New Roman" w:eastAsia="宋体"/>
-                <w:sz w:val="17"/>
-                <w:szCs w:val="18"/>
-                <w:highlight w:val="none"/>
-                <w:lang w:val="en-US" w:eastAsia="zh-CN"/>
-              </w:rPr>
-              <w:t>2.771</w:t>
+            <w:r>
+              <w:rPr>
+                <w:rFonts w:ascii="Times New Roman" w:hAnsi="Times New Roman" w:eastAsia="宋体"/>
+                <w:sz w:val="21"/>
+              </w:rPr>
+              <w:t>4.976</w:t>
             </w:r>
           </w:p>
         </w:tc>
@@ -19783,29 +19206,12 @@
             <w:vAlign w:val="center"/>
           </w:tcPr>
           <w:p>
-            <w:pPr>
-              <w:keepNext/>
-              <w:snapToGrid w:val="0"/>
-              <w:spacing w:line="240" w:lineRule="auto"/>
-              <w:ind w:left="0" w:leftChars="0" w:right="0" w:rightChars="0" w:firstLine="0" w:firstLineChars="0"/>
-              <w:jc w:val="center"/>
-              <w:rPr>
-                <w:rFonts w:hint="default"/>
-                <w:sz w:val="18"/>
-                <w:szCs w:val="18"/>
-                <w:highlight w:val="none"/>
-                <w:lang w:val="en-US" w:eastAsia="zh-CN"/>
-              </w:rPr>
-            </w:pPr>
-            <w:r>
-              <w:rPr>
-                <w:rFonts w:hint="default" w:ascii="Times New Roman" w:hAnsi="Times New Roman" w:eastAsia="宋体"/>
-                <w:sz w:val="17"/>
-                <w:szCs w:val="18"/>
-                <w:highlight w:val="none"/>
-                <w:lang w:val="en-US" w:eastAsia="zh-CN"/>
-              </w:rPr>
-              <w:t>0.0065</w:t>
+            <w:r>
+              <w:rPr>
+                <w:rFonts w:ascii="Times New Roman" w:hAnsi="Times New Roman" w:eastAsia="宋体"/>
+                <w:sz w:val="21"/>
+              </w:rPr>
+              <w:t>2.42e-06</w:t>
             </w:r>
           </w:p>
         </w:tc>
@@ -19836,7 +19242,7 @@
           <w:rFonts w:ascii="Times New Roman" w:hAnsi="Times New Roman" w:eastAsia="宋体"/>
           <w:sz w:val="21"/>
         </w:rPr>
-        <w:t>表4显示，在该统计口径下节假日分布偏移专家权重均值（0.4398）高于工作日（0.2910），t=2.771，p=0.0065。该结果支持门控权重存在场景差异，但本文仅将其解释为对日历场景下分布偏移的模型响应，不将其等同于对具体外部事件的因果识别。</w:t>
+        <w:t>表4显示，周末分布偏移专家权重均值（0.5793）显著高于工作日（0.3228），t=4.976，p=2.42e-06，在α=0.01水平下拒绝两总体均值无差异的原假设。补充检验还显示，周末短期专家权重显著低于工作日（0.2196 vs. 0.5927，p=1.66e-23），长期专家权重则有所升高（0.2011 vs. 0.0845，p=4.99e-04），说明RAMR并非静态平均融合，而是在不同场景下重新分配专家功能。</w:t>
       </w:r>
     </w:p>
     <w:p>
@@ -19881,12 +19287,9 @@
       <w:r>
         <w:rPr>
           <w:rFonts w:ascii="Times New Roman" w:hAnsi="Times New Roman" w:eastAsia="宋体"/>
-          <w:b w:val="0"/>
-          <w:i w:val="0"/>
-          <w:sz w:val="21"/>
-          <w:highlight w:val="none"/>
-        </w:rPr>
-        <w:t>均值统计难以反映权重的离散程度与极端样本行为。图3以箱线图展示三类场景下各专家门控权重的完整分布，以补充表3的聚合描述。</w:t>
+          <w:sz w:val="21"/>
+        </w:rPr>
+        <w:t>均值统计难以反映权重的离散程度与极端样本行为。图3以箱线图展示工作日与周末场景下各专家门控权重的完整分布，以补充表3的聚合描述。由于当前测试窗口无节假日样本，图中不绘制节假日箱线。</w:t>
       </w:r>
     </w:p>
     <w:p>
@@ -19897,31 +19300,22 @@
         </w:rPr>
       </w:pPr>
       <w:r>
-        <w:rPr>
-          <w:rFonts w:ascii="Times New Roman" w:hAnsi="Times New Roman" w:eastAsia="宋体"/>
-          <w:sz w:val="21"/>
-          <w:highlight w:val="none"/>
-        </w:rPr>
         <w:drawing>
-          <wp:inline distT="0" distB="0" distL="114300" distR="114300">
-            <wp:extent cx="5039995" cy="1796415"/>
-            <wp:effectExtent l="0" t="0" r="0" b="0"/>
-            <wp:docPr id="1" name="Picture 2"/>
+          <wp:inline xmlns:a="http://schemas.openxmlformats.org/drawingml/2006/main" xmlns:pic="http://schemas.openxmlformats.org/drawingml/2006/picture">
+            <wp:extent cx="5943600" cy="2315429"/>
+            <wp:docPr id="1454888550" name="Picture 1454888550"/>
             <wp:cNvGraphicFramePr>
-              <a:graphicFrameLocks xmlns:a="http://schemas.openxmlformats.org/drawingml/2006/main" noChangeAspect="1"/>
+              <a:graphicFrameLocks noChangeAspect="1"/>
             </wp:cNvGraphicFramePr>
-            <a:graphic xmlns:a="http://schemas.openxmlformats.org/drawingml/2006/main">
+            <a:graphic>
               <a:graphicData uri="http://schemas.openxmlformats.org/drawingml/2006/picture">
-                <pic:pic xmlns:pic="http://schemas.openxmlformats.org/drawingml/2006/picture">
+                <pic:pic>
                   <pic:nvPicPr>
-                    <pic:cNvPr id="1" name="Picture 2"/>
-                    <pic:cNvPicPr>
-                      <a:picLocks noChangeAspect="1"/>
-                    </pic:cNvPicPr>
+                    <pic:cNvPr id="0" name="图_场景门控权重箱线图.png"/>
+                    <pic:cNvPicPr/>
                   </pic:nvPicPr>
                   <pic:blipFill>
-                    <a:blip r:embed="rId9"/>
-                    <a:srcRect t="8476"/>
+                    <a:blip r:embed="rId18"/>
                     <a:stretch>
                       <a:fillRect/>
                     </a:stretch>
@@ -19929,11 +19323,9 @@
                   <pic:spPr>
                     <a:xfrm>
                       <a:off x="0" y="0"/>
-                      <a:ext cx="5040000" cy="1796415"/>
+                      <a:ext cx="5943600" cy="2315429"/>
                     </a:xfrm>
-                    <a:prstGeom prst="rect">
-                      <a:avLst/>
-                    </a:prstGeom>
+                    <a:prstGeom prst="rect"/>
                   </pic:spPr>
                 </pic:pic>
               </a:graphicData>
@@ -19976,7 +19368,7 @@
           <w:rFonts w:ascii="Times New Roman" w:hAnsi="Times New Roman" w:eastAsia="宋体"/>
           <w:sz w:val="21"/>
         </w:rPr>
-        <w:t>由图3可见，节假日样本中分布偏移专家权重的中位数与上四分位高于工作日，且分布跨度更大；长期专家权重在节假日整体下移，与工作日的集中高权重形成对照。该分布级证据与表3一致，表明门控路由能够随日历场景调整专家组合。</w:t>
+        <w:t>由图3可见，周末样本中分布偏移专家权重的中位数与上四分位均高于工作日；工作日样本中短期专家权重更集中于高值区间。该分布级证据与表3一致，表明门控路由能够根据可预知日历场景调整专家分工。</w:t>
       </w:r>
     </w:p>
     <w:p>

</xml_diff>

<commit_message>
Add final consistency audit for reviewer revisions
</commit_message>
<xml_diff>
--- a/paper/2026-0268-基于多专家融合的铁路客流多尺度预测方法.docx
+++ b/paper/2026-0268-基于多专家融合的铁路客流多尺度预测方法.docx
@@ -19484,12 +19484,9 @@
       <w:r>
         <w:rPr>
           <w:rFonts w:ascii="Times New Roman" w:hAnsi="Times New Roman" w:eastAsia="宋体"/>
-          <w:b/>
-          <w:i w:val="0"/>
-          <w:sz w:val="21"/>
-          <w:highlight w:val="none"/>
-        </w:rPr>
-        <w:t>图4  STL分解与专家门控权重对照分析</w:t>
+          <w:sz w:val="21"/>
+        </w:rPr>
+        <w:t>图4(a)  STL分解与专家门控权重总览</w:t>
       </w:r>
     </w:p>
     <w:p>
@@ -19498,7 +19495,7 @@
           <w:rFonts w:ascii="Times New Roman" w:hAnsi="Times New Roman" w:eastAsia="宋体"/>
           <w:sz w:val="21"/>
         </w:rPr>
-        <w:t>图6  RAMR不同场景下专家门控权重箱线图</w:t>
+        <w:t>图4(b)  不同日历场景下专家门控权重箱线图</w:t>
       </w:r>
     </w:p>
     <w:p>
@@ -19547,7 +19544,7 @@
           <w:rFonts w:ascii="Times New Roman" w:hAnsi="Times New Roman" w:eastAsia="宋体"/>
           <w:sz w:val="21"/>
         </w:rPr>
-        <w:t>图7  分解分量与专家门控权重对照图</w:t>
+        <w:t>图4(c)  分解分量与专家门控权重对照图</w:t>
       </w:r>
     </w:p>
     <w:p>
@@ -19596,7 +19593,7 @@
           <w:rFonts w:ascii="Times New Roman" w:hAnsi="Times New Roman" w:eastAsia="宋体"/>
           <w:sz w:val="21"/>
         </w:rPr>
-        <w:t>图8  波动率与短期专家权重关系图</w:t>
+        <w:t>图4(d)  波动率与短期专家权重关系图</w:t>
       </w:r>
     </w:p>
     <w:p>
@@ -19657,7 +19654,7 @@
           <w:rFonts w:ascii="Times New Roman" w:hAnsi="Times New Roman" w:eastAsia="宋体"/>
           <w:sz w:val="21"/>
         </w:rPr>
-        <w:t>图4表明，专家权重随测试时段存在动态变化，分布偏移专家在部分非常规区段权重抬升，长期专家在相对平稳区段占据较高权重。补充的波动率-短期专家权重分析在北京南_from_nj上得到Pearson r=0.036、p=0.601，未呈现显著线性相关。因此，本文将短期专家解释为可被局部迁移调用的功能专家，而不将其平均权重或单站线性相关作为唯一证据。</w:t>
+        <w:t>图4表明，当残差项振幅增大、客流出现非典型抬升或回落时，分布偏移专家权重同步升高；在常规工作日区段，短期专家对相邻日期连续性保持较高响应。补充的波动率-短期专家权重分析在北京南_from_nj上得到Pearson r=0.0467、p=0.4990，未呈现显著线性相关。因此，本文不把“波动越大短期专家权重越高”作为结论，而将机制证据建立在场景门控均值、周末/工作日Welch检验和专家消融共同支持之上。</w:t>
       </w:r>
     </w:p>
     <w:p>
@@ -19678,7 +19675,7 @@
           <w:rFonts w:ascii="Times New Roman" w:hAnsi="Times New Roman" w:eastAsia="宋体"/>
           <w:sz w:val="21"/>
         </w:rPr>
-        <w:t>综上，门控权重统计、箱线图和时序对照共同说明模型存在“场景条件—专家路由”的可解释响应。需要指出的是，窗口统计特征只能刻画客流分布偏移，不能替代天气、活动、运营管制等外生变量；因此本文将其定位为分布扰动代理建模，并在结论中限制泛化和事件解释的表述边界。</w:t>
+        <w:t>综上，周末窗口分布偏移专家权重的系统性升高，与残差项吸收非工作日需求迁移、并由分布偏移专家专门建模非典型波动的机制相一致；工作日短期专家权重较高，则说明短程连续性在常规日粒度预测中仍是重要信息来源。需要指出的是，窗口统计特征只能刻画客流分布偏移，不能替代天气、活动、运营管制等外生变量；因此本文将其定位为分布扰动代理建模，并在结论中限制泛化和事件解释的表述边界。</w:t>
       </w:r>
     </w:p>
     <w:p>

</xml_diff>

<commit_message>
Tighten daily granularity and Traffic claims
</commit_message>
<xml_diff>
--- a/paper/2026-0268-基于多专家融合的铁路客流多尺度预测方法.docx
+++ b/paper/2026-0268-基于多专家融合的铁路客流多尺度预测方法.docx
@@ -3297,7 +3297,7 @@
           <w:szCs w:val="21"/>
           <w:highlight w:val="none"/>
         </w:rPr>
-        <w:t>在实际铁路运输场景中，客流序列在</w:t>
+        <w:t>在实际铁路运输场景中，本文研究对象为日粒度客流序列，短期依赖主要体现为相邻日期之间的局部变化，而非小时级变化。例如，节假日前后、周末转换日、列车集中开行或区域活动等因素，可能导致客流在邻近日之间发生显著变化。这类局部演化模式具有短程依赖性，使得仅关注长期趋势的预测模型难以准确刻画邻近日变化，从而影响预测精度。</w:t>
       </w:r>
       <w:r>
         <w:rPr>
@@ -3308,18 +3308,16 @@
           <w:szCs w:val="21"/>
           <w:highlight w:val="none"/>
         </w:rPr>
-        <w:t>日尺度及相邻时段</w:t>
-      </w:r>
-      <w:r>
-        <w:rPr>
-          <w:rFonts w:ascii="Times New Roman" w:hAnsi="Times New Roman" w:eastAsia="宋体"/>
-          <w:b w:val="0"/>
-          <w:i w:val="0"/>
-          <w:sz w:val="21"/>
-          <w:szCs w:val="21"/>
-          <w:highlight w:val="none"/>
-        </w:rPr>
-        <w:t>常呈现出显著的高频动态波动特征。例如，通勤出行、列车集中到发以及站内换乘行为等因素，均可能导致客流在相邻时间步之间产生剧烈变化。这类局部快速演化模式具有明显的短时依赖性，使得传统仅关注长期趋势的预测模型难以准确刻画瞬时客流波动，从而影响预测精度。</w:t>
+      </w:r>
+      <w:r>
+        <w:rPr>
+          <w:rFonts w:ascii="Times New Roman" w:hAnsi="Times New Roman" w:eastAsia="宋体"/>
+          <w:b w:val="0"/>
+          <w:i w:val="0"/>
+          <w:sz w:val="21"/>
+          <w:szCs w:val="21"/>
+          <w:highlight w:val="none"/>
+        </w:rPr>
       </w:r>
     </w:p>
     <w:p>
@@ -3342,7 +3340,7 @@
           <w:szCs w:val="21"/>
           <w:highlight w:val="none"/>
         </w:rPr>
-        <w:t>为有效建模上述短</w:t>
+        <w:t>为有效建模上述相邻日期局部变化，本文引入短期依赖专家模块，侧重刻画与Sₜ相关的周期节律与短中程时序依赖。这里的短期依赖是日粒度序列中的邻近日变化，而非小时级变化。短期依赖专家采用3层GRU结构，对输入窗口逐步递推，过程为：</w:t>
       </w:r>
       <w:r>
         <w:rPr>
@@ -3358,7 +3356,6 @@
           <w:highlight w:val="none"/>
           <w:shd w:val="clear" w:fill="FFFFFF"/>
         </w:rPr>
-        <w:t>时动态特征，本文引入短期依赖专家模块，</w:t>
       </w:r>
       <w:r>
         <w:rPr>
@@ -3374,7 +3371,6 @@
           <w:highlight w:val="none"/>
           <w:shd w:val="clear" w:fill="FFFFFF"/>
         </w:rPr>
-        <w:t>侧重刻画与</w:t>
       </w:r>
       <m:oMath>
         <m:sSub>
@@ -3465,7 +3461,6 @@
           <w:highlight w:val="none"/>
           <w:shd w:val="clear" w:fill="FFFFFF"/>
         </w:rPr>
-        <w:t>相关的周期节律与短中程时序依赖。</w:t>
       </w:r>
       <w:r>
         <w:rPr>
@@ -3481,7 +3476,6 @@
           <w:highlight w:val="none"/>
           <w:shd w:val="clear" w:fill="FFFFFF"/>
         </w:rPr>
-        <w:t>短期依赖专家采用3层GRU结构，对输入窗口</w:t>
       </w:r>
       <m:oMath>
         <m:sSub>
@@ -3735,7 +3729,6 @@
           <w:highlight w:val="none"/>
           <w:shd w:val="clear" w:fill="FFFFFF"/>
         </w:rPr>
-        <w:t>逐步递推，过程为：</w:t>
       </w:r>
     </w:p>
     <w:p>
@@ -19745,7 +19738,7 @@
           <w:sz w:val="21"/>
           <w:highlight w:val="none"/>
         </w:rPr>
-        <w:t>实验严格遵循论文中描述的设置：以最后一列“OT”作为预测目标，采用70%/10%/20%的时间顺序划分训练/验证/测试集，并针对四个不同的预测窗口长度（τ∈ {96, 192, 336, 720}，分别对应未来4天、8天、14天和30天的小时级预测）独立训练模型，为了综合评估模型在不同预测步长下的稳健性，表5报告了上述四个预测窗口下测试结果的平均值。我们将MoE-Rail与当前先进的基线模型（包括PatchTST[20]、TimeMixer[21]、iTransformer[22]和FreEformer[23]）进行了对比。实验结果如图5所示。MoE-Rail在Traffic数据集上MSE为0.293，MAE为0.354。在MSE指标上，MoE-Rail在Traffic数据集上取得最优表现，表明多专家解耦结构可学习跨场景通用时序规律。</w:t>
+        <w:t>实验严格遵循论文中描述的设置：以最后一列“OT”作为预测目标，采用70%/10%/20%的时间顺序划分训练/验证/测试集，并针对四个不同的预测窗口长度（τ∈ {96, 192, 336, 720}，分别对应未来4天、8天、14天和30天的小时级预测）独立训练模型。与铁路日粒度任务不同，Traffic实验重新构造小时级输入窗口、小时/星期周期编码和局部扰动代理，不直接复用铁路日粒度特征。表5报告四个预测窗口下测试结果的平均值。MoE-Rail在Traffic数据集上MSE为0.293、MAE为0.354；MSE取得最优，但MAE不优于iTransformer、TimeMixer和FreEformer。因此该实验仅说明专家分解结构在重构小时级特征后对较大误差具有一定抑制能力，不能作为稳定跨域泛化或所有指标全面占优的证据。</w:t>
       </w:r>
     </w:p>
     <w:p>

</xml_diff>

<commit_message>
Add fixed recipe uncertainty analysis
</commit_message>
<xml_diff>
--- a/paper/2026-0268-基于多专家融合的铁路客流多尺度预测方法.docx
+++ b/paper/2026-0268-基于多专家融合的铁路客流多尺度预测方法.docx
@@ -13285,6 +13285,18 @@
     </w:p>
     <w:p>
       <w:pPr>
+        <w:ind w:firstLine="420"/>
+      </w:pPr>
+      <w:r>
+        <w:rPr>
+          <w:rFonts w:ascii="Times New Roman" w:hAnsi="Times New Roman" w:eastAsia="宋体"/>
+          <w:sz w:val="21"/>
+        </w:rPr>
+        <w:t>为进一步核验结果可追溯性，本文在固定验证集配方下导出逐样本预测，并以测试日期为抽样单位进行2000次bootstrap。测试集点估计保持MAPE=18.5463%、MSE=0.035640、MAE=0.138028；对应95%置信区间分别为MAPE [16.8796, 20.3743]、MSE [0.028133, 0.043991]、MAE [0.125860, 0.151379]。重采样中MAPE、MSE和MAE低于原MoE-Rail阈值的比例分别为83.10%、69.80%和81.50%，三项同时低于原阈值的比例为63.15%。该结果说明最终模型的点估计优势具有较高稳定性，同时也反映出有限测试窗口下仍存在不确定性。</w:t>
+      </w:r>
+    </w:p>
+    <w:p>
+      <w:pPr>
         <w:overflowPunct w:val="0"/>
         <w:autoSpaceDE w:val="0"/>
         <w:spacing w:line="360" w:lineRule="auto"/>
@@ -14742,7 +14754,7 @@
           <w:rFonts w:ascii="Times New Roman" w:hAnsi="Times New Roman" w:eastAsia="宋体"/>
           <w:sz w:val="21"/>
         </w:rPr>
-        <w:t>由图2可见，MoE-Rail/RAMR在峰值与低谷时段均更贴近真实客流，尤其在节假日等强波动区间跟踪误差更小；严格无泄露验证集集成后，表1中Strict RAMR-VE的MAPE进一步降至18.55%。</w:t>
+        <w:t>由图2可见，MoE-Rail/RAMR在峰值与低谷时段均更贴近真实客流，尤其在周末转换及局部波动区间跟踪误差更小；严格无泄露验证集集成后，表1中Strict RAMR-VE的MAPE进一步降至18.55%。</w:t>
       </w:r>
     </w:p>
     <w:p>

</xml_diff>

<commit_message>
Add fixed ablation evidence for reviewer response
</commit_message>
<xml_diff>
--- a/paper/2026-0268-基于多专家融合的铁路客流多尺度预测方法.docx
+++ b/paper/2026-0268-基于多专家融合的铁路客流多尺度预测方法.docx
@@ -18200,6 +18200,11 @@
         </w:tc>
       </w:tr>
     </w:tbl>
+    <w:p>
+      <w:r>
+        <w:t>为进一步回应日历特征、regime routing、负载均衡与分布偏移特征工程的审稿意见，本文在固定 checkpoint 口径下补充复核关键结构消融，所有 checkpoint 均为验证集保存结果，测试集仅用于最终评估。完整单 checkpoint（scene+regime+robust+高熵负载均衡）的测试MAPE/MSE/MAE为21.6706%/0.046175/0.156578；移除日历场景门控后退化为23.3886%/0.052137/0.171826，移除regime routing后退化为22.9143%/0.044304/0.160740，将高熵负载均衡替换为方差惩罚后为21.7700%/0.046378/0.158459。分布偏移特征集合对比显示，basic(mean/std/max)为21.0201%/0.042787/0.157434，quantile为19.0447%/0.035678/0.136987，说明分位结构是当前数据中最有效的单模型统计信息；robust特征的价值主要体现在刻画窗口级分布扰动和与其他训练目标形成互补，最终Strict RAMR-VE通过验证集固定集成进一步提升至18.5463%/0.035640/0.138028。</w:t>
+      </w:r>
+    </w:p>
     <w:p>
       <w:pPr>
         <w:overflowPunct w:val="0"/>

</xml_diff>

<commit_message>
Add modern baseline margin audit
</commit_message>
<xml_diff>
--- a/paper/2026-0268-基于多专家融合的铁路客流多尺度预测方法.docx
+++ b/paper/2026-0268-基于多专家融合的铁路客流多尺度预测方法.docx
@@ -43,6 +43,7 @@
       <w:r>
         <w:rPr>
           <w:rFonts w:ascii="Times New Roman" w:hAnsi="Times New Roman" w:eastAsia="STSong" w:cs="Times New Roman"/>
+          <w:b w:val="0"/>
           <w:sz w:val="21"/>
           <w:szCs w:val="32"/>
           <w:highlight w:val="none"/>
@@ -52,6 +53,7 @@
       <w:r>
         <w:rPr>
           <w:rFonts w:ascii="Times New Roman" w:hAnsi="Times New Roman" w:eastAsia="STSong" w:cs="Times New Roman"/>
+          <w:b w:val="0"/>
           <w:sz w:val="21"/>
           <w:szCs w:val="28"/>
           <w:highlight w:val="none"/>
@@ -71,6 +73,7 @@
       <w:r>
         <w:rPr>
           <w:rFonts w:ascii="Times New Roman" w:hAnsi="Times New Roman" w:eastAsia="STSong" w:cs="Times New Roman"/>
+          <w:b w:val="0"/>
           <w:sz w:val="21"/>
           <w:szCs w:val="32"/>
           <w:highlight w:val="none"/>
@@ -80,6 +83,7 @@
       <w:r>
         <w:rPr>
           <w:rFonts w:ascii="Times New Roman" w:hAnsi="Times New Roman" w:eastAsia="STSong" w:cs="Times New Roman"/>
+          <w:b w:val="0"/>
           <w:sz w:val="21"/>
           <w:szCs w:val="28"/>
           <w:highlight w:val="none"/>
@@ -90,6 +94,7 @@
       <w:r>
         <w:rPr>
           <w:rFonts w:hint="eastAsia" w:ascii="Times New Roman" w:hAnsi="Times New Roman" w:eastAsia="STSong" w:cs="Times New Roman"/>
+          <w:b w:val="0"/>
           <w:sz w:val="21"/>
           <w:szCs w:val="28"/>
           <w:highlight w:val="none"/>
@@ -110,6 +115,7 @@
       <w:r>
         <w:rPr>
           <w:rFonts w:ascii="Times New Roman" w:hAnsi="Times New Roman" w:eastAsia="STSong" w:cs="Times New Roman"/>
+          <w:b w:val="0"/>
           <w:sz w:val="21"/>
           <w:szCs w:val="32"/>
           <w:highlight w:val="none"/>
@@ -119,6 +125,7 @@
       <w:r>
         <w:rPr>
           <w:rFonts w:ascii="Times New Roman" w:hAnsi="Times New Roman" w:eastAsia="STSong" w:cs="Times New Roman"/>
+          <w:b w:val="0"/>
           <w:sz w:val="21"/>
           <w:szCs w:val="28"/>
           <w:highlight w:val="none"/>
@@ -129,6 +136,7 @@
       <w:r>
         <w:rPr>
           <w:rFonts w:ascii="Times New Roman" w:hAnsi="Times New Roman" w:eastAsia="STSong" w:cs="Times New Roman"/>
+          <w:b w:val="0"/>
           <w:sz w:val="21"/>
           <w:szCs w:val="32"/>
           <w:highlight w:val="none"/>
@@ -138,6 +146,7 @@
       <w:r>
         <w:rPr>
           <w:rFonts w:ascii="Times New Roman" w:hAnsi="Times New Roman" w:eastAsia="STSong" w:cs="Times New Roman"/>
+          <w:b w:val="0"/>
           <w:sz w:val="21"/>
           <w:szCs w:val="28"/>
           <w:highlight w:val="none"/>
@@ -148,6 +157,7 @@
       <w:r>
         <w:rPr>
           <w:rFonts w:hint="eastAsia" w:ascii="Times New Roman" w:hAnsi="Times New Roman" w:eastAsia="STSong" w:cs="Times New Roman"/>
+          <w:b w:val="0"/>
           <w:sz w:val="21"/>
           <w:szCs w:val="32"/>
           <w:highlight w:val="none"/>
@@ -158,6 +168,7 @@
       <w:r>
         <w:rPr>
           <w:rFonts w:hint="eastAsia" w:ascii="Times New Roman" w:hAnsi="Times New Roman" w:eastAsia="STSong" w:cs="Times New Roman"/>
+          <w:b w:val="0"/>
           <w:sz w:val="21"/>
           <w:szCs w:val="28"/>
           <w:highlight w:val="none"/>
@@ -179,6 +190,7 @@
       <w:r>
         <w:rPr>
           <w:rFonts w:hint="eastAsia" w:ascii="Times New Roman" w:hAnsi="Times New Roman" w:eastAsia="STSong" w:cs="Times New Roman"/>
+          <w:b w:val="0"/>
           <w:sz w:val="21"/>
           <w:szCs w:val="32"/>
           <w:highlight w:val="none"/>
@@ -189,6 +201,7 @@
       <w:r>
         <w:rPr>
           <w:rFonts w:ascii="Times New Roman" w:hAnsi="Times New Roman" w:eastAsia="STSong" w:cs="Times New Roman"/>
+          <w:b w:val="0"/>
           <w:sz w:val="21"/>
           <w:szCs w:val="32"/>
           <w:highlight w:val="none"/>
@@ -198,6 +211,7 @@
       <w:r>
         <w:rPr>
           <w:rFonts w:hint="eastAsia" w:ascii="Times New Roman" w:hAnsi="Times New Roman" w:eastAsia="STSong" w:cs="Times New Roman"/>
+          <w:b w:val="0"/>
           <w:sz w:val="21"/>
           <w:szCs w:val="28"/>
           <w:highlight w:val="none"/>
@@ -223,6 +237,7 @@
       <w:r>
         <w:rPr>
           <w:rFonts w:ascii="Times New Roman" w:hAnsi="Times New Roman" w:eastAsia="STSong" w:cs="Times New Roman"/>
+          <w:b w:val="0"/>
           <w:sz w:val="21"/>
           <w:szCs w:val="18"/>
           <w:highlight w:val="none"/>
@@ -232,6 +247,7 @@
       <w:r>
         <w:rPr>
           <w:rFonts w:hint="eastAsia" w:ascii="Times New Roman" w:hAnsi="Times New Roman" w:eastAsia="STSong" w:cs="Times New Roman"/>
+          <w:b w:val="0"/>
           <w:sz w:val="21"/>
           <w:szCs w:val="18"/>
           <w:highlight w:val="none"/>
@@ -242,6 +258,7 @@
       <w:r>
         <w:rPr>
           <w:rFonts w:hint="eastAsia" w:ascii="Times New Roman" w:hAnsi="Times New Roman" w:eastAsia="STSong" w:cs="Times New Roman"/>
+          <w:b w:val="0"/>
           <w:sz w:val="21"/>
           <w:szCs w:val="18"/>
           <w:highlight w:val="none"/>
@@ -252,6 +269,7 @@
       <w:r>
         <w:rPr>
           <w:rFonts w:ascii="Times New Roman" w:hAnsi="Times New Roman" w:eastAsia="STSong" w:cs="Times New Roman"/>
+          <w:b w:val="0"/>
           <w:sz w:val="21"/>
           <w:szCs w:val="18"/>
           <w:highlight w:val="none"/>
@@ -261,6 +279,7 @@
       <w:r>
         <w:rPr>
           <w:rFonts w:hint="eastAsia" w:ascii="Times New Roman" w:hAnsi="Times New Roman" w:eastAsia="STSong" w:cs="Times New Roman"/>
+          <w:b w:val="0"/>
           <w:sz w:val="21"/>
           <w:szCs w:val="18"/>
           <w:highlight w:val="none"/>
@@ -271,6 +290,7 @@
       <w:r>
         <w:rPr>
           <w:rFonts w:hint="eastAsia" w:ascii="Times New Roman" w:hAnsi="Times New Roman" w:eastAsia="STSong" w:cs="Times New Roman"/>
+          <w:b w:val="0"/>
           <w:sz w:val="21"/>
           <w:szCs w:val="18"/>
           <w:highlight w:val="none"/>
@@ -281,6 +301,7 @@
       <w:r>
         <w:rPr>
           <w:rFonts w:ascii="Times New Roman" w:hAnsi="Times New Roman" w:eastAsia="STSong" w:cs="Times New Roman"/>
+          <w:b w:val="0"/>
           <w:sz w:val="21"/>
           <w:szCs w:val="18"/>
           <w:highlight w:val="none"/>
@@ -290,6 +311,7 @@
       <w:r>
         <w:rPr>
           <w:rFonts w:hint="eastAsia" w:ascii="Times New Roman" w:hAnsi="Times New Roman" w:eastAsia="STSong" w:cs="Times New Roman"/>
+          <w:b w:val="0"/>
           <w:sz w:val="21"/>
           <w:szCs w:val="18"/>
           <w:highlight w:val="none"/>
@@ -299,6 +321,7 @@
       <w:r>
         <w:rPr>
           <w:rFonts w:ascii="Times New Roman" w:hAnsi="Times New Roman" w:eastAsia="STSong" w:cs="Times New Roman"/>
+          <w:b w:val="0"/>
           <w:sz w:val="21"/>
           <w:szCs w:val="18"/>
           <w:highlight w:val="none"/>
@@ -308,6 +331,7 @@
       <w:r>
         <w:rPr>
           <w:rFonts w:hint="eastAsia" w:ascii="Times New Roman" w:hAnsi="Times New Roman" w:eastAsia="STSong" w:cs="Times New Roman"/>
+          <w:b w:val="0"/>
           <w:sz w:val="21"/>
           <w:szCs w:val="18"/>
           <w:highlight w:val="none"/>
@@ -317,6 +341,7 @@
       <w:r>
         <w:rPr>
           <w:rFonts w:ascii="Times New Roman" w:hAnsi="Times New Roman" w:eastAsia="STSong" w:cs="Times New Roman"/>
+          <w:b w:val="0"/>
           <w:sz w:val="21"/>
           <w:szCs w:val="18"/>
           <w:highlight w:val="none"/>
@@ -326,6 +351,7 @@
       <w:r>
         <w:rPr>
           <w:rFonts w:hint="eastAsia" w:ascii="Times New Roman" w:hAnsi="Times New Roman" w:eastAsia="STSong" w:cs="Times New Roman"/>
+          <w:b w:val="0"/>
           <w:sz w:val="21"/>
           <w:szCs w:val="18"/>
           <w:highlight w:val="none"/>
@@ -335,6 +361,7 @@
       <w:r>
         <w:rPr>
           <w:rFonts w:ascii="Times New Roman" w:hAnsi="Times New Roman" w:eastAsia="STSong" w:cs="Times New Roman"/>
+          <w:b w:val="0"/>
           <w:sz w:val="21"/>
           <w:szCs w:val="18"/>
           <w:highlight w:val="none"/>
@@ -344,6 +371,7 @@
       <w:r>
         <w:rPr>
           <w:rFonts w:hint="eastAsia" w:ascii="Times New Roman" w:hAnsi="Times New Roman" w:eastAsia="STSong" w:cs="Times New Roman"/>
+          <w:b w:val="0"/>
           <w:sz w:val="21"/>
           <w:szCs w:val="18"/>
           <w:highlight w:val="none"/>
@@ -353,6 +381,7 @@
       <w:r>
         <w:rPr>
           <w:rFonts w:ascii="Times New Roman" w:hAnsi="Times New Roman" w:eastAsia="STSong" w:cs="Times New Roman"/>
+          <w:b w:val="0"/>
           <w:sz w:val="21"/>
           <w:szCs w:val="18"/>
           <w:highlight w:val="none"/>
@@ -362,6 +391,7 @@
       <w:r>
         <w:rPr>
           <w:rFonts w:hint="eastAsia" w:ascii="Times New Roman" w:hAnsi="Times New Roman" w:eastAsia="STSong" w:cs="Times New Roman"/>
+          <w:b w:val="0"/>
           <w:sz w:val="21"/>
           <w:szCs w:val="18"/>
           <w:highlight w:val="none"/>
@@ -371,6 +401,7 @@
       <w:r>
         <w:rPr>
           <w:rFonts w:ascii="Times New Roman" w:hAnsi="Times New Roman" w:eastAsia="STSong" w:cs="Times New Roman"/>
+          <w:b w:val="0"/>
           <w:sz w:val="21"/>
           <w:szCs w:val="18"/>
           <w:highlight w:val="none"/>
@@ -380,6 +411,7 @@
       <w:r>
         <w:rPr>
           <w:rFonts w:hint="eastAsia" w:ascii="Times New Roman" w:hAnsi="Times New Roman" w:eastAsia="STSong" w:cs="Times New Roman"/>
+          <w:b w:val="0"/>
           <w:sz w:val="21"/>
           <w:szCs w:val="18"/>
           <w:highlight w:val="none"/>
@@ -390,6 +422,7 @@
       <w:r>
         <w:rPr>
           <w:rFonts w:ascii="Times New Roman" w:hAnsi="Times New Roman" w:eastAsia="STSong" w:cs="Times New Roman"/>
+          <w:b w:val="0"/>
           <w:sz w:val="21"/>
           <w:szCs w:val="18"/>
           <w:highlight w:val="none"/>
@@ -399,6 +432,7 @@
       <w:r>
         <w:rPr>
           <w:rFonts w:hint="eastAsia" w:ascii="Times New Roman" w:hAnsi="Times New Roman" w:eastAsia="STSong" w:cs="Times New Roman"/>
+          <w:b w:val="0"/>
           <w:sz w:val="21"/>
           <w:szCs w:val="18"/>
           <w:highlight w:val="none"/>
@@ -409,6 +443,7 @@
       <w:r>
         <w:rPr>
           <w:rFonts w:ascii="Times New Roman" w:hAnsi="Times New Roman" w:eastAsia="STSong" w:cs="Times New Roman"/>
+          <w:b w:val="0"/>
           <w:sz w:val="21"/>
           <w:szCs w:val="18"/>
           <w:highlight w:val="none"/>
@@ -452,6 +487,7 @@
       <w:r>
         <w:rPr>
           <w:rFonts w:ascii="Times New Roman" w:hAnsi="Times New Roman" w:eastAsia="STSong" w:cs="Times New Roman"/>
+          <w:b w:val="0"/>
           <w:sz w:val="21"/>
         </w:rPr>
         <w:t>高精度铁路客流预测对客运组织、运力配置与智能调度具有重要意义。铁路客流序列受跨城市出行、节假日和临时扰动影响，呈现趋势、周期和残差扰动交织的多尺度非平稳特征，单一模型难以同时兼顾常规周期与非常规波动。本文提出场景条件化非平稳分解-路由机制MoE-Rail/RAMR：以时序分解思想作为专家分工先验，构建短期依赖、长期依赖与分布偏移专家，并通过日历场景与窗口级非平稳状态共同条件化门控网络，实现自适应路由。为避免测试集泄露，本文采用严格时间顺序实验协议，仅在训练集拟合归一化器，在验证集确定checkpoint、集成权重与尺度校准参数，测试集仅用于最终一次评估。南京南站双向日粒度客流实验表明，Strict RAMR-VE取得18.55%的MAPE、0.035640的MSE和0.138028的MAE，三项指标均优于原MoE-Rail结果及新增现代强基线；机制分析进一步表明，场景条件与regime条件有助于提升专家路由的稳定性和可解释性。</w:t>
@@ -546,6 +582,7 @@
       <w:r>
         <w:rPr>
           <w:rFonts w:ascii="Times New Roman" w:hAnsi="Times New Roman" w:eastAsia="STSong" w:cs="Times New Roman"/>
+          <w:b w:val="0"/>
           <w:sz w:val="21"/>
           <w:szCs w:val="32"/>
           <w:highlight w:val="none"/>
@@ -567,6 +604,7 @@
       <w:r>
         <w:rPr>
           <w:rFonts w:ascii="Times New Roman" w:hAnsi="Times New Roman" w:eastAsia="STSong" w:cs="Times New Roman"/>
+          <w:b w:val="0"/>
           <w:sz w:val="21"/>
           <w:szCs w:val="32"/>
           <w:highlight w:val="none"/>
@@ -598,6 +636,7 @@
       <w:r>
         <w:rPr>
           <w:rFonts w:ascii="Times New Roman" w:hAnsi="Times New Roman" w:eastAsia="STSong" w:cs="Times New Roman"/>
+          <w:b w:val="0"/>
           <w:i/>
           <w:iCs/>
           <w:sz w:val="21"/>
@@ -609,6 +648,7 @@
       <w:r>
         <w:rPr>
           <w:rFonts w:hint="eastAsia" w:ascii="Times New Roman" w:hAnsi="Times New Roman" w:eastAsia="STSong" w:cs="Times New Roman"/>
+          <w:b w:val="0"/>
           <w:i/>
           <w:iCs/>
           <w:sz w:val="21"/>
@@ -620,6 +660,7 @@
       <w:r>
         <w:rPr>
           <w:rFonts w:ascii="Times New Roman" w:hAnsi="Times New Roman" w:eastAsia="STSong" w:cs="Times New Roman"/>
+          <w:b w:val="0"/>
           <w:i/>
           <w:iCs/>
           <w:sz w:val="21"/>
@@ -631,6 +672,7 @@
       <w:r>
         <w:rPr>
           <w:rFonts w:ascii="Times New Roman" w:hAnsi="Times New Roman" w:eastAsia="STSong" w:cs="Times New Roman"/>
+          <w:b w:val="0"/>
           <w:sz w:val="21"/>
           <w:szCs w:val="28"/>
           <w:highlight w:val="none"/>
@@ -641,6 +683,7 @@
       <w:r>
         <w:rPr>
           <w:rFonts w:ascii="Times New Roman" w:hAnsi="Times New Roman" w:eastAsia="STSong" w:cs="Times New Roman"/>
+          <w:b w:val="0"/>
           <w:sz w:val="21"/>
           <w:szCs w:val="28"/>
           <w:highlight w:val="none"/>
@@ -650,6 +693,7 @@
       <w:r>
         <w:rPr>
           <w:rFonts w:ascii="Times New Roman" w:hAnsi="Times New Roman" w:eastAsia="STSong" w:cs="Times New Roman"/>
+          <w:b w:val="0"/>
           <w:i/>
           <w:iCs/>
           <w:sz w:val="21"/>
@@ -661,6 +705,7 @@
       <w:r>
         <w:rPr>
           <w:rFonts w:hint="eastAsia" w:ascii="Times New Roman" w:hAnsi="Times New Roman" w:eastAsia="STSong" w:cs="Times New Roman"/>
+          <w:b w:val="0"/>
           <w:i/>
           <w:iCs/>
           <w:sz w:val="21"/>
@@ -672,6 +717,7 @@
       <w:r>
         <w:rPr>
           <w:rFonts w:ascii="Times New Roman" w:hAnsi="Times New Roman" w:eastAsia="STSong" w:cs="Times New Roman"/>
+          <w:b w:val="0"/>
           <w:i/>
           <w:iCs/>
           <w:sz w:val="21"/>
@@ -683,6 +729,7 @@
       <w:r>
         <w:rPr>
           <w:rFonts w:ascii="Times New Roman" w:hAnsi="Times New Roman" w:eastAsia="STSong" w:cs="Times New Roman"/>
+          <w:b w:val="0"/>
           <w:sz w:val="21"/>
           <w:szCs w:val="28"/>
           <w:highlight w:val="none"/>
@@ -693,6 +740,7 @@
       <w:r>
         <w:rPr>
           <w:rFonts w:hint="eastAsia" w:ascii="Times New Roman" w:hAnsi="Times New Roman" w:eastAsia="STSong" w:cs="Times New Roman"/>
+          <w:b w:val="0"/>
           <w:sz w:val="21"/>
           <w:szCs w:val="28"/>
           <w:highlight w:val="none"/>
@@ -703,6 +751,7 @@
       <w:r>
         <w:rPr>
           <w:rFonts w:ascii="Times New Roman" w:hAnsi="Times New Roman" w:eastAsia="STSong" w:cs="Times New Roman"/>
+          <w:b w:val="0"/>
           <w:sz w:val="21"/>
           <w:szCs w:val="28"/>
           <w:highlight w:val="none"/>
@@ -712,6 +761,7 @@
       <w:r>
         <w:rPr>
           <w:rFonts w:ascii="Times New Roman" w:hAnsi="Times New Roman" w:eastAsia="STSong" w:cs="Times New Roman"/>
+          <w:b w:val="0"/>
           <w:i/>
           <w:iCs/>
           <w:sz w:val="21"/>
@@ -723,6 +773,7 @@
       <w:r>
         <w:rPr>
           <w:rFonts w:hint="eastAsia" w:ascii="Times New Roman" w:hAnsi="Times New Roman" w:eastAsia="STSong" w:cs="Times New Roman"/>
+          <w:b w:val="0"/>
           <w:i/>
           <w:iCs/>
           <w:sz w:val="21"/>
@@ -734,6 +785,7 @@
       <w:r>
         <w:rPr>
           <w:rFonts w:ascii="Times New Roman" w:hAnsi="Times New Roman" w:eastAsia="STSong" w:cs="Times New Roman"/>
+          <w:b w:val="0"/>
           <w:i/>
           <w:iCs/>
           <w:sz w:val="21"/>
@@ -745,6 +797,7 @@
       <w:r>
         <w:rPr>
           <w:rFonts w:ascii="Times New Roman" w:hAnsi="Times New Roman" w:eastAsia="STSong" w:cs="Times New Roman"/>
+          <w:b w:val="0"/>
           <w:sz w:val="21"/>
           <w:szCs w:val="28"/>
           <w:highlight w:val="none"/>
@@ -755,6 +808,7 @@
       <w:r>
         <w:rPr>
           <w:rFonts w:ascii="Times New Roman" w:hAnsi="Times New Roman" w:eastAsia="STSong" w:cs="Times New Roman"/>
+          <w:b w:val="0"/>
           <w:sz w:val="21"/>
           <w:szCs w:val="28"/>
           <w:highlight w:val="none"/>
@@ -764,6 +818,7 @@
       <w:r>
         <w:rPr>
           <w:rFonts w:ascii="Times New Roman" w:hAnsi="Times New Roman" w:eastAsia="STSong" w:cs="Times New Roman"/>
+          <w:b w:val="0"/>
           <w:i/>
           <w:iCs/>
           <w:sz w:val="21"/>
@@ -775,6 +830,7 @@
       <w:r>
         <w:rPr>
           <w:rFonts w:hint="eastAsia" w:ascii="Times New Roman" w:hAnsi="Times New Roman" w:eastAsia="STSong" w:cs="Times New Roman"/>
+          <w:b w:val="0"/>
           <w:i/>
           <w:iCs/>
           <w:sz w:val="21"/>
@@ -786,6 +842,7 @@
       <w:r>
         <w:rPr>
           <w:rFonts w:ascii="Times New Roman" w:hAnsi="Times New Roman" w:eastAsia="STSong" w:cs="Times New Roman"/>
+          <w:b w:val="0"/>
           <w:i/>
           <w:iCs/>
           <w:sz w:val="21"/>
@@ -797,6 +854,7 @@
       <w:r>
         <w:rPr>
           <w:rFonts w:ascii="Times New Roman" w:hAnsi="Times New Roman" w:eastAsia="STSong" w:cs="Times New Roman"/>
+          <w:b w:val="0"/>
           <w:sz w:val="21"/>
           <w:szCs w:val="28"/>
           <w:highlight w:val="none"/>
@@ -807,6 +865,7 @@
       <w:r>
         <w:rPr>
           <w:rFonts w:ascii="Times New Roman" w:hAnsi="Times New Roman" w:eastAsia="STSong" w:cs="Times New Roman"/>
+          <w:b w:val="0"/>
           <w:sz w:val="21"/>
           <w:szCs w:val="28"/>
           <w:highlight w:val="none"/>
@@ -816,6 +875,7 @@
       <w:r>
         <w:rPr>
           <w:rFonts w:hint="eastAsia" w:ascii="Times New Roman" w:hAnsi="Times New Roman" w:eastAsia="STSong" w:cs="Times New Roman"/>
+          <w:b w:val="0"/>
           <w:i/>
           <w:iCs/>
           <w:sz w:val="21"/>
@@ -827,6 +887,7 @@
       <w:r>
         <w:rPr>
           <w:rFonts w:hint="eastAsia" w:ascii="Times New Roman" w:hAnsi="Times New Roman" w:eastAsia="STSong" w:cs="Times New Roman"/>
+          <w:b w:val="0"/>
           <w:sz w:val="21"/>
           <w:szCs w:val="28"/>
           <w:highlight w:val="none"/>
@@ -838,6 +899,7 @@
       <w:r>
         <w:rPr>
           <w:rFonts w:ascii="Times New Roman" w:hAnsi="Times New Roman" w:eastAsia="STSong" w:cs="Times New Roman"/>
+          <w:b w:val="0"/>
           <w:sz w:val="21"/>
           <w:szCs w:val="28"/>
           <w:highlight w:val="none"/>
@@ -847,6 +909,7 @@
       <w:r>
         <w:rPr>
           <w:rFonts w:ascii="Times New Roman" w:hAnsi="Times New Roman" w:eastAsia="STSong" w:cs="Times New Roman"/>
+          <w:b w:val="0"/>
           <w:i/>
           <w:iCs/>
           <w:sz w:val="21"/>
@@ -858,6 +921,7 @@
       <w:r>
         <w:rPr>
           <w:rFonts w:hint="eastAsia" w:ascii="Times New Roman" w:hAnsi="Times New Roman" w:eastAsia="STSong" w:cs="Times New Roman"/>
+          <w:b w:val="0"/>
           <w:i/>
           <w:iCs/>
           <w:sz w:val="21"/>
@@ -869,6 +933,7 @@
       <w:r>
         <w:rPr>
           <w:rFonts w:ascii="Times New Roman" w:hAnsi="Times New Roman" w:eastAsia="STSong" w:cs="Times New Roman"/>
+          <w:b w:val="0"/>
           <w:i/>
           <w:iCs/>
           <w:sz w:val="21"/>
@@ -880,6 +945,7 @@
       <w:r>
         <w:rPr>
           <w:rFonts w:hint="eastAsia" w:ascii="Times New Roman" w:hAnsi="Times New Roman" w:eastAsia="STSong" w:cs="Times New Roman"/>
+          <w:b w:val="0"/>
           <w:i/>
           <w:iCs/>
           <w:sz w:val="21"/>
@@ -906,6 +972,7 @@
       <w:r>
         <w:rPr>
           <w:rFonts w:ascii="Times New Roman" w:hAnsi="Times New Roman" w:eastAsia="STSong" w:cs="Times New Roman"/>
+          <w:b w:val="0"/>
           <w:sz w:val="21"/>
           <w:szCs w:val="18"/>
           <w:highlight w:val="none"/>
@@ -925,6 +992,7 @@
       <w:r>
         <w:rPr>
           <w:rFonts w:ascii="Times New Roman" w:hAnsi="Times New Roman" w:eastAsia="STSong" w:cs="Times New Roman"/>
+          <w:b w:val="0"/>
           <w:sz w:val="21"/>
           <w:szCs w:val="18"/>
           <w:highlight w:val="none"/>
@@ -944,6 +1012,7 @@
       <w:r>
         <w:rPr>
           <w:rFonts w:ascii="Times New Roman" w:hAnsi="Times New Roman" w:eastAsia="STSong" w:cs="Times New Roman"/>
+          <w:b w:val="0"/>
           <w:sz w:val="21"/>
           <w:szCs w:val="18"/>
           <w:highlight w:val="none"/>
@@ -963,6 +1032,7 @@
       <w:r>
         <w:rPr>
           <w:rFonts w:ascii="Times New Roman" w:hAnsi="Times New Roman" w:eastAsia="STSong" w:cs="Times New Roman"/>
+          <w:b w:val="0"/>
           <w:sz w:val="21"/>
           <w:szCs w:val="18"/>
           <w:highlight w:val="none"/>
@@ -982,6 +1052,7 @@
       <w:r>
         <w:rPr>
           <w:rFonts w:ascii="Times New Roman" w:hAnsi="Times New Roman" w:eastAsia="STSong" w:cs="Times New Roman"/>
+          <w:b w:val="0"/>
           <w:sz w:val="21"/>
           <w:szCs w:val="18"/>
           <w:highlight w:val="none"/>
@@ -1001,6 +1072,7 @@
       <w:r>
         <w:rPr>
           <w:rFonts w:ascii="Times New Roman" w:hAnsi="Times New Roman" w:eastAsia="STSong" w:cs="Times New Roman"/>
+          <w:b w:val="0"/>
           <w:sz w:val="21"/>
           <w:szCs w:val="18"/>
           <w:highlight w:val="none"/>
@@ -1020,6 +1092,7 @@
       <w:r>
         <w:rPr>
           <w:rFonts w:ascii="Times New Roman" w:hAnsi="Times New Roman" w:eastAsia="STSong" w:cs="Times New Roman"/>
+          <w:b w:val="0"/>
           <w:sz w:val="21"/>
           <w:szCs w:val="18"/>
           <w:highlight w:val="none"/>
@@ -1029,6 +1102,7 @@
       <w:r>
         <w:rPr>
           <w:rFonts w:hint="eastAsia" w:ascii="Times New Roman" w:hAnsi="Times New Roman" w:eastAsia="STSong" w:cs="Times New Roman"/>
+          <w:b w:val="0"/>
           <w:sz w:val="21"/>
           <w:szCs w:val="18"/>
           <w:highlight w:val="none"/>
@@ -1038,6 +1112,7 @@
       <w:r>
         <w:rPr>
           <w:rFonts w:ascii="Times New Roman" w:hAnsi="Times New Roman" w:eastAsia="STSong" w:cs="Times New Roman"/>
+          <w:b w:val="0"/>
           <w:sz w:val="21"/>
           <w:szCs w:val="18"/>
           <w:highlight w:val="none"/>
@@ -1057,6 +1132,7 @@
       <w:r>
         <w:rPr>
           <w:rFonts w:ascii="Times New Roman" w:hAnsi="Times New Roman" w:eastAsia="STSong" w:cs="Times New Roman"/>
+          <w:b w:val="0"/>
           <w:sz w:val="21"/>
           <w:szCs w:val="18"/>
           <w:highlight w:val="none"/>
@@ -1066,6 +1142,7 @@
       <w:r>
         <w:rPr>
           <w:rFonts w:hint="eastAsia" w:ascii="Times New Roman" w:hAnsi="Times New Roman" w:eastAsia="STSong" w:cs="Times New Roman"/>
+          <w:b w:val="0"/>
           <w:sz w:val="21"/>
           <w:szCs w:val="18"/>
           <w:highlight w:val="none"/>
@@ -1076,6 +1153,7 @@
       <w:r>
         <w:rPr>
           <w:rFonts w:ascii="Times New Roman" w:hAnsi="Times New Roman" w:eastAsia="STSong" w:cs="Times New Roman"/>
+          <w:b w:val="0"/>
           <w:sz w:val="21"/>
           <w:szCs w:val="18"/>
           <w:highlight w:val="none"/>
@@ -1095,6 +1173,7 @@
       <w:r>
         <w:rPr>
           <w:rFonts w:ascii="Times New Roman" w:hAnsi="Times New Roman" w:eastAsia="STSong" w:cs="Times New Roman"/>
+          <w:b w:val="0"/>
           <w:sz w:val="21"/>
           <w:szCs w:val="18"/>
           <w:highlight w:val="none"/>
@@ -1114,6 +1193,7 @@
       <w:r>
         <w:rPr>
           <w:rFonts w:ascii="Times New Roman" w:hAnsi="Times New Roman" w:eastAsia="STSong" w:cs="Times New Roman"/>
+          <w:b w:val="0"/>
           <w:sz w:val="21"/>
           <w:szCs w:val="18"/>
           <w:highlight w:val="none"/>
@@ -1133,6 +1213,7 @@
       <w:r>
         <w:rPr>
           <w:rFonts w:hint="eastAsia" w:ascii="Times New Roman" w:hAnsi="Times New Roman" w:eastAsia="STSong" w:cs="Times New Roman"/>
+          <w:b w:val="0"/>
           <w:sz w:val="21"/>
           <w:szCs w:val="18"/>
           <w:highlight w:val="none"/>
@@ -1142,6 +1223,7 @@
       <w:r>
         <w:rPr>
           <w:rFonts w:ascii="Times New Roman" w:hAnsi="Times New Roman" w:eastAsia="STSong" w:cs="Times New Roman"/>
+          <w:b w:val="0"/>
           <w:sz w:val="21"/>
           <w:szCs w:val="18"/>
           <w:highlight w:val="none"/>
@@ -1161,6 +1243,7 @@
       <w:r>
         <w:rPr>
           <w:rFonts w:ascii="Times New Roman" w:hAnsi="Times New Roman" w:eastAsia="STSong" w:cs="Times New Roman"/>
+          <w:b w:val="0"/>
           <w:sz w:val="21"/>
           <w:szCs w:val="18"/>
           <w:highlight w:val="none"/>
@@ -1180,6 +1263,7 @@
       <w:r>
         <w:rPr>
           <w:rFonts w:ascii="Times New Roman" w:hAnsi="Times New Roman" w:eastAsia="STSong" w:cs="Times New Roman"/>
+          <w:b w:val="0"/>
           <w:sz w:val="21"/>
           <w:szCs w:val="18"/>
           <w:highlight w:val="none"/>
@@ -1199,6 +1283,7 @@
       <w:r>
         <w:rPr>
           <w:rFonts w:ascii="Times New Roman" w:hAnsi="Times New Roman" w:eastAsia="STSong" w:cs="Times New Roman"/>
+          <w:b w:val="0"/>
           <w:sz w:val="21"/>
           <w:szCs w:val="18"/>
           <w:highlight w:val="none"/>
@@ -1218,6 +1303,7 @@
       <w:r>
         <w:rPr>
           <w:rFonts w:hint="eastAsia" w:ascii="Times New Roman" w:hAnsi="Times New Roman" w:eastAsia="STSong" w:cs="Times New Roman"/>
+          <w:b w:val="0"/>
           <w:sz w:val="21"/>
           <w:szCs w:val="18"/>
           <w:highlight w:val="none"/>
@@ -1238,6 +1324,7 @@
       <w:r>
         <w:rPr>
           <w:rFonts w:hint="eastAsia" w:ascii="Times New Roman" w:hAnsi="Times New Roman" w:eastAsia="STSong" w:cs="Times New Roman"/>
+          <w:b w:val="0"/>
           <w:sz w:val="21"/>
           <w:szCs w:val="18"/>
           <w:highlight w:val="none"/>
@@ -1248,6 +1335,7 @@
       <w:r>
         <w:rPr>
           <w:rFonts w:ascii="Times New Roman" w:hAnsi="Times New Roman" w:eastAsia="STSong" w:cs="Times New Roman"/>
+          <w:b w:val="0"/>
           <w:sz w:val="21"/>
           <w:szCs w:val="18"/>
           <w:highlight w:val="none"/>
@@ -1268,6 +1356,7 @@
       <w:r>
         <w:rPr>
           <w:rFonts w:ascii="Times New Roman" w:hAnsi="Times New Roman" w:eastAsia="STSong" w:cs="Times New Roman"/>
+          <w:b w:val="0"/>
           <w:sz w:val="21"/>
         </w:rPr>
         <w:t>Abstract: High-precision railway passenger flow forecasting is important for passenger organization, capacity allocation, and intelligent dispatching. Railway passenger flow is affected by intercity travel demand, holidays, and temporary disturbances, and therefore exhibits multi-scale non-stationarity with intertwined trend, seasonal, and residual disturbance components. This paper proposes MoE-Rail/RAMR, a scenario-conditioned non-stationary decomposition and routing mechanism. The method uses temporal decomposition as an inductive bias for expert specialization, constructs short-term, long-term, and distribution-shift experts, and conditions the gating network on both calendar scenarios and window-level non-stationary regimes. To avoid test-set leakage, the scaler is fitted only on the training set; checkpoints, ensemble weights, and calibration scale are selected on the validation set; and the test set is evaluated only once after the final configuration is fixed. On the bidirectional daily passenger flow dataset of Nanjing South Railway Station, Strict RAMR-VE achieves 18.55% MAPE, 0.035640 MSE, and 0.138028 MAE, outperforming the original MoE-Rail result and modern strong baselines. Mechanism analyses further show that scenario conditioning and regime-aware routing improve the stability and interpretability of expert allocation.</w:t>
@@ -1396,6 +1485,7 @@
       <w:r>
         <w:rPr>
           <w:rFonts w:ascii="Times New Roman" w:hAnsi="Times New Roman" w:eastAsia="STSong" w:cs="Times New Roman"/>
+          <w:b w:val="0"/>
           <w:sz w:val="21"/>
         </w:rPr>
         <w:t>尽管如此，单一深度网络仍难以在统一参数空间内兼顾相邻日期局部波动与中长期周期演化，铁路客流在非平稳、多模式叠加下更易出现多尺度优化冲突。从生成机制看，日粒度序列可近似理解为长期趋势Tₜ、周期节律Sₜ与随机扰动Rₜ的叠加。近年来，混合专家模型（MoE）因非平稳、多模式序列建模优势，成为时间序列预测热点[11-13]。例如，GateTS通过注意力启发的门控机制学习不同专家对输入序列的响应强度，在提升专家选择灵活性的同时缓解了单一专家主导的问题[14]；FreqMoE进一步从频域视角出发，通过对时间序列进行频率分解，引导不同专家分别学习高频、低频及混合频率成分，提高了专家专业化分工能力和模型对多尺度模式的表征效果[15]。然而，现有MoE方法大多面向通用时间序列预测任务，专家划分与门控策略通常缺少与T/S/R生成机制及节假日、星期等日历场景的可解释对齐，在枢纽高密度运行下仍难以稳定协调局部突发扰动与中长期周期，易出现专家利用不均衡或分工失衡。</w:t>
@@ -1414,6 +1504,7 @@
       <w:r>
         <w:rPr>
           <w:rFonts w:ascii="Times New Roman" w:hAnsi="Times New Roman" w:eastAsia="STSong" w:cs="Times New Roman"/>
+          <w:b w:val="0"/>
           <w:sz w:val="21"/>
         </w:rPr>
         <w:t>针对上述局限，本文提出场景条件化非平稳分解-路由框架MoE-Rail/RAMR，将铁路客流的趋势、周期和扰动三类可解释生成机制转化为专家分工先验，并显式构建从distribution regime到expert routing的映射。该方法围绕铁路客流多尺度演化机理，构建短期依赖专家（GRU）、长期依赖专家（Transformer）与分布偏移专家（Robust Distribution Shift Expert）三类异构专家：短期专家侧重相邻日期局部变化与邻近日期迁移，长期专家侧重跨周周期与趋势演化，分布偏移专家侧重窗口级分布变化和异常扰动强度。在此基础上，门控网络同时接收历史窗口、日历场景向量和regime embedding，使模型从“多模型拼接”转化为“场景驱动的非平稳成分路由”。</w:t>
@@ -1423,6 +1514,7 @@
       <w:r>
         <w:rPr>
           <w:rFonts w:ascii="Times New Roman" w:hAnsi="Times New Roman" w:eastAsia="STSong" w:cs="Times New Roman"/>
+          <w:b w:val="0"/>
           <w:sz w:val="21"/>
         </w:rPr>
         <w:t>本文的主要贡献体现在以下四个方面：（1）提出场景条件化非平稳分解-路由机制，将铁路客流的趋势、周期和扰动结构转化为专家空间中的可学习归纳偏置；（2）设计Regime Encoder，将窗口级波动率、趋势强度和周期强度编码为regime embedding，显式建立distribution regime到expert routing的映射；（3）将分布偏移专家重新定义为Robust Distribution Shift Expert，通过鲁棒z-score、分位偏态、峰均比和局部波动率刻画稀有扰动下的分布偏移，同时明确其不替代外部事件因果识别；（4）基于南京南站双向日粒度客流数据，补充现代强基线、场景/路由/负载均衡消融和门控可解释性分析，验证所提机制的有效性与适用边界。</w:t>
@@ -2851,6 +2943,7 @@
       <w:r>
         <w:rPr>
           <w:rFonts w:ascii="Times New Roman" w:hAnsi="Times New Roman" w:eastAsia="STSong" w:cs="Times New Roman"/>
+          <w:b w:val="0"/>
           <w:sz w:val="21"/>
         </w:rPr>
         <w:t>日粒度铁路客流序列可近似理解为长期趋势Tₜ、周期节律Sₜ与随机扰动Rₜ的叠加。本文不对序列进行显式在线分解，而是将长期依赖专家、短期依赖专家与分布偏移专家分别作为与Tₜ、Sₜ、Rₜ相对应的可学习建模模块，通过门控实现条件混合。</w:t>
@@ -3137,6 +3230,7 @@
       <w:r>
         <w:rPr>
           <w:rFonts w:ascii="Times New Roman" w:hAnsi="Times New Roman" w:eastAsia="STSong" w:cs="Times New Roman"/>
+          <w:b w:val="0"/>
           <w:sz w:val="21"/>
         </w:rPr>
         <w:t>为有效刻画铁路客流序列在不同时间尺度上的演化规律，本文提出MoE-Rail/RAMR多专家协同预测模型。该模型基于Mixture-of-Experts框架构建，通过功能专门化专家网络对客流模式进行分解建模，并利用场景条件化门控机制实现专家能力的自适应融合。整体结构如图1所示，MoE-Rail/RAMR集成短期依赖专家（ShortTermExpert）、长期依赖专家（LongTermExpert）和分布偏移专家（Robust Distribution Shift Expert）三类异构专家，在分解引导框架下分别对应Sₜ、Tₜ和Rₜ相关模式。三类专家在统一框架内协同工作，共同完成对复杂客流模式的多尺度建模。</w:t>
@@ -5822,6 +5916,7 @@
       <w:r>
         <w:rPr>
           <w:rFonts w:ascii="Times New Roman" w:hAnsi="Times New Roman" w:eastAsia="STSong" w:cs="Times New Roman"/>
+          <w:b w:val="0"/>
           <w:sz w:val="21"/>
         </w:rPr>
         <w:t>（3）分布偏移专家（Robust Distribution Shift Expert）</w:t>
@@ -5841,6 +5936,7 @@
       <w:r>
         <w:rPr>
           <w:rFonts w:ascii="Times New Roman" w:hAnsi="Times New Roman" w:eastAsia="STSong" w:cs="Times New Roman"/>
+          <w:b w:val="0"/>
           <w:sz w:val="21"/>
         </w:rPr>
         <w:t>在实际运行环境中，铁路客流可能受到突发事件、极端天气或大型活动等不确定因素影响[16-18]，表现为窗口级分布形态、尾部强度和局部波动率的变化。需要强调的是，在缺少未来天气、活动和运营管制等外生标签时，统计量不能直接识别事件成因，其作用是刻画已观测客流的distribution shift under rare events，为门控网络提供非常规扰动证据。</w:t>
@@ -5858,6 +5954,7 @@
       <w:r>
         <w:rPr>
           <w:rFonts w:ascii="Times New Roman" w:hAnsi="Times New Roman" w:eastAsia="STSong" w:cs="Times New Roman"/>
+          <w:b w:val="0"/>
           <w:sz w:val="21"/>
         </w:rPr>
         <w:t>基于上述考虑，本文将原统计特征专家升级为分布偏移专家。除均值、标准差和最大值外，增强特征包括分位数结构、robust z-score、quantile skewness、peak-to-average ratio和volatility index，用于刻画抗异常分布偏移、偏态、峰均突发强度与局部波动率。上述特征拼接后经MLP映射，输出分布偏移专家预测结果。</w:t>
@@ -6058,6 +6155,7 @@
       <w:r>
         <w:rPr>
           <w:rFonts w:ascii="Times New Roman" w:hAnsi="Times New Roman" w:eastAsia="STSong" w:cs="Times New Roman"/>
+          <w:b w:val="0"/>
           <w:sz w:val="21"/>
         </w:rPr>
         <w:t>其中，z为由均值、标准差、极值、分位数、鲁棒偏移强度、分位偏态、峰均比和局部波动率等组成的窗口级分布特征向量；该专家目标是刻画非常规扰动下的分布迁移，而非仅进行均值拟合。</w:t>
@@ -6104,6 +6202,7 @@
       <w:r>
         <w:rPr>
           <w:rFonts w:ascii="Times New Roman" w:hAnsi="Times New Roman" w:eastAsia="STSong" w:cs="Times New Roman"/>
+          <w:b w:val="0"/>
           <w:sz w:val="21"/>
         </w:rPr>
         <w:t>在铁路客流预测任务中，不同日期与不同运营场景下的客流变化规律存在明显差异。例如，普通工作日的变化更依赖稳定的跨周节律，周末或节假日期间的客流演化则更受出行制度与假期安排影响，而在突发事件、极端天气等特殊情形下，客流序列又会表现出异常波动特征。由此可见，单一预测模式难以同时适应多种复杂场景，不同专家模块在不同条件下的贡献程度也并不一致。</w:t>
@@ -6131,6 +6230,7 @@
       <w:r>
         <w:rPr>
           <w:rFonts w:ascii="Times New Roman" w:hAnsi="Times New Roman" w:eastAsia="STSong" w:cs="Times New Roman"/>
+          <w:b w:val="0"/>
           <w:sz w:val="21"/>
         </w:rPr>
         <w:t>为提升模型对多场景客流模式的适应能力，本文引入Regime-aware Mixture Routing（RAMR）门控网络。该网络不仅输入历史窗口展平表示与日历场景向量，还引入Regime Encoder显式编码窗口级非平稳状态，包括volatility、trend strength、local shift和distribution shift四类状态量。</w:t>
@@ -6150,6 +6250,7 @@
       <w:r>
         <w:rPr>
           <w:rFonts w:ascii="Times New Roman" w:hAnsi="Times New Roman" w:eastAsia="STSong" w:cs="Times New Roman"/>
+          <w:b w:val="0"/>
           <w:sz w:val="21"/>
         </w:rPr>
         <w:t>Regime Encoder将上述状态量映射为regime embedding，并与日历场景向量共同输入门控MLP，形成“历史窗口—日历场景—非平稳状态”的条件化路由。随后，Softmax函数对各专家logits归一化，得到专家权重向量。</w:t>
@@ -6902,6 +7003,7 @@
       <w:r>
         <w:rPr>
           <w:rFonts w:ascii="Times New Roman" w:hAnsi="Times New Roman" w:eastAsia="STSong" w:cs="Times New Roman"/>
+          <w:b w:val="0"/>
           <w:sz w:val="21"/>
         </w:rPr>
         <w:t>RAMR门控网络的核心并非平均提高某一专家权重，而是在不同非平稳状态下选择合适专家组合：常规周期段更依赖长期专家，局部迁移段提高短期专家响应，分布偏移或峰值扰动段强化分布偏移专家。补充实验显示，去除场景门控或regime路由均会带来测试误差上升，说明场景条件与非平稳状态条件是专家路由的重要信息来源。</w:t>
@@ -7240,6 +7342,7 @@
       <w:r>
         <w:rPr>
           <w:rFonts w:ascii="Times New Roman" w:hAnsi="Times New Roman" w:eastAsia="STSong" w:cs="Times New Roman"/>
+          <w:b w:val="0"/>
           <w:sz w:val="21"/>
         </w:rPr>
         <w:t>其中，表示模型的最终预测输出，为第k个专家网络对输入序列给出的预测结果，为分配给第k个专家的权重系数，K为专家网络总数。该机制整合短期依赖专家（局部周期与短程依赖）、长期依赖专家（跨周/跨月趋势）、分布偏移专家（窗口级分布扰动与异常），实现对铁路客流多尺度模式的协同预测。</w:t>
@@ -9074,6 +9177,7 @@
       <w:r>
         <w:rPr>
           <w:rFonts w:ascii="Times New Roman" w:hAnsi="Times New Roman" w:eastAsia="STSong" w:cs="Times New Roman"/>
+          <w:b w:val="0"/>
           <w:sz w:val="21"/>
         </w:rPr>
         <w:t>本文主实验采用高熵负载均衡约束：</w:t>
@@ -9455,6 +9559,7 @@
       <w:r>
         <w:rPr>
           <w:rFonts w:ascii="Times New Roman" w:hAnsi="Times New Roman" w:eastAsia="STSong" w:cs="Times New Roman"/>
+          <w:b w:val="0"/>
           <w:sz w:val="21"/>
         </w:rPr>
         <w:t>L_balance = sum_{k=1}^{K} gbar_k log(gbar_k + epsilon)    (16)</w:t>
@@ -9914,6 +10019,7 @@
       <w:r>
         <w:rPr>
           <w:rFonts w:ascii="Times New Roman" w:hAnsi="Times New Roman" w:eastAsia="STSong" w:cs="Times New Roman"/>
+          <w:b w:val="0"/>
           <w:sz w:val="21"/>
         </w:rPr>
         <w:t>其中，gbar=[gbar_1,gbar_2,gbar_3]为各专家在当前批次上的平均权重向量，epsilon为数值稳定项。由于训练目标最小化L_balance，该项等价于最大化批次平均专家使用熵，鼓励门控网络避免长期集中调用单一专家。该损失项本质上是负载均衡约束，而非事件识别项；其作用是抑制专家坍缩，使不同时间尺度专家在训练中保持可学习机会。方差型负载约束仅作为消融对照，不作为主实验默认设置。</w:t>
@@ -10068,6 +10174,7 @@
       <w:r>
         <w:rPr>
           <w:rFonts w:ascii="Times New Roman" w:hAnsi="Times New Roman" w:eastAsia="STSong" w:cs="Times New Roman"/>
+          <w:b w:val="0"/>
           <w:sz w:val="21"/>
         </w:rPr>
         <w:t>本研究采用南京南站与10个关联方向站点之间的真实运营数据，数据文件为项目内 data/from_nj.csv 与 data/to_nj.csv，分别表示南京南站到其他站点、其他站点到南京南站的日粒度客流量。两个CSV均为GBK编码，SHA256分别为 c4f8919ce83c4c677d772036ed42fb5e76c99507f3368e2d32f081b556df4ae7 和 d16b3becfc12ed22a576741a505080e9dc279d4ab54d8c8ef597b729efb3c41e。数据时间跨度为2023年1月1日至2025年5月26日。原始数据分为枢纽站至各方向站点（from）和各方向站点至枢纽站（to）两张日粒度表，分别包含854条和852条记录；按日期内连接并去除缺失日期后，得到846个有效共同日期、20个客流变量（10个from变量与10个to变量）。数据覆盖工作日、周末、节假日等典型模式，呈现多周期叠加与非平稳波动。</w:t>
@@ -10087,6 +10194,7 @@
       <w:r>
         <w:rPr>
           <w:rFonts w:ascii="Times New Roman" w:hAnsi="Times New Roman" w:eastAsia="STSong" w:cs="Times New Roman"/>
+          <w:b w:val="0"/>
           <w:sz w:val="21"/>
         </w:rPr>
         <w:t>为避免未来信息泄露，严格按时间顺序划分数据：前50%作为训练集，中间25%作为验证集，后25%作为测试集。模型输入仅使用历史客流窗口与由日期构造的场景特征，场景特征包括星期周期编码、月份周期编码、是否周末、是否节假日、调休工作日标志和日号归一化等。</w:t>
@@ -10099,6 +10207,7 @@
       <w:r>
         <w:rPr>
           <w:rFonts w:ascii="Times New Roman" w:hAnsi="Times New Roman" w:eastAsia="STSong" w:cs="Times New Roman"/>
+          <w:b w:val="0"/>
           <w:sz w:val="21"/>
         </w:rPr>
         <w:t>表1-0  数据集字段说明</w:t>
@@ -10188,6 +10297,7 @@
             <w:r>
               <w:rPr>
                 <w:rFonts w:ascii="Times New Roman" w:hAnsi="Times New Roman" w:eastAsia="STSong" w:cs="Times New Roman"/>
+                <w:b w:val="0"/>
                 <w:sz w:val="17"/>
               </w:rPr>
               <w:t>passenger flow</w:t>
@@ -10206,6 +10316,7 @@
             <w:r>
               <w:rPr>
                 <w:rFonts w:ascii="Times New Roman" w:hAnsi="Times New Roman" w:eastAsia="STSong" w:cs="Times New Roman"/>
+                <w:b w:val="0"/>
                 <w:sz w:val="17"/>
               </w:rPr>
               <w:t>target/continuous</w:t>
@@ -10224,6 +10335,7 @@
             <w:r>
               <w:rPr>
                 <w:rFonts w:ascii="Times New Roman" w:hAnsi="Times New Roman" w:eastAsia="STSong" w:cs="Times New Roman"/>
+                <w:b w:val="0"/>
                 <w:sz w:val="17"/>
               </w:rPr>
               <w:t>站点-方向级日客流，包含枢纽至方向站点from与方向站点至枢纽to</w:t>
@@ -10244,6 +10356,7 @@
             <w:r>
               <w:rPr>
                 <w:rFonts w:ascii="Times New Roman" w:hAnsi="Times New Roman" w:eastAsia="STSong" w:cs="Times New Roman"/>
+                <w:b w:val="0"/>
                 <w:sz w:val="17"/>
               </w:rPr>
               <w:t>time/date</w:t>
@@ -10262,6 +10375,7 @@
             <w:r>
               <w:rPr>
                 <w:rFonts w:ascii="Times New Roman" w:hAnsi="Times New Roman" w:eastAsia="STSong" w:cs="Times New Roman"/>
+                <w:b w:val="0"/>
                 <w:sz w:val="17"/>
               </w:rPr>
               <w:t>timestamp</w:t>
@@ -10280,6 +10394,7 @@
             <w:r>
               <w:rPr>
                 <w:rFonts w:ascii="Times New Roman" w:hAnsi="Times New Roman" w:eastAsia="STSong" w:cs="Times New Roman"/>
+                <w:b w:val="0"/>
                 <w:sz w:val="17"/>
               </w:rPr>
               <w:t>日粒度日期索引，用于时间顺序划分与日历特征构造</w:t>
@@ -10300,6 +10415,7 @@
             <w:r>
               <w:rPr>
                 <w:rFonts w:ascii="Times New Roman" w:hAnsi="Times New Roman" w:eastAsia="STSong" w:cs="Times New Roman"/>
+                <w:b w:val="0"/>
                 <w:sz w:val="17"/>
               </w:rPr>
               <w:t>weekday</w:t>
@@ -10318,6 +10434,7 @@
             <w:r>
               <w:rPr>
                 <w:rFonts w:ascii="Times New Roman" w:hAnsi="Times New Roman" w:eastAsia="STSong" w:cs="Times New Roman"/>
+                <w:b w:val="0"/>
                 <w:sz w:val="17"/>
               </w:rPr>
               <w:t>categorical/derived</w:t>
@@ -10336,6 +10453,7 @@
             <w:r>
               <w:rPr>
                 <w:rFonts w:ascii="Times New Roman" w:hAnsi="Times New Roman" w:eastAsia="STSong" w:cs="Times New Roman"/>
+                <w:b w:val="0"/>
                 <w:sz w:val="17"/>
               </w:rPr>
               <w:t>星期周期，反映跨周出行节律</w:t>
@@ -10356,6 +10474,7 @@
             <w:r>
               <w:rPr>
                 <w:rFonts w:ascii="Times New Roman" w:hAnsi="Times New Roman" w:eastAsia="STSong" w:cs="Times New Roman"/>
+                <w:b w:val="0"/>
                 <w:sz w:val="17"/>
               </w:rPr>
               <w:t>holiday</w:t>
@@ -10374,6 +10493,7 @@
             <w:r>
               <w:rPr>
                 <w:rFonts w:ascii="Times New Roman" w:hAnsi="Times New Roman" w:eastAsia="STSong" w:cs="Times New Roman"/>
+                <w:b w:val="0"/>
                 <w:sz w:val="17"/>
               </w:rPr>
               <w:t>binary/derived</w:t>
@@ -10392,6 +10512,7 @@
             <w:r>
               <w:rPr>
                 <w:rFonts w:ascii="Times New Roman" w:hAnsi="Times New Roman" w:eastAsia="STSong" w:cs="Times New Roman"/>
+                <w:b w:val="0"/>
                 <w:sz w:val="17"/>
               </w:rPr>
               <w:t>法定节假日标志，刻画非常规出行场景</w:t>
@@ -10412,6 +10533,7 @@
             <w:r>
               <w:rPr>
                 <w:rFonts w:ascii="Times New Roman" w:hAnsi="Times New Roman" w:eastAsia="STSong" w:cs="Times New Roman"/>
+                <w:b w:val="0"/>
                 <w:sz w:val="17"/>
               </w:rPr>
               <w:t>weekend/workday adjustment</w:t>
@@ -10430,6 +10552,7 @@
             <w:r>
               <w:rPr>
                 <w:rFonts w:ascii="Times New Roman" w:hAnsi="Times New Roman" w:eastAsia="STSong" w:cs="Times New Roman"/>
+                <w:b w:val="0"/>
                 <w:sz w:val="17"/>
               </w:rPr>
               <w:t>binary/derived</w:t>
@@ -10448,6 +10571,7 @@
             <w:r>
               <w:rPr>
                 <w:rFonts w:ascii="Times New Roman" w:hAnsi="Times New Roman" w:eastAsia="STSong" w:cs="Times New Roman"/>
+                <w:b w:val="0"/>
                 <w:sz w:val="17"/>
               </w:rPr>
               <w:t>周末与调休工作日标志，修正普通星期语义</w:t>
@@ -10468,6 +10592,7 @@
             <w:r>
               <w:rPr>
                 <w:rFonts w:ascii="Times New Roman" w:hAnsi="Times New Roman" w:eastAsia="STSong" w:cs="Times New Roman"/>
+                <w:b w:val="0"/>
                 <w:sz w:val="17"/>
               </w:rPr>
               <w:t>trend/regime statistics</w:t>
@@ -10486,6 +10611,7 @@
             <w:r>
               <w:rPr>
                 <w:rFonts w:ascii="Times New Roman" w:hAnsi="Times New Roman" w:eastAsia="STSong" w:cs="Times New Roman"/>
+                <w:b w:val="0"/>
                 <w:sz w:val="17"/>
               </w:rPr>
               <w:t>derived</w:t>
@@ -10504,6 +10630,7 @@
             <w:r>
               <w:rPr>
                 <w:rFonts w:ascii="Times New Roman" w:hAnsi="Times New Roman" w:eastAsia="STSong" w:cs="Times New Roman"/>
+                <w:b w:val="0"/>
                 <w:sz w:val="17"/>
               </w:rPr>
               <w:t>rolling statistics、volatility、quantile skewness等窗口级分布变化特征</w:t>
@@ -10519,6 +10646,7 @@
       <w:r>
         <w:rPr>
           <w:rFonts w:ascii="Times New Roman" w:hAnsi="Times New Roman" w:eastAsia="STSong" w:cs="Times New Roman"/>
+          <w:b w:val="0"/>
           <w:sz w:val="21"/>
         </w:rPr>
         <w:t>表1-1  数据集样例（部分站点-方向字段）</w:t>
@@ -10648,6 +10776,7 @@
             <w:r>
               <w:rPr>
                 <w:rFonts w:ascii="Times New Roman" w:hAnsi="Times New Roman" w:eastAsia="STSong" w:cs="Times New Roman"/>
+                <w:b w:val="0"/>
                 <w:sz w:val="17"/>
               </w:rPr>
               <w:t>2023-01-01</w:t>
@@ -10666,6 +10795,7 @@
             <w:r>
               <w:rPr>
                 <w:rFonts w:ascii="Times New Roman" w:hAnsi="Times New Roman" w:eastAsia="STSong" w:cs="Times New Roman"/>
+                <w:b w:val="0"/>
                 <w:sz w:val="17"/>
               </w:rPr>
               <w:t>1910</w:t>
@@ -10684,6 +10814,7 @@
             <w:r>
               <w:rPr>
                 <w:rFonts w:ascii="Times New Roman" w:hAnsi="Times New Roman" w:eastAsia="STSong" w:cs="Times New Roman"/>
+                <w:b w:val="0"/>
                 <w:sz w:val="17"/>
               </w:rPr>
               <w:t>134</w:t>
@@ -10702,6 +10833,7 @@
             <w:r>
               <w:rPr>
                 <w:rFonts w:ascii="Times New Roman" w:hAnsi="Times New Roman" w:eastAsia="STSong" w:cs="Times New Roman"/>
+                <w:b w:val="0"/>
                 <w:sz w:val="17"/>
               </w:rPr>
               <w:t>1535</w:t>
@@ -10720,6 +10852,7 @@
             <w:r>
               <w:rPr>
                 <w:rFonts w:ascii="Times New Roman" w:hAnsi="Times New Roman" w:eastAsia="STSong" w:cs="Times New Roman"/>
+                <w:b w:val="0"/>
                 <w:sz w:val="17"/>
               </w:rPr>
               <w:t>36</w:t>
@@ -10740,6 +10873,7 @@
             <w:r>
               <w:rPr>
                 <w:rFonts w:ascii="Times New Roman" w:hAnsi="Times New Roman" w:eastAsia="STSong" w:cs="Times New Roman"/>
+                <w:b w:val="0"/>
                 <w:sz w:val="17"/>
               </w:rPr>
               <w:t>2023-01-02</w:t>
@@ -10758,6 +10892,7 @@
             <w:r>
               <w:rPr>
                 <w:rFonts w:ascii="Times New Roman" w:hAnsi="Times New Roman" w:eastAsia="STSong" w:cs="Times New Roman"/>
+                <w:b w:val="0"/>
                 <w:sz w:val="17"/>
               </w:rPr>
               <w:t>5657</w:t>
@@ -10776,6 +10911,7 @@
             <w:r>
               <w:rPr>
                 <w:rFonts w:ascii="Times New Roman" w:hAnsi="Times New Roman" w:eastAsia="STSong" w:cs="Times New Roman"/>
+                <w:b w:val="0"/>
                 <w:sz w:val="17"/>
               </w:rPr>
               <w:t>63</w:t>
@@ -10794,6 +10930,7 @@
             <w:r>
               <w:rPr>
                 <w:rFonts w:ascii="Times New Roman" w:hAnsi="Times New Roman" w:eastAsia="STSong" w:cs="Times New Roman"/>
+                <w:b w:val="0"/>
                 <w:sz w:val="17"/>
               </w:rPr>
               <w:t>2700</w:t>
@@ -10812,6 +10949,7 @@
             <w:r>
               <w:rPr>
                 <w:rFonts w:ascii="Times New Roman" w:hAnsi="Times New Roman" w:eastAsia="STSong" w:cs="Times New Roman"/>
+                <w:b w:val="0"/>
                 <w:sz w:val="17"/>
               </w:rPr>
               <w:t>61</w:t>
@@ -10832,6 +10970,7 @@
             <w:r>
               <w:rPr>
                 <w:rFonts w:ascii="Times New Roman" w:hAnsi="Times New Roman" w:eastAsia="STSong" w:cs="Times New Roman"/>
+                <w:b w:val="0"/>
                 <w:sz w:val="17"/>
               </w:rPr>
               <w:t>2023-01-03</w:t>
@@ -10850,6 +10989,7 @@
             <w:r>
               <w:rPr>
                 <w:rFonts w:ascii="Times New Roman" w:hAnsi="Times New Roman" w:eastAsia="STSong" w:cs="Times New Roman"/>
+                <w:b w:val="0"/>
                 <w:sz w:val="17"/>
               </w:rPr>
               <w:t>4184</w:t>
@@ -10868,6 +11008,7 @@
             <w:r>
               <w:rPr>
                 <w:rFonts w:ascii="Times New Roman" w:hAnsi="Times New Roman" w:eastAsia="STSong" w:cs="Times New Roman"/>
+                <w:b w:val="0"/>
                 <w:sz w:val="17"/>
               </w:rPr>
               <w:t>81</w:t>
@@ -10886,6 +11027,7 @@
             <w:r>
               <w:rPr>
                 <w:rFonts w:ascii="Times New Roman" w:hAnsi="Times New Roman" w:eastAsia="STSong" w:cs="Times New Roman"/>
+                <w:b w:val="0"/>
                 <w:sz w:val="17"/>
               </w:rPr>
               <w:t>2935</w:t>
@@ -10904,6 +11046,7 @@
             <w:r>
               <w:rPr>
                 <w:rFonts w:ascii="Times New Roman" w:hAnsi="Times New Roman" w:eastAsia="STSong" w:cs="Times New Roman"/>
+                <w:b w:val="0"/>
                 <w:sz w:val="17"/>
               </w:rPr>
               <w:t>52</w:t>
@@ -10924,6 +11067,7 @@
             <w:r>
               <w:rPr>
                 <w:rFonts w:ascii="Times New Roman" w:hAnsi="Times New Roman" w:eastAsia="STSong" w:cs="Times New Roman"/>
+                <w:b w:val="0"/>
                 <w:sz w:val="17"/>
               </w:rPr>
               <w:t>2023-01-04</w:t>
@@ -10942,6 +11086,7 @@
             <w:r>
               <w:rPr>
                 <w:rFonts w:ascii="Times New Roman" w:hAnsi="Times New Roman" w:eastAsia="STSong" w:cs="Times New Roman"/>
+                <w:b w:val="0"/>
                 <w:sz w:val="17"/>
               </w:rPr>
               <w:t>3617</w:t>
@@ -10960,6 +11105,7 @@
             <w:r>
               <w:rPr>
                 <w:rFonts w:ascii="Times New Roman" w:hAnsi="Times New Roman" w:eastAsia="STSong" w:cs="Times New Roman"/>
+                <w:b w:val="0"/>
                 <w:sz w:val="17"/>
               </w:rPr>
               <w:t>230</w:t>
@@ -10978,6 +11124,7 @@
             <w:r>
               <w:rPr>
                 <w:rFonts w:ascii="Times New Roman" w:hAnsi="Times New Roman" w:eastAsia="STSong" w:cs="Times New Roman"/>
+                <w:b w:val="0"/>
                 <w:sz w:val="17"/>
               </w:rPr>
               <w:t>3019</w:t>
@@ -10996,6 +11143,7 @@
             <w:r>
               <w:rPr>
                 <w:rFonts w:ascii="Times New Roman" w:hAnsi="Times New Roman" w:eastAsia="STSong" w:cs="Times New Roman"/>
+                <w:b w:val="0"/>
                 <w:sz w:val="17"/>
               </w:rPr>
               <w:t>52</w:t>
@@ -11016,6 +11164,7 @@
             <w:r>
               <w:rPr>
                 <w:rFonts w:ascii="Times New Roman" w:hAnsi="Times New Roman" w:eastAsia="STSong" w:cs="Times New Roman"/>
+                <w:b w:val="0"/>
                 <w:sz w:val="17"/>
               </w:rPr>
               <w:t>2023-01-05</w:t>
@@ -11034,6 +11183,7 @@
             <w:r>
               <w:rPr>
                 <w:rFonts w:ascii="Times New Roman" w:hAnsi="Times New Roman" w:eastAsia="STSong" w:cs="Times New Roman"/>
+                <w:b w:val="0"/>
                 <w:sz w:val="17"/>
               </w:rPr>
               <w:t>3491</w:t>
@@ -11052,6 +11202,7 @@
             <w:r>
               <w:rPr>
                 <w:rFonts w:ascii="Times New Roman" w:hAnsi="Times New Roman" w:eastAsia="STSong" w:cs="Times New Roman"/>
+                <w:b w:val="0"/>
                 <w:sz w:val="17"/>
               </w:rPr>
               <w:t>263</w:t>
@@ -11070,6 +11221,7 @@
             <w:r>
               <w:rPr>
                 <w:rFonts w:ascii="Times New Roman" w:hAnsi="Times New Roman" w:eastAsia="STSong" w:cs="Times New Roman"/>
+                <w:b w:val="0"/>
                 <w:sz w:val="17"/>
               </w:rPr>
               <w:t>3326</w:t>
@@ -11088,6 +11240,7 @@
             <w:r>
               <w:rPr>
                 <w:rFonts w:ascii="Times New Roman" w:hAnsi="Times New Roman" w:eastAsia="STSong" w:cs="Times New Roman"/>
+                <w:b w:val="0"/>
                 <w:sz w:val="17"/>
               </w:rPr>
               <w:t>83</w:t>
@@ -11110,6 +11263,7 @@
       <w:r>
         <w:rPr>
           <w:rFonts w:ascii="Times New Roman" w:hAnsi="Times New Roman" w:eastAsia="STSong" w:cs="Times New Roman"/>
+          <w:b w:val="0"/>
           <w:sz w:val="21"/>
         </w:rPr>
         <w:t>本文并非直接将原始客流输入模型，而是围绕专家分解目标构建多视图特征空间。特征选择遵循三项原则：预测时可获得、不引入未来信息、与短期依赖、长期周期和分布扰动三类专家功能对齐。</w:t>
@@ -11122,6 +11276,7 @@
       <w:r>
         <w:rPr>
           <w:rFonts w:ascii="Times New Roman" w:hAnsi="Times New Roman" w:eastAsia="STSong" w:cs="Times New Roman"/>
+          <w:b w:val="0"/>
           <w:sz w:val="21"/>
         </w:rPr>
         <w:t>表1-2  多视图特征工程设计</w:t>
@@ -11231,6 +11386,7 @@
             <w:r>
               <w:rPr>
                 <w:rFonts w:ascii="Times New Roman" w:hAnsi="Times New Roman" w:eastAsia="STSong" w:cs="Times New Roman"/>
+                <w:b w:val="0"/>
                 <w:sz w:val="17"/>
               </w:rPr>
               <w:t>历史客流窗口</w:t>
@@ -11249,6 +11405,7 @@
             <w:r>
               <w:rPr>
                 <w:rFonts w:ascii="Times New Roman" w:hAnsi="Times New Roman" w:eastAsia="STSong" w:cs="Times New Roman"/>
+                <w:b w:val="0"/>
                 <w:sz w:val="17"/>
               </w:rPr>
               <w:t>连续变量</w:t>
@@ -11267,6 +11424,7 @@
             <w:r>
               <w:rPr>
                 <w:rFonts w:ascii="Times New Roman" w:hAnsi="Times New Roman" w:eastAsia="STSong" w:cs="Times New Roman"/>
+                <w:b w:val="0"/>
                 <w:sz w:val="17"/>
               </w:rPr>
               <w:t>20个from/to方向客流序列，lookback=6，RobustScaler归一化</w:t>
@@ -11285,6 +11443,7 @@
             <w:r>
               <w:rPr>
                 <w:rFonts w:ascii="Times New Roman" w:hAnsi="Times New Roman" w:eastAsia="STSong" w:cs="Times New Roman"/>
+                <w:b w:val="0"/>
                 <w:sz w:val="17"/>
               </w:rPr>
               <w:t>短期依赖专家、长期依赖专家的主要输入</w:t>
@@ -11305,6 +11464,7 @@
             <w:r>
               <w:rPr>
                 <w:rFonts w:ascii="Times New Roman" w:hAnsi="Times New Roman" w:eastAsia="STSong" w:cs="Times New Roman"/>
+                <w:b w:val="0"/>
                 <w:sz w:val="17"/>
               </w:rPr>
               <w:t>日历场景特征</w:t>
@@ -11323,6 +11483,7 @@
             <w:r>
               <w:rPr>
                 <w:rFonts w:ascii="Times New Roman" w:hAnsi="Times New Roman" w:eastAsia="STSong" w:cs="Times New Roman"/>
+                <w:b w:val="0"/>
                 <w:sz w:val="17"/>
               </w:rPr>
               <w:t>可预测类别/周期特征</w:t>
@@ -11341,6 +11502,7 @@
             <w:r>
               <w:rPr>
                 <w:rFonts w:ascii="Times New Roman" w:hAnsi="Times New Roman" w:eastAsia="STSong" w:cs="Times New Roman"/>
+                <w:b w:val="0"/>
                 <w:sz w:val="17"/>
               </w:rPr>
               <w:t>星期、月份、周末、节假日、调休工作日、日期归一化及周期编码</w:t>
@@ -11359,6 +11521,7 @@
             <w:r>
               <w:rPr>
                 <w:rFonts w:ascii="Times New Roman" w:hAnsi="Times New Roman" w:eastAsia="STSong" w:cs="Times New Roman"/>
+                <w:b w:val="0"/>
                 <w:sz w:val="17"/>
               </w:rPr>
               <w:t>刻画工作日/周末/节假日等regime条件，输入门控网络</w:t>
@@ -11379,6 +11542,7 @@
             <w:r>
               <w:rPr>
                 <w:rFonts w:ascii="Times New Roman" w:hAnsi="Times New Roman" w:eastAsia="STSong" w:cs="Times New Roman"/>
+                <w:b w:val="0"/>
                 <w:sz w:val="17"/>
               </w:rPr>
               <w:t>滚动统计特征</w:t>
@@ -11397,6 +11561,7 @@
             <w:r>
               <w:rPr>
                 <w:rFonts w:ascii="Times New Roman" w:hAnsi="Times New Roman" w:eastAsia="STSong" w:cs="Times New Roman"/>
+                <w:b w:val="0"/>
                 <w:sz w:val="17"/>
               </w:rPr>
               <w:t>派生连续变量</w:t>
@@ -11415,6 +11580,7 @@
             <w:r>
               <w:rPr>
                 <w:rFonts w:ascii="Times New Roman" w:hAnsi="Times New Roman" w:eastAsia="STSong" w:cs="Times New Roman"/>
+                <w:b w:val="0"/>
                 <w:sz w:val="17"/>
               </w:rPr>
               <w:t>窗口均值、标准差、最大值、分位数、分布偏态等</w:t>
@@ -11433,6 +11599,7 @@
             <w:r>
               <w:rPr>
                 <w:rFonts w:ascii="Times New Roman" w:hAnsi="Times New Roman" w:eastAsia="STSong" w:cs="Times New Roman"/>
+                <w:b w:val="0"/>
                 <w:sz w:val="17"/>
               </w:rPr>
               <w:t>为分布偏移专家提供窗口级扰动证据</w:t>
@@ -11453,6 +11620,7 @@
             <w:r>
               <w:rPr>
                 <w:rFonts w:ascii="Times New Roman" w:hAnsi="Times New Roman" w:eastAsia="STSong" w:cs="Times New Roman"/>
+                <w:b w:val="0"/>
                 <w:sz w:val="17"/>
               </w:rPr>
               <w:t>鲁棒扰动特征</w:t>
@@ -11471,6 +11639,7 @@
             <w:r>
               <w:rPr>
                 <w:rFonts w:ascii="Times New Roman" w:hAnsi="Times New Roman" w:eastAsia="STSong" w:cs="Times New Roman"/>
+                <w:b w:val="0"/>
                 <w:sz w:val="17"/>
               </w:rPr>
               <w:t>派生连续变量</w:t>
@@ -11489,6 +11658,7 @@
             <w:r>
               <w:rPr>
                 <w:rFonts w:ascii="Times New Roman" w:hAnsi="Times New Roman" w:eastAsia="STSong" w:cs="Times New Roman"/>
+                <w:b w:val="0"/>
                 <w:sz w:val="17"/>
               </w:rPr>
               <w:t>robust z-score、quantile skewness、peak-to-average ratio、volatility index</w:t>
@@ -11507,6 +11677,7 @@
             <w:r>
               <w:rPr>
                 <w:rFonts w:ascii="Times New Roman" w:hAnsi="Times New Roman" w:eastAsia="STSong" w:cs="Times New Roman"/>
+                <w:b w:val="0"/>
                 <w:sz w:val="17"/>
               </w:rPr>
               <w:t>刻画rare-event下的distribution shift，而非直接识别事件成因</w:t>
@@ -11558,6 +11729,7 @@
       <w:r>
         <w:rPr>
           <w:rFonts w:ascii="Times New Roman" w:hAnsi="Times New Roman" w:eastAsia="STSong" w:cs="Times New Roman"/>
+          <w:b w:val="0"/>
           <w:sz w:val="21"/>
         </w:rPr>
         <w:t>为了全面验证所提方法的性能，本文除历史平均值、随机森林、FNN、FCGRU、VAR和TSMixer外，进一步补充DLinear、PatchTST、iTransformer、TimeMixer和FreEformer等现代强基线。现代基线均采用相同的时间顺序划分、lookback=6和horizon=1设置重新训练，并以验证集最优checkpoint进行测试评估，从而避免仅与传统模型比较造成基线过弱的问题。</w:t>
@@ -11652,6 +11824,7 @@
       <w:r>
         <w:rPr>
           <w:rFonts w:ascii="Times New Roman" w:hAnsi="Times New Roman" w:eastAsia="STSong" w:cs="Times New Roman"/>
+          <w:b w:val="0"/>
           <w:sz w:val="21"/>
         </w:rPr>
         <w:t>MoE-Rail/RAMR的核心超参数为：历史窗口T=6天，预测窗口H=1天，隐藏特征维度512，专家数量3，批次大小64。优化器采用Adam（学习率1e-3，权重衰减1e-4），训练上限300个epoch，结合ReduceLROnPlateau学习率调度与早停机制。补充消融统一采用相同数据划分与训练设置，仅改变场景门控、regime路由、统计特征集合或负载均衡形式。</w:t>
@@ -13278,6 +13451,7 @@
       <w:r>
         <w:rPr>
           <w:rFonts w:ascii="Times New Roman" w:hAnsi="Times New Roman" w:eastAsia="STSong" w:cs="Times New Roman"/>
+          <w:b w:val="0"/>
           <w:sz w:val="21"/>
         </w:rPr>
         <w:t>严格无泄露最终结果：Strict RAMR-VE采用验证集balanced objective选择集成权重和全局尺度，测试集只在方案固定后评估一次；最终MAPE=18.55%、MSE=0.035640、MAE=0.138028，相比原MoE-Rail的19.41%、0.037700、0.144000三项指标均改善。</w:t>
@@ -13290,9 +13464,23 @@
       <w:r>
         <w:rPr>
           <w:rFonts w:ascii="Times New Roman" w:hAnsi="Times New Roman" w:eastAsia="STSong" w:cs="Times New Roman"/>
+          <w:b w:val="0"/>
           <w:sz w:val="21"/>
         </w:rPr>
         <w:t>为进一步核验结果可追溯性，本文在固定验证集配方下导出逐样本预测，并以测试日期为抽样单位进行2000次bootstrap。测试集点估计保持MAPE=18.5463%、MSE=0.035640、MAE=0.138028；对应95%置信区间分别为MAPE [16.8796, 20.3743]、MSE [0.028133, 0.043991]、MAE [0.125860, 0.151379]。重采样中MAPE、MSE和MAE低于原MoE-Rail阈值的比例分别为83.10%、69.80%和81.50%，三项同时低于原阈值的比例为63.15%。该结果说明最终模型的点估计优势具有较高稳定性，同时也反映出有限测试窗口下仍存在不确定性。</w:t>
+      </w:r>
+    </w:p>
+    <w:p>
+      <w:pPr>
+        <w:ind w:firstLine="420"/>
+      </w:pPr>
+      <w:r>
+        <w:rPr>
+          <w:rFonts w:ascii="Times New Roman" w:hAnsi="Times New Roman" w:eastAsia="STSong"/>
+          <w:b w:val="0"/>
+          <w:sz w:val="21"/>
+        </w:rPr>
+        <w:t>进一步地，本文对现代强基线进行优势边界审计。由于现代强基线未保存逐样本预测，该审计不作为配对显著性检验，而是将固定Strict RAMR-VE测试预测的日期级bootstrap分布与现代强基线点估计进行比较。相对当前最强现代基线FreEformer，Strict RAMR-VE在点估计上分别将MAPE、MSE和MAE降低7.98%、10.96%和6.83%；以FreEformer点估计为阈值，2000次日期级bootstrap中MAPE、MSE和MAE分项更优比例分别为95.80%、85.20%和92.60%，三项同时更优比例为82.90%。该结果进一步支持Strict RAMR-VE在南京南站主数据集上并非仅MSE占优，而是在相对误差、平方误差和绝对误差三个维度均具有较高稳定优势。</w:t>
       </w:r>
     </w:p>
     <w:p>
@@ -13314,6 +13502,7 @@
       <w:r>
         <w:rPr>
           <w:rFonts w:ascii="Times New Roman" w:hAnsi="Times New Roman" w:eastAsia="STSong" w:cs="Times New Roman"/>
+          <w:b w:val="0"/>
           <w:sz w:val="21"/>
         </w:rPr>
         <w:t>图2对预测结果进行了图形化展示；表1汇总了MoE-Rail、Strict RAMR-VE与代表性基线方法的性能对比。为避免测试集泄露，Strict RAMR-VE采用严格时间顺序协议：归一化器仅在训练集拟合，checkpoint、集成权重与尺度校准参数均由验证集确定，测试集仅用于最终一次评估。实验结果表明，Strict RAMR-VE在铁路主数据集上取得18.55%的MAPE、0.035640的MSE和0.138028的MAE，三项指标均优于原MoE-Rail结果（19.41%、0.037700、0.144000）以及新增现代强基线。新增基线中FreEformer表现最强，MAPE为20.15%，但仍低于Strict RAMR-VE。</w:t>
@@ -13333,6 +13522,7 @@
       <w:r>
         <w:rPr>
           <w:rFonts w:ascii="Times New Roman" w:hAnsi="Times New Roman" w:eastAsia="STSong" w:cs="Times New Roman"/>
+          <w:b w:val="0"/>
           <w:sz w:val="21"/>
         </w:rPr>
         <w:t>MoE-Rail性能提升主要原因在于：在分解引导框架下，短期依赖、长期依赖与分布偏移三类异构专家分别刻画与Sₜ、Tₜ、Rₜ相关的局部周期迁移、长期趋势与窗口级分布变化，更有针对性地建模铁路客流的复杂变化规律；场景感知门控根据输入状态与日历语义自适应分配专家权重，使模型在不同场景下动态调用更合适的专家；负载均衡约束避免权重过度集中于少数专家，提升各专家的协同学习能力。</w:t>
@@ -13432,6 +13622,7 @@
             <w:r>
               <w:rPr>
                 <w:rFonts w:ascii="Times New Roman" w:hAnsi="Times New Roman" w:eastAsia="STSong" w:cs="Times New Roman"/>
+                <w:b w:val="0"/>
                 <w:sz w:val="17"/>
                 <w:szCs w:val="18"/>
                 <w:highlight w:val="none"/>
@@ -13463,6 +13654,7 @@
             <w:r>
               <w:rPr>
                 <w:rFonts w:ascii="Times New Roman" w:hAnsi="Times New Roman" w:eastAsia="STSong" w:cs="Times New Roman"/>
+                <w:b w:val="0"/>
                 <w:sz w:val="17"/>
                 <w:szCs w:val="18"/>
                 <w:highlight w:val="none"/>
@@ -13494,6 +13686,7 @@
             <w:r>
               <w:rPr>
                 <w:rFonts w:ascii="Times New Roman" w:hAnsi="Times New Roman" w:eastAsia="STSong" w:cs="Times New Roman"/>
+                <w:b w:val="0"/>
                 <w:sz w:val="17"/>
                 <w:szCs w:val="18"/>
                 <w:highlight w:val="none"/>
@@ -13525,6 +13718,7 @@
             <w:r>
               <w:rPr>
                 <w:rFonts w:ascii="Times New Roman" w:hAnsi="Times New Roman" w:eastAsia="STSong" w:cs="Times New Roman"/>
+                <w:b w:val="0"/>
                 <w:sz w:val="17"/>
                 <w:szCs w:val="18"/>
                 <w:highlight w:val="none"/>
@@ -13577,6 +13771,7 @@
             <w:r>
               <w:rPr>
                 <w:rFonts w:ascii="Times New Roman" w:hAnsi="Times New Roman" w:eastAsia="STSong" w:cs="Times New Roman"/>
+                <w:b w:val="0"/>
                 <w:sz w:val="17"/>
                 <w:szCs w:val="18"/>
                 <w:highlight w:val="none"/>
@@ -13608,6 +13803,7 @@
             <w:r>
               <w:rPr>
                 <w:rFonts w:ascii="Times New Roman" w:hAnsi="Times New Roman" w:eastAsia="STSong" w:cs="Times New Roman"/>
+                <w:b w:val="0"/>
                 <w:sz w:val="17"/>
                 <w:szCs w:val="18"/>
                 <w:highlight w:val="none"/>
@@ -13639,6 +13835,7 @@
             <w:r>
               <w:rPr>
                 <w:rFonts w:ascii="Times New Roman" w:hAnsi="Times New Roman" w:eastAsia="STSong" w:cs="Times New Roman"/>
+                <w:b w:val="0"/>
                 <w:sz w:val="17"/>
                 <w:szCs w:val="18"/>
                 <w:highlight w:val="none"/>
@@ -13670,6 +13867,7 @@
             <w:r>
               <w:rPr>
                 <w:rFonts w:ascii="Times New Roman" w:hAnsi="Times New Roman" w:eastAsia="STSong" w:cs="Times New Roman"/>
+                <w:b w:val="0"/>
                 <w:sz w:val="17"/>
                 <w:szCs w:val="18"/>
                 <w:highlight w:val="none"/>
@@ -13722,6 +13920,7 @@
             <w:r>
               <w:rPr>
                 <w:rFonts w:ascii="Times New Roman" w:hAnsi="Times New Roman" w:eastAsia="STSong" w:cs="Times New Roman"/>
+                <w:b w:val="0"/>
                 <w:sz w:val="17"/>
                 <w:szCs w:val="18"/>
                 <w:highlight w:val="none"/>
@@ -13753,6 +13952,7 @@
             <w:r>
               <w:rPr>
                 <w:rFonts w:ascii="Times New Roman" w:hAnsi="Times New Roman" w:eastAsia="STSong" w:cs="Times New Roman"/>
+                <w:b w:val="0"/>
                 <w:sz w:val="17"/>
                 <w:szCs w:val="18"/>
                 <w:highlight w:val="none"/>
@@ -13784,6 +13984,7 @@
             <w:r>
               <w:rPr>
                 <w:rFonts w:ascii="Times New Roman" w:hAnsi="Times New Roman" w:eastAsia="STSong" w:cs="Times New Roman"/>
+                <w:b w:val="0"/>
                 <w:sz w:val="17"/>
                 <w:szCs w:val="18"/>
                 <w:highlight w:val="none"/>
@@ -13815,6 +14016,7 @@
             <w:r>
               <w:rPr>
                 <w:rFonts w:ascii="Times New Roman" w:hAnsi="Times New Roman" w:eastAsia="STSong" w:cs="Times New Roman"/>
+                <w:b w:val="0"/>
                 <w:sz w:val="17"/>
                 <w:szCs w:val="18"/>
                 <w:highlight w:val="none"/>
@@ -13867,6 +14069,7 @@
             <w:r>
               <w:rPr>
                 <w:rFonts w:ascii="Times New Roman" w:hAnsi="Times New Roman" w:eastAsia="STSong" w:cs="Times New Roman"/>
+                <w:b w:val="0"/>
                 <w:sz w:val="17"/>
                 <w:szCs w:val="18"/>
                 <w:highlight w:val="none"/>
@@ -13898,6 +14101,7 @@
             <w:r>
               <w:rPr>
                 <w:rFonts w:ascii="Times New Roman" w:hAnsi="Times New Roman" w:eastAsia="STSong" w:cs="Times New Roman"/>
+                <w:b w:val="0"/>
                 <w:sz w:val="17"/>
                 <w:szCs w:val="18"/>
                 <w:highlight w:val="none"/>
@@ -13929,6 +14133,7 @@
             <w:r>
               <w:rPr>
                 <w:rFonts w:ascii="Times New Roman" w:hAnsi="Times New Roman" w:eastAsia="STSong" w:cs="Times New Roman"/>
+                <w:b w:val="0"/>
                 <w:sz w:val="17"/>
                 <w:szCs w:val="18"/>
                 <w:highlight w:val="none"/>
@@ -13960,6 +14165,7 @@
             <w:r>
               <w:rPr>
                 <w:rFonts w:ascii="Times New Roman" w:hAnsi="Times New Roman" w:eastAsia="STSong" w:cs="Times New Roman"/>
+                <w:b w:val="0"/>
                 <w:sz w:val="17"/>
                 <w:szCs w:val="18"/>
                 <w:highlight w:val="none"/>
@@ -14012,6 +14218,7 @@
             <w:r>
               <w:rPr>
                 <w:rFonts w:ascii="Times New Roman" w:hAnsi="Times New Roman" w:eastAsia="STSong" w:cs="Times New Roman"/>
+                <w:b w:val="0"/>
                 <w:sz w:val="17"/>
                 <w:szCs w:val="18"/>
                 <w:highlight w:val="none"/>
@@ -14043,6 +14250,7 @@
             <w:r>
               <w:rPr>
                 <w:rFonts w:ascii="Times New Roman" w:hAnsi="Times New Roman" w:eastAsia="STSong" w:cs="Times New Roman"/>
+                <w:b w:val="0"/>
                 <w:sz w:val="17"/>
                 <w:szCs w:val="18"/>
                 <w:highlight w:val="none"/>
@@ -14074,6 +14282,7 @@
             <w:r>
               <w:rPr>
                 <w:rFonts w:ascii="Times New Roman" w:hAnsi="Times New Roman" w:eastAsia="STSong" w:cs="Times New Roman"/>
+                <w:b w:val="0"/>
                 <w:sz w:val="17"/>
                 <w:szCs w:val="18"/>
                 <w:highlight w:val="none"/>
@@ -14105,6 +14314,7 @@
             <w:r>
               <w:rPr>
                 <w:rFonts w:ascii="Times New Roman" w:hAnsi="Times New Roman" w:eastAsia="STSong" w:cs="Times New Roman"/>
+                <w:b w:val="0"/>
                 <w:sz w:val="17"/>
                 <w:szCs w:val="18"/>
                 <w:highlight w:val="none"/>
@@ -14157,6 +14367,7 @@
             <w:r>
               <w:rPr>
                 <w:rFonts w:ascii="Times New Roman" w:hAnsi="Times New Roman" w:eastAsia="STSong" w:cs="Times New Roman"/>
+                <w:b w:val="0"/>
                 <w:sz w:val="17"/>
                 <w:szCs w:val="18"/>
                 <w:highlight w:val="none"/>
@@ -14188,6 +14399,7 @@
             <w:r>
               <w:rPr>
                 <w:rFonts w:ascii="Times New Roman" w:hAnsi="Times New Roman" w:eastAsia="STSong" w:cs="Times New Roman"/>
+                <w:b w:val="0"/>
                 <w:sz w:val="17"/>
                 <w:szCs w:val="18"/>
                 <w:highlight w:val="none"/>
@@ -14219,6 +14431,7 @@
             <w:r>
               <w:rPr>
                 <w:rFonts w:ascii="Times New Roman" w:hAnsi="Times New Roman" w:eastAsia="STSong" w:cs="Times New Roman"/>
+                <w:b w:val="0"/>
                 <w:sz w:val="17"/>
                 <w:szCs w:val="18"/>
                 <w:highlight w:val="none"/>
@@ -14250,6 +14463,7 @@
             <w:r>
               <w:rPr>
                 <w:rFonts w:ascii="Times New Roman" w:hAnsi="Times New Roman" w:eastAsia="STSong" w:cs="Times New Roman"/>
+                <w:b w:val="0"/>
                 <w:sz w:val="17"/>
                 <w:szCs w:val="18"/>
                 <w:highlight w:val="none"/>
@@ -14302,6 +14516,7 @@
             <w:r>
               <w:rPr>
                 <w:rFonts w:ascii="Times New Roman" w:hAnsi="Times New Roman" w:eastAsia="STSong" w:cs="Times New Roman"/>
+                <w:b w:val="0"/>
                 <w:sz w:val="17"/>
                 <w:szCs w:val="18"/>
                 <w:highlight w:val="none"/>
@@ -14333,6 +14548,7 @@
             <w:r>
               <w:rPr>
                 <w:rFonts w:ascii="Times New Roman" w:hAnsi="Times New Roman" w:eastAsia="STSong" w:cs="Times New Roman"/>
+                <w:b w:val="0"/>
                 <w:sz w:val="17"/>
                 <w:szCs w:val="18"/>
                 <w:highlight w:val="none"/>
@@ -14364,6 +14580,7 @@
             <w:r>
               <w:rPr>
                 <w:rFonts w:ascii="Times New Roman" w:hAnsi="Times New Roman" w:eastAsia="STSong" w:cs="Times New Roman"/>
+                <w:b w:val="0"/>
                 <w:sz w:val="17"/>
                 <w:szCs w:val="18"/>
                 <w:highlight w:val="none"/>
@@ -14395,6 +14612,7 @@
             <w:r>
               <w:rPr>
                 <w:rFonts w:ascii="Times New Roman" w:hAnsi="Times New Roman" w:eastAsia="STSong" w:cs="Times New Roman"/>
+                <w:b w:val="0"/>
                 <w:sz w:val="17"/>
                 <w:szCs w:val="18"/>
                 <w:highlight w:val="none"/>
@@ -14577,6 +14795,7 @@
             <w:r>
               <w:rPr>
                 <w:rFonts w:ascii="Times New Roman" w:hAnsi="Times New Roman" w:eastAsia="STSong" w:cs="Times New Roman"/>
+                <w:b w:val="0"/>
                 <w:sz w:val="21"/>
               </w:rPr>
               <w:t>Strict RAMR-VE</w:t>
@@ -14591,6 +14810,7 @@
             <w:r>
               <w:rPr>
                 <w:rFonts w:ascii="Times New Roman" w:hAnsi="Times New Roman" w:eastAsia="STSong" w:cs="Times New Roman"/>
+                <w:b w:val="0"/>
                 <w:sz w:val="21"/>
               </w:rPr>
               <w:t>0.1380</w:t>
@@ -14605,6 +14825,7 @@
             <w:r>
               <w:rPr>
                 <w:rFonts w:ascii="Times New Roman" w:hAnsi="Times New Roman" w:eastAsia="STSong" w:cs="Times New Roman"/>
+                <w:b w:val="0"/>
                 <w:sz w:val="21"/>
               </w:rPr>
               <w:t>0.035640</w:t>
@@ -14619,6 +14840,7 @@
             <w:r>
               <w:rPr>
                 <w:rFonts w:ascii="Times New Roman" w:hAnsi="Times New Roman" w:eastAsia="STSong" w:cs="Times New Roman"/>
+                <w:b w:val="0"/>
                 <w:sz w:val="21"/>
               </w:rPr>
               <w:t>18.55%</w:t>
@@ -14752,6 +14974,7 @@
       <w:r>
         <w:rPr>
           <w:rFonts w:ascii="Times New Roman" w:hAnsi="Times New Roman" w:eastAsia="STSong" w:cs="Times New Roman"/>
+          <w:b w:val="0"/>
           <w:sz w:val="21"/>
         </w:rPr>
         <w:t>由图2可见，MoE-Rail/RAMR在峰值与低谷时段均更贴近真实客流，尤其在周末转换及局部波动区间跟踪误差更小；严格无泄露验证集集成后，表1中Strict RAMR-VE的MAPE进一步降至18.55%。</w:t>
@@ -14764,6 +14987,7 @@
       <w:r>
         <w:rPr>
           <w:rFonts w:ascii="Times New Roman" w:hAnsi="Times New Roman" w:eastAsia="STSong" w:cs="Times New Roman"/>
+          <w:b w:val="0"/>
           <w:sz w:val="21"/>
         </w:rPr>
         <w:t>表1-3  现代强基线补充实验结果（铁路主数据集）</w:t>
@@ -14913,6 +15137,7 @@
             <w:r>
               <w:rPr>
                 <w:rFonts w:ascii="Times New Roman" w:hAnsi="Times New Roman" w:eastAsia="STSong" w:cs="Times New Roman"/>
+                <w:b w:val="0"/>
                 <w:sz w:val="17"/>
               </w:rPr>
               <w:t>DLinear</w:t>
@@ -14931,6 +15156,7 @@
             <w:r>
               <w:rPr>
                 <w:rFonts w:ascii="Times New Roman" w:hAnsi="Times New Roman" w:eastAsia="STSong" w:cs="Times New Roman"/>
+                <w:b w:val="0"/>
                 <w:sz w:val="17"/>
               </w:rPr>
               <w:t>160</w:t>
@@ -14949,6 +15175,7 @@
             <w:r>
               <w:rPr>
                 <w:rFonts w:ascii="Times New Roman" w:hAnsi="Times New Roman" w:eastAsia="STSong" w:cs="Times New Roman"/>
+                <w:b w:val="0"/>
                 <w:sz w:val="17"/>
               </w:rPr>
               <w:t>40.56</w:t>
@@ -14967,6 +15194,7 @@
             <w:r>
               <w:rPr>
                 <w:rFonts w:ascii="Times New Roman" w:hAnsi="Times New Roman" w:eastAsia="STSong" w:cs="Times New Roman"/>
+                <w:b w:val="0"/>
                 <w:sz w:val="17"/>
               </w:rPr>
               <w:t>24.34</w:t>
@@ -14985,6 +15213,7 @@
             <w:r>
               <w:rPr>
                 <w:rFonts w:ascii="Times New Roman" w:hAnsi="Times New Roman" w:eastAsia="STSong" w:cs="Times New Roman"/>
+                <w:b w:val="0"/>
                 <w:sz w:val="17"/>
               </w:rPr>
               <w:t>0.054314</w:t>
@@ -15003,6 +15232,7 @@
             <w:r>
               <w:rPr>
                 <w:rFonts w:ascii="Times New Roman" w:hAnsi="Times New Roman" w:eastAsia="STSong" w:cs="Times New Roman"/>
+                <w:b w:val="0"/>
                 <w:sz w:val="17"/>
               </w:rPr>
               <w:t>0.182450</w:t>
@@ -15023,6 +15253,7 @@
             <w:r>
               <w:rPr>
                 <w:rFonts w:ascii="Times New Roman" w:hAnsi="Times New Roman" w:eastAsia="STSong" w:cs="Times New Roman"/>
+                <w:b w:val="0"/>
                 <w:sz w:val="17"/>
               </w:rPr>
               <w:t>PatchTST</w:t>
@@ -15041,6 +15272,7 @@
             <w:r>
               <w:rPr>
                 <w:rFonts w:ascii="Times New Roman" w:hAnsi="Times New Roman" w:eastAsia="STSong" w:cs="Times New Roman"/>
+                <w:b w:val="0"/>
                 <w:sz w:val="17"/>
               </w:rPr>
               <w:t>24</w:t>
@@ -15059,6 +15291,7 @@
             <w:r>
               <w:rPr>
                 <w:rFonts w:ascii="Times New Roman" w:hAnsi="Times New Roman" w:eastAsia="STSong" w:cs="Times New Roman"/>
+                <w:b w:val="0"/>
                 <w:sz w:val="17"/>
               </w:rPr>
               <w:t>35.38</w:t>
@@ -15077,6 +15310,7 @@
             <w:r>
               <w:rPr>
                 <w:rFonts w:ascii="Times New Roman" w:hAnsi="Times New Roman" w:eastAsia="STSong" w:cs="Times New Roman"/>
+                <w:b w:val="0"/>
                 <w:sz w:val="17"/>
               </w:rPr>
               <w:t>24.31</w:t>
@@ -15095,6 +15329,7 @@
             <w:r>
               <w:rPr>
                 <w:rFonts w:ascii="Times New Roman" w:hAnsi="Times New Roman" w:eastAsia="STSong" w:cs="Times New Roman"/>
+                <w:b w:val="0"/>
                 <w:sz w:val="17"/>
               </w:rPr>
               <w:t>0.054858</w:t>
@@ -15113,6 +15348,7 @@
             <w:r>
               <w:rPr>
                 <w:rFonts w:ascii="Times New Roman" w:hAnsi="Times New Roman" w:eastAsia="STSong" w:cs="Times New Roman"/>
+                <w:b w:val="0"/>
                 <w:sz w:val="17"/>
               </w:rPr>
               <w:t>0.170963</w:t>
@@ -15133,6 +15369,7 @@
             <w:r>
               <w:rPr>
                 <w:rFonts w:ascii="Times New Roman" w:hAnsi="Times New Roman" w:eastAsia="STSong" w:cs="Times New Roman"/>
+                <w:b w:val="0"/>
                 <w:sz w:val="17"/>
               </w:rPr>
               <w:t>iTransformer</w:t>
@@ -15151,6 +15388,7 @@
             <w:r>
               <w:rPr>
                 <w:rFonts w:ascii="Times New Roman" w:hAnsi="Times New Roman" w:eastAsia="STSong" w:cs="Times New Roman"/>
+                <w:b w:val="0"/>
                 <w:sz w:val="17"/>
               </w:rPr>
               <w:t>27</w:t>
@@ -15169,6 +15407,7 @@
             <w:r>
               <w:rPr>
                 <w:rFonts w:ascii="Times New Roman" w:hAnsi="Times New Roman" w:eastAsia="STSong" w:cs="Times New Roman"/>
+                <w:b w:val="0"/>
                 <w:sz w:val="17"/>
               </w:rPr>
               <w:t>36.28</w:t>
@@ -15187,6 +15426,7 @@
             <w:r>
               <w:rPr>
                 <w:rFonts w:ascii="Times New Roman" w:hAnsi="Times New Roman" w:eastAsia="STSong" w:cs="Times New Roman"/>
+                <w:b w:val="0"/>
                 <w:sz w:val="17"/>
               </w:rPr>
               <w:t>21.37</w:t>
@@ -15205,6 +15445,7 @@
             <w:r>
               <w:rPr>
                 <w:rFonts w:ascii="Times New Roman" w:hAnsi="Times New Roman" w:eastAsia="STSong" w:cs="Times New Roman"/>
+                <w:b w:val="0"/>
                 <w:sz w:val="17"/>
               </w:rPr>
               <w:t>0.043506</w:t>
@@ -15223,6 +15464,7 @@
             <w:r>
               <w:rPr>
                 <w:rFonts w:ascii="Times New Roman" w:hAnsi="Times New Roman" w:eastAsia="STSong" w:cs="Times New Roman"/>
+                <w:b w:val="0"/>
                 <w:sz w:val="17"/>
               </w:rPr>
               <w:t>0.154333</w:t>
@@ -15243,6 +15485,7 @@
             <w:r>
               <w:rPr>
                 <w:rFonts w:ascii="Times New Roman" w:hAnsi="Times New Roman" w:eastAsia="STSong" w:cs="Times New Roman"/>
+                <w:b w:val="0"/>
                 <w:sz w:val="17"/>
               </w:rPr>
               <w:t>TimeMixer</w:t>
@@ -15261,6 +15504,7 @@
             <w:r>
               <w:rPr>
                 <w:rFonts w:ascii="Times New Roman" w:hAnsi="Times New Roman" w:eastAsia="STSong" w:cs="Times New Roman"/>
+                <w:b w:val="0"/>
                 <w:sz w:val="17"/>
               </w:rPr>
               <w:t>49</w:t>
@@ -15279,6 +15523,7 @@
             <w:r>
               <w:rPr>
                 <w:rFonts w:ascii="Times New Roman" w:hAnsi="Times New Roman" w:eastAsia="STSong" w:cs="Times New Roman"/>
+                <w:b w:val="0"/>
                 <w:sz w:val="17"/>
               </w:rPr>
               <w:t>32.51</w:t>
@@ -15297,6 +15542,7 @@
             <w:r>
               <w:rPr>
                 <w:rFonts w:ascii="Times New Roman" w:hAnsi="Times New Roman" w:eastAsia="STSong" w:cs="Times New Roman"/>
+                <w:b w:val="0"/>
                 <w:sz w:val="17"/>
               </w:rPr>
               <w:t>23.55</w:t>
@@ -15315,6 +15561,7 @@
             <w:r>
               <w:rPr>
                 <w:rFonts w:ascii="Times New Roman" w:hAnsi="Times New Roman" w:eastAsia="STSong" w:cs="Times New Roman"/>
+                <w:b w:val="0"/>
                 <w:sz w:val="17"/>
               </w:rPr>
               <w:t>0.042384</w:t>
@@ -15333,6 +15580,7 @@
             <w:r>
               <w:rPr>
                 <w:rFonts w:ascii="Times New Roman" w:hAnsi="Times New Roman" w:eastAsia="STSong" w:cs="Times New Roman"/>
+                <w:b w:val="0"/>
                 <w:sz w:val="17"/>
               </w:rPr>
               <w:t>0.159879</w:t>
@@ -15353,6 +15601,7 @@
             <w:r>
               <w:rPr>
                 <w:rFonts w:ascii="Times New Roman" w:hAnsi="Times New Roman" w:eastAsia="STSong" w:cs="Times New Roman"/>
+                <w:b w:val="0"/>
                 <w:sz w:val="17"/>
               </w:rPr>
               <w:t>FreEformer</w:t>
@@ -15371,6 +15620,7 @@
             <w:r>
               <w:rPr>
                 <w:rFonts w:ascii="Times New Roman" w:hAnsi="Times New Roman" w:eastAsia="STSong" w:cs="Times New Roman"/>
+                <w:b w:val="0"/>
                 <w:sz w:val="17"/>
               </w:rPr>
               <w:t>51</w:t>
@@ -15389,6 +15639,7 @@
             <w:r>
               <w:rPr>
                 <w:rFonts w:ascii="Times New Roman" w:hAnsi="Times New Roman" w:eastAsia="STSong" w:cs="Times New Roman"/>
+                <w:b w:val="0"/>
                 <w:sz w:val="17"/>
               </w:rPr>
               <w:t>33.31</w:t>
@@ -15407,6 +15658,7 @@
             <w:r>
               <w:rPr>
                 <w:rFonts w:ascii="Times New Roman" w:hAnsi="Times New Roman" w:eastAsia="STSong" w:cs="Times New Roman"/>
+                <w:b w:val="0"/>
                 <w:sz w:val="17"/>
               </w:rPr>
               <w:t>20.15</w:t>
@@ -15425,6 +15677,7 @@
             <w:r>
               <w:rPr>
                 <w:rFonts w:ascii="Times New Roman" w:hAnsi="Times New Roman" w:eastAsia="STSong" w:cs="Times New Roman"/>
+                <w:b w:val="0"/>
                 <w:sz w:val="17"/>
               </w:rPr>
               <w:t>0.040026</w:t>
@@ -15443,6 +15696,7 @@
             <w:r>
               <w:rPr>
                 <w:rFonts w:ascii="Times New Roman" w:hAnsi="Times New Roman" w:eastAsia="STSong" w:cs="Times New Roman"/>
+                <w:b w:val="0"/>
                 <w:sz w:val="17"/>
               </w:rPr>
               <w:t>0.148139</w:t>
@@ -15463,6 +15717,7 @@
             <w:r>
               <w:rPr>
                 <w:rFonts w:ascii="Times New Roman" w:hAnsi="Times New Roman" w:eastAsia="STSong" w:cs="Times New Roman"/>
+                <w:b w:val="0"/>
                 <w:sz w:val="17"/>
               </w:rPr>
               <w:t>MoE-Rail（本文原模型）</w:t>
@@ -15481,6 +15736,7 @@
             <w:r>
               <w:rPr>
                 <w:rFonts w:ascii="Times New Roman" w:hAnsi="Times New Roman" w:eastAsia="STSong" w:cs="Times New Roman"/>
+                <w:b w:val="0"/>
                 <w:sz w:val="17"/>
               </w:rPr>
               <w:t>-</w:t>
@@ -15499,6 +15755,7 @@
             <w:r>
               <w:rPr>
                 <w:rFonts w:ascii="Times New Roman" w:hAnsi="Times New Roman" w:eastAsia="STSong" w:cs="Times New Roman"/>
+                <w:b w:val="0"/>
                 <w:sz w:val="17"/>
               </w:rPr>
               <w:t>-</w:t>
@@ -15517,6 +15774,7 @@
             <w:r>
               <w:rPr>
                 <w:rFonts w:ascii="Times New Roman" w:hAnsi="Times New Roman" w:eastAsia="STSong" w:cs="Times New Roman"/>
+                <w:b w:val="0"/>
                 <w:sz w:val="17"/>
               </w:rPr>
               <w:t>19.41</w:t>
@@ -15535,6 +15793,7 @@
             <w:r>
               <w:rPr>
                 <w:rFonts w:ascii="Times New Roman" w:hAnsi="Times New Roman" w:eastAsia="STSong" w:cs="Times New Roman"/>
+                <w:b w:val="0"/>
                 <w:sz w:val="17"/>
               </w:rPr>
               <w:t>0.037700</w:t>
@@ -15553,6 +15812,7 @@
             <w:r>
               <w:rPr>
                 <w:rFonts w:ascii="Times New Roman" w:hAnsi="Times New Roman" w:eastAsia="STSong" w:cs="Times New Roman"/>
+                <w:b w:val="0"/>
                 <w:sz w:val="17"/>
               </w:rPr>
               <w:t>0.144000</w:t>
@@ -15569,6 +15829,7 @@
             <w:r>
               <w:rPr>
                 <w:rFonts w:ascii="Times New Roman" w:hAnsi="Times New Roman" w:eastAsia="STSong" w:cs="Times New Roman"/>
+                <w:b w:val="0"/>
                 <w:sz w:val="21"/>
               </w:rPr>
               <w:t>Strict RAMR-VE</w:t>
@@ -15583,6 +15844,7 @@
             <w:r>
               <w:rPr>
                 <w:rFonts w:ascii="Times New Roman" w:hAnsi="Times New Roman" w:eastAsia="STSong" w:cs="Times New Roman"/>
+                <w:b w:val="0"/>
                 <w:sz w:val="21"/>
               </w:rPr>
               <w:t>验证集集成</w:t>
@@ -15597,6 +15859,7 @@
             <w:r>
               <w:rPr>
                 <w:rFonts w:ascii="Times New Roman" w:hAnsi="Times New Roman" w:eastAsia="STSong" w:cs="Times New Roman"/>
+                <w:b w:val="0"/>
                 <w:sz w:val="21"/>
               </w:rPr>
               <w:t>31.26</w:t>
@@ -15611,6 +15874,7 @@
             <w:r>
               <w:rPr>
                 <w:rFonts w:ascii="Times New Roman" w:hAnsi="Times New Roman" w:eastAsia="STSong" w:cs="Times New Roman"/>
+                <w:b w:val="0"/>
                 <w:sz w:val="21"/>
               </w:rPr>
               <w:t>18.55</w:t>
@@ -15625,6 +15889,7 @@
             <w:r>
               <w:rPr>
                 <w:rFonts w:ascii="Times New Roman" w:hAnsi="Times New Roman" w:eastAsia="STSong" w:cs="Times New Roman"/>
+                <w:b w:val="0"/>
                 <w:sz w:val="21"/>
               </w:rPr>
               <w:t>0.035640</w:t>
@@ -15639,6 +15904,7 @@
             <w:r>
               <w:rPr>
                 <w:rFonts w:ascii="Times New Roman" w:hAnsi="Times New Roman" w:eastAsia="STSong" w:cs="Times New Roman"/>
+                <w:b w:val="0"/>
                 <w:sz w:val="21"/>
               </w:rPr>
               <w:t>0.138028</w:t>
@@ -15651,6 +15917,7 @@
       <w:r>
         <w:rPr>
           <w:rFonts w:ascii="Times New Roman" w:hAnsi="Times New Roman" w:eastAsia="STSong" w:cs="Times New Roman"/>
+          <w:b w:val="0"/>
           <w:sz w:val="21"/>
         </w:rPr>
         <w:t>注：DLinear、PatchTST、iTransformer、TimeMixer和FreEformer均在相同铁路数据划分、lookback=6、horizon=1下重新训练；Strict RAMR-VE的checkpoint权重与尺度校准参数仅由验证集确定，测试集只用于最终一次评估。</w:t>
@@ -15706,6 +15973,7 @@
       <w:r>
         <w:rPr>
           <w:rFonts w:ascii="Times New Roman" w:hAnsi="Times New Roman" w:eastAsia="STSong" w:cs="Times New Roman"/>
+          <w:b w:val="0"/>
           <w:sz w:val="21"/>
         </w:rPr>
         <w:t>图2-1  现代强基线在铁路主数据集上的MAPE对比</w:t>
@@ -15800,6 +16068,7 @@
       <w:r>
         <w:rPr>
           <w:rFonts w:ascii="Times New Roman" w:hAnsi="Times New Roman" w:eastAsia="STSong" w:cs="Times New Roman"/>
+          <w:b w:val="0"/>
           <w:sz w:val="21"/>
         </w:rPr>
         <w:t>为验证审稿意见所关注的机制贡献，本文进一步补充RAMR消融实验：完整RAMR测试MAPE为20.88%；去除regime路由后MAPE升至21.37%，去除场景门控后升至22.44%，说明日历场景条件与窗口级非平稳状态均能改善专家路由。统计特征消融显示，basic（mean/std/max）在本轮测试集上MAPE为19.74%，quantile为19.96%，robust为20.88%，表明鲁棒分布偏移特征增强了机制解释，但在当前样本规模下并未带来最低测试误差，因此论文结论按真实消融结果表述，不将鲁棒特征写作必然优于简单统计量。</w:t>
@@ -15833,6 +16102,7 @@
       <w:r>
         <w:rPr>
           <w:rFonts w:ascii="Times New Roman" w:hAnsi="Times New Roman" w:eastAsia="STSong" w:cs="Times New Roman"/>
+          <w:b w:val="0"/>
           <w:sz w:val="21"/>
         </w:rPr>
         <w:t>表2-1  RAMR补充消融实验结果（测试集）</w:t>
@@ -15860,6 +16130,8 @@
             <w:r>
               <w:rPr>
                 <w:rFonts w:ascii="Times New Roman" w:hAnsi="Times New Roman" w:cs="Times New Roman" w:eastAsia="STSong"/>
+                <w:b w:val="0"/>
+                <w:sz w:val="21"/>
               </w:rPr>
               <w:t>实验设置</w:t>
             </w:r>
@@ -15873,6 +16145,8 @@
             <w:r>
               <w:rPr>
                 <w:rFonts w:ascii="Times New Roman" w:hAnsi="Times New Roman" w:cs="Times New Roman" w:eastAsia="STSong"/>
+                <w:b w:val="0"/>
+                <w:sz w:val="21"/>
               </w:rPr>
               <w:t>验证MAPE/%</w:t>
             </w:r>
@@ -15886,6 +16160,8 @@
             <w:r>
               <w:rPr>
                 <w:rFonts w:ascii="Times New Roman" w:hAnsi="Times New Roman" w:cs="Times New Roman" w:eastAsia="STSong"/>
+                <w:b w:val="0"/>
+                <w:sz w:val="21"/>
               </w:rPr>
               <w:t>测试MAPE/%</w:t>
             </w:r>
@@ -15899,6 +16175,8 @@
             <w:r>
               <w:rPr>
                 <w:rFonts w:ascii="Times New Roman" w:hAnsi="Times New Roman" w:cs="Times New Roman" w:eastAsia="STSong"/>
+                <w:b w:val="0"/>
+                <w:sz w:val="21"/>
               </w:rPr>
               <w:t>MSE</w:t>
             </w:r>
@@ -15912,6 +16190,8 @@
             <w:r>
               <w:rPr>
                 <w:rFonts w:ascii="Times New Roman" w:hAnsi="Times New Roman" w:cs="Times New Roman" w:eastAsia="STSong"/>
+                <w:b w:val="0"/>
+                <w:sz w:val="21"/>
               </w:rPr>
               <w:t>MAE</w:t>
             </w:r>
@@ -15927,6 +16207,8 @@
             <w:r>
               <w:rPr>
                 <w:rFonts w:ascii="Times New Roman" w:hAnsi="Times New Roman" w:cs="Times New Roman" w:eastAsia="STSong"/>
+                <w:b w:val="0"/>
+                <w:sz w:val="21"/>
               </w:rPr>
               <w:t>RAMR完整单checkpoint（scene+regime+robust+entropy）</w:t>
             </w:r>
@@ -15940,6 +16222,8 @@
             <w:r>
               <w:rPr>
                 <w:rFonts w:ascii="Times New Roman" w:hAnsi="Times New Roman" w:cs="Times New Roman" w:eastAsia="STSong"/>
+                <w:b w:val="0"/>
+                <w:sz w:val="21"/>
               </w:rPr>
               <w:t>33.4012</w:t>
             </w:r>
@@ -15953,6 +16237,8 @@
             <w:r>
               <w:rPr>
                 <w:rFonts w:ascii="Times New Roman" w:hAnsi="Times New Roman" w:cs="Times New Roman" w:eastAsia="STSong"/>
+                <w:b w:val="0"/>
+                <w:sz w:val="21"/>
               </w:rPr>
               <w:t>21.6706</w:t>
             </w:r>
@@ -15966,6 +16252,8 @@
             <w:r>
               <w:rPr>
                 <w:rFonts w:ascii="Times New Roman" w:hAnsi="Times New Roman" w:cs="Times New Roman" w:eastAsia="STSong"/>
+                <w:b w:val="0"/>
+                <w:sz w:val="21"/>
               </w:rPr>
               <w:t>0.046175</w:t>
             </w:r>
@@ -15979,6 +16267,8 @@
             <w:r>
               <w:rPr>
                 <w:rFonts w:ascii="Times New Roman" w:hAnsi="Times New Roman" w:cs="Times New Roman" w:eastAsia="STSong"/>
+                <w:b w:val="0"/>
+                <w:sz w:val="21"/>
               </w:rPr>
               <w:t>0.156578</w:t>
             </w:r>
@@ -15994,6 +16284,8 @@
             <w:r>
               <w:rPr>
                 <w:rFonts w:ascii="Times New Roman" w:hAnsi="Times New Roman" w:cs="Times New Roman" w:eastAsia="STSong"/>
+                <w:b w:val="0"/>
+                <w:sz w:val="21"/>
               </w:rPr>
               <w:t>无regime路由</w:t>
             </w:r>
@@ -16007,6 +16299,8 @@
             <w:r>
               <w:rPr>
                 <w:rFonts w:ascii="Times New Roman" w:hAnsi="Times New Roman" w:cs="Times New Roman" w:eastAsia="STSong"/>
+                <w:b w:val="0"/>
+                <w:sz w:val="21"/>
               </w:rPr>
               <w:t>34.2224</w:t>
             </w:r>
@@ -16020,6 +16314,8 @@
             <w:r>
               <w:rPr>
                 <w:rFonts w:ascii="Times New Roman" w:hAnsi="Times New Roman" w:cs="Times New Roman" w:eastAsia="STSong"/>
+                <w:b w:val="0"/>
+                <w:sz w:val="21"/>
               </w:rPr>
               <w:t>22.9143</w:t>
             </w:r>
@@ -16033,6 +16329,8 @@
             <w:r>
               <w:rPr>
                 <w:rFonts w:ascii="Times New Roman" w:hAnsi="Times New Roman" w:cs="Times New Roman" w:eastAsia="STSong"/>
+                <w:b w:val="0"/>
+                <w:sz w:val="21"/>
               </w:rPr>
               <w:t>0.044304</w:t>
             </w:r>
@@ -16046,6 +16344,8 @@
             <w:r>
               <w:rPr>
                 <w:rFonts w:ascii="Times New Roman" w:hAnsi="Times New Roman" w:cs="Times New Roman" w:eastAsia="STSong"/>
+                <w:b w:val="0"/>
+                <w:sz w:val="21"/>
               </w:rPr>
               <w:t>0.160740</w:t>
             </w:r>
@@ -16061,6 +16361,8 @@
             <w:r>
               <w:rPr>
                 <w:rFonts w:ascii="Times New Roman" w:hAnsi="Times New Roman" w:cs="Times New Roman" w:eastAsia="STSong"/>
+                <w:b w:val="0"/>
+                <w:sz w:val="21"/>
               </w:rPr>
               <w:t>无场景门控</w:t>
             </w:r>
@@ -16074,6 +16376,8 @@
             <w:r>
               <w:rPr>
                 <w:rFonts w:ascii="Times New Roman" w:hAnsi="Times New Roman" w:cs="Times New Roman" w:eastAsia="STSong"/>
+                <w:b w:val="0"/>
+                <w:sz w:val="21"/>
               </w:rPr>
               <w:t>37.2138</w:t>
             </w:r>
@@ -16087,6 +16391,8 @@
             <w:r>
               <w:rPr>
                 <w:rFonts w:ascii="Times New Roman" w:hAnsi="Times New Roman" w:cs="Times New Roman" w:eastAsia="STSong"/>
+                <w:b w:val="0"/>
+                <w:sz w:val="21"/>
               </w:rPr>
               <w:t>23.3886</w:t>
             </w:r>
@@ -16100,6 +16406,8 @@
             <w:r>
               <w:rPr>
                 <w:rFonts w:ascii="Times New Roman" w:hAnsi="Times New Roman" w:cs="Times New Roman" w:eastAsia="STSong"/>
+                <w:b w:val="0"/>
+                <w:sz w:val="21"/>
               </w:rPr>
               <w:t>0.052137</w:t>
             </w:r>
@@ -16113,6 +16421,8 @@
             <w:r>
               <w:rPr>
                 <w:rFonts w:ascii="Times New Roman" w:hAnsi="Times New Roman" w:cs="Times New Roman" w:eastAsia="STSong"/>
+                <w:b w:val="0"/>
+                <w:sz w:val="21"/>
               </w:rPr>
               <w:t>0.171826</w:t>
             </w:r>
@@ -16128,6 +16438,8 @@
             <w:r>
               <w:rPr>
                 <w:rFonts w:ascii="Times New Roman" w:hAnsi="Times New Roman" w:cs="Times New Roman" w:eastAsia="STSong"/>
+                <w:b w:val="0"/>
+                <w:sz w:val="21"/>
               </w:rPr>
               <w:t>分布偏移basic（mean/std/max）</w:t>
             </w:r>
@@ -16141,6 +16453,8 @@
             <w:r>
               <w:rPr>
                 <w:rFonts w:ascii="Times New Roman" w:hAnsi="Times New Roman" w:cs="Times New Roman" w:eastAsia="STSong"/>
+                <w:b w:val="0"/>
+                <w:sz w:val="21"/>
               </w:rPr>
               <w:t>33.5855</w:t>
             </w:r>
@@ -16154,6 +16468,8 @@
             <w:r>
               <w:rPr>
                 <w:rFonts w:ascii="Times New Roman" w:hAnsi="Times New Roman" w:cs="Times New Roman" w:eastAsia="STSong"/>
+                <w:b w:val="0"/>
+                <w:sz w:val="21"/>
               </w:rPr>
               <w:t>21.0201</w:t>
             </w:r>
@@ -16167,6 +16483,8 @@
             <w:r>
               <w:rPr>
                 <w:rFonts w:ascii="Times New Roman" w:hAnsi="Times New Roman" w:cs="Times New Roman" w:eastAsia="STSong"/>
+                <w:b w:val="0"/>
+                <w:sz w:val="21"/>
               </w:rPr>
               <w:t>0.042787</w:t>
             </w:r>
@@ -16180,6 +16498,8 @@
             <w:r>
               <w:rPr>
                 <w:rFonts w:ascii="Times New Roman" w:hAnsi="Times New Roman" w:cs="Times New Roman" w:eastAsia="STSong"/>
+                <w:b w:val="0"/>
+                <w:sz w:val="21"/>
               </w:rPr>
               <w:t>0.157434</w:t>
             </w:r>
@@ -16195,6 +16515,8 @@
             <w:r>
               <w:rPr>
                 <w:rFonts w:ascii="Times New Roman" w:hAnsi="Times New Roman" w:cs="Times New Roman" w:eastAsia="STSong"/>
+                <w:b w:val="0"/>
+                <w:sz w:val="21"/>
               </w:rPr>
               <w:t>分布偏移quantile</w:t>
             </w:r>
@@ -16208,6 +16530,8 @@
             <w:r>
               <w:rPr>
                 <w:rFonts w:ascii="Times New Roman" w:hAnsi="Times New Roman" w:cs="Times New Roman" w:eastAsia="STSong"/>
+                <w:b w:val="0"/>
+                <w:sz w:val="21"/>
               </w:rPr>
               <w:t>32.1661</w:t>
             </w:r>
@@ -16221,6 +16545,8 @@
             <w:r>
               <w:rPr>
                 <w:rFonts w:ascii="Times New Roman" w:hAnsi="Times New Roman" w:cs="Times New Roman" w:eastAsia="STSong"/>
+                <w:b w:val="0"/>
+                <w:sz w:val="21"/>
               </w:rPr>
               <w:t>19.0447</w:t>
             </w:r>
@@ -16234,6 +16560,8 @@
             <w:r>
               <w:rPr>
                 <w:rFonts w:ascii="Times New Roman" w:hAnsi="Times New Roman" w:cs="Times New Roman" w:eastAsia="STSong"/>
+                <w:b w:val="0"/>
+                <w:sz w:val="21"/>
               </w:rPr>
               <w:t>0.035678</w:t>
             </w:r>
@@ -16247,6 +16575,8 @@
             <w:r>
               <w:rPr>
                 <w:rFonts w:ascii="Times New Roman" w:hAnsi="Times New Roman" w:cs="Times New Roman" w:eastAsia="STSong"/>
+                <w:b w:val="0"/>
+                <w:sz w:val="21"/>
               </w:rPr>
               <w:t>0.136987</w:t>
             </w:r>
@@ -16262,6 +16592,8 @@
             <w:r>
               <w:rPr>
                 <w:rFonts w:ascii="Times New Roman" w:hAnsi="Times New Roman" w:cs="Times New Roman" w:eastAsia="STSong"/>
+                <w:b w:val="0"/>
+                <w:sz w:val="21"/>
               </w:rPr>
               <w:t>方差负载均衡</w:t>
             </w:r>
@@ -16275,6 +16607,8 @@
             <w:r>
               <w:rPr>
                 <w:rFonts w:ascii="Times New Roman" w:hAnsi="Times New Roman" w:cs="Times New Roman" w:eastAsia="STSong"/>
+                <w:b w:val="0"/>
+                <w:sz w:val="21"/>
               </w:rPr>
               <w:t>34.9200</w:t>
             </w:r>
@@ -16288,6 +16622,8 @@
             <w:r>
               <w:rPr>
                 <w:rFonts w:ascii="Times New Roman" w:hAnsi="Times New Roman" w:cs="Times New Roman" w:eastAsia="STSong"/>
+                <w:b w:val="0"/>
+                <w:sz w:val="21"/>
               </w:rPr>
               <w:t>21.7700</w:t>
             </w:r>
@@ -16301,6 +16637,8 @@
             <w:r>
               <w:rPr>
                 <w:rFonts w:ascii="Times New Roman" w:hAnsi="Times New Roman" w:cs="Times New Roman" w:eastAsia="STSong"/>
+                <w:b w:val="0"/>
+                <w:sz w:val="21"/>
               </w:rPr>
               <w:t>0.046378</w:t>
             </w:r>
@@ -16314,6 +16652,8 @@
             <w:r>
               <w:rPr>
                 <w:rFonts w:ascii="Times New Roman" w:hAnsi="Times New Roman" w:cs="Times New Roman" w:eastAsia="STSong"/>
+                <w:b w:val="0"/>
+                <w:sz w:val="21"/>
               </w:rPr>
               <w:t>0.158459</w:t>
             </w:r>
@@ -16329,6 +16669,8 @@
             <w:r>
               <w:rPr>
                 <w:rFonts w:ascii="Times New Roman" w:hAnsi="Times New Roman" w:cs="Times New Roman" w:eastAsia="STSong"/>
+                <w:b w:val="0"/>
+                <w:sz w:val="21"/>
               </w:rPr>
               <w:t>MAE-aware robust</w:t>
             </w:r>
@@ -16342,6 +16684,8 @@
             <w:r>
               <w:rPr>
                 <w:rFonts w:ascii="Times New Roman" w:hAnsi="Times New Roman" w:cs="Times New Roman" w:eastAsia="STSong"/>
+                <w:b w:val="0"/>
+                <w:sz w:val="21"/>
               </w:rPr>
               <w:t>33.7868</w:t>
             </w:r>
@@ -16355,6 +16699,8 @@
             <w:r>
               <w:rPr>
                 <w:rFonts w:ascii="Times New Roman" w:hAnsi="Times New Roman" w:cs="Times New Roman" w:eastAsia="STSong"/>
+                <w:b w:val="0"/>
+                <w:sz w:val="21"/>
               </w:rPr>
               <w:t>21.2186</w:t>
             </w:r>
@@ -16368,6 +16714,8 @@
             <w:r>
               <w:rPr>
                 <w:rFonts w:ascii="Times New Roman" w:hAnsi="Times New Roman" w:cs="Times New Roman" w:eastAsia="STSong"/>
+                <w:b w:val="0"/>
+                <w:sz w:val="21"/>
               </w:rPr>
               <w:t>0.049823</w:t>
             </w:r>
@@ -16381,6 +16729,8 @@
             <w:r>
               <w:rPr>
                 <w:rFonts w:ascii="Times New Roman" w:hAnsi="Times New Roman" w:cs="Times New Roman" w:eastAsia="STSong"/>
+                <w:b w:val="0"/>
+                <w:sz w:val="21"/>
               </w:rPr>
               <w:t>0.164273</w:t>
             </w:r>
@@ -16392,6 +16742,7 @@
       <w:r>
         <w:rPr>
           <w:rFonts w:ascii="Times New Roman" w:hAnsi="Times New Roman" w:eastAsia="STSong" w:cs="Times New Roman"/>
+          <w:b w:val="0"/>
           <w:sz w:val="21"/>
         </w:rPr>
         <w:t>注：测试指标均使用对应实验的验证集最优checkpoint重新评估得到；best_model_latest.pth不一定等同于验证集最优模型。</w:t>
@@ -16541,6 +16892,8 @@
             <w:r>
               <w:rPr>
                 <w:rFonts w:ascii="Times New Roman" w:hAnsi="Times New Roman" w:cs="Times New Roman" w:eastAsia="STSong"/>
+                <w:b w:val="0"/>
+                <w:sz w:val="21"/>
               </w:rPr>
               <w:t>早期RAMR完整模型（MAE实验参照）</w:t>
             </w:r>
@@ -16903,6 +17256,7 @@
             <w:r>
               <w:rPr>
                 <w:rFonts w:ascii="Times New Roman" w:hAnsi="Times New Roman" w:eastAsia="STSong" w:cs="Times New Roman"/>
+                <w:b w:val="0"/>
                 <w:sz w:val="21"/>
               </w:rPr>
               <w:t>原论文结果</w:t>
@@ -17016,6 +17370,7 @@
             <w:r>
               <w:rPr>
                 <w:rFonts w:ascii="Times New Roman" w:hAnsi="Times New Roman" w:eastAsia="STSong" w:cs="Times New Roman"/>
+                <w:b w:val="0"/>
                 <w:sz w:val="21"/>
               </w:rPr>
               <w:t>Strict RAMR-VE</w:t>
@@ -17030,6 +17385,7 @@
             <w:r>
               <w:rPr>
                 <w:rFonts w:ascii="Times New Roman" w:hAnsi="Times New Roman" w:eastAsia="STSong" w:cs="Times New Roman"/>
+                <w:b w:val="0"/>
                 <w:sz w:val="21"/>
               </w:rPr>
               <w:t>18.55</w:t>
@@ -17044,6 +17400,7 @@
             <w:r>
               <w:rPr>
                 <w:rFonts w:ascii="Times New Roman" w:hAnsi="Times New Roman" w:eastAsia="STSong" w:cs="Times New Roman"/>
+                <w:b w:val="0"/>
                 <w:sz w:val="21"/>
               </w:rPr>
               <w:t>0.035640</w:t>
@@ -17058,6 +17415,7 @@
             <w:r>
               <w:rPr>
                 <w:rFonts w:ascii="Times New Roman" w:hAnsi="Times New Roman" w:eastAsia="STSong" w:cs="Times New Roman"/>
+                <w:b w:val="0"/>
                 <w:sz w:val="21"/>
               </w:rPr>
               <w:t>0.138028</w:t>
@@ -17072,6 +17430,7 @@
             <w:r>
               <w:rPr>
                 <w:rFonts w:ascii="Times New Roman" w:hAnsi="Times New Roman" w:eastAsia="STSong" w:cs="Times New Roman"/>
+                <w:b w:val="0"/>
                 <w:sz w:val="21"/>
               </w:rPr>
               <w:t>验证集选权重与尺度，测试集最终一次评估</w:t>
@@ -17084,6 +17443,7 @@
       <w:r>
         <w:rPr>
           <w:rFonts w:ascii="Times New Roman" w:hAnsi="Times New Roman" w:eastAsia="STSong" w:cs="Times New Roman"/>
+          <w:b w:val="0"/>
           <w:sz w:val="21"/>
         </w:rPr>
         <w:t>由表2-2可见，MAE导向训练能够缓解RAMR完整模型的平均绝对误差弱项：RAMR-MAE-basic-mape将MAE由0.151176降至0.148552，同时MAPE由20.88%降至20.34%。单模型目标函数调整仍存在MAPE、MSE和MAE之间的权衡。进一步地，本文采用严格无泄露验证集集成（Strict RAMR-VE），仅利用验证集确定checkpoint权重与尺度校准参数，最终在测试集取得MAPE=18.55%、MSE=0.035640、MAE=0.138028，三项指标均优于原MoE-Rail。</w:t>
@@ -17163,6 +17523,7 @@
             <w:r>
               <w:rPr>
                 <w:rFonts w:ascii="Times New Roman" w:hAnsi="Times New Roman" w:eastAsia="STSong" w:cs="Times New Roman"/>
+                <w:b w:val="0"/>
                 <w:sz w:val="17"/>
                 <w:szCs w:val="18"/>
                 <w:highlight w:val="none"/>
@@ -17195,6 +17556,7 @@
             <w:r>
               <w:rPr>
                 <w:rFonts w:ascii="Times New Roman" w:hAnsi="Times New Roman" w:eastAsia="STSong" w:cs="Times New Roman"/>
+                <w:b w:val="0"/>
                 <w:sz w:val="17"/>
                 <w:szCs w:val="18"/>
                 <w:highlight w:val="none"/>
@@ -17236,6 +17598,7 @@
             <w:r>
               <w:rPr>
                 <w:rFonts w:ascii="Times New Roman" w:hAnsi="Times New Roman" w:eastAsia="STSong" w:cs="Times New Roman"/>
+                <w:b w:val="0"/>
                 <w:sz w:val="17"/>
                 <w:szCs w:val="18"/>
                 <w:highlight w:val="none"/>
@@ -17268,6 +17631,7 @@
             <w:r>
               <w:rPr>
                 <w:rFonts w:ascii="Times New Roman" w:hAnsi="Times New Roman" w:eastAsia="STSong" w:cs="Times New Roman"/>
+                <w:b w:val="0"/>
                 <w:sz w:val="17"/>
                 <w:szCs w:val="18"/>
                 <w:highlight w:val="none"/>
@@ -17300,6 +17664,7 @@
             <w:r>
               <w:rPr>
                 <w:rFonts w:ascii="Times New Roman" w:hAnsi="Times New Roman" w:eastAsia="STSong" w:cs="Times New Roman"/>
+                <w:b w:val="0"/>
                 <w:sz w:val="17"/>
                 <w:szCs w:val="18"/>
                 <w:highlight w:val="none"/>
@@ -17332,6 +17697,7 @@
             <w:r>
               <w:rPr>
                 <w:rFonts w:hint="default" w:ascii="Times New Roman" w:hAnsi="Times New Roman" w:eastAsia="STSong" w:cs="Times New Roman"/>
+                <w:b w:val="0"/>
                 <w:i w:val="0"/>
                 <w:iCs w:val="0"/>
                 <w:caps w:val="0"/>
@@ -17391,6 +17757,7 @@
             <w:r>
               <w:rPr>
                 <w:rFonts w:hint="eastAsia" w:ascii="Times New Roman" w:hAnsi="Times New Roman" w:eastAsia="STSong" w:cs="Times New Roman"/>
+                <w:b w:val="0"/>
                 <w:sz w:val="17"/>
                 <w:szCs w:val="18"/>
                 <w:highlight w:val="none"/>
@@ -17401,6 +17768,7 @@
             <w:r>
               <w:rPr>
                 <w:rFonts w:ascii="Times New Roman" w:hAnsi="Times New Roman" w:eastAsia="STSong" w:cs="Times New Roman"/>
+                <w:b w:val="0"/>
                 <w:sz w:val="17"/>
                 <w:szCs w:val="18"/>
                 <w:highlight w:val="none"/>
@@ -17433,6 +17801,7 @@
             <w:r>
               <w:rPr>
                 <w:rFonts w:ascii="Times New Roman" w:hAnsi="Times New Roman" w:eastAsia="STSong" w:cs="Times New Roman"/>
+                <w:b w:val="0"/>
                 <w:sz w:val="17"/>
                 <w:szCs w:val="18"/>
                 <w:highlight w:val="none"/>
@@ -17465,6 +17834,7 @@
             <w:r>
               <w:rPr>
                 <w:rFonts w:ascii="Times New Roman" w:hAnsi="Times New Roman" w:eastAsia="STSong" w:cs="Times New Roman"/>
+                <w:b w:val="0"/>
                 <w:sz w:val="17"/>
                 <w:szCs w:val="18"/>
                 <w:highlight w:val="none"/>
@@ -17497,6 +17867,7 @@
             <w:r>
               <w:rPr>
                 <w:rFonts w:ascii="Times New Roman" w:hAnsi="Times New Roman" w:eastAsia="STSong" w:cs="Times New Roman"/>
+                <w:b w:val="0"/>
                 <w:sz w:val="17"/>
                 <w:szCs w:val="18"/>
                 <w:highlight w:val="none"/>
@@ -17529,6 +17900,7 @@
             <w:r>
               <w:rPr>
                 <w:rFonts w:ascii="Times New Roman" w:hAnsi="Times New Roman" w:eastAsia="STSong" w:cs="Times New Roman"/>
+                <w:b w:val="0"/>
                 <w:sz w:val="17"/>
                 <w:szCs w:val="18"/>
                 <w:highlight w:val="none"/>
@@ -17563,6 +17935,7 @@
             <w:r>
               <w:rPr>
                 <w:rFonts w:ascii="Times New Roman" w:hAnsi="Times New Roman" w:eastAsia="STSong" w:cs="Times New Roman"/>
+                <w:b w:val="0"/>
                 <w:i w:val="0"/>
                 <w:iCs w:val="0"/>
                 <w:caps w:val="0"/>
@@ -17613,6 +17986,7 @@
             <w:r>
               <w:rPr>
                 <w:rFonts w:ascii="Times New Roman" w:hAnsi="Times New Roman" w:eastAsia="STSong" w:cs="Times New Roman"/>
+                <w:b w:val="0"/>
                 <w:sz w:val="21"/>
               </w:rPr>
               <w:t>MoE-Rail (w/o Shift)</w:t>
@@ -17634,6 +18008,7 @@
             <w:r>
               <w:rPr>
                 <w:rFonts w:ascii="Times New Roman" w:hAnsi="Times New Roman" w:eastAsia="STSong" w:cs="Times New Roman"/>
+                <w:b w:val="0"/>
                 <w:sz w:val="21"/>
               </w:rPr>
               <w:t>分布偏移专家</w:t>
@@ -17664,6 +18039,7 @@
             <w:r>
               <w:rPr>
                 <w:rFonts w:ascii="Times New Roman" w:hAnsi="Times New Roman" w:eastAsia="STSong" w:cs="Times New Roman"/>
+                <w:b w:val="0"/>
                 <w:sz w:val="17"/>
                 <w:szCs w:val="18"/>
                 <w:highlight w:val="none"/>
@@ -17696,6 +18072,7 @@
             <w:r>
               <w:rPr>
                 <w:rFonts w:ascii="Times New Roman" w:hAnsi="Times New Roman" w:eastAsia="STSong" w:cs="Times New Roman"/>
+                <w:b w:val="0"/>
                 <w:sz w:val="17"/>
                 <w:szCs w:val="18"/>
                 <w:highlight w:val="none"/>
@@ -17728,6 +18105,7 @@
             <w:r>
               <w:rPr>
                 <w:rFonts w:ascii="Times New Roman" w:hAnsi="Times New Roman" w:eastAsia="STSong" w:cs="Times New Roman"/>
+                <w:b w:val="0"/>
                 <w:sz w:val="17"/>
                 <w:szCs w:val="18"/>
                 <w:highlight w:val="none"/>
@@ -17762,6 +18140,7 @@
             <w:r>
               <w:rPr>
                 <w:rFonts w:hint="eastAsia" w:ascii="Times New Roman" w:hAnsi="Times New Roman" w:eastAsia="STSong" w:cs="Times New Roman"/>
+                <w:b w:val="0"/>
                 <w:sz w:val="17"/>
                 <w:szCs w:val="18"/>
                 <w:highlight w:val="none"/>
@@ -17817,6 +18196,7 @@
             <w:r>
               <w:rPr>
                 <w:rFonts w:hint="eastAsia" w:ascii="Times New Roman" w:hAnsi="Times New Roman" w:eastAsia="STSong" w:cs="Times New Roman"/>
+                <w:b w:val="0"/>
                 <w:sz w:val="17"/>
                 <w:szCs w:val="18"/>
                 <w:highlight w:val="none"/>
@@ -17827,6 +18207,7 @@
             <w:r>
               <w:rPr>
                 <w:rFonts w:ascii="Times New Roman" w:hAnsi="Times New Roman" w:eastAsia="STSong" w:cs="Times New Roman"/>
+                <w:b w:val="0"/>
                 <w:sz w:val="17"/>
                 <w:szCs w:val="18"/>
                 <w:highlight w:val="none"/>
@@ -17859,6 +18240,7 @@
             <w:r>
               <w:rPr>
                 <w:rFonts w:ascii="Times New Roman" w:hAnsi="Times New Roman" w:eastAsia="STSong" w:cs="Times New Roman"/>
+                <w:b w:val="0"/>
                 <w:sz w:val="17"/>
                 <w:szCs w:val="18"/>
                 <w:highlight w:val="none"/>
@@ -17891,6 +18273,7 @@
             <w:r>
               <w:rPr>
                 <w:rFonts w:ascii="Times New Roman" w:hAnsi="Times New Roman" w:eastAsia="STSong" w:cs="Times New Roman"/>
+                <w:b w:val="0"/>
                 <w:sz w:val="17"/>
                 <w:szCs w:val="18"/>
                 <w:highlight w:val="none"/>
@@ -17923,6 +18306,7 @@
             <w:r>
               <w:rPr>
                 <w:rFonts w:ascii="Times New Roman" w:hAnsi="Times New Roman" w:eastAsia="STSong" w:cs="Times New Roman"/>
+                <w:b w:val="0"/>
                 <w:sz w:val="17"/>
                 <w:szCs w:val="18"/>
                 <w:highlight w:val="none"/>
@@ -17955,6 +18339,7 @@
             <w:r>
               <w:rPr>
                 <w:rFonts w:ascii="Times New Roman" w:hAnsi="Times New Roman" w:eastAsia="STSong" w:cs="Times New Roman"/>
+                <w:b w:val="0"/>
                 <w:sz w:val="17"/>
                 <w:szCs w:val="18"/>
                 <w:highlight w:val="none"/>
@@ -17989,6 +18374,7 @@
             <w:r>
               <w:rPr>
                 <w:rFonts w:hint="eastAsia" w:ascii="Times New Roman" w:hAnsi="Times New Roman" w:eastAsia="STSong" w:cs="Times New Roman"/>
+                <w:b w:val="0"/>
                 <w:sz w:val="17"/>
                 <w:szCs w:val="18"/>
                 <w:highlight w:val="none"/>
@@ -18044,6 +18430,7 @@
             <w:r>
               <w:rPr>
                 <w:rFonts w:hint="eastAsia" w:ascii="Times New Roman" w:hAnsi="Times New Roman" w:eastAsia="STSong" w:cs="Times New Roman"/>
+                <w:b w:val="0"/>
                 <w:sz w:val="17"/>
                 <w:szCs w:val="18"/>
                 <w:highlight w:val="none"/>
@@ -18054,6 +18441,7 @@
             <w:r>
               <w:rPr>
                 <w:rFonts w:ascii="Times New Roman" w:hAnsi="Times New Roman" w:eastAsia="STSong" w:cs="Times New Roman"/>
+                <w:b w:val="0"/>
                 <w:sz w:val="17"/>
                 <w:szCs w:val="18"/>
                 <w:highlight w:val="none"/>
@@ -18086,6 +18474,7 @@
             <w:r>
               <w:rPr>
                 <w:rFonts w:ascii="Times New Roman" w:hAnsi="Times New Roman" w:eastAsia="STSong" w:cs="Times New Roman"/>
+                <w:b w:val="0"/>
                 <w:sz w:val="17"/>
                 <w:szCs w:val="18"/>
                 <w:highlight w:val="none"/>
@@ -18118,6 +18507,7 @@
             <w:r>
               <w:rPr>
                 <w:rFonts w:ascii="Times New Roman" w:hAnsi="Times New Roman" w:eastAsia="STSong" w:cs="Times New Roman"/>
+                <w:b w:val="0"/>
                 <w:sz w:val="17"/>
                 <w:szCs w:val="18"/>
                 <w:highlight w:val="none"/>
@@ -18150,6 +18540,7 @@
             <w:r>
               <w:rPr>
                 <w:rFonts w:ascii="Times New Roman" w:hAnsi="Times New Roman" w:eastAsia="STSong" w:cs="Times New Roman"/>
+                <w:b w:val="0"/>
                 <w:sz w:val="17"/>
                 <w:szCs w:val="18"/>
                 <w:highlight w:val="none"/>
@@ -18182,6 +18573,7 @@
             <w:r>
               <w:rPr>
                 <w:rFonts w:ascii="Times New Roman" w:hAnsi="Times New Roman" w:eastAsia="STSong" w:cs="Times New Roman"/>
+                <w:b w:val="0"/>
                 <w:sz w:val="17"/>
                 <w:szCs w:val="18"/>
                 <w:highlight w:val="none"/>
@@ -18216,6 +18608,7 @@
             <w:r>
               <w:rPr>
                 <w:rFonts w:hint="eastAsia" w:ascii="Times New Roman" w:hAnsi="Times New Roman" w:eastAsia="STSong" w:cs="Times New Roman"/>
+                <w:b w:val="0"/>
                 <w:sz w:val="17"/>
                 <w:szCs w:val="18"/>
                 <w:highlight w:val="none"/>
@@ -18231,6 +18624,8 @@
       <w:r>
         <w:rPr>
           <w:rFonts w:ascii="Times New Roman" w:hAnsi="Times New Roman" w:cs="Times New Roman" w:eastAsia="STSong"/>
+          <w:b w:val="0"/>
+          <w:sz w:val="21"/>
         </w:rPr>
         <w:t>为进一步回应日历特征、regime routing、负载均衡与分布偏移特征工程的审稿意见，本文在固定 checkpoint 口径下补充复核关键结构消融，所有 checkpoint 均为验证集保存结果，测试集仅用于最终评估。完整单 checkpoint（scene+regime+robust+高熵负载均衡）的测试MAPE/MSE/MAE为21.6706%/0.046175/0.156578；移除日历场景门控后退化为23.3886%/0.052137/0.171826，移除regime routing后退化为22.9143%/0.044304/0.160740，将高熵负载均衡替换为方差惩罚后为21.7700%/0.046378/0.158459。分布偏移特征集合对比显示，basic(mean/std/max)为21.0201%/0.042787/0.157434，quantile为19.0447%/0.035678/0.136987，说明分位结构是当前数据中最有效的单模型统计信息；robust特征的价值主要体现在刻画窗口级分布扰动和与其他训练目标形成互补，最终Strict RAMR-VE通过验证集固定集成进一步提升至18.5463%/0.035640/0.138028。</w:t>
       </w:r>
@@ -18331,6 +18726,7 @@
       <w:r>
         <w:rPr>
           <w:rFonts w:ascii="Times New Roman" w:hAnsi="Times New Roman" w:eastAsia="STSong" w:cs="Times New Roman"/>
+          <w:b w:val="0"/>
           <w:sz w:val="21"/>
         </w:rPr>
         <w:t>对测试集各站点客流序列进行趋势、周期与残差扰动分解，并同步记录RAMR输出的短期、长期与分布偏移专家门控权重。当前严格时间顺序测试窗口包含152个工作日样本、60个周末样本和0个节假日样本，因此本文仅报告工作日与周末的场景门控统计，并对两类子集进行Welch t检验；不对当前测试集不存在的节假日样本作显著性外推。</w:t>
@@ -18348,6 +18744,7 @@
       <w:r>
         <w:rPr>
           <w:rFonts w:ascii="Times New Roman" w:hAnsi="Times New Roman" w:eastAsia="STSong" w:cs="Times New Roman"/>
+          <w:b w:val="0"/>
           <w:sz w:val="21"/>
         </w:rPr>
         <w:t>表3汇总当前测试窗口中工作日与周末两类日历场景下各专家门控权重的样本均值。模型实际输出专家顺序为短期专家、长期专家和分布偏移专家，表中按该顺序报告。</w:t>
@@ -18452,6 +18849,7 @@
             <w:r>
               <w:rPr>
                 <w:rFonts w:ascii="Times New Roman" w:hAnsi="Times New Roman" w:eastAsia="STSong" w:cs="Times New Roman"/>
+                <w:b w:val="0"/>
                 <w:sz w:val="21"/>
               </w:rPr>
               <w:t>场景</w:t>
@@ -18481,6 +18879,7 @@
             <w:r>
               <w:rPr>
                 <w:rFonts w:ascii="Times New Roman" w:hAnsi="Times New Roman" w:eastAsia="STSong" w:cs="Times New Roman"/>
+                <w:b w:val="0"/>
                 <w:sz w:val="21"/>
               </w:rPr>
               <w:t>短期专家</w:t>
@@ -18510,6 +18909,7 @@
             <w:r>
               <w:rPr>
                 <w:rFonts w:ascii="Times New Roman" w:hAnsi="Times New Roman" w:eastAsia="STSong" w:cs="Times New Roman"/>
+                <w:b w:val="0"/>
                 <w:sz w:val="21"/>
               </w:rPr>
               <w:t>长期专家</w:t>
@@ -18539,6 +18939,7 @@
             <w:r>
               <w:rPr>
                 <w:rFonts w:ascii="Times New Roman" w:hAnsi="Times New Roman" w:eastAsia="STSong" w:cs="Times New Roman"/>
+                <w:b w:val="0"/>
                 <w:sz w:val="21"/>
               </w:rPr>
               <w:t>分布偏移专家</w:t>
@@ -18592,6 +18993,7 @@
             <w:r>
               <w:rPr>
                 <w:rFonts w:ascii="Times New Roman" w:hAnsi="Times New Roman" w:eastAsia="STSong" w:cs="Times New Roman"/>
+                <w:b w:val="0"/>
                 <w:sz w:val="21"/>
               </w:rPr>
               <w:t>工作日</w:t>
@@ -18621,6 +19023,7 @@
             <w:r>
               <w:rPr>
                 <w:rFonts w:ascii="Times New Roman" w:hAnsi="Times New Roman" w:eastAsia="STSong" w:cs="Times New Roman"/>
+                <w:b w:val="0"/>
                 <w:sz w:val="21"/>
               </w:rPr>
               <w:t>0.5927</w:t>
@@ -18650,6 +19053,7 @@
             <w:r>
               <w:rPr>
                 <w:rFonts w:ascii="Times New Roman" w:hAnsi="Times New Roman" w:eastAsia="STSong" w:cs="Times New Roman"/>
+                <w:b w:val="0"/>
                 <w:sz w:val="21"/>
               </w:rPr>
               <w:t>0.0845</w:t>
@@ -18679,6 +19083,7 @@
             <w:r>
               <w:rPr>
                 <w:rFonts w:ascii="Times New Roman" w:hAnsi="Times New Roman" w:eastAsia="STSong" w:cs="Times New Roman"/>
+                <w:b w:val="0"/>
                 <w:sz w:val="21"/>
               </w:rPr>
               <w:t>0.3228</w:t>
@@ -18732,6 +19137,7 @@
             <w:r>
               <w:rPr>
                 <w:rFonts w:ascii="Times New Roman" w:hAnsi="Times New Roman" w:eastAsia="STSong" w:cs="Times New Roman"/>
+                <w:b w:val="0"/>
                 <w:sz w:val="21"/>
               </w:rPr>
               <w:t>周末</w:t>
@@ -18761,6 +19167,7 @@
             <w:r>
               <w:rPr>
                 <w:rFonts w:ascii="Times New Roman" w:hAnsi="Times New Roman" w:eastAsia="STSong" w:cs="Times New Roman"/>
+                <w:b w:val="0"/>
                 <w:sz w:val="21"/>
               </w:rPr>
               <w:t>0.2196</w:t>
@@ -18790,6 +19197,7 @@
             <w:r>
               <w:rPr>
                 <w:rFonts w:ascii="Times New Roman" w:hAnsi="Times New Roman" w:eastAsia="STSong" w:cs="Times New Roman"/>
+                <w:b w:val="0"/>
                 <w:sz w:val="21"/>
               </w:rPr>
               <w:t>0.2011</w:t>
@@ -18819,6 +19227,7 @@
             <w:r>
               <w:rPr>
                 <w:rFonts w:ascii="Times New Roman" w:hAnsi="Times New Roman" w:eastAsia="STSong" w:cs="Times New Roman"/>
+                <w:b w:val="0"/>
                 <w:sz w:val="21"/>
               </w:rPr>
               <w:t>0.5793</w:t>
@@ -18846,6 +19255,7 @@
       <w:r>
         <w:rPr>
           <w:rFonts w:ascii="Times New Roman" w:hAnsi="Times New Roman" w:eastAsia="STSong" w:cs="Times New Roman"/>
+          <w:b w:val="0"/>
           <w:sz w:val="21"/>
         </w:rPr>
         <w:t>由表3可知，短期专家并非在所有场景中权重最低。工作日短期专家权重为0.5927，高于分布偏移专家的0.3228和长期专家的0.0845，表明常规日粒度预测主要依赖相邻日期连续性与短程校正；周末分布偏移专家权重升至0.5793，短期专家权重降至0.2196，说明非工作日需求结构变化会触发分布偏移建模。该结果纠正了旧版统计中因专家顺序解释不一致造成的“短期专家始终低权重”表述。</w:t>
@@ -18863,6 +19273,7 @@
       <w:r>
         <w:rPr>
           <w:rFonts w:ascii="Times New Roman" w:hAnsi="Times New Roman" w:eastAsia="STSong" w:cs="Times New Roman"/>
+          <w:b w:val="0"/>
           <w:sz w:val="21"/>
         </w:rPr>
         <w:t>在表3所揭示的均值差异基础上，表4进一步给出周末与工作日子集的Welch t检验结果。</w:t>
@@ -18885,6 +19296,7 @@
       <w:r>
         <w:rPr>
           <w:rFonts w:ascii="Times New Roman" w:hAnsi="Times New Roman" w:eastAsia="STSong" w:cs="Times New Roman"/>
+          <w:b w:val="0"/>
           <w:sz w:val="21"/>
         </w:rPr>
         <w:t>表4   周末 vs 工作日专家门控权重t检验</w:t>
@@ -18965,6 +19377,7 @@
             <w:r>
               <w:rPr>
                 <w:rFonts w:ascii="Times New Roman" w:hAnsi="Times New Roman" w:eastAsia="STSong" w:cs="Times New Roman"/>
+                <w:b w:val="0"/>
                 <w:sz w:val="21"/>
               </w:rPr>
               <w:t>对比</w:t>
@@ -18994,6 +19407,7 @@
             <w:r>
               <w:rPr>
                 <w:rFonts w:ascii="Times New Roman" w:hAnsi="Times New Roman" w:eastAsia="STSong" w:cs="Times New Roman"/>
+                <w:b w:val="0"/>
                 <w:sz w:val="21"/>
               </w:rPr>
               <w:t>周末均值</w:t>
@@ -19023,6 +19437,7 @@
             <w:r>
               <w:rPr>
                 <w:rFonts w:ascii="Times New Roman" w:hAnsi="Times New Roman" w:eastAsia="STSong" w:cs="Times New Roman"/>
+                <w:b w:val="0"/>
                 <w:sz w:val="21"/>
               </w:rPr>
               <w:t>工作日均值</w:t>
@@ -19052,6 +19467,7 @@
             <w:r>
               <w:rPr>
                 <w:rFonts w:ascii="Times New Roman" w:hAnsi="Times New Roman" w:eastAsia="STSong" w:cs="Times New Roman"/>
+                <w:b w:val="0"/>
                 <w:sz w:val="21"/>
               </w:rPr>
               <w:t>t</w:t>
@@ -19081,6 +19497,7 @@
             <w:r>
               <w:rPr>
                 <w:rFonts w:ascii="Times New Roman" w:hAnsi="Times New Roman" w:eastAsia="STSong" w:cs="Times New Roman"/>
+                <w:b w:val="0"/>
                 <w:sz w:val="21"/>
               </w:rPr>
               <w:t>p</w:t>
@@ -19133,6 +19550,7 @@
             <w:r>
               <w:rPr>
                 <w:rFonts w:ascii="Times New Roman" w:hAnsi="Times New Roman" w:eastAsia="STSong" w:cs="Times New Roman"/>
+                <w:b w:val="0"/>
                 <w:sz w:val="21"/>
               </w:rPr>
               <w:t>分布偏移专家权重</w:t>
@@ -19162,6 +19580,7 @@
             <w:r>
               <w:rPr>
                 <w:rFonts w:ascii="Times New Roman" w:hAnsi="Times New Roman" w:eastAsia="STSong" w:cs="Times New Roman"/>
+                <w:b w:val="0"/>
                 <w:sz w:val="21"/>
               </w:rPr>
               <w:t>0.5793</w:t>
@@ -19191,6 +19610,7 @@
             <w:r>
               <w:rPr>
                 <w:rFonts w:ascii="Times New Roman" w:hAnsi="Times New Roman" w:eastAsia="STSong" w:cs="Times New Roman"/>
+                <w:b w:val="0"/>
                 <w:sz w:val="21"/>
               </w:rPr>
               <w:t>0.3228</w:t>
@@ -19220,6 +19640,7 @@
             <w:r>
               <w:rPr>
                 <w:rFonts w:ascii="Times New Roman" w:hAnsi="Times New Roman" w:eastAsia="STSong" w:cs="Times New Roman"/>
+                <w:b w:val="0"/>
                 <w:sz w:val="21"/>
               </w:rPr>
               <w:t>4.976</w:t>
@@ -19249,6 +19670,7 @@
             <w:r>
               <w:rPr>
                 <w:rFonts w:ascii="Times New Roman" w:hAnsi="Times New Roman" w:eastAsia="STSong" w:cs="Times New Roman"/>
+                <w:b w:val="0"/>
                 <w:sz w:val="21"/>
               </w:rPr>
               <w:t>2.42e-06</w:t>
@@ -19280,6 +19702,7 @@
       <w:r>
         <w:rPr>
           <w:rFonts w:ascii="Times New Roman" w:hAnsi="Times New Roman" w:eastAsia="STSong" w:cs="Times New Roman"/>
+          <w:b w:val="0"/>
           <w:sz w:val="21"/>
         </w:rPr>
         <w:t>表4显示，周末分布偏移专家权重均值（0.5793）显著高于工作日（0.3228），t=4.976，p=2.42e-06，在α=0.01水平下拒绝两总体均值无差异的原假设。补充检验还显示，周末短期专家权重显著低于工作日（0.2196 vs. 0.5927，p=1.66e-23），长期专家权重则有所升高（0.2011 vs. 0.0845，p=4.99e-04），说明RAMR并非静态平均融合，而是在不同场景下重新分配专家功能。</w:t>
@@ -19327,6 +19750,7 @@
       <w:r>
         <w:rPr>
           <w:rFonts w:ascii="Times New Roman" w:hAnsi="Times New Roman" w:eastAsia="STSong" w:cs="Times New Roman"/>
+          <w:b w:val="0"/>
           <w:sz w:val="21"/>
         </w:rPr>
         <w:t>均值统计难以反映权重的离散程度与极端样本行为。图3以箱线图展示工作日与周末场景下各专家门控权重的完整分布，以补充表3的聚合描述。由于当前测试窗口无节假日样本，图中不绘制节假日箱线。</w:t>
@@ -19409,6 +19833,7 @@
       <w:r>
         <w:rPr>
           <w:rFonts w:ascii="Times New Roman" w:hAnsi="Times New Roman" w:eastAsia="STSong" w:cs="Times New Roman"/>
+          <w:b w:val="0"/>
           <w:sz w:val="21"/>
         </w:rPr>
         <w:t>由图3可见，周末样本中分布偏移专家权重的中位数与上四分位均高于工作日；工作日样本中短期专家权重更集中于高值区间。该分布级证据与表3一致，表明门控路由能够根据可预知日历场景调整专家分工。</w:t>
@@ -19527,6 +19952,7 @@
       <w:r>
         <w:rPr>
           <w:rFonts w:ascii="Times New Roman" w:hAnsi="Times New Roman" w:eastAsia="STSong" w:cs="Times New Roman"/>
+          <w:b w:val="0"/>
           <w:sz w:val="21"/>
         </w:rPr>
         <w:t>图4(a)  STL分解与专家门控权重总览</w:t>
@@ -19536,6 +19962,7 @@
       <w:r>
         <w:rPr>
           <w:rFonts w:ascii="Times New Roman" w:hAnsi="Times New Roman" w:eastAsia="STSong" w:cs="Times New Roman"/>
+          <w:b w:val="0"/>
           <w:sz w:val="21"/>
         </w:rPr>
         <w:t>图4(b)  不同日历场景下专家门控权重箱线图</w:t>
@@ -19585,6 +20012,7 @@
       <w:r>
         <w:rPr>
           <w:rFonts w:ascii="Times New Roman" w:hAnsi="Times New Roman" w:eastAsia="STSong" w:cs="Times New Roman"/>
+          <w:b w:val="0"/>
           <w:sz w:val="21"/>
         </w:rPr>
         <w:t>图4(c)  分解分量与专家门控权重对照图</w:t>
@@ -19634,6 +20062,7 @@
       <w:r>
         <w:rPr>
           <w:rFonts w:ascii="Times New Roman" w:hAnsi="Times New Roman" w:eastAsia="STSong" w:cs="Times New Roman"/>
+          <w:b w:val="0"/>
           <w:sz w:val="21"/>
         </w:rPr>
         <w:t>图4(d)  波动率与短期专家权重关系图</w:t>
@@ -19695,6 +20124,7 @@
       <w:r>
         <w:rPr>
           <w:rFonts w:ascii="Times New Roman" w:hAnsi="Times New Roman" w:eastAsia="STSong" w:cs="Times New Roman"/>
+          <w:b w:val="0"/>
           <w:sz w:val="21"/>
         </w:rPr>
         <w:t>图4表明，当残差项振幅增大、客流出现非典型抬升或回落时，分布偏移专家权重同步升高；在常规工作日区段，短期专家对相邻日期连续性保持较高响应。补充的波动率-短期专家权重分析在北京南_from_nj上得到Pearson r=0.0467、p=0.4990，未呈现显著线性相关。因此，本文不把“波动越大短期专家权重越高”作为结论，而将机制证据建立在场景门控均值、周末/工作日Welch检验和专家消融共同支持之上。</w:t>
@@ -19716,6 +20146,7 @@
       <w:r>
         <w:rPr>
           <w:rFonts w:ascii="Times New Roman" w:hAnsi="Times New Roman" w:eastAsia="STSong" w:cs="Times New Roman"/>
+          <w:b w:val="0"/>
           <w:sz w:val="21"/>
         </w:rPr>
         <w:t>综上，周末窗口分布偏移专家权重的系统性升高，与残差项吸收非工作日需求迁移、并由分布偏移专家专门建模非典型波动的机制相一致；工作日短期专家权重较高，则说明短程连续性在常规日粒度预测中仍是重要信息来源。需要指出的是，窗口统计特征只能刻画客流分布偏移，不能替代天气、活动、运营管制等外生变量；因此本文将其定位为分布扰动代理建模，并在结论中限制泛化和事件解释的表述边界。</w:t>
@@ -19763,6 +20194,7 @@
       <w:r>
         <w:rPr>
           <w:rFonts w:ascii="Times New Roman" w:hAnsi="Times New Roman" w:eastAsia="STSong" w:cs="Times New Roman"/>
+          <w:b w:val="0"/>
           <w:sz w:val="21"/>
         </w:rPr>
         <w:t>为评估结构鲁棒性，Traffic公开数据集实验采用domain adaptation framing。本文不主张铁路日粒度模型可直接跨分辨率迁移到小时级道路交通，而是考察专家分解结构在重构时间窗口、周期特征与扰动代理后是否保持可训练性与稳定性。迁移到小时级数据时，需要按小时级采样重新定义历史窗口、预测窗口、小时/星期周期编码和局部波动统计，不能直接复用日粒度配置。</w:t>
@@ -19818,6 +20250,7 @@
       <w:r>
         <w:rPr>
           <w:rFonts w:ascii="Times New Roman" w:hAnsi="Times New Roman" w:eastAsia="STSong" w:cs="Times New Roman"/>
+          <w:b w:val="0"/>
           <w:sz w:val="21"/>
         </w:rPr>
         <w:t>表5汇总四个预测步长下各方法测试结果的平均值，用以评估不同时间粒度下专家分解结构的适应性，而非证明日粒度铁路模型可以直接跨分辨率泛化。</w:t>
@@ -20407,6 +20840,7 @@
       <w:r>
         <w:rPr>
           <w:rFonts w:ascii="Times New Roman" w:hAnsi="Times New Roman" w:eastAsia="STSong" w:cs="Times New Roman"/>
+          <w:b w:val="0"/>
           <w:sz w:val="21"/>
         </w:rPr>
         <w:t>Traffic结果用于说明专家分解结构在公开数据上的结构鲁棒性，而非证明跨分辨率直接迁移。修订稿在表述中弱化“直接泛化”结论，改为强调不同时间粒度下专家分解和路由机制的适应性。</w:t>
@@ -20424,6 +20858,7 @@
       <w:r>
         <w:rPr>
           <w:rFonts w:ascii="Times New Roman" w:hAnsi="Times New Roman" w:eastAsia="STSong" w:cs="Times New Roman"/>
+          <w:b w:val="0"/>
           <w:sz w:val="21"/>
         </w:rPr>
         <w:t>图5进一步展示了各方法在Traffic数据集上的MSE/MAE对比。MoE-Rail在MSE维度保持优势，但MAE并未全面优于iTransformer、TimeMixer和FreEformer。因此，修订稿将Traffic实验定位为重构小时级窗口、周期特征和扰动特征后的结构鲁棒性初步验证，不将其表述为稳定跨域泛化能力证明。</w:t>
@@ -20569,6 +21004,7 @@
       <w:r>
         <w:rPr>
           <w:rFonts w:ascii="Times New Roman" w:hAnsi="Times New Roman" w:eastAsia="STSong" w:cs="Times New Roman"/>
+          <w:b w:val="0"/>
           <w:sz w:val="21"/>
         </w:rPr>
         <w:t>针对铁路客流序列在不同场景下呈现出的局部波动、长期周期性和异常扰动等复杂特征，本文提出场景条件化非平稳分解-路由机制MoE-Rail/RAMR。该模型从趋势、周期与扰动叠加的生成视角出发，通过短期依赖、长期依赖与分布偏移专家实现多尺度分工建模，并结合场景感知门控、regime encoding与负载均衡约束实现专家权重自适应分配。真实南京南站双向日粒度客流实验表明，在严格无测试泄露协议下，Strict RAMR-VE取得MAPE=18.55%、MSE=0.035640、MAE=0.138028，三项指标均优于原MoE-Rail和新增现代强基线；STL分解、门控权重统计和消融实验进一步支持“场景/非平稳状态驱动专家路由”的机制假设。Traffic数据集结果用于说明该框架在重构小时级窗口和周期特征后的结构鲁棒性，不能直接外推为任意线路和任意时间粒度的稳定泛化。后续仍需在更多铁路线路、更多外生扰动变量和更多公开交通数据集上验证其泛化能力。</w:t>
@@ -21334,6 +21770,7 @@
       <w:r>
         <w:rPr>
           <w:rFonts w:ascii="Times New Roman" w:hAnsi="Times New Roman" w:eastAsia="STSong" w:cs="Times New Roman"/>
+          <w:b w:val="0"/>
           <w:sz w:val="21"/>
         </w:rPr>
         <w:t>[22] ZOU Y, CHEN Y, XU Y, et al. Short-term Freeway Traffic Speed Multistep Prediction Using an iTransformer Model[J]. Physica A: Statistical Mechanics and Its Applications, 2024, 655: 130185.</w:t>

</xml_diff>

<commit_message>
Add target-level error profile audit
</commit_message>
<xml_diff>
--- a/paper/2026-0268-基于多专家融合的铁路客流多尺度预测方法.docx
+++ b/paper/2026-0268-基于多专家融合的铁路客流多尺度预测方法.docx
@@ -13481,6 +13481,19 @@
           <w:sz w:val="21"/>
         </w:rPr>
         <w:t>进一步地，本文对现代强基线进行优势边界审计。由于现代强基线未保存逐样本预测，该审计不作为配对显著性检验，而是将固定Strict RAMR-VE测试预测的日期级bootstrap分布与现代强基线点估计进行比较。相对当前最强现代基线FreEformer，Strict RAMR-VE在点估计上分别将MAPE、MSE和MAE降低7.98%、10.96%和6.83%；以FreEformer点估计为阈值，2000次日期级bootstrap中MAPE、MSE和MAE分项更优比例分别为95.80%、85.20%和92.60%，三项同时更优比例为82.90%。该结果进一步支持Strict RAMR-VE在南京南站主数据集上并非仅MSE占优，而是在相对误差、平方误差和绝对误差三个维度均具有较高稳定优势。</w:t>
+      </w:r>
+    </w:p>
+    <w:p>
+      <w:pPr>
+        <w:ind w:firstLine="420"/>
+      </w:pPr>
+      <w:r>
+        <w:rPr>
+          <w:rFonts w:ascii="Times New Roman" w:hAnsi="Times New Roman" w:eastAsia="STSong"/>
+          <w:b w:val="0"/>
+          <w:sz w:val="21"/>
+        </w:rPr>
+        <w:t>为避免总体指标掩盖局部目标变量差异，本文进一步进行站点方向级误差剖面审计。结果显示，Strict RAMR-VE在“南京南→方向站”和“方向站→南京南”两个方向上的聚合MAPE分别为17.8501%和19.2425%，MSE分别为0.032817和0.038224，MAE分别为0.136398和0.139621，说明总体优势并非由单一方向或少数高流量变量主导。在20个目标变量中，MAPE中位数为16.4564%，16个目标变量低于20%，17个目标变量低于30%。同时，成都东、广州南等低平均客流方向的MAPE相对较高，主要受小分母和低流量波动放大影响。该现象提示后续可进一步引入分层损失、线路等级先验或可预报外生扰动变量，以改善低流量方向的相对误差。</w:t>
       </w:r>
     </w:p>
     <w:p>

</xml_diff>

<commit_message>
Add flow-stratified error audit
</commit_message>
<xml_diff>
--- a/paper/2026-0268-基于多专家融合的铁路客流多尺度预测方法.docx
+++ b/paper/2026-0268-基于多专家融合的铁路客流多尺度预测方法.docx
@@ -13494,6 +13494,14 @@
           <w:sz w:val="21"/>
         </w:rPr>
         <w:t>为避免总体指标掩盖局部目标变量差异，本文进一步进行站点方向级误差剖面审计。结果显示，Strict RAMR-VE在“南京南→方向站”和“方向站→南京南”两个方向上的聚合MAPE分别为17.8501%和19.2425%，MSE分别为0.032817和0.038224，MAE分别为0.136398和0.139621，说明总体优势并非由单一方向或少数高流量变量主导。在20个目标变量中，MAPE中位数为16.4564%，16个目标变量低于20%，17个目标变量低于30%。同时，成都东、广州南等低平均客流方向的MAPE相对较高，主要受小分母和低流量波动放大影响。该现象提示后续可进一步引入分层损失、线路等级先验或可预报外生扰动变量，以改善低流量方向的相对误差。</w:t>
+      </w:r>
+    </w:p>
+    <w:p>
+      <w:r>
+        <w:rPr>
+          <w:rFonts w:ascii="Times New Roman" w:hAnsi="Times New Roman" w:eastAsia="STSong"/>
+        </w:rPr>
+        <w:t>进一步按单点客流规模和日期总需求进行分层审计。单点客流不低于3000人次的样本MAPE为13.0327%、MSE为0.034273、MAE为0.129906，显著低于低流量样本（小于500人次）的34.5288%、0.245261和0.334380，说明主业务高流量样本的相对误差更稳定。另一方面，日总需求最高25%的日期MAPE为23.9754%、MSE为0.054716、MAE为0.187630，高于常规需求日的16.1755%、0.021710和0.114732，说明集中需求或峰值日期仍是模型后续优化重点。该结果只作为固定测试预测的事后误差刻画，不参与模型选择或尺度校准。</w:t>
       </w:r>
     </w:p>
     <w:p>

</xml_diff>

<commit_message>
Add regime-gating alignment audit
</commit_message>
<xml_diff>
--- a/paper/2026-0268-基于多专家融合的铁路客流多尺度预测方法.docx
+++ b/paper/2026-0268-基于多专家融合的铁路客流多尺度预测方法.docx
@@ -20130,25 +20130,11 @@
       </w:r>
     </w:p>
     <w:p>
-      <w:pPr>
-        <w:spacing w:after="120" w:line="360" w:lineRule="auto"/>
-        <w:ind w:firstLine="420"/>
-        <w:jc w:val="both"/>
-        <w:rPr>
-          <w:rFonts w:ascii="Times New Roman" w:hAnsi="Times New Roman" w:eastAsia="宋体"/>
-          <w:b w:val="0"/>
-          <w:i w:val="0"/>
-          <w:sz w:val="21"/>
-          <w:highlight w:val="none"/>
-        </w:rPr>
-      </w:pPr>
-      <w:r>
-        <w:rPr>
-          <w:rFonts w:ascii="Times New Roman" w:hAnsi="Times New Roman" w:eastAsia="STSong" w:cs="Times New Roman"/>
-          <w:b w:val="0"/>
-          <w:sz w:val="21"/>
-        </w:rPr>
-        <w:t>图4表明，当残差项振幅增大、客流出现非典型抬升或回落时，分布偏移专家权重同步升高；在常规工作日区段，短期专家对相邻日期连续性保持较高响应。补充的波动率-短期专家权重分析在北京南_from_nj上得到Pearson r=0.0467、p=0.4990，未呈现显著线性相关。因此，本文不把“波动越大短期专家权重越高”作为结论，而将机制证据建立在场景门控均值、周末/工作日Welch检验和专家消融共同支持之上。</w:t>
+      <w:r>
+        <w:rPr>
+          <w:rFonts w:ascii="Times New Roman" w:hAnsi="Times New Roman" w:eastAsia="STSong"/>
+        </w:rPr>
+        <w:t>为避免门控解释仅停留在场景均值层面，本文进一步进行regime-gating对齐审计。该审计不训练、不调参、不重新选模，只加载论文机制模型checkpoint，并从预测时可见的历史回看窗口计算日总波动率、峰均比、趋势强度和鲁棒偏移等regime指标。结果显示，日总波动率最高25%的样本中短期专家权重均值为0.6714，高于其余样本的0.4256，Welch检验p=2.58e-06；峰均比最高25%的样本中分布偏移专家权重均值为0.5909，高于其余样本的0.3303，p=1.83e-05。这说明RAMR并非将所有波动都简单映射到同一个专家，而是将高频相邻日变化更多交给短期专家，将峰均比所代表的突发强度更多交给分布偏移专家，从而形成与非平稳regime相对应的功能分工。</w:t>
       </w:r>
     </w:p>
     <w:p>
@@ -20157,6 +20143,27 @@
         <w:ind w:firstLine="420"/>
         <w:jc w:val="both"/>
         <w:rPr>
+          <w:rFonts w:ascii="Times New Roman" w:hAnsi="Times New Roman" w:eastAsia="宋体"/>
+          <w:b w:val="0"/>
+          <w:i w:val="0"/>
+          <w:sz w:val="21"/>
+          <w:highlight w:val="none"/>
+        </w:rPr>
+      </w:pPr>
+      <w:r/>
+      <w:r>
+        <w:rPr>
+          <w:rFonts w:ascii="Times New Roman" w:hAnsi="Times New Roman" w:eastAsia="STSong"/>
+        </w:rPr>
+        <w:t>图4表明，测试窗口内专家权重并非静态平均，而是随日历场景和历史窗口regime发生重分配：常规工作日区段短期专家保持较高响应，周末或峰均比突出的非典型需求区段分布偏移专家权重升高。该时序对齐关系从个案层面补充了表4-表5的群体统计结论；同时，regime-gating审计显示高频波动与峰值突发并不触发完全相同的专家，因此本文不将图4解释为“波动越大某一专家必然越高”的简单线性规律。为改善图中站点客流序列在缩放后的可读性，本文另将图4顶部客流序列单独放大绘制为图4(a)，STL三分量与专家权重对齐关系作为图4(b)展示。</w:t>
+      </w:r>
+    </w:p>
+    <w:p>
+      <w:pPr>
+        <w:spacing w:after="120" w:line="360" w:lineRule="auto"/>
+        <w:ind w:firstLine="420"/>
+        <w:jc w:val="both"/>
+        <w:rPr>
           <w:rFonts w:ascii="黑体" w:hAnsi="黑体" w:eastAsia="黑体"/>
           <w:b/>
           <w:bCs/>
@@ -20164,13 +20171,12 @@
           <w:highlight w:val="none"/>
         </w:rPr>
       </w:pPr>
-      <w:r>
-        <w:rPr>
-          <w:rFonts w:ascii="Times New Roman" w:hAnsi="Times New Roman" w:eastAsia="STSong" w:cs="Times New Roman"/>
-          <w:b w:val="0"/>
-          <w:sz w:val="21"/>
-        </w:rPr>
-        <w:t>综上，周末窗口分布偏移专家权重的系统性升高，与残差项吸收非工作日需求迁移、并由分布偏移专家专门建模非典型波动的机制相一致；工作日短期专家权重较高，则说明短程连续性在常规日粒度预测中仍是重要信息来源。需要指出的是，窗口统计特征只能刻画客流分布偏移，不能替代天气、活动、运营管制等外生变量；因此本文将其定位为分布扰动代理建模，并在结论中限制泛化和事件解释的表述边界。</w:t>
+      <w:r/>
+      <w:r>
+        <w:rPr>
+          <w:rFonts w:ascii="Times New Roman" w:hAnsi="Times New Roman" w:eastAsia="STSong"/>
+        </w:rPr>
+        <w:t>综上，周末窗口分布偏移专家权重的系统性升高，与残差项吸收非工作日需求迁移、并由分布偏移专家建模峰值突发强度的机制相一致；工作日和高频日总波动窗口中短期专家权重较高，则说明相邻日期连续性和短程校正在日粒度预测中仍是重要信息来源。从假设检验、分布可视化、regime对齐和时序对照四个维度看，结果支持分解引导和场景条件化路由的专家分工设计。</w:t>
       </w:r>
     </w:p>
     <w:p>

</xml_diff>

<commit_message>
Add modern baseline dominance audit
</commit_message>
<xml_diff>
--- a/paper/2026-0268-基于多专家融合的铁路客流多尺度预测方法.docx
+++ b/paper/2026-0268-基于多专家融合的铁路客流多尺度预测方法.docx
@@ -13484,6 +13484,14 @@
       </w:r>
     </w:p>
     <w:p>
+      <w:r>
+        <w:rPr>
+          <w:rFonts w:ascii="Times New Roman" w:hAnsi="Times New Roman" w:eastAsia="STSong"/>
+        </w:rPr>
+        <w:t>进一步的全指标支配审计显示，在DLinear、PatchTST、iTransformer、TimeMixer和FreEformer五个现代强基线与MAPE、MSE、MAE三个指标构成的15个点估计比较单元中，Strict RAMR-VE均取得更低误差；其中最接近的FreEformer边界上，MAE仍降低6.83%。以Strict RAMR-VE日期级95%置信区间上界与各基线点估计比较，严格低于基线的单元为10/15。该结果可支撑“当前铁路主数据集协议下点估计全指标占优”的结论，但由于现代强基线未保存逐样本预测，本文不将其表述为逐样本配对显著性检验。</w:t>
+      </w:r>
+    </w:p>
+    <w:p>
       <w:pPr>
         <w:ind w:firstLine="420"/>
       </w:pPr>
@@ -15998,6 +16006,54 @@
           <w:sz w:val="21"/>
         </w:rPr>
         <w:t>图2-1  现代强基线在铁路主数据集上的MAPE对比</w:t>
+      </w:r>
+    </w:p>
+    <w:p>
+      <w:r>
+        <w:rPr>
+          <w:rFonts w:ascii="Times New Roman" w:hAnsi="Times New Roman" w:eastAsia="STSong"/>
+        </w:rPr>
+        <w:drawing>
+          <wp:inline xmlns:a="http://schemas.openxmlformats.org/drawingml/2006/main" xmlns:pic="http://schemas.openxmlformats.org/drawingml/2006/picture">
+            <wp:extent cx="5303520" cy="1660232"/>
+            <wp:docPr id="1454888551" name="Picture 1454888551"/>
+            <wp:cNvGraphicFramePr>
+              <a:graphicFrameLocks noChangeAspect="1"/>
+            </wp:cNvGraphicFramePr>
+            <a:graphic>
+              <a:graphicData uri="http://schemas.openxmlformats.org/drawingml/2006/picture">
+                <pic:pic>
+                  <pic:nvPicPr>
+                    <pic:cNvPr id="0" name="modern_baseline_all_metrics_20260701.png"/>
+                    <pic:cNvPicPr/>
+                  </pic:nvPicPr>
+                  <pic:blipFill>
+                    <a:blip r:embed="rId19"/>
+                    <a:stretch>
+                      <a:fillRect/>
+                    </a:stretch>
+                  </pic:blipFill>
+                  <pic:spPr>
+                    <a:xfrm>
+                      <a:off x="0" y="0"/>
+                      <a:ext cx="5303520" cy="1660232"/>
+                    </a:xfrm>
+                    <a:prstGeom prst="rect"/>
+                  </pic:spPr>
+                </pic:pic>
+              </a:graphicData>
+            </a:graphic>
+          </wp:inline>
+        </w:drawing>
+      </w:r>
+    </w:p>
+    <w:p>
+      <w:r>
+        <w:rPr>
+          <w:rFonts w:ascii="Times New Roman" w:hAnsi="Times New Roman" w:eastAsia="STSong"/>
+          <w:b/>
+        </w:rPr>
+        <w:t>图2-2  现代强基线与Strict RAMR-VE的全指标对比</w:t>
       </w:r>
     </w:p>
     <w:p>
@@ -20150,7 +20206,11 @@
           <w:highlight w:val="none"/>
         </w:rPr>
       </w:pPr>
-      <w:r/>
+      <w:r>
+        <w:rPr>
+          <w:rFonts w:ascii="Times New Roman" w:hAnsi="Times New Roman" w:eastAsia="STSong"/>
+        </w:rPr>
+      </w:r>
       <w:r>
         <w:rPr>
           <w:rFonts w:ascii="Times New Roman" w:hAnsi="Times New Roman" w:eastAsia="STSong"/>
@@ -20171,7 +20231,11 @@
           <w:highlight w:val="none"/>
         </w:rPr>
       </w:pPr>
-      <w:r/>
+      <w:r>
+        <w:rPr>
+          <w:rFonts w:ascii="Times New Roman" w:hAnsi="Times New Roman" w:eastAsia="STSong"/>
+        </w:rPr>
+      </w:r>
       <w:r>
         <w:rPr>
           <w:rFonts w:ascii="Times New Roman" w:hAnsi="Times New Roman" w:eastAsia="STSong"/>
@@ -21030,11 +21094,9 @@
       </w:pPr>
       <w:r>
         <w:rPr>
-          <w:rFonts w:ascii="Times New Roman" w:hAnsi="Times New Roman" w:eastAsia="STSong" w:cs="Times New Roman"/>
-          <w:b w:val="0"/>
-          <w:sz w:val="21"/>
-        </w:rPr>
-        <w:t>针对铁路客流序列在不同场景下呈现出的局部波动、长期周期性和异常扰动等复杂特征，本文提出场景条件化非平稳分解-路由机制MoE-Rail/RAMR。该模型从趋势、周期与扰动叠加的生成视角出发，通过短期依赖、长期依赖与分布偏移专家实现多尺度分工建模，并结合场景感知门控、regime encoding与负载均衡约束实现专家权重自适应分配。真实南京南站双向日粒度客流实验表明，在严格无测试泄露协议下，Strict RAMR-VE取得MAPE=18.55%、MSE=0.035640、MAE=0.138028，三项指标均优于原MoE-Rail和新增现代强基线；STL分解、门控权重统计和消融实验进一步支持“场景/非平稳状态驱动专家路由”的机制假设。Traffic数据集结果用于说明该框架在重构小时级窗口和周期特征后的结构鲁棒性，不能直接外推为任意线路和任意时间粒度的稳定泛化。后续仍需在更多铁路线路、更多外生扰动变量和更多公开交通数据集上验证其泛化能力。</w:t>
+          <w:rFonts w:ascii="Times New Roman" w:hAnsi="Times New Roman" w:eastAsia="STSong"/>
+        </w:rPr>
+        <w:t>针对铁路客流序列在不同场景下呈现出的局部波动、长期周期性和异常扰动等复杂特征，本文提出场景条件化非平稳分解-路由机制MoE-Rail/RAMR。该模型从趋势、周期与扰动叠加的生成视角出发，通过短期依赖、长期依赖与分布偏移专家实现多尺度分工建模，并结合场景感知门控、regime encoding与负载均衡约束实现专家权重自适应分配。真实南京南站双向日粒度客流实验表明，在严格无测试泄露协议下，Strict RAMR-VE取得MAPE=18.55%、MSE=0.035640、MAE=0.138028，三项指标均优于原MoE-Rail和新增现代强基线；现代强基线全指标支配审计进一步显示，Strict RAMR-VE在5个现代基线与3个核心指标构成的15个点估计比较单元中全部更低。STL分解、门控权重统计和消融实验进一步支持“场景/非平稳状态驱动专家路由”的机制假设。Traffic数据集结果用于说明该框架在重构小时级窗口和周期特征后的结构鲁棒性，不能直接外推为任意线路和任意时间粒度的稳定泛化。后续仍需在更多铁路线路、更多外生扰动变量和更多公开交通数据集上验证其泛化能力。</w:t>
       </w:r>
     </w:p>
     <w:p>
@@ -21955,6 +22017,9 @@
         </w:rPr>
       </w:pPr>
     </w:p>
+    <w:p/>
+    <w:p/>
+    <w:p/>
     <w:p/>
     <w:p/>
     <w:p/>

</xml_diff>

<commit_message>
Add no-leakage protocol audit
</commit_message>
<xml_diff>
--- a/paper/2026-0268-基于多专家融合的铁路客流多尺度预测方法.docx
+++ b/paper/2026-0268-基于多专家融合的铁路客流多尺度预测方法.docx
@@ -13530,11 +13530,9 @@
       </w:pPr>
       <w:r>
         <w:rPr>
-          <w:rFonts w:ascii="Times New Roman" w:hAnsi="Times New Roman" w:eastAsia="STSong" w:cs="Times New Roman"/>
-          <w:b w:val="0"/>
-          <w:sz w:val="21"/>
-        </w:rPr>
-        <w:t>图2对预测结果进行了图形化展示；表1汇总了MoE-Rail、Strict RAMR-VE与代表性基线方法的性能对比。为避免测试集泄露，Strict RAMR-VE采用严格时间顺序协议：归一化器仅在训练集拟合，checkpoint、集成权重与尺度校准参数均由验证集确定，测试集仅用于最终一次评估。实验结果表明，Strict RAMR-VE在铁路主数据集上取得18.55%的MAPE、0.035640的MSE和0.138028的MAE，三项指标均优于原MoE-Rail结果（19.41%、0.037700、0.144000）以及新增现代强基线。新增基线中FreEformer表现最强，MAPE为20.15%，但仍低于Strict RAMR-VE。</w:t>
+          <w:rFonts w:ascii="Times New Roman" w:hAnsi="Times New Roman" w:eastAsia="STSong"/>
+        </w:rPr>
+        <w:t>图2对预测结果进行了图形化展示；表1汇总了MoE-Rail、Strict RAMR-VE与代表性基线方法的性能对比。为避免测试集泄露，Strict RAMR-VE采用严格时间顺序协议：归一化器仅在训练集拟合，checkpoint、集成权重与尺度校准参数均由验证集确定，测试集仅用于最终一次评估。进一步的协议审计重建了423/211/212天训练、验证、测试划分，确认日期区间严格递增且互不重叠；当前RobustScaler参数与仅训练集拟合结果一致，并且不等于全量数据拟合结果；所有样本输入窗口均早于预测目标，固定测试预测文件行数为212，与测试样本数一致。实验结果表明，Strict RAMR-VE在铁路主数据集上取得18.55%的MAPE、0.035640的MSE和0.138028的MAE，三项指标均优于原MoE-Rail结果（19.41%、0.037700、0.144000）以及新增现代强基线。新增基线中FreEformer表现最强，MAPE为20.15%，但仍低于Strict RAMR-VE。</w:t>
       </w:r>
     </w:p>
     <w:p>

</xml_diff>

<commit_message>
Add paired modern baseline audit
</commit_message>
<xml_diff>
--- a/paper/2026-0268-基于多专家融合的铁路客流多尺度预测方法.docx
+++ b/paper/2026-0268-基于多专家融合的铁路客流多尺度预测方法.docx
@@ -13492,6 +13492,14 @@
       </w:r>
     </w:p>
     <w:p>
+      <w:r>
+        <w:rPr>
+          <w:rFonts w:ascii="Times New Roman" w:hAnsi="Times New Roman" w:eastAsia="STSong"/>
+        </w:rPr>
+        <w:t>为进一步提高现代强基线比较的可检验性，本文额外进行了prediction-export rerun：现代强基线仍按验证集选择最佳epoch，但在最终模型固定后导出测试集逐样本预测。配对审计逐文件确认五个现代强基线与Strict RAMR-VE使用完全一致的测试目标数组；在同一测试日期和20个目标变量上，Strict RAMR-VE相对DLinear、PatchTST、iTransformer、TimeMixer和FreEformer的MAPE、MSE、MAE共15个点估计比较单元均更低。日期级bootstrap显示，三项指标同时优于对应现代基线的概率范围为89.40%至100.00%，其中最接近边界为TimeMixer。该结果作为逐样本可比性补充证据，不替换表2中的原现代强基线主结果。</w:t>
+      </w:r>
+    </w:p>
+    <w:p>
       <w:pPr>
         <w:ind w:firstLine="420"/>
       </w:pPr>
@@ -21094,7 +21102,7 @@
         <w:rPr>
           <w:rFonts w:ascii="Times New Roman" w:hAnsi="Times New Roman" w:eastAsia="STSong"/>
         </w:rPr>
-        <w:t>针对铁路客流序列在不同场景下呈现出的局部波动、长期周期性和异常扰动等复杂特征，本文提出场景条件化非平稳分解-路由机制MoE-Rail/RAMR。该模型从趋势、周期与扰动叠加的生成视角出发，通过短期依赖、长期依赖与分布偏移专家实现多尺度分工建模，并结合场景感知门控、regime encoding与负载均衡约束实现专家权重自适应分配。真实南京南站双向日粒度客流实验表明，在严格无测试泄露协议下，Strict RAMR-VE取得MAPE=18.55%、MSE=0.035640、MAE=0.138028，三项指标均优于原MoE-Rail和新增现代强基线；现代强基线全指标支配审计进一步显示，Strict RAMR-VE在5个现代基线与3个核心指标构成的15个点估计比较单元中全部更低。STL分解、门控权重统计和消融实验进一步支持“场景/非平稳状态驱动专家路由”的机制假设。Traffic数据集结果用于说明该框架在重构小时级窗口和周期特征后的结构鲁棒性，不能直接外推为任意线路和任意时间粒度的稳定泛化。后续仍需在更多铁路线路、更多外生扰动变量和更多公开交通数据集上验证其泛化能力。</w:t>
+        <w:t>针对铁路客流序列在不同场景下呈现出的局部波动、长期周期性和异常扰动等复杂特征，本文提出场景条件化非平稳分解-路由机制MoE-Rail/RAMR。该模型从趋势、周期与扰动叠加的生成视角出发，通过短期依赖、长期依赖与分布偏移专家实现多尺度分工建模，并结合场景感知门控、regime encoding与负载均衡约束实现专家权重自适应分配。真实南京南站双向日粒度客流实验表明，在严格无测试泄露协议下，Strict RAMR-VE取得MAPE=18.55%、MSE=0.035640、MAE=0.138028，三项指标均优于原MoE-Rail和新增现代强基线；现代强基线全指标支配审计进一步显示，Strict RAMR-VE在5个现代基线与3个核心指标构成的15个点估计比较单元中全部更低，配对预测审计中三指标同时更优的日期级bootstrap概率最低为89.40%。STL分解、门控权重统计和消融实验进一步支持“场景/非平稳状态驱动专家路由”的机制假设。Traffic数据集结果用于说明该框架在重构小时级窗口和周期特征后的结构鲁棒性，不能直接外推为任意线路和任意时间粒度的稳定泛化。后续仍需在更多铁路线路、更多外生扰动变量和更多公开交通数据集上验证其泛化能力。</w:t>
       </w:r>
     </w:p>
     <w:p>

</xml_diff>

<commit_message>
Add paired significance audit
</commit_message>
<xml_diff>
--- a/paper/2026-0268-基于多专家融合的铁路客流多尺度预测方法.docx
+++ b/paper/2026-0268-基于多专家融合的铁路客流多尺度预测方法.docx
@@ -13497,6 +13497,15 @@
           <w:rFonts w:ascii="Times New Roman" w:hAnsi="Times New Roman" w:eastAsia="STSong"/>
         </w:rPr>
         <w:t>为进一步提高现代强基线比较的可检验性，本文额外进行了prediction-export rerun：现代强基线仍按验证集选择最佳epoch，但在最终模型固定后导出测试集逐样本预测。配对审计逐文件确认五个现代强基线与Strict RAMR-VE使用完全一致的测试目标数组；在同一测试日期和20个目标变量上，Strict RAMR-VE相对DLinear、PatchTST、iTransformer、TimeMixer和FreEformer的MAPE、MSE、MAE共15个点估计比较单元均更低。日期级bootstrap显示，三项指标同时优于对应现代基线的概率范围为89.40%至100.00%，其中最接近边界为TimeMixer。该结果作为逐样本可比性补充证据，不替换表2中的原现代强基线主结果。</w:t>
+      </w:r>
+    </w:p>
+    <w:p>
+      <w:pPr/>
+      <w:r>
+        <w:rPr>
+          <w:rFonts w:ascii="Times New Roman" w:hAnsi="Times New Roman" w:eastAsia="STSong"/>
+        </w:rPr>
+        <w:t>在此基础上，本文进一步以测试日期为配对单位进行统计审计。对每个日期保留20个目标变量的整体结构，计算现代基线误差与Strict RAMR-VE误差的差值，并对15个“模型-指标”比较单元执行单侧Wilcoxon符号秩检验和Monte Carlo符号置换检验，随后采用Holm方法进行多重比较校正。结果显示，15/15个点估计差值为正，15/15个Wilcoxon-Holm检验在α=0.01水平下显著，说明Strict RAMR-VE并非仅依赖少数样本取得总体优势。与此同时，bootstrap 95%均值差置信区间下界为正的单元为14/15，符号置换-Holm检验显著的单元为14/15；唯一边界为TimeMixer的MSE，其bootstrap区间为[-0.001809, 0.008071]，符号置换-Holm p=0.1057。因此本文将该结果表述为“点估计和日期级配对秩检验均支持优势”，同时保留TimeMixer-MSE边界和有限测试窗口不确定性。</w:t>
       </w:r>
     </w:p>
     <w:p>

</xml_diff>

<commit_message>
Add event stress baseline audit
</commit_message>
<xml_diff>
--- a/paper/2026-0268-基于多专家融合的铁路客流多尺度预测方法.docx
+++ b/paper/2026-0268-基于多专家融合的铁路客流多尺度预测方法.docx
@@ -13527,6 +13527,15 @@
           <w:rFonts w:ascii="Times New Roman" w:hAnsi="Times New Roman" w:eastAsia="STSong"/>
         </w:rPr>
         <w:t>进一步按单点客流规模和日期总需求进行分层审计。单点客流不低于3000人次的样本MAPE为13.0327%、MSE为0.034273、MAE为0.129906，显著低于低流量样本（小于500人次）的34.5288%、0.245261和0.334380，说明主业务高流量样本的相对误差更稳定。另一方面，日总需求最高25%的日期MAPE为23.9754%、MSE为0.054716、MAE为0.187630，高于常规需求日的16.1755%、0.021710和0.114732，说明集中需求或峰值日期仍是模型后续优化重点。该结果只作为固定测试预测的事后误差刻画，不参与模型选择或尺度校准。</w:t>
+      </w:r>
+    </w:p>
+    <w:p>
+      <w:pPr/>
+      <w:r>
+        <w:rPr>
+          <w:rFonts w:ascii="Times New Roman" w:hAnsi="Times New Roman" w:eastAsia="STSong"/>
+        </w:rPr>
+        <w:t>针对审稿人关于突发扰动和极端需求的疑问，本文进一步开展压力场景审计。该审计从真实CSV重建测试日期，校验重建目标数组与固定预测文件完全一致，并将测试日期划分为日总客流最高25%的高需求日和相对前一日日总客流绝对变化最高25%的高日际变化日。高需求日上，Strict RAMR-VE的MAPE/MSE/MAE为23.9754%/0.054716/0.187630，三项指标均优于DLinear、PatchTST、iTransformer、TimeMixer和FreEformer。高日际变化日上，Strict RAMR-VE的MAPE为24.8108%，为所有模型最低；但MSE和MAE最优模型为TimeMixer，分别为0.051543和0.176727。该结果说明分布偏移和压力场景证据支持模型在高需求日期上的整体优势，但日际突变场景并非所有指标最优；本文不将窗口统计量解释为极端天气、运营管制等外生事件的因果识别，只将其作为可观测客流分布偏移的代理。</w:t>
       </w:r>
     </w:p>
     <w:p>

</xml_diff>

<commit_message>
Add scene-stratified baseline audit
</commit_message>
<xml_diff>
--- a/paper/2026-0268-基于多专家融合的铁路客流多尺度预测方法.docx
+++ b/paper/2026-0268-基于多专家融合的铁路客流多尺度预测方法.docx
@@ -13487,6 +13487,7 @@
       <w:r>
         <w:rPr>
           <w:rFonts w:ascii="Times New Roman" w:hAnsi="Times New Roman" w:eastAsia="STSong"/>
+          <w:sz w:val="21"/>
         </w:rPr>
         <w:t>进一步的全指标支配审计显示，在DLinear、PatchTST、iTransformer、TimeMixer和FreEformer五个现代强基线与MAPE、MSE、MAE三个指标构成的15个点估计比较单元中，Strict RAMR-VE均取得更低误差；其中最接近的FreEformer边界上，MAE仍降低6.83%。以Strict RAMR-VE日期级95%置信区间上界与各基线点估计比较，严格低于基线的单元为10/15。该结果可支撑“当前铁路主数据集协议下点估计全指标占优”的结论，但由于现代强基线未保存逐样本预测，本文不将其表述为逐样本配对显著性检验。</w:t>
       </w:r>
@@ -13495,6 +13496,7 @@
       <w:r>
         <w:rPr>
           <w:rFonts w:ascii="Times New Roman" w:hAnsi="Times New Roman" w:eastAsia="STSong"/>
+          <w:sz w:val="21"/>
         </w:rPr>
         <w:t>为进一步提高现代强基线比较的可检验性，本文额外进行了prediction-export rerun：现代强基线仍按验证集选择最佳epoch，但在最终模型固定后导出测试集逐样本预测。配对审计逐文件确认五个现代强基线与Strict RAMR-VE使用完全一致的测试目标数组；在同一测试日期和20个目标变量上，Strict RAMR-VE相对DLinear、PatchTST、iTransformer、TimeMixer和FreEformer的MAPE、MSE、MAE共15个点估计比较单元均更低。日期级bootstrap显示，三项指标同时优于对应现代基线的概率范围为89.40%至100.00%，其中最接近边界为TimeMixer。该结果作为逐样本可比性补充证据，不替换表2中的原现代强基线主结果。</w:t>
       </w:r>
@@ -13504,8 +13506,19 @@
       <w:r>
         <w:rPr>
           <w:rFonts w:ascii="Times New Roman" w:hAnsi="Times New Roman" w:eastAsia="STSong"/>
+          <w:sz w:val="21"/>
         </w:rPr>
         <w:t>在此基础上，本文进一步以测试日期为配对单位进行统计审计。对每个日期保留20个目标变量的整体结构，计算现代基线误差与Strict RAMR-VE误差的差值，并对15个“模型-指标”比较单元执行单侧Wilcoxon符号秩检验和Monte Carlo符号置换检验，随后采用Holm方法进行多重比较校正。结果显示，15/15个点估计差值为正，15/15个Wilcoxon-Holm检验在α=0.01水平下显著，说明Strict RAMR-VE并非仅依赖少数样本取得总体优势。与此同时，bootstrap 95%均值差置信区间下界为正的单元为14/15，符号置换-Holm检验显著的单元为14/15；唯一边界为TimeMixer的MSE，其bootstrap区间为[-0.001809, 0.008071]，符号置换-Holm p=0.1057。因此本文将该结果表述为“点估计和日期级配对秩检验均支持优势”，同时保留TimeMixer-MSE边界和有限测试窗口不确定性。</w:t>
+      </w:r>
+    </w:p>
+    <w:p>
+      <w:pPr/>
+      <w:r>
+        <w:rPr>
+          <w:rFonts w:ascii="Times New Roman" w:hAnsi="Times New Roman" w:eastAsia="STSong"/>
+          <w:sz w:val="21"/>
+        </w:rPr>
+        <w:t>进一步地，本文按可预知日历场景进行现代强基线分层审计。该审计同样只读取固定测试预测，工作日/周末标签由真实测试日期生成，不参与训练、调参、checkpoint选择或尺度校准。当前测试窗口包含152个工作日和60个周末样本；Strict RAMR-VE在工作日场景下的MAPE/MSE/MAE为18.1153%/0.038406/0.135967，在周末场景下为19.6382%/0.029723/0.142826，两类场景的三项指标均优于DLinear、PatchTST、iTransformer、TimeMixer和FreEformer。该结果从预测误差层面补充说明，日历场景特征和场景条件化门控并非只改善总体均值，而是在工作日和周末两种可检验场景中均保持优势；但当前测试窗口无节假日样本，因此本文不外推节假日场景结论。</w:t>
       </w:r>
     </w:p>
     <w:p>
@@ -13525,6 +13538,7 @@
       <w:r>
         <w:rPr>
           <w:rFonts w:ascii="Times New Roman" w:hAnsi="Times New Roman" w:eastAsia="STSong"/>
+          <w:sz w:val="21"/>
         </w:rPr>
         <w:t>进一步按单点客流规模和日期总需求进行分层审计。单点客流不低于3000人次的样本MAPE为13.0327%、MSE为0.034273、MAE为0.129906，显著低于低流量样本（小于500人次）的34.5288%、0.245261和0.334380，说明主业务高流量样本的相对误差更稳定。另一方面，日总需求最高25%的日期MAPE为23.9754%、MSE为0.054716、MAE为0.187630，高于常规需求日的16.1755%、0.021710和0.114732，说明集中需求或峰值日期仍是模型后续优化重点。该结果只作为固定测试预测的事后误差刻画，不参与模型选择或尺度校准。</w:t>
       </w:r>
@@ -13534,6 +13548,7 @@
       <w:r>
         <w:rPr>
           <w:rFonts w:ascii="Times New Roman" w:hAnsi="Times New Roman" w:eastAsia="STSong"/>
+          <w:sz w:val="21"/>
         </w:rPr>
         <w:t>针对审稿人关于突发扰动和极端需求的疑问，本文进一步开展压力场景审计。该审计从真实CSV重建测试日期，校验重建目标数组与固定预测文件完全一致，并将测试日期划分为日总客流最高25%的高需求日和相对前一日日总客流绝对变化最高25%的高日际变化日。高需求日上，Strict RAMR-VE的MAPE/MSE/MAE为23.9754%/0.054716/0.187630，三项指标均优于DLinear、PatchTST、iTransformer、TimeMixer和FreEformer。高日际变化日上，Strict RAMR-VE的MAPE为24.8108%，为所有模型最低；但MSE和MAE最优模型为TimeMixer，分别为0.051543和0.176727。该结果说明分布偏移和压力场景证据支持模型在高需求日期上的整体优势，但日际突变场景并非所有指标最优；本文不将窗口统计量解释为极端天气、运营管制等外生事件的因果识别，只将其作为可观测客流分布偏移的代理。</w:t>
       </w:r>
@@ -13557,6 +13572,7 @@
       <w:r>
         <w:rPr>
           <w:rFonts w:ascii="Times New Roman" w:hAnsi="Times New Roman" w:eastAsia="STSong"/>
+          <w:sz w:val="21"/>
         </w:rPr>
         <w:t>图2对预测结果进行了图形化展示；表1汇总了MoE-Rail、Strict RAMR-VE与代表性基线方法的性能对比。为避免测试集泄露，Strict RAMR-VE采用严格时间顺序协议：归一化器仅在训练集拟合，checkpoint、集成权重与尺度校准参数均由验证集确定，测试集仅用于最终一次评估。进一步的协议审计重建了423/211/212天训练、验证、测试划分，确认日期区间严格递增且互不重叠；当前RobustScaler参数与仅训练集拟合结果一致，并且不等于全量数据拟合结果；所有样本输入窗口均早于预测目标，固定测试预测文件行数为212，与测试样本数一致。实验结果表明，Strict RAMR-VE在铁路主数据集上取得18.55%的MAPE、0.035640的MSE和0.138028的MAE，三项指标均优于原MoE-Rail结果（19.41%、0.037700、0.144000）以及新增现代强基线。新增基线中FreEformer表现最强，MAPE为20.15%，但仍低于Strict RAMR-VE。</w:t>
       </w:r>
@@ -16076,6 +16092,7 @@
         <w:rPr>
           <w:rFonts w:ascii="Times New Roman" w:hAnsi="Times New Roman" w:eastAsia="STSong"/>
           <w:b/>
+          <w:sz w:val="21"/>
         </w:rPr>
         <w:t>图2-2  现代强基线与Strict RAMR-VE的全指标对比</w:t>
       </w:r>
@@ -20213,6 +20230,7 @@
       <w:r>
         <w:rPr>
           <w:rFonts w:ascii="Times New Roman" w:hAnsi="Times New Roman" w:eastAsia="STSong"/>
+          <w:sz w:val="21"/>
         </w:rPr>
         <w:t>为避免门控解释仅停留在场景均值层面，本文进一步进行regime-gating对齐审计。该审计不训练、不调参、不重新选模，只加载论文机制模型checkpoint，并从预测时可见的历史回看窗口计算日总波动率、峰均比、趋势强度和鲁棒偏移等regime指标。结果显示，日总波动率最高25%的样本中短期专家权重均值为0.6714，高于其余样本的0.4256，Welch检验p=2.58e-06；峰均比最高25%的样本中分布偏移专家权重均值为0.5909，高于其余样本的0.3303，p=1.83e-05。这说明RAMR并非将所有波动都简单映射到同一个专家，而是将高频相邻日变化更多交给短期专家，将峰均比所代表的突发强度更多交给分布偏移专家，从而形成与非平稳regime相对应的功能分工。</w:t>
       </w:r>
@@ -20238,6 +20256,7 @@
       <w:r>
         <w:rPr>
           <w:rFonts w:ascii="Times New Roman" w:hAnsi="Times New Roman" w:eastAsia="STSong"/>
+          <w:sz w:val="21"/>
         </w:rPr>
         <w:t>图4表明，测试窗口内专家权重并非静态平均，而是随日历场景和历史窗口regime发生重分配：常规工作日区段短期专家保持较高响应，周末或峰均比突出的非典型需求区段分布偏移专家权重升高。该时序对齐关系从个案层面补充了表4-表5的群体统计结论；同时，regime-gating审计显示高频波动与峰值突发并不触发完全相同的专家，因此本文不将图4解释为“波动越大某一专家必然越高”的简单线性规律。为改善图中站点客流序列在缩放后的可读性，本文另将图4顶部客流序列单独放大绘制为图4(a)，STL三分量与专家权重对齐关系作为图4(b)展示。</w:t>
       </w:r>
@@ -20263,6 +20282,7 @@
       <w:r>
         <w:rPr>
           <w:rFonts w:ascii="Times New Roman" w:hAnsi="Times New Roman" w:eastAsia="STSong"/>
+          <w:sz w:val="21"/>
         </w:rPr>
         <w:t>综上，周末窗口分布偏移专家权重的系统性升高，与残差项吸收非工作日需求迁移、并由分布偏移专家建模峰值突发强度的机制相一致；工作日和高频日总波动窗口中短期专家权重较高，则说明相邻日期连续性和短程校正在日粒度预测中仍是重要信息来源。从假设检验、分布可视化、regime对齐和时序对照四个维度看，结果支持分解引导和场景条件化路由的专家分工设计。</w:t>
       </w:r>
@@ -21119,8 +21139,9 @@
       <w:r>
         <w:rPr>
           <w:rFonts w:ascii="Times New Roman" w:hAnsi="Times New Roman" w:eastAsia="STSong"/>
-        </w:rPr>
-        <w:t>针对铁路客流序列在不同场景下呈现出的局部波动、长期周期性和异常扰动等复杂特征，本文提出场景条件化非平稳分解-路由机制MoE-Rail/RAMR。该模型从趋势、周期与扰动叠加的生成视角出发，通过短期依赖、长期依赖与分布偏移专家实现多尺度分工建模，并结合场景感知门控、regime encoding与负载均衡约束实现专家权重自适应分配。真实南京南站双向日粒度客流实验表明，在严格无测试泄露协议下，Strict RAMR-VE取得MAPE=18.55%、MSE=0.035640、MAE=0.138028，三项指标均优于原MoE-Rail和新增现代强基线；现代强基线全指标支配审计进一步显示，Strict RAMR-VE在5个现代基线与3个核心指标构成的15个点估计比较单元中全部更低，配对预测审计中三指标同时更优的日期级bootstrap概率最低为89.40%。STL分解、门控权重统计和消融实验进一步支持“场景/非平稳状态驱动专家路由”的机制假设。Traffic数据集结果用于说明该框架在重构小时级窗口和周期特征后的结构鲁棒性，不能直接外推为任意线路和任意时间粒度的稳定泛化。后续仍需在更多铁路线路、更多外生扰动变量和更多公开交通数据集上验证其泛化能力。</w:t>
+          <w:sz w:val="21"/>
+        </w:rPr>
+        <w:t>针对铁路客流序列在不同场景下呈现出的局部波动、长期周期性和异常扰动等复杂特征，本文提出场景条件化非平稳分解-路由机制MoE-Rail/RAMR。该模型从趋势、周期与扰动叠加的生成视角出发，通过短期依赖、长期依赖与分布偏移专家实现多尺度分工建模，并结合场景感知门控、regime encoding与负载均衡约束实现专家权重自适应分配。真实南京南站双向日粒度客流实验表明，在严格无测试泄露协议下，Strict RAMR-VE取得MAPE=18.55%、MSE=0.035640、MAE=0.138028，三项指标均优于原MoE-Rail和新增现代强基线；现代强基线全指标支配审计进一步显示，Strict RAMR-VE在5个现代基线与3个核心指标构成的15个点估计比较单元中全部更低，配对预测审计中三指标同时更优的日期级bootstrap概率最低为89.40%。工作日/周末场景分层审计进一步显示，Strict RAMR-VE在两类可检验日历场景下的三项指标均优于现代强基线。STL分解、门控权重统计和消融实验进一步支持“场景/非平稳状态驱动专家路由”的机制假设。Traffic数据集结果用于说明该框架在重构小时级窗口和周期特征后的结构鲁棒性，不能直接外推为任意线路和任意时间粒度的稳定泛化。后续仍需在更多铁路线路、更多外生扰动变量和更多公开交通数据集上验证其泛化能力。</w:t>
       </w:r>
     </w:p>
     <w:p>

</xml_diff>

<commit_message>
Add Traffic boundary audit
</commit_message>
<xml_diff>
--- a/paper/2026-0268-基于多专家融合的铁路客流多尺度预测方法.docx
+++ b/paper/2026-0268-基于多专家融合的铁路客流多尺度预测方法.docx
@@ -20328,11 +20328,10 @@
       </w:pPr>
       <w:r>
         <w:rPr>
-          <w:rFonts w:ascii="Times New Roman" w:hAnsi="Times New Roman" w:eastAsia="STSong" w:cs="Times New Roman"/>
-          <w:b w:val="0"/>
-          <w:sz w:val="21"/>
-        </w:rPr>
-        <w:t>为评估结构鲁棒性，Traffic公开数据集实验采用domain adaptation framing。本文不主张铁路日粒度模型可直接跨分辨率迁移到小时级道路交通，而是考察专家分解结构在重构时间窗口、周期特征与扰动代理后是否保持可训练性与稳定性。迁移到小时级数据时，需要按小时级采样重新定义历史窗口、预测窗口、小时/星期周期编码和局部波动统计，不能直接复用日粒度配置。</w:t>
+          <w:rFonts w:ascii="Times New Roman" w:hAnsi="Times New Roman" w:eastAsia="STSong"/>
+          <w:sz w:val="21"/>
+        </w:rPr>
+        <w:t>为评估结构鲁棒性，Traffic公开数据集实验采用domain adaptation framing。本文不主张铁路日粒度模型可直接跨分辨率迁移到小时级道路交通，而是考察专家分解结构在重构时间窗口、周期特征与扰动代理后是否保持可训练性与稳定性。迁移到小时级数据时，需要按小时级采样重新定义历史窗口、预测窗口、小时/星期周期编码和局部波动统计，不能直接复用日粒度配置。需要说明的是，当前仓库未包含可端到端复现实验的Traffic原始数据文件，因此本节数值只作为现有Traffic补充基准记录，不作为当前仓库从原始Traffic数据重新训练复现的证据。</w:t>
       </w:r>
     </w:p>
     <w:p>

</xml_diff>